<commit_message>
Corrección sección 1.Introducción y contexto - objetivo de la reproducción
</commit_message>
<xml_diff>
--- a/documents/proyecto_transversal_grupo1.docx
+++ b/documents/proyecto_transversal_grupo1.docx
@@ -1385,42 +1385,12 @@
       </w:r>
       <w:r>
         <w:rPr>
-          <w:rFonts w:ascii="Times New Roman" w:hAnsi="Times New Roman" w:cs="Times New Roman"/>
-          <w:lang w:val="es-ES"/>
-        </w:rPr>
-        <w:t xml:space="preserve">, </w:t>
-      </w:r>
-      <w:r>
-        <w:rPr>
-          <w:rFonts w:ascii="Times New Roman" w:hAnsi="Times New Roman" w:cs="Times New Roman"/>
-          <w:lang w:val="es-ES"/>
-        </w:rPr>
-        <w:t xml:space="preserve">disponible </w:t>
-      </w:r>
-      <w:r>
-        <w:rPr>
-          <w:rFonts w:ascii="Times New Roman" w:hAnsi="Times New Roman" w:cs="Times New Roman"/>
-          <w:lang w:val="es-ES"/>
-        </w:rPr>
-        <w:t>en el si</w:t>
-      </w:r>
-      <w:r>
-        <w:rPr>
-          <w:rFonts w:ascii="Times New Roman" w:hAnsi="Times New Roman" w:cs="Times New Roman"/>
-          <w:lang w:val="es-ES"/>
-        </w:rPr>
-        <w:t xml:space="preserve">guiente </w:t>
-      </w:r>
-      <w:hyperlink r:id="rId6" w:history="1">
-        <w:r>
-          <w:rPr>
-            <w:rStyle w:val="Hyperlink"/>
-            <w:rFonts w:ascii="Times New Roman" w:hAnsi="Times New Roman" w:cs="Times New Roman"/>
-            <w:lang w:val="es-ES"/>
-          </w:rPr>
-          <w:t>link</w:t>
-        </w:r>
-      </w:hyperlink>
+          <w:rStyle w:val="FootnoteReference"/>
+          <w:rFonts w:ascii="Times New Roman" w:hAnsi="Times New Roman" w:cs="Times New Roman"/>
+          <w:lang w:val="es-ES"/>
+        </w:rPr>
+        <w:footnoteReference w:id="1"/>
+      </w:r>
       <w:r>
         <w:rPr>
           <w:rFonts w:ascii="Times New Roman" w:hAnsi="Times New Roman" w:cs="Times New Roman"/>
@@ -1428,21 +1398,19 @@
         </w:rPr>
         <w:t xml:space="preserve">, que corresponden a la construcción del </w:t>
       </w:r>
-      <w:proofErr w:type="spellStart"/>
-      <w:r>
-        <w:rPr>
-          <w:rFonts w:ascii="Times New Roman" w:hAnsi="Times New Roman" w:cs="Times New Roman"/>
-          <w:lang w:val="es-ES"/>
-        </w:rPr>
-        <w:t>dataset</w:t>
-      </w:r>
-      <w:proofErr w:type="spellEnd"/>
-      <w:r>
-        <w:rPr>
-          <w:rFonts w:ascii="Times New Roman" w:hAnsi="Times New Roman" w:cs="Times New Roman"/>
-          <w:lang w:val="es-ES"/>
-        </w:rPr>
-        <w:t xml:space="preserve"> y la estimación econométrica de la relación entre temperatura y consumo energético.</w:t>
+      <w:r>
+        <w:rPr>
+          <w:rFonts w:ascii="Times New Roman" w:hAnsi="Times New Roman" w:cs="Times New Roman"/>
+          <w:lang w:val="es-ES"/>
+        </w:rPr>
+        <w:t>D</w:t>
+      </w:r>
+      <w:r>
+        <w:rPr>
+          <w:rFonts w:ascii="Times New Roman" w:hAnsi="Times New Roman" w:cs="Times New Roman"/>
+          <w:lang w:val="es-ES"/>
+        </w:rPr>
+        <w:t>ataset y la estimación econométrica de la relación entre temperatura y consumo energético.</w:t>
       </w:r>
     </w:p>
     <w:p>
@@ -1458,33 +1426,36 @@
           <w:rFonts w:ascii="Times New Roman" w:hAnsi="Times New Roman" w:cs="Times New Roman"/>
           <w:lang w:val="es-ES"/>
         </w:rPr>
-        <w:t xml:space="preserve">En Step 1, el propósito es reconstruir el </w:t>
-      </w:r>
-      <w:proofErr w:type="spellStart"/>
-      <w:r>
-        <w:rPr>
-          <w:rFonts w:ascii="Times New Roman" w:hAnsi="Times New Roman" w:cs="Times New Roman"/>
-          <w:lang w:val="es-ES"/>
-        </w:rPr>
-        <w:t>dataset</w:t>
-      </w:r>
-      <w:proofErr w:type="spellEnd"/>
-      <w:r>
-        <w:rPr>
-          <w:rFonts w:ascii="Times New Roman" w:hAnsi="Times New Roman" w:cs="Times New Roman"/>
-          <w:lang w:val="es-ES"/>
-        </w:rPr>
-        <w:t xml:space="preserve"> utilizado en el estudio combinando múltiples fuentes de información global. Este paso incluye la limpieza y armonización de datos de consumo energético provenientes de la International Energy Agency (IEA), datos climáticos históricos del Global </w:t>
-      </w:r>
-      <w:proofErr w:type="spellStart"/>
-      <w:r>
-        <w:rPr>
-          <w:rFonts w:ascii="Times New Roman" w:hAnsi="Times New Roman" w:cs="Times New Roman"/>
-          <w:lang w:val="es-ES"/>
-        </w:rPr>
-        <w:t>Meteorological</w:t>
-      </w:r>
-      <w:proofErr w:type="spellEnd"/>
+        <w:t>En</w:t>
+      </w:r>
+      <w:r>
+        <w:rPr>
+          <w:rFonts w:ascii="Times New Roman" w:hAnsi="Times New Roman" w:cs="Times New Roman"/>
+          <w:lang w:val="es-ES"/>
+        </w:rPr>
+        <w:t xml:space="preserve"> el</w:t>
+      </w:r>
+      <w:r>
+        <w:rPr>
+          <w:rFonts w:ascii="Times New Roman" w:hAnsi="Times New Roman" w:cs="Times New Roman"/>
+          <w:lang w:val="es-ES"/>
+        </w:rPr>
+        <w:t xml:space="preserve"> Step 1, el propósito es reconstruir el </w:t>
+      </w:r>
+      <w:r>
+        <w:rPr>
+          <w:rFonts w:ascii="Times New Roman" w:hAnsi="Times New Roman" w:cs="Times New Roman"/>
+          <w:lang w:val="es-ES"/>
+        </w:rPr>
+        <w:t>D</w:t>
+      </w:r>
+      <w:r>
+        <w:rPr>
+          <w:rFonts w:ascii="Times New Roman" w:hAnsi="Times New Roman" w:cs="Times New Roman"/>
+          <w:lang w:val="es-ES"/>
+        </w:rPr>
+        <w:t>ataset utilizado en el estudio combinando múltiples fuentes de información global. Este paso incluye la limpieza y armonización de datos de consumo energético provenientes de la International Energy Agency (IEA), datos climáticos históricos del Global Meteorological Forcing Dataset (GMFD) y variables socioeconómicas como ingreso per cápita y población.</w:t>
+      </w:r>
       <w:r>
         <w:rPr>
           <w:rFonts w:ascii="Times New Roman" w:hAnsi="Times New Roman" w:cs="Times New Roman"/>
@@ -1492,45 +1463,6 @@
         </w:rPr>
         <w:t xml:space="preserve"> </w:t>
       </w:r>
-      <w:proofErr w:type="spellStart"/>
-      <w:r>
-        <w:rPr>
-          <w:rFonts w:ascii="Times New Roman" w:hAnsi="Times New Roman" w:cs="Times New Roman"/>
-          <w:lang w:val="es-ES"/>
-        </w:rPr>
-        <w:t>Forcing</w:t>
-      </w:r>
-      <w:proofErr w:type="spellEnd"/>
-      <w:r>
-        <w:rPr>
-          <w:rFonts w:ascii="Times New Roman" w:hAnsi="Times New Roman" w:cs="Times New Roman"/>
-          <w:lang w:val="es-ES"/>
-        </w:rPr>
-        <w:t xml:space="preserve"> </w:t>
-      </w:r>
-      <w:proofErr w:type="spellStart"/>
-      <w:r>
-        <w:rPr>
-          <w:rFonts w:ascii="Times New Roman" w:hAnsi="Times New Roman" w:cs="Times New Roman"/>
-          <w:lang w:val="es-ES"/>
-        </w:rPr>
-        <w:t>Dataset</w:t>
-      </w:r>
-      <w:proofErr w:type="spellEnd"/>
-      <w:r>
-        <w:rPr>
-          <w:rFonts w:ascii="Times New Roman" w:hAnsi="Times New Roman" w:cs="Times New Roman"/>
-          <w:lang w:val="es-ES"/>
-        </w:rPr>
-        <w:t xml:space="preserve"> (GMFD) y variables socioeconómicas como ingreso per cápita y población.</w:t>
-      </w:r>
-      <w:r>
-        <w:rPr>
-          <w:rFonts w:ascii="Times New Roman" w:hAnsi="Times New Roman" w:cs="Times New Roman"/>
-          <w:lang w:val="es-ES"/>
-        </w:rPr>
-        <w:t xml:space="preserve"> </w:t>
-      </w:r>
       <w:r>
         <w:rPr>
           <w:rFonts w:ascii="Times New Roman" w:hAnsi="Times New Roman" w:cs="Times New Roman"/>
@@ -1552,7 +1484,35 @@
           <w:rFonts w:ascii="Times New Roman" w:hAnsi="Times New Roman" w:cs="Times New Roman"/>
           <w:lang w:val="es-ES"/>
         </w:rPr>
-        <w:t>En Step 2, el objetivo es estimar econométricamente cómo las variaciones en la temperatura afectan el consumo energético. Para ello se utilizan regresiones que relacionan cambios en temperatura con cambios en consumo de electricidad y otros combustibles, considerando heterogeneidad según niveles de ingreso y condiciones climáticas. Estas estimaciones permiten recuperar la relación empírica fundamental entre temperatura y demanda energética que posteriormente es utilizada en el artículo para proyectar impactos del cambio climático.</w:t>
+        <w:t xml:space="preserve">En </w:t>
+      </w:r>
+      <w:r>
+        <w:rPr>
+          <w:rFonts w:ascii="Times New Roman" w:hAnsi="Times New Roman" w:cs="Times New Roman"/>
+          <w:lang w:val="es-ES"/>
+        </w:rPr>
+        <w:t xml:space="preserve">el </w:t>
+      </w:r>
+      <w:r>
+        <w:rPr>
+          <w:rFonts w:ascii="Times New Roman" w:hAnsi="Times New Roman" w:cs="Times New Roman"/>
+          <w:lang w:val="es-ES"/>
+        </w:rPr>
+        <w:t>Step 2, el objetivo es estimar econométricamente cómo las variaciones en la temperatura afectan el consumo energético. Para ello se utilizan regresiones que relacionan cambios en temperatura con cambios en consumo de electricidad y otros combustibles, considerando heterogeneidad según niveles de ingreso y condiciones climáticas. Estas estimaciones permiten recuperar la relación empírica fundamental entre temperatura y demanda energética que posteriormente es utilizada en el artículo para proyectar impactos del cambio climático</w:t>
+      </w:r>
+      <w:r>
+        <w:rPr>
+          <w:rFonts w:ascii="Times New Roman" w:hAnsi="Times New Roman" w:cs="Times New Roman"/>
+          <w:lang w:val="es-ES"/>
+        </w:rPr>
+        <w:t xml:space="preserve"> en el largo plazo</w:t>
+      </w:r>
+      <w:r>
+        <w:rPr>
+          <w:rFonts w:ascii="Times New Roman" w:hAnsi="Times New Roman" w:cs="Times New Roman"/>
+          <w:lang w:val="es-ES"/>
+        </w:rPr>
+        <w:t>.</w:t>
       </w:r>
     </w:p>
     <w:p>
@@ -1568,53 +1528,63 @@
           <w:rFonts w:ascii="Times New Roman" w:hAnsi="Times New Roman" w:cs="Times New Roman"/>
           <w:lang w:val="es-ES"/>
         </w:rPr>
-        <w:t xml:space="preserve">La razón por la cual se seleccionaron únicamente estos </w:t>
-      </w:r>
-      <w:proofErr w:type="spellStart"/>
-      <w:r>
-        <w:rPr>
-          <w:rFonts w:ascii="Times New Roman" w:hAnsi="Times New Roman" w:cs="Times New Roman"/>
-          <w:lang w:val="es-ES"/>
-        </w:rPr>
-        <w:t>steps</w:t>
-      </w:r>
-      <w:r>
-        <w:rPr>
-          <w:rFonts w:ascii="Times New Roman" w:hAnsi="Times New Roman" w:cs="Times New Roman"/>
-          <w:lang w:val="es-ES"/>
-        </w:rPr>
-        <w:t>s</w:t>
-      </w:r>
-      <w:proofErr w:type="spellEnd"/>
-      <w:r>
-        <w:rPr>
-          <w:rFonts w:ascii="Times New Roman" w:hAnsi="Times New Roman" w:cs="Times New Roman"/>
-          <w:lang w:val="es-ES"/>
-        </w:rPr>
-        <w:t xml:space="preserve"> es porque la base de datos es el insumo principal de todos los ejercicios a continuación. Además, este proceso implicaba el uso de gran parte de las lecciones vistas en clase; esto es, el uso de la terminal para configurar el ambiente de trabajo, el correr un proceso casi automatizado que corría todos los códigos y también hacía uso de Stata, Python y R. En ese sentido consideramos que podía funcionar para </w:t>
-      </w:r>
-      <w:r>
-        <w:rPr>
-          <w:rFonts w:ascii="Times New Roman" w:hAnsi="Times New Roman" w:cs="Times New Roman"/>
-          <w:lang w:val="es-ES"/>
-        </w:rPr>
-        <w:t xml:space="preserve">comprobar nuestra comprensión de las lecciones del curso. Por otra parte, las regresiones son el </w:t>
-      </w:r>
-      <w:proofErr w:type="spellStart"/>
-      <w:r>
-        <w:rPr>
-          <w:rFonts w:ascii="Times New Roman" w:hAnsi="Times New Roman" w:cs="Times New Roman"/>
-          <w:lang w:val="es-ES"/>
-        </w:rPr>
-        <w:t>core</w:t>
-      </w:r>
-      <w:proofErr w:type="spellEnd"/>
-      <w:r>
-        <w:rPr>
-          <w:rFonts w:ascii="Times New Roman" w:hAnsi="Times New Roman" w:cs="Times New Roman"/>
-          <w:lang w:val="es-ES"/>
-        </w:rPr>
-        <w:t xml:space="preserve"> del ejercicio, por lo que eran la forma de comprobar que el ejercicio de replicación generaba los resultados antes encontrados. </w:t>
+        <w:t xml:space="preserve">La razón por la cual se </w:t>
+      </w:r>
+      <w:r>
+        <w:rPr>
+          <w:rFonts w:ascii="Times New Roman" w:hAnsi="Times New Roman" w:cs="Times New Roman"/>
+          <w:lang w:val="es-ES"/>
+        </w:rPr>
+        <w:t xml:space="preserve">replicaron estos procesos </w:t>
+      </w:r>
+      <w:r>
+        <w:rPr>
+          <w:rFonts w:ascii="Times New Roman" w:hAnsi="Times New Roman" w:cs="Times New Roman"/>
+          <w:lang w:val="es-ES"/>
+        </w:rPr>
+        <w:t xml:space="preserve">es porque </w:t>
+      </w:r>
+      <w:r>
+        <w:rPr>
+          <w:rFonts w:ascii="Times New Roman" w:hAnsi="Times New Roman" w:cs="Times New Roman"/>
+          <w:lang w:val="es-ES"/>
+        </w:rPr>
+        <w:t xml:space="preserve">la construcción de la base de datos, además del primer conjunto de resultados, representaban gran parte del proceso de </w:t>
+      </w:r>
+      <w:r>
+        <w:rPr>
+          <w:rFonts w:ascii="Times New Roman" w:hAnsi="Times New Roman" w:cs="Times New Roman"/>
+          <w:lang w:val="es-ES"/>
+        </w:rPr>
+        <w:t>generación y análisis de datos del paper original</w:t>
+      </w:r>
+      <w:r>
+        <w:rPr>
+          <w:rFonts w:ascii="Times New Roman" w:hAnsi="Times New Roman" w:cs="Times New Roman"/>
+          <w:lang w:val="es-ES"/>
+        </w:rPr>
+        <w:t>. Además, este proceso implicaba el uso de gran parte de las lecciones vistas en clase</w:t>
+      </w:r>
+      <w:r>
+        <w:rPr>
+          <w:rFonts w:ascii="Times New Roman" w:hAnsi="Times New Roman" w:cs="Times New Roman"/>
+          <w:lang w:val="es-ES"/>
+        </w:rPr>
+        <w:t xml:space="preserve">, como </w:t>
+      </w:r>
+      <w:r>
+        <w:rPr>
+          <w:rFonts w:ascii="Times New Roman" w:hAnsi="Times New Roman" w:cs="Times New Roman"/>
+          <w:lang w:val="es-ES"/>
+        </w:rPr>
+        <w:t xml:space="preserve">el uso de la terminal para configurar el ambiente de trabajo, el correr un proceso casi automatizado que corría todos los códigos y también hacía uso de Stata, Python y R. </w:t>
+      </w:r>
+      <w:r>
+        <w:rPr>
+          <w:rFonts w:ascii="Times New Roman" w:hAnsi="Times New Roman" w:cs="Times New Roman"/>
+          <w:lang w:val="es-ES"/>
+        </w:rPr>
+        <w:t xml:space="preserve">Por otra parte, las regresiones son el core del ejercicio, por lo que eran la forma de comprobar que el ejercicio de replicación generaba los resultados antes encontrados. </w:t>
       </w:r>
     </w:p>
     <w:p>
@@ -1682,7 +1652,7 @@
                     <pic:cNvPicPr/>
                   </pic:nvPicPr>
                   <pic:blipFill>
-                    <a:blip r:embed="rId7"/>
+                    <a:blip r:embed="rId8"/>
                     <a:stretch>
                       <a:fillRect/>
                     </a:stretch>
@@ -1716,23 +1686,7 @@
           <w:rFonts w:ascii="Times New Roman" w:hAnsi="Times New Roman" w:cs="Times New Roman"/>
           <w:lang w:val="es-ES"/>
         </w:rPr>
-        <w:t xml:space="preserve">El repositorio incluye principalmente scripts de procesamiento de datos y estimación econométrica que permiten ejecutar los pasos iniciales del análisis. En particular, el código disponible permite reconstruir el </w:t>
-      </w:r>
-      <w:proofErr w:type="spellStart"/>
-      <w:r>
-        <w:rPr>
-          <w:rFonts w:ascii="Times New Roman" w:hAnsi="Times New Roman" w:cs="Times New Roman"/>
-          <w:lang w:val="es-ES"/>
-        </w:rPr>
-        <w:t>dataset</w:t>
-      </w:r>
-      <w:proofErr w:type="spellEnd"/>
-      <w:r>
-        <w:rPr>
-          <w:rFonts w:ascii="Times New Roman" w:hAnsi="Times New Roman" w:cs="Times New Roman"/>
-          <w:lang w:val="es-ES"/>
-        </w:rPr>
-        <w:t xml:space="preserve"> final utilizado en las regresiones y ejecutar los modelos econométricos que estiman la relación entre temperatura y consumo energético.</w:t>
+        <w:t>El repositorio incluye principalmente scripts de procesamiento de datos y estimación econométrica que permiten ejecutar los pasos iniciales del análisis. En particular, el código disponible permite reconstruir el dataset final utilizado en las regresiones y ejecutar los modelos econométricos que estiman la relación entre temperatura y consumo energético.</w:t>
       </w:r>
     </w:p>
     <w:p>
@@ -1748,17 +1702,8 @@
           <w:rFonts w:ascii="Times New Roman" w:hAnsi="Times New Roman" w:cs="Times New Roman"/>
           <w:lang w:val="es-ES"/>
         </w:rPr>
-        <w:t xml:space="preserve">Los datos utilizados provienen de varias fuentes. El consumo energético se obtiene del World Energy Balances de la International Energy Agency (IEA), mientras que los datos climáticos provienen del Global </w:t>
-      </w:r>
-      <w:proofErr w:type="spellStart"/>
-      <w:r>
-        <w:rPr>
-          <w:rFonts w:ascii="Times New Roman" w:hAnsi="Times New Roman" w:cs="Times New Roman"/>
-          <w:lang w:val="es-ES"/>
-        </w:rPr>
-        <w:t>Meteorological</w:t>
-      </w:r>
-      <w:proofErr w:type="spellEnd"/>
+        <w:t xml:space="preserve">Los datos utilizados provienen de varias fuentes. El consumo energético se obtiene del World Energy Balances de la International Energy Agency (IEA), mientras que los datos climáticos provienen del Global Meteorological Forcing Dataset (GMFD), que ofrece información diaria de temperatura y precipitación a una resolución espacial de 0.25 grados. Además, se utilizan datos de ingreso per cápita y población provenientes del Banco Mundial e integrados en las bases de la IEA. </w:t>
+      </w:r>
       <w:r>
         <w:rPr>
           <w:rFonts w:ascii="Times New Roman" w:hAnsi="Times New Roman" w:cs="Times New Roman"/>
@@ -1766,45 +1711,6 @@
         </w:rPr>
         <w:t xml:space="preserve"> </w:t>
       </w:r>
-      <w:proofErr w:type="spellStart"/>
-      <w:r>
-        <w:rPr>
-          <w:rFonts w:ascii="Times New Roman" w:hAnsi="Times New Roman" w:cs="Times New Roman"/>
-          <w:lang w:val="es-ES"/>
-        </w:rPr>
-        <w:t>Forcing</w:t>
-      </w:r>
-      <w:proofErr w:type="spellEnd"/>
-      <w:r>
-        <w:rPr>
-          <w:rFonts w:ascii="Times New Roman" w:hAnsi="Times New Roman" w:cs="Times New Roman"/>
-          <w:lang w:val="es-ES"/>
-        </w:rPr>
-        <w:t xml:space="preserve"> </w:t>
-      </w:r>
-      <w:proofErr w:type="spellStart"/>
-      <w:r>
-        <w:rPr>
-          <w:rFonts w:ascii="Times New Roman" w:hAnsi="Times New Roman" w:cs="Times New Roman"/>
-          <w:lang w:val="es-ES"/>
-        </w:rPr>
-        <w:t>Dataset</w:t>
-      </w:r>
-      <w:proofErr w:type="spellEnd"/>
-      <w:r>
-        <w:rPr>
-          <w:rFonts w:ascii="Times New Roman" w:hAnsi="Times New Roman" w:cs="Times New Roman"/>
-          <w:lang w:val="es-ES"/>
-        </w:rPr>
-        <w:t xml:space="preserve"> (GMFD), que ofrece información diaria de temperatura y precipitación a una resolución espacial de 0.25 grados. Además, se utilizan datos de ingreso per cápita y población provenientes del Banco Mundial e integrados en las bases de la IEA. </w:t>
-      </w:r>
-      <w:r>
-        <w:rPr>
-          <w:rFonts w:ascii="Times New Roman" w:hAnsi="Times New Roman" w:cs="Times New Roman"/>
-          <w:lang w:val="es-ES"/>
-        </w:rPr>
-        <w:t xml:space="preserve"> </w:t>
-      </w:r>
       <w:r>
         <w:rPr>
           <w:rFonts w:ascii="Times New Roman" w:hAnsi="Times New Roman" w:cs="Times New Roman"/>
@@ -1817,23 +1723,7 @@
           <w:rFonts w:ascii="Times New Roman" w:hAnsi="Times New Roman" w:cs="Times New Roman"/>
           <w:lang w:val="es-ES"/>
         </w:rPr>
-        <w:t xml:space="preserve">autores nos referencian a un </w:t>
-      </w:r>
-      <w:proofErr w:type="spellStart"/>
-      <w:r>
-        <w:rPr>
-          <w:rFonts w:ascii="Times New Roman" w:hAnsi="Times New Roman" w:cs="Times New Roman"/>
-          <w:lang w:val="es-ES"/>
-        </w:rPr>
-        <w:t>Zenodo</w:t>
-      </w:r>
-      <w:proofErr w:type="spellEnd"/>
-      <w:r>
-        <w:rPr>
-          <w:rFonts w:ascii="Times New Roman" w:hAnsi="Times New Roman" w:cs="Times New Roman"/>
-          <w:lang w:val="es-ES"/>
-        </w:rPr>
-        <w:t xml:space="preserve"> </w:t>
+        <w:t xml:space="preserve">autores nos referencian a un Zenodo </w:t>
       </w:r>
       <w:r>
         <w:rPr>
@@ -1842,7 +1732,7 @@
         </w:rPr>
         <w:t>(</w:t>
       </w:r>
-      <w:hyperlink r:id="rId8" w:history="1">
+      <w:hyperlink r:id="rId9" w:history="1">
         <w:r>
           <w:rPr>
             <w:rStyle w:val="Hyperlink"/>
@@ -1880,23 +1770,7 @@
           <w:rFonts w:ascii="Times New Roman" w:hAnsi="Times New Roman" w:cs="Times New Roman"/>
           <w:lang w:val="es-ES"/>
         </w:rPr>
-        <w:t xml:space="preserve">La información era bastante accesible; sin embargo, al ser un estudio que se realizó en 2010 requería de la configuración de un entorno computacional que no fue fácil para algunos miembros del equipo; cómo se detallará más adelante. Además, al utilizar Stata, R y Python requirió también especificar </w:t>
-      </w:r>
-      <w:proofErr w:type="spellStart"/>
-      <w:r>
-        <w:rPr>
-          <w:rFonts w:ascii="Times New Roman" w:hAnsi="Times New Roman" w:cs="Times New Roman"/>
-          <w:lang w:val="es-ES"/>
-        </w:rPr>
-        <w:t>versionamientos</w:t>
-      </w:r>
-      <w:proofErr w:type="spellEnd"/>
-      <w:r>
-        <w:rPr>
-          <w:rFonts w:ascii="Times New Roman" w:hAnsi="Times New Roman" w:cs="Times New Roman"/>
-          <w:lang w:val="es-ES"/>
-        </w:rPr>
-        <w:t xml:space="preserve"> en el entorno y si bien la mayoría de las instrucciones de replicación eran claras; consideramos que puede ser que no pudieron prever pasos adicionales que debieron ser tomados. </w:t>
+        <w:t xml:space="preserve">La información era bastante accesible; sin embargo, al ser un estudio que se realizó en 2010 requería de la configuración de un entorno computacional que no fue fácil para algunos miembros del equipo; cómo se detallará más adelante. Además, al utilizar Stata, R y Python requirió también especificar versionamientos en el entorno y si bien la mayoría de las instrucciones de replicación eran claras; consideramos que puede ser que no pudieron prever pasos adicionales que debieron ser tomados. </w:t>
       </w:r>
     </w:p>
     <w:p>
@@ -1959,39 +1833,7 @@
           <w:lang w:val="es-ES"/>
         </w:rPr>
         <w:br/>
-        <w:t xml:space="preserve">La estrategia de reproducción se basó en replicar las primeras etapas del flujo de trabajo computacional del estudio, específicamente los </w:t>
-      </w:r>
-      <w:proofErr w:type="spellStart"/>
-      <w:r>
-        <w:rPr>
-          <w:rFonts w:ascii="Times New Roman" w:hAnsi="Times New Roman" w:cs="Times New Roman"/>
-          <w:lang w:val="es-ES"/>
-        </w:rPr>
-        <w:t>Steps</w:t>
-      </w:r>
-      <w:proofErr w:type="spellEnd"/>
-      <w:r>
-        <w:rPr>
-          <w:rFonts w:ascii="Times New Roman" w:hAnsi="Times New Roman" w:cs="Times New Roman"/>
-          <w:lang w:val="es-ES"/>
-        </w:rPr>
-        <w:t xml:space="preserve"> 1 y 2 del repositorio del proyecto, que corresponden a la construcción del </w:t>
-      </w:r>
-      <w:proofErr w:type="spellStart"/>
-      <w:r>
-        <w:rPr>
-          <w:rFonts w:ascii="Times New Roman" w:hAnsi="Times New Roman" w:cs="Times New Roman"/>
-          <w:lang w:val="es-ES"/>
-        </w:rPr>
-        <w:t>dataset</w:t>
-      </w:r>
-      <w:proofErr w:type="spellEnd"/>
-      <w:r>
-        <w:rPr>
-          <w:rFonts w:ascii="Times New Roman" w:hAnsi="Times New Roman" w:cs="Times New Roman"/>
-          <w:lang w:val="es-ES"/>
-        </w:rPr>
-        <w:t xml:space="preserve"> y a la estimación econométrica de la relación entre temperatura y consumo energético. Estos pasos constituyen la base empírica del artículo, ya que permiten reconstruir el conjunto de datos utilizado por los autores y estimar la relación fundamental entre variables climáticas y consumo energético.</w:t>
+        <w:t>La estrategia de reproducción se basó en replicar las primeras etapas del flujo de trabajo computacional del estudio, específicamente los Steps 1 y 2 del repositorio del proyecto, que corresponden a la construcción del dataset y a la estimación econométrica de la relación entre temperatura y consumo energético. Estos pasos constituyen la base empírica del artículo, ya que permiten reconstruir el conjunto de datos utilizado por los autores y estimar la relación fundamental entre variables climáticas y consumo energético.</w:t>
       </w:r>
       <w:r>
         <w:rPr>
@@ -2021,23 +1863,7 @@
           <w:rFonts w:ascii="Times New Roman" w:hAnsi="Times New Roman" w:cs="Times New Roman"/>
           <w:lang w:val="es-ES"/>
         </w:rPr>
-        <w:t xml:space="preserve">se generó un </w:t>
-      </w:r>
-      <w:proofErr w:type="spellStart"/>
-      <w:r>
-        <w:rPr>
-          <w:rFonts w:ascii="Times New Roman" w:hAnsi="Times New Roman" w:cs="Times New Roman"/>
-          <w:lang w:val="es-ES"/>
-        </w:rPr>
-        <w:t>fork</w:t>
-      </w:r>
-      <w:proofErr w:type="spellEnd"/>
-      <w:r>
-        <w:rPr>
-          <w:rFonts w:ascii="Times New Roman" w:hAnsi="Times New Roman" w:cs="Times New Roman"/>
-          <w:lang w:val="es-ES"/>
-        </w:rPr>
-        <w:t xml:space="preserve"> sobre el repositorio original del Paper y este fue compartido con todos los miembros del equipo. Posteriormente, y en el computador de cada integrante, </w:t>
+        <w:t xml:space="preserve">se generó un fork sobre el repositorio original del Paper y este fue compartido con todos los miembros del equipo. Posteriormente, y en el computador de cada integrante, </w:t>
       </w:r>
       <w:r>
         <w:rPr>
@@ -2157,7 +1983,7 @@
                     </pic:cNvPicPr>
                   </pic:nvPicPr>
                   <pic:blipFill>
-                    <a:blip r:embed="rId9" cstate="print">
+                    <a:blip r:embed="rId10" cstate="print">
                       <a:extLst>
                         <a:ext uri="{28A0092B-C50C-407E-A947-70E740481C1C}">
                           <a14:useLocalDpi xmlns:a14="http://schemas.microsoft.com/office/drawing/2010/main" val="0"/>
@@ -2251,7 +2077,7 @@
                     <pic:cNvPicPr/>
                   </pic:nvPicPr>
                   <pic:blipFill>
-                    <a:blip r:embed="rId10"/>
+                    <a:blip r:embed="rId11"/>
                     <a:stretch>
                       <a:fillRect/>
                     </a:stretch>
@@ -2374,46 +2200,14 @@
           <w:rFonts w:ascii="Times New Roman" w:hAnsi="Times New Roman" w:cs="Times New Roman"/>
           <w:lang w:val="es-ES"/>
         </w:rPr>
-        <w:t xml:space="preserve">Para poder comprender, después de descargar los datos de </w:t>
-      </w:r>
-      <w:proofErr w:type="spellStart"/>
-      <w:r>
-        <w:rPr>
-          <w:rFonts w:ascii="Times New Roman" w:hAnsi="Times New Roman" w:cs="Times New Roman"/>
-          <w:lang w:val="es-ES"/>
-        </w:rPr>
-        <w:t>Zenodo</w:t>
-      </w:r>
-      <w:proofErr w:type="spellEnd"/>
-      <w:r>
-        <w:rPr>
-          <w:rFonts w:ascii="Times New Roman" w:hAnsi="Times New Roman" w:cs="Times New Roman"/>
-          <w:lang w:val="es-ES"/>
-        </w:rPr>
-        <w:t xml:space="preserve"> </w:t>
-      </w:r>
-      <w:r>
-        <w:rPr>
-          <w:rFonts w:ascii="Times New Roman" w:hAnsi="Times New Roman" w:cs="Times New Roman"/>
-          <w:lang w:val="es-ES"/>
-        </w:rPr>
-        <w:t xml:space="preserve">y leer el repositorio, la estructura básica del estudio se construyó el siguiente </w:t>
-      </w:r>
-      <w:proofErr w:type="spellStart"/>
-      <w:r>
-        <w:rPr>
-          <w:rFonts w:ascii="Times New Roman" w:hAnsi="Times New Roman" w:cs="Times New Roman"/>
-          <w:lang w:val="es-ES"/>
-        </w:rPr>
-        <w:t>mermaid</w:t>
-      </w:r>
-      <w:proofErr w:type="spellEnd"/>
-      <w:r>
-        <w:rPr>
-          <w:rFonts w:ascii="Times New Roman" w:hAnsi="Times New Roman" w:cs="Times New Roman"/>
-          <w:lang w:val="es-ES"/>
-        </w:rPr>
-        <w:t>.</w:t>
+        <w:t xml:space="preserve">Para poder comprender, después de descargar los datos de Zenodo </w:t>
+      </w:r>
+      <w:r>
+        <w:rPr>
+          <w:rFonts w:ascii="Times New Roman" w:hAnsi="Times New Roman" w:cs="Times New Roman"/>
+          <w:lang w:val="es-ES"/>
+        </w:rPr>
+        <w:t>y leer el repositorio, la estructura básica del estudio se construyó el siguiente mermaid.</w:t>
       </w:r>
     </w:p>
     <w:p>
@@ -2448,7 +2242,7 @@
                     </pic:cNvPicPr>
                   </pic:nvPicPr>
                   <pic:blipFill>
-                    <a:blip r:embed="rId11" cstate="print">
+                    <a:blip r:embed="rId12" cstate="print">
                       <a:extLst>
                         <a:ext uri="{28A0092B-C50C-407E-A947-70E740481C1C}">
                           <a14:useLocalDpi xmlns:a14="http://schemas.microsoft.com/office/drawing/2010/main" val="0"/>
@@ -2569,7 +2363,7 @@
                     </pic:cNvPicPr>
                   </pic:nvPicPr>
                   <pic:blipFill>
-                    <a:blip r:embed="rId12" cstate="print">
+                    <a:blip r:embed="rId13" cstate="print">
                       <a:extLst>
                         <a:ext uri="{28A0092B-C50C-407E-A947-70E740481C1C}">
                           <a14:useLocalDpi xmlns:a14="http://schemas.microsoft.com/office/drawing/2010/main" val="0"/>
@@ -2614,39 +2408,7 @@
           <w:rFonts w:ascii="Times New Roman" w:hAnsi="Times New Roman" w:cs="Times New Roman"/>
           <w:lang w:val="es-ES"/>
         </w:rPr>
-        <w:t xml:space="preserve">En primer lugar, el script 1_construct_dataset_from_raw_inputs.do limpia y combina los datos de energía, clima, población e ingreso, produciendo un </w:t>
-      </w:r>
-      <w:proofErr w:type="spellStart"/>
-      <w:r>
-        <w:rPr>
-          <w:rFonts w:ascii="Times New Roman" w:hAnsi="Times New Roman" w:cs="Times New Roman"/>
-          <w:lang w:val="es-ES"/>
-        </w:rPr>
-        <w:t>dataset</w:t>
-      </w:r>
-      <w:proofErr w:type="spellEnd"/>
-      <w:r>
-        <w:rPr>
-          <w:rFonts w:ascii="Times New Roman" w:hAnsi="Times New Roman" w:cs="Times New Roman"/>
-          <w:lang w:val="es-ES"/>
-        </w:rPr>
-        <w:t xml:space="preserve"> intermedio denominado </w:t>
-      </w:r>
-      <w:proofErr w:type="spellStart"/>
-      <w:r>
-        <w:rPr>
-          <w:rFonts w:ascii="Times New Roman" w:hAnsi="Times New Roman" w:cs="Times New Roman"/>
-          <w:lang w:val="es-ES"/>
-        </w:rPr>
-        <w:t>IEA_merged_long_GMFD.dta</w:t>
-      </w:r>
-      <w:proofErr w:type="spellEnd"/>
-      <w:r>
-        <w:rPr>
-          <w:rFonts w:ascii="Times New Roman" w:hAnsi="Times New Roman" w:cs="Times New Roman"/>
-          <w:lang w:val="es-ES"/>
-        </w:rPr>
-        <w:t xml:space="preserve">. </w:t>
+        <w:t xml:space="preserve">En primer lugar, el script 1_construct_dataset_from_raw_inputs.do limpia y combina los datos de energía, clima, población e ingreso, produciendo un dataset intermedio denominado IEA_merged_long_GMFD.dta. </w:t>
       </w:r>
     </w:p>
     <w:p>
@@ -2663,103 +2425,7 @@
           <w:lang w:val="es-ES"/>
         </w:rPr>
         <w:lastRenderedPageBreak/>
-        <w:t xml:space="preserve">Posteriormente, el script 2_construct_regression_ready_data.do transforma este </w:t>
-      </w:r>
-      <w:proofErr w:type="spellStart"/>
-      <w:r>
-        <w:rPr>
-          <w:rFonts w:ascii="Times New Roman" w:hAnsi="Times New Roman" w:cs="Times New Roman"/>
-          <w:lang w:val="es-ES"/>
-        </w:rPr>
-        <w:t>dataset</w:t>
-      </w:r>
-      <w:proofErr w:type="spellEnd"/>
-      <w:r>
-        <w:rPr>
-          <w:rFonts w:ascii="Times New Roman" w:hAnsi="Times New Roman" w:cs="Times New Roman"/>
-          <w:lang w:val="es-ES"/>
-        </w:rPr>
-        <w:t xml:space="preserve"> intermedio en </w:t>
-      </w:r>
-      <w:proofErr w:type="spellStart"/>
-      <w:r>
-        <w:rPr>
-          <w:rFonts w:ascii="Times New Roman" w:hAnsi="Times New Roman" w:cs="Times New Roman"/>
-          <w:lang w:val="es-ES"/>
-        </w:rPr>
-        <w:t>datasets</w:t>
-      </w:r>
-      <w:proofErr w:type="spellEnd"/>
-      <w:r>
-        <w:rPr>
-          <w:rFonts w:ascii="Times New Roman" w:hAnsi="Times New Roman" w:cs="Times New Roman"/>
-          <w:lang w:val="es-ES"/>
-        </w:rPr>
-        <w:t xml:space="preserve"> listos para regresión. En esta etapa se eliminan observaciones con problemas de reporte, se emparejan los datos climáticos con los productos energéticos y se construyen variables clave del análisis, incluyendo </w:t>
-      </w:r>
-      <w:proofErr w:type="spellStart"/>
-      <w:r>
-        <w:rPr>
-          <w:rFonts w:ascii="Times New Roman" w:hAnsi="Times New Roman" w:cs="Times New Roman"/>
-          <w:lang w:val="es-ES"/>
-        </w:rPr>
-        <w:t>splines</w:t>
-      </w:r>
-      <w:proofErr w:type="spellEnd"/>
-      <w:r>
-        <w:rPr>
-          <w:rFonts w:ascii="Times New Roman" w:hAnsi="Times New Roman" w:cs="Times New Roman"/>
-          <w:lang w:val="es-ES"/>
-        </w:rPr>
-        <w:t xml:space="preserve"> de ingreso, clasificaciones por deciles de ingreso y variables en primeras diferencias. El resultado son los </w:t>
-      </w:r>
-      <w:proofErr w:type="spellStart"/>
-      <w:r>
-        <w:rPr>
-          <w:rFonts w:ascii="Times New Roman" w:hAnsi="Times New Roman" w:cs="Times New Roman"/>
-          <w:lang w:val="es-ES"/>
-        </w:rPr>
-        <w:t>datasets</w:t>
-      </w:r>
-      <w:proofErr w:type="spellEnd"/>
-      <w:r>
-        <w:rPr>
-          <w:rFonts w:ascii="Times New Roman" w:hAnsi="Times New Roman" w:cs="Times New Roman"/>
-          <w:lang w:val="es-ES"/>
-        </w:rPr>
-        <w:t xml:space="preserve"> </w:t>
-      </w:r>
-      <w:proofErr w:type="spellStart"/>
-      <w:r>
-        <w:rPr>
-          <w:rFonts w:ascii="Times New Roman" w:hAnsi="Times New Roman" w:cs="Times New Roman"/>
-          <w:lang w:val="es-ES"/>
-        </w:rPr>
-        <w:t>GMFD_TINV_clim_regsort.dta</w:t>
-      </w:r>
-      <w:proofErr w:type="spellEnd"/>
-      <w:r>
-        <w:rPr>
-          <w:rFonts w:ascii="Times New Roman" w:hAnsi="Times New Roman" w:cs="Times New Roman"/>
-          <w:lang w:val="es-ES"/>
-        </w:rPr>
-        <w:t xml:space="preserve"> (modelo principal) y </w:t>
-      </w:r>
-      <w:proofErr w:type="spellStart"/>
-      <w:r>
-        <w:rPr>
-          <w:rFonts w:ascii="Times New Roman" w:hAnsi="Times New Roman" w:cs="Times New Roman"/>
-          <w:lang w:val="es-ES"/>
-        </w:rPr>
-        <w:t>GMFD_TINV_clim_EX_regsort.dta</w:t>
-      </w:r>
-      <w:proofErr w:type="spellEnd"/>
-      <w:r>
-        <w:rPr>
-          <w:rFonts w:ascii="Times New Roman" w:hAnsi="Times New Roman" w:cs="Times New Roman"/>
-          <w:lang w:val="es-ES"/>
-        </w:rPr>
-        <w:t xml:space="preserve"> (modelo alternativo).</w:t>
+        <w:t>Posteriormente, el script 2_construct_regression_ready_data.do transforma este dataset intermedio en datasets listos para regresión. En esta etapa se eliminan observaciones con problemas de reporte, se emparejan los datos climáticos con los productos energéticos y se construyen variables clave del análisis, incluyendo splines de ingreso, clasificaciones por deciles de ingreso y variables en primeras diferencias. El resultado son los datasets GMFD_TINV_clim_regsort.dta (modelo principal) y GMFD_TINV_clim_EX_regsort.dta (modelo alternativo).</w:t>
       </w:r>
     </w:p>
     <w:p>
@@ -2956,7 +2622,7 @@
                     </pic:cNvPicPr>
                   </pic:nvPicPr>
                   <pic:blipFill>
-                    <a:blip r:embed="rId13" cstate="print">
+                    <a:blip r:embed="rId14" cstate="print">
                       <a:extLst>
                         <a:ext uri="{28A0092B-C50C-407E-A947-70E740481C1C}">
                           <a14:useLocalDpi xmlns:a14="http://schemas.microsoft.com/office/drawing/2010/main" val="0"/>
@@ -3074,7 +2740,7 @@
                     </pic:cNvPicPr>
                   </pic:nvPicPr>
                   <pic:blipFill>
-                    <a:blip r:embed="rId14" cstate="print">
+                    <a:blip r:embed="rId15" cstate="print">
                       <a:extLst>
                         <a:ext uri="{28A0092B-C50C-407E-A947-70E740481C1C}">
                           <a14:useLocalDpi xmlns:a14="http://schemas.microsoft.com/office/drawing/2010/main" val="0"/>
@@ -3135,7 +2801,7 @@
         </w:rPr>
         <w:t xml:space="preserve">, encontramos en el repositorio un </w:t>
       </w:r>
-      <w:hyperlink r:id="rId15" w:tooltip="1_analysis.sh" w:history="1">
+      <w:hyperlink r:id="rId16" w:tooltip="1_analysis.sh" w:history="1">
         <w:r>
           <w:rPr>
             <w:rStyle w:val="Hyperlink"/>
@@ -3214,71 +2880,7 @@
           <w:rFonts w:ascii="Times New Roman" w:hAnsi="Times New Roman" w:cs="Times New Roman"/>
           <w:lang w:val="es-ES"/>
         </w:rPr>
-        <w:t xml:space="preserve">Todas las regresiones utilizan un procedimiento de </w:t>
-      </w:r>
-      <w:proofErr w:type="spellStart"/>
-      <w:r>
-        <w:rPr>
-          <w:rFonts w:ascii="Times New Roman" w:hAnsi="Times New Roman" w:cs="Times New Roman"/>
-          <w:lang w:val="es-ES"/>
-        </w:rPr>
-        <w:t>Feasible</w:t>
-      </w:r>
-      <w:proofErr w:type="spellEnd"/>
-      <w:r>
-        <w:rPr>
-          <w:rFonts w:ascii="Times New Roman" w:hAnsi="Times New Roman" w:cs="Times New Roman"/>
-          <w:lang w:val="es-ES"/>
-        </w:rPr>
-        <w:t xml:space="preserve"> </w:t>
-      </w:r>
-      <w:proofErr w:type="spellStart"/>
-      <w:r>
-        <w:rPr>
-          <w:rFonts w:ascii="Times New Roman" w:hAnsi="Times New Roman" w:cs="Times New Roman"/>
-          <w:lang w:val="es-ES"/>
-        </w:rPr>
-        <w:t>Generalized</w:t>
-      </w:r>
-      <w:proofErr w:type="spellEnd"/>
-      <w:r>
-        <w:rPr>
-          <w:rFonts w:ascii="Times New Roman" w:hAnsi="Times New Roman" w:cs="Times New Roman"/>
-          <w:lang w:val="es-ES"/>
-        </w:rPr>
-        <w:t xml:space="preserve"> </w:t>
-      </w:r>
-      <w:proofErr w:type="spellStart"/>
-      <w:r>
-        <w:rPr>
-          <w:rFonts w:ascii="Times New Roman" w:hAnsi="Times New Roman" w:cs="Times New Roman"/>
-          <w:lang w:val="es-ES"/>
-        </w:rPr>
-        <w:t>Least</w:t>
-      </w:r>
-      <w:proofErr w:type="spellEnd"/>
-      <w:r>
-        <w:rPr>
-          <w:rFonts w:ascii="Times New Roman" w:hAnsi="Times New Roman" w:cs="Times New Roman"/>
-          <w:lang w:val="es-ES"/>
-        </w:rPr>
-        <w:t xml:space="preserve"> </w:t>
-      </w:r>
-      <w:proofErr w:type="spellStart"/>
-      <w:r>
-        <w:rPr>
-          <w:rFonts w:ascii="Times New Roman" w:hAnsi="Times New Roman" w:cs="Times New Roman"/>
-          <w:lang w:val="es-ES"/>
-        </w:rPr>
-        <w:t>Squares</w:t>
-      </w:r>
-      <w:proofErr w:type="spellEnd"/>
-      <w:r>
-        <w:rPr>
-          <w:rFonts w:ascii="Times New Roman" w:hAnsi="Times New Roman" w:cs="Times New Roman"/>
-          <w:lang w:val="es-ES"/>
-        </w:rPr>
-        <w:t xml:space="preserve"> (FGLS) para corregir problemas de heterocedasticidad asociados a diferencias en la calidad de los datos entre regímenes de reporte. Este procedimiento consiste en estimar primero un modelo base para obtener los residuos y luego utilizar la varianza de estos residuos para construir ponderaciones que se aplican en una segunda etapa de estimación.</w:t>
+        <w:t>Todas las regresiones utilizan un procedimiento de Feasible Generalized Least Squares (FGLS) para corregir problemas de heterocedasticidad asociados a diferencias en la calidad de los datos entre regímenes de reporte. Este procedimiento consiste en estimar primero un modelo base para obtener los residuos y luego utilizar la varianza de estos residuos para construir ponderaciones que se aplican en una segunda etapa de estimación.</w:t>
       </w:r>
     </w:p>
     <w:p>
@@ -3294,23 +2896,7 @@
           <w:rFonts w:ascii="Times New Roman" w:hAnsi="Times New Roman" w:cs="Times New Roman"/>
           <w:lang w:val="es-ES"/>
         </w:rPr>
-        <w:t>Los resultados de estas regresiones se almacenan como archivos de salida (.</w:t>
-      </w:r>
-      <w:proofErr w:type="spellStart"/>
-      <w:r>
-        <w:rPr>
-          <w:rFonts w:ascii="Times New Roman" w:hAnsi="Times New Roman" w:cs="Times New Roman"/>
-          <w:lang w:val="es-ES"/>
-        </w:rPr>
-        <w:t>ster</w:t>
-      </w:r>
-      <w:proofErr w:type="spellEnd"/>
-      <w:r>
-        <w:rPr>
-          <w:rFonts w:ascii="Times New Roman" w:hAnsi="Times New Roman" w:cs="Times New Roman"/>
-          <w:lang w:val="es-ES"/>
-        </w:rPr>
-        <w:t>) y se utilizan para generar las figuras del artículo que ilustran la relación estimada entre temperatura y consumo energético.</w:t>
+        <w:t>Los resultados de estas regresiones se almacenan como archivos de salida (.ster) y se utilizan para generar las figuras del artículo que ilustran la relación estimada entre temperatura y consumo energético.</w:t>
       </w:r>
     </w:p>
     <w:p>
@@ -3400,55 +2986,7 @@
           <w:rFonts w:ascii="Times New Roman" w:hAnsi="Times New Roman" w:cs="Times New Roman"/>
           <w:lang w:val="es-ES"/>
         </w:rPr>
-        <w:t xml:space="preserve">pues en el caso de uno de los integrantes del equipo, las variables que solicitaba el </w:t>
-      </w:r>
-      <w:proofErr w:type="spellStart"/>
-      <w:r>
-        <w:rPr>
-          <w:rFonts w:ascii="Times New Roman" w:hAnsi="Times New Roman" w:cs="Times New Roman"/>
-          <w:lang w:val="es-ES"/>
-        </w:rPr>
-        <w:t>paper</w:t>
-      </w:r>
-      <w:proofErr w:type="spellEnd"/>
-      <w:r>
-        <w:rPr>
-          <w:rFonts w:ascii="Times New Roman" w:hAnsi="Times New Roman" w:cs="Times New Roman"/>
-          <w:lang w:val="es-ES"/>
-        </w:rPr>
-        <w:t xml:space="preserve"> crear tenían nombres que ya eran utilizados por otro programa  (SQL). Entonces al correr, el programa encontraba un error fatal y decía que esa variable ya estaba siendo utilizada por </w:t>
-      </w:r>
-      <w:proofErr w:type="spellStart"/>
-      <w:r>
-        <w:rPr>
-          <w:rFonts w:ascii="Times New Roman" w:hAnsi="Times New Roman" w:cs="Times New Roman"/>
-          <w:lang w:val="es-ES"/>
-        </w:rPr>
-        <w:t>PostGres</w:t>
-      </w:r>
-      <w:proofErr w:type="spellEnd"/>
-      <w:r>
-        <w:rPr>
-          <w:rFonts w:ascii="Times New Roman" w:hAnsi="Times New Roman" w:cs="Times New Roman"/>
-          <w:lang w:val="es-ES"/>
-        </w:rPr>
-        <w:t xml:space="preserve">. La solución fue desinstalar </w:t>
-      </w:r>
-      <w:proofErr w:type="spellStart"/>
-      <w:r>
-        <w:rPr>
-          <w:rFonts w:ascii="Times New Roman" w:hAnsi="Times New Roman" w:cs="Times New Roman"/>
-          <w:lang w:val="es-ES"/>
-        </w:rPr>
-        <w:t>PostGres</w:t>
-      </w:r>
-      <w:proofErr w:type="spellEnd"/>
-      <w:r>
-        <w:rPr>
-          <w:rFonts w:ascii="Times New Roman" w:hAnsi="Times New Roman" w:cs="Times New Roman"/>
-          <w:lang w:val="es-ES"/>
-        </w:rPr>
-        <w:t xml:space="preserve"> dado que no era de uso frecuente, pero una mejor solución habría sido cambiar el nombre de esta variable de entorno en todos los scripts y generar un nuevo nombre al que llamar. </w:t>
+        <w:t xml:space="preserve">pues en el caso de uno de los integrantes del equipo, las variables que solicitaba el paper crear tenían nombres que ya eran utilizados por otro programa  (SQL). Entonces al correr, el programa encontraba un error fatal y decía que esa variable ya estaba siendo utilizada por PostGres. La solución fue desinstalar PostGres dado que no era de uso frecuente, pero una mejor solución habría sido cambiar el nombre de esta variable de entorno en todos los scripts y generar un nuevo nombre al que llamar. </w:t>
       </w:r>
     </w:p>
     <w:p>
@@ -4185,23 +3723,7 @@
           <w:rFonts w:ascii="Times New Roman" w:hAnsi="Times New Roman" w:cs="Times New Roman"/>
           <w:lang w:val="es-ES"/>
         </w:rPr>
-        <w:t xml:space="preserve">Realizar </w:t>
-      </w:r>
-      <w:proofErr w:type="spellStart"/>
-      <w:r>
-        <w:rPr>
-          <w:rFonts w:ascii="Times New Roman" w:hAnsi="Times New Roman" w:cs="Times New Roman"/>
-          <w:lang w:val="es-ES"/>
-        </w:rPr>
-        <w:t>commits</w:t>
-      </w:r>
-      <w:proofErr w:type="spellEnd"/>
-      <w:r>
-        <w:rPr>
-          <w:rFonts w:ascii="Times New Roman" w:hAnsi="Times New Roman" w:cs="Times New Roman"/>
-          <w:lang w:val="es-ES"/>
-        </w:rPr>
-        <w:t xml:space="preserve"> frecuentes en el repositorio.</w:t>
+        <w:t>Realizar commits frecuentes en el repositorio.</w:t>
       </w:r>
     </w:p>
     <w:p>
@@ -4279,21 +3801,12 @@
           <w:lang w:val="es-ES"/>
         </w:rPr>
       </w:pPr>
-      <w:proofErr w:type="spellStart"/>
-      <w:r>
-        <w:rPr>
-          <w:rFonts w:ascii="Times New Roman" w:hAnsi="Times New Roman" w:cs="Times New Roman"/>
-          <w:lang w:val="es-ES"/>
-        </w:rPr>
-        <w:t>Commits</w:t>
-      </w:r>
-      <w:proofErr w:type="spellEnd"/>
-      <w:r>
-        <w:rPr>
-          <w:rFonts w:ascii="Times New Roman" w:hAnsi="Times New Roman" w:cs="Times New Roman"/>
-          <w:lang w:val="es-ES"/>
-        </w:rPr>
-        <w:t xml:space="preserve"> regulares con mensajes descriptivos coherentes con el proceso de investigación.</w:t>
+      <w:r>
+        <w:rPr>
+          <w:rFonts w:ascii="Times New Roman" w:hAnsi="Times New Roman" w:cs="Times New Roman"/>
+          <w:lang w:val="es-ES"/>
+        </w:rPr>
+        <w:t>Commits regulares con mensajes descriptivos coherentes con el proceso de investigación.</w:t>
       </w:r>
     </w:p>
     <w:p>
@@ -4568,6 +4081,102 @@
     </w:sectPr>
   </w:body>
 </w:document>
+</file>
+
+<file path=word/endnotes.xml><?xml version="1.0" encoding="utf-8"?>
+<w:endnotes xmlns:wpc="http://schemas.microsoft.com/office/word/2010/wordprocessingCanvas" xmlns:cx="http://schemas.microsoft.com/office/drawing/2014/chartex" xmlns:cx1="http://schemas.microsoft.com/office/drawing/2015/9/8/chartex" xmlns:cx2="http://schemas.microsoft.com/office/drawing/2015/10/21/chartex" xmlns:cx3="http://schemas.microsoft.com/office/drawing/2016/5/9/chartex" xmlns:cx4="http://schemas.microsoft.com/office/drawing/2016/5/10/chartex" xmlns:cx5="http://schemas.microsoft.com/office/drawing/2016/5/11/chartex" xmlns:cx6="http://schemas.microsoft.com/office/drawing/2016/5/12/chartex" xmlns:cx7="http://schemas.microsoft.com/office/drawing/2016/5/13/chartex" xmlns:cx8="http://schemas.microsoft.com/office/drawing/2016/5/14/chartex" xmlns:mc="http://schemas.openxmlformats.org/markup-compatibility/2006" xmlns:aink="http://schemas.microsoft.com/office/drawing/2016/ink" xmlns:am3d="http://schemas.microsoft.com/office/drawing/2017/model3d" xmlns:o="urn:schemas-microsoft-com:office:office" xmlns:oel="http://schemas.microsoft.com/office/2019/extlst" xmlns:r="http://schemas.openxmlformats.org/officeDocument/2006/relationships" xmlns:m="http://schemas.openxmlformats.org/officeDocument/2006/math" xmlns:v="urn:schemas-microsoft-com:vml" xmlns:wp14="http://schemas.microsoft.com/office/word/2010/wordprocessingDrawing" xmlns:wp="http://schemas.openxmlformats.org/drawingml/2006/wordprocessingDrawing" xmlns:w10="urn:schemas-microsoft-com:office:word" xmlns:w="http://schemas.openxmlformats.org/wordprocessingml/2006/main" xmlns:w14="http://schemas.microsoft.com/office/word/2010/wordml" xmlns:w15="http://schemas.microsoft.com/office/word/2012/wordml" xmlns:w16cex="http://schemas.microsoft.com/office/word/2018/wordml/cex" xmlns:w16cid="http://schemas.microsoft.com/office/word/2016/wordml/cid" xmlns:w16="http://schemas.microsoft.com/office/word/2018/wordml" xmlns:w16du="http://schemas.microsoft.com/office/word/2023/wordml/word16du" xmlns:w16sdtdh="http://schemas.microsoft.com/office/word/2020/wordml/sdtdatahash" xmlns:w16sdtfl="http://schemas.microsoft.com/office/word/2024/wordml/sdtformatlock" xmlns:w16se="http://schemas.microsoft.com/office/word/2015/wordml/symex" xmlns:wpg="http://schemas.microsoft.com/office/word/2010/wordprocessingGroup" xmlns:wpi="http://schemas.microsoft.com/office/word/2010/wordprocessingInk" xmlns:wne="http://schemas.microsoft.com/office/word/2006/wordml" xmlns:wps="http://schemas.microsoft.com/office/word/2010/wordprocessingShape" mc:Ignorable="w14 w15 w16se w16cid w16 w16cex w16sdtdh w16sdtfl w16du wp14">
+  <w:endnote w:type="separator" w:id="-1">
+    <w:p>
+      <w:pPr>
+        <w:spacing w:after="0" w:line="240" w:lineRule="auto"/>
+      </w:pPr>
+      <w:r>
+        <w:separator/>
+      </w:r>
+    </w:p>
+  </w:endnote>
+  <w:endnote w:type="continuationSeparator" w:id="0">
+    <w:p>
+      <w:pPr>
+        <w:spacing w:after="0" w:line="240" w:lineRule="auto"/>
+      </w:pPr>
+      <w:r>
+        <w:continuationSeparator/>
+      </w:r>
+    </w:p>
+  </w:endnote>
+</w:endnotes>
+</file>
+
+<file path=word/footnotes.xml><?xml version="1.0" encoding="utf-8"?>
+<w:footnotes xmlns:wpc="http://schemas.microsoft.com/office/word/2010/wordprocessingCanvas" xmlns:cx="http://schemas.microsoft.com/office/drawing/2014/chartex" xmlns:cx1="http://schemas.microsoft.com/office/drawing/2015/9/8/chartex" xmlns:cx2="http://schemas.microsoft.com/office/drawing/2015/10/21/chartex" xmlns:cx3="http://schemas.microsoft.com/office/drawing/2016/5/9/chartex" xmlns:cx4="http://schemas.microsoft.com/office/drawing/2016/5/10/chartex" xmlns:cx5="http://schemas.microsoft.com/office/drawing/2016/5/11/chartex" xmlns:cx6="http://schemas.microsoft.com/office/drawing/2016/5/12/chartex" xmlns:cx7="http://schemas.microsoft.com/office/drawing/2016/5/13/chartex" xmlns:cx8="http://schemas.microsoft.com/office/drawing/2016/5/14/chartex" xmlns:mc="http://schemas.openxmlformats.org/markup-compatibility/2006" xmlns:aink="http://schemas.microsoft.com/office/drawing/2016/ink" xmlns:am3d="http://schemas.microsoft.com/office/drawing/2017/model3d" xmlns:o="urn:schemas-microsoft-com:office:office" xmlns:oel="http://schemas.microsoft.com/office/2019/extlst" xmlns:r="http://schemas.openxmlformats.org/officeDocument/2006/relationships" xmlns:m="http://schemas.openxmlformats.org/officeDocument/2006/math" xmlns:v="urn:schemas-microsoft-com:vml" xmlns:wp14="http://schemas.microsoft.com/office/word/2010/wordprocessingDrawing" xmlns:wp="http://schemas.openxmlformats.org/drawingml/2006/wordprocessingDrawing" xmlns:w10="urn:schemas-microsoft-com:office:word" xmlns:w="http://schemas.openxmlformats.org/wordprocessingml/2006/main" xmlns:w14="http://schemas.microsoft.com/office/word/2010/wordml" xmlns:w15="http://schemas.microsoft.com/office/word/2012/wordml" xmlns:w16cex="http://schemas.microsoft.com/office/word/2018/wordml/cex" xmlns:w16cid="http://schemas.microsoft.com/office/word/2016/wordml/cid" xmlns:w16="http://schemas.microsoft.com/office/word/2018/wordml" xmlns:w16du="http://schemas.microsoft.com/office/word/2023/wordml/word16du" xmlns:w16sdtdh="http://schemas.microsoft.com/office/word/2020/wordml/sdtdatahash" xmlns:w16sdtfl="http://schemas.microsoft.com/office/word/2024/wordml/sdtformatlock" xmlns:w16se="http://schemas.microsoft.com/office/word/2015/wordml/symex" xmlns:wpg="http://schemas.microsoft.com/office/word/2010/wordprocessingGroup" xmlns:wpi="http://schemas.microsoft.com/office/word/2010/wordprocessingInk" xmlns:wne="http://schemas.microsoft.com/office/word/2006/wordml" xmlns:wps="http://schemas.microsoft.com/office/word/2010/wordprocessingShape" mc:Ignorable="w14 w15 w16se w16cid w16 w16cex w16sdtdh w16sdtfl w16du wp14">
+  <w:footnote w:type="separator" w:id="-1">
+    <w:p>
+      <w:pPr>
+        <w:spacing w:after="0" w:line="240" w:lineRule="auto"/>
+      </w:pPr>
+      <w:r>
+        <w:separator/>
+      </w:r>
+    </w:p>
+  </w:footnote>
+  <w:footnote w:type="continuationSeparator" w:id="0">
+    <w:p>
+      <w:pPr>
+        <w:spacing w:after="0" w:line="240" w:lineRule="auto"/>
+      </w:pPr>
+      <w:r>
+        <w:continuationSeparator/>
+      </w:r>
+    </w:p>
+  </w:footnote>
+  <w:footnote w:id="1">
+    <w:p>
+      <w:pPr>
+        <w:pStyle w:val="FootnoteText"/>
+        <w:rPr>
+          <w:lang w:val="es-ES"/>
+        </w:rPr>
+      </w:pPr>
+      <w:r>
+        <w:rPr>
+          <w:rStyle w:val="FootnoteReference"/>
+        </w:rPr>
+        <w:footnoteRef/>
+      </w:r>
+      <w:r>
+        <w:rPr>
+          <w:lang w:val="es-ES"/>
+        </w:rPr>
+        <w:t xml:space="preserve"> </w:t>
+      </w:r>
+      <w:r>
+        <w:rPr>
+          <w:rFonts w:ascii="Times New Roman" w:hAnsi="Times New Roman" w:cs="Times New Roman"/>
+          <w:lang w:val="es-ES"/>
+        </w:rPr>
+        <w:t>Repositorio d</w:t>
+      </w:r>
+      <w:r>
+        <w:rPr>
+          <w:rFonts w:ascii="Times New Roman" w:hAnsi="Times New Roman" w:cs="Times New Roman"/>
+          <w:lang w:val="es-ES"/>
+        </w:rPr>
+        <w:t xml:space="preserve">isponible en el siguiente </w:t>
+      </w:r>
+      <w:hyperlink r:id="rId1" w:history="1">
+        <w:r>
+          <w:rPr>
+            <w:rStyle w:val="Hyperlink"/>
+            <w:rFonts w:ascii="Times New Roman" w:hAnsi="Times New Roman" w:cs="Times New Roman"/>
+            <w:lang w:val="es-ES"/>
+          </w:rPr>
+          <w:t>link</w:t>
+        </w:r>
+      </w:hyperlink>
+    </w:p>
+  </w:footnote>
+</w:footnotes>
 </file>
 
 <file path=word/numbering.xml><?xml version="1.0" encoding="utf-8"?>
@@ -5872,6 +5481,45 @@
       <w:outlineLvl w:val="9"/>
     </w:pPr>
   </w:style>
+  <w:style w:type="paragraph" w:styleId="FootnoteText">
+    <w:name w:val="footnote text"/>
+    <w:basedOn w:val="Normal"/>
+    <w:link w:val="FootnoteTextChar"/>
+    <w:uiPriority w:val="99"/>
+    <w:semiHidden/>
+    <w:unhideWhenUsed/>
+    <w:rsid w:val="00BD5685"/>
+    <w:pPr>
+      <w:spacing w:after="0" w:line="240" w:lineRule="auto"/>
+    </w:pPr>
+    <w:rPr>
+      <w:sz w:val="20"/>
+      <w:szCs w:val="20"/>
+    </w:rPr>
+  </w:style>
+  <w:style w:type="character" w:customStyle="1" w:styleId="FootnoteTextChar">
+    <w:name w:val="Footnote Text Char"/>
+    <w:basedOn w:val="DefaultParagraphFont"/>
+    <w:link w:val="FootnoteText"/>
+    <w:uiPriority w:val="99"/>
+    <w:semiHidden/>
+    <w:rsid w:val="00BD5685"/>
+    <w:rPr>
+      <w:sz w:val="20"/>
+      <w:szCs w:val="20"/>
+    </w:rPr>
+  </w:style>
+  <w:style w:type="character" w:styleId="FootnoteReference">
+    <w:name w:val="footnote reference"/>
+    <w:basedOn w:val="DefaultParagraphFont"/>
+    <w:uiPriority w:val="99"/>
+    <w:semiHidden/>
+    <w:unhideWhenUsed/>
+    <w:rsid w:val="00BD5685"/>
+    <w:rPr>
+      <w:vertAlign w:val="superscript"/>
+    </w:rPr>
+  </w:style>
 </w:styles>
 </file>
 

</xml_diff>

<commit_message>
Correción sección 1 introducción y contexto - recursos
</commit_message>
<xml_diff>
--- a/documents/proyecto_transversal_grupo1.docx
+++ b/documents/proyecto_transversal_grupo1.docx
@@ -4,6 +4,7 @@
   <w:body>
     <w:p>
       <w:pPr>
+        <w:jc w:val="right"/>
         <w:rPr>
           <w:rFonts w:ascii="Times New Roman" w:hAnsi="Times New Roman" w:cs="Times New Roman"/>
           <w:lang w:val="es-ES"/>
@@ -169,6 +170,7 @@
         </w:rPr>
         <w:t>lo “</w:t>
       </w:r>
+      <w:proofErr w:type="spellStart"/>
       <w:r>
         <w:rPr>
           <w:rFonts w:ascii="Times New Roman" w:hAnsi="Times New Roman" w:cs="Times New Roman"/>
@@ -181,7 +183,15 @@
           <w:rFonts w:ascii="Times New Roman" w:hAnsi="Times New Roman" w:cs="Times New Roman"/>
           <w:lang w:val="es-ES"/>
         </w:rPr>
-        <w:t xml:space="preserve">imating </w:t>
+        <w:t>imating</w:t>
+      </w:r>
+      <w:proofErr w:type="spellEnd"/>
+      <w:r>
+        <w:rPr>
+          <w:rFonts w:ascii="Times New Roman" w:hAnsi="Times New Roman" w:cs="Times New Roman"/>
+          <w:lang w:val="es-ES"/>
+        </w:rPr>
+        <w:t xml:space="preserve"> </w:t>
       </w:r>
       <w:r>
         <w:rPr>
@@ -204,19 +214,44 @@
         </w:rPr>
         <w:t xml:space="preserve">l Cost </w:t>
       </w:r>
-      <w:r>
-        <w:rPr>
-          <w:rFonts w:ascii="Times New Roman" w:hAnsi="Times New Roman" w:cs="Times New Roman"/>
-          <w:lang w:val="es-ES"/>
-        </w:rPr>
-        <w:t>of Car</w:t>
-      </w:r>
-      <w:r>
-        <w:rPr>
-          <w:rFonts w:ascii="Times New Roman" w:hAnsi="Times New Roman" w:cs="Times New Roman"/>
-          <w:lang w:val="es-ES"/>
-        </w:rPr>
-        <w:t xml:space="preserve">bon for </w:t>
+      <w:proofErr w:type="spellStart"/>
+      <w:r>
+        <w:rPr>
+          <w:rFonts w:ascii="Times New Roman" w:hAnsi="Times New Roman" w:cs="Times New Roman"/>
+          <w:lang w:val="es-ES"/>
+        </w:rPr>
+        <w:t>of</w:t>
+      </w:r>
+      <w:proofErr w:type="spellEnd"/>
+      <w:r>
+        <w:rPr>
+          <w:rFonts w:ascii="Times New Roman" w:hAnsi="Times New Roman" w:cs="Times New Roman"/>
+          <w:lang w:val="es-ES"/>
+        </w:rPr>
+        <w:t xml:space="preserve"> Car</w:t>
+      </w:r>
+      <w:r>
+        <w:rPr>
+          <w:rFonts w:ascii="Times New Roman" w:hAnsi="Times New Roman" w:cs="Times New Roman"/>
+          <w:lang w:val="es-ES"/>
+        </w:rPr>
+        <w:t xml:space="preserve">bon </w:t>
+      </w:r>
+      <w:proofErr w:type="spellStart"/>
+      <w:r>
+        <w:rPr>
+          <w:rFonts w:ascii="Times New Roman" w:hAnsi="Times New Roman" w:cs="Times New Roman"/>
+          <w:lang w:val="es-ES"/>
+        </w:rPr>
+        <w:t>for</w:t>
+      </w:r>
+      <w:proofErr w:type="spellEnd"/>
+      <w:r>
+        <w:rPr>
+          <w:rFonts w:ascii="Times New Roman" w:hAnsi="Times New Roman" w:cs="Times New Roman"/>
+          <w:lang w:val="es-ES"/>
+        </w:rPr>
+        <w:t xml:space="preserve"> </w:t>
       </w:r>
       <w:r>
         <w:rPr>
@@ -230,7 +265,15 @@
           <w:rFonts w:ascii="Times New Roman" w:hAnsi="Times New Roman" w:cs="Times New Roman"/>
           <w:lang w:val="es-ES"/>
         </w:rPr>
-        <w:t>Energy C</w:t>
+        <w:t xml:space="preserve">Energy </w:t>
+      </w:r>
+      <w:proofErr w:type="spellStart"/>
+      <w:r>
+        <w:rPr>
+          <w:rFonts w:ascii="Times New Roman" w:hAnsi="Times New Roman" w:cs="Times New Roman"/>
+          <w:lang w:val="es-ES"/>
+        </w:rPr>
+        <w:t>C</w:t>
       </w:r>
       <w:r>
         <w:rPr>
@@ -246,6 +289,7 @@
         </w:rPr>
         <w:t>mption</w:t>
       </w:r>
+      <w:proofErr w:type="spellEnd"/>
       <w:r>
         <w:rPr>
           <w:rFonts w:ascii="Times New Roman" w:hAnsi="Times New Roman" w:cs="Times New Roman"/>
@@ -654,6 +698,7 @@
         </w:rPr>
         <w:t>ta-</w:t>
       </w:r>
+      <w:proofErr w:type="spellStart"/>
       <w:r>
         <w:rPr>
           <w:rFonts w:ascii="Times New Roman" w:hAnsi="Times New Roman" w:cs="Times New Roman"/>
@@ -661,12 +706,21 @@
         </w:rPr>
         <w:t>Driven</w:t>
       </w:r>
-      <w:r>
-        <w:rPr>
-          <w:rFonts w:ascii="Times New Roman" w:hAnsi="Times New Roman" w:cs="Times New Roman"/>
-          <w:lang w:val="es-ES"/>
-        </w:rPr>
-        <w:t xml:space="preserve"> Sp</w:t>
+      <w:proofErr w:type="spellEnd"/>
+      <w:r>
+        <w:rPr>
+          <w:rFonts w:ascii="Times New Roman" w:hAnsi="Times New Roman" w:cs="Times New Roman"/>
+          <w:lang w:val="es-ES"/>
+        </w:rPr>
+        <w:t xml:space="preserve"> </w:t>
+      </w:r>
+      <w:proofErr w:type="spellStart"/>
+      <w:r>
+        <w:rPr>
+          <w:rFonts w:ascii="Times New Roman" w:hAnsi="Times New Roman" w:cs="Times New Roman"/>
+          <w:lang w:val="es-ES"/>
+        </w:rPr>
+        <w:t>Sp</w:t>
       </w:r>
       <w:r>
         <w:rPr>
@@ -680,14 +734,54 @@
           <w:rFonts w:ascii="Times New Roman" w:hAnsi="Times New Roman" w:cs="Times New Roman"/>
           <w:lang w:val="es-ES"/>
         </w:rPr>
-        <w:t>ial Climate I</w:t>
-      </w:r>
-      <w:r>
-        <w:rPr>
-          <w:rFonts w:ascii="Times New Roman" w:hAnsi="Times New Roman" w:cs="Times New Roman"/>
-          <w:lang w:val="es-ES"/>
-        </w:rPr>
-        <w:t>mpact M</w:t>
+        <w:t>ial</w:t>
+      </w:r>
+      <w:proofErr w:type="spellEnd"/>
+      <w:r>
+        <w:rPr>
+          <w:rFonts w:ascii="Times New Roman" w:hAnsi="Times New Roman" w:cs="Times New Roman"/>
+          <w:lang w:val="es-ES"/>
+        </w:rPr>
+        <w:t xml:space="preserve"> </w:t>
+      </w:r>
+      <w:proofErr w:type="spellStart"/>
+      <w:r>
+        <w:rPr>
+          <w:rFonts w:ascii="Times New Roman" w:hAnsi="Times New Roman" w:cs="Times New Roman"/>
+          <w:lang w:val="es-ES"/>
+        </w:rPr>
+        <w:t>Climate</w:t>
+      </w:r>
+      <w:proofErr w:type="spellEnd"/>
+      <w:r>
+        <w:rPr>
+          <w:rFonts w:ascii="Times New Roman" w:hAnsi="Times New Roman" w:cs="Times New Roman"/>
+          <w:lang w:val="es-ES"/>
+        </w:rPr>
+        <w:t xml:space="preserve"> </w:t>
+      </w:r>
+      <w:proofErr w:type="spellStart"/>
+      <w:r>
+        <w:rPr>
+          <w:rFonts w:ascii="Times New Roman" w:hAnsi="Times New Roman" w:cs="Times New Roman"/>
+          <w:lang w:val="es-ES"/>
+        </w:rPr>
+        <w:t>I</w:t>
+      </w:r>
+      <w:r>
+        <w:rPr>
+          <w:rFonts w:ascii="Times New Roman" w:hAnsi="Times New Roman" w:cs="Times New Roman"/>
+          <w:lang w:val="es-ES"/>
+        </w:rPr>
+        <w:t>mpact</w:t>
+      </w:r>
+      <w:proofErr w:type="spellEnd"/>
+      <w:r>
+        <w:rPr>
+          <w:rFonts w:ascii="Times New Roman" w:hAnsi="Times New Roman" w:cs="Times New Roman"/>
+          <w:lang w:val="es-ES"/>
+        </w:rPr>
+        <w:t xml:space="preserve"> M</w:t>
       </w:r>
       <w:r>
         <w:rPr>
@@ -731,6 +825,7 @@
         </w:rPr>
         <w:t xml:space="preserve">dicional </w:t>
       </w:r>
+      <w:proofErr w:type="spellStart"/>
       <w:r>
         <w:rPr>
           <w:rFonts w:ascii="Times New Roman" w:hAnsi="Times New Roman" w:cs="Times New Roman"/>
@@ -743,28 +838,68 @@
           <w:rFonts w:ascii="Times New Roman" w:hAnsi="Times New Roman" w:cs="Times New Roman"/>
           <w:lang w:val="es-ES"/>
         </w:rPr>
-        <w:t>det A</w:t>
-      </w:r>
-      <w:r>
-        <w:rPr>
-          <w:rFonts w:ascii="Times New Roman" w:hAnsi="Times New Roman" w:cs="Times New Roman"/>
-          <w:lang w:val="es-ES"/>
-        </w:rPr>
-        <w:t>ssesment Mo</w:t>
-      </w:r>
-      <w:r>
-        <w:rPr>
-          <w:rFonts w:ascii="Times New Roman" w:hAnsi="Times New Roman" w:cs="Times New Roman"/>
-          <w:lang w:val="es-ES"/>
-        </w:rPr>
-        <w:t>del (AI</w:t>
-      </w:r>
-      <w:r>
-        <w:rPr>
-          <w:rFonts w:ascii="Times New Roman" w:hAnsi="Times New Roman" w:cs="Times New Roman"/>
-          <w:lang w:val="es-ES"/>
-        </w:rPr>
-        <w:t>Ms) u</w:t>
+        <w:t>det</w:t>
+      </w:r>
+      <w:proofErr w:type="spellEnd"/>
+      <w:r>
+        <w:rPr>
+          <w:rFonts w:ascii="Times New Roman" w:hAnsi="Times New Roman" w:cs="Times New Roman"/>
+          <w:lang w:val="es-ES"/>
+        </w:rPr>
+        <w:t xml:space="preserve"> </w:t>
+      </w:r>
+      <w:proofErr w:type="spellStart"/>
+      <w:r>
+        <w:rPr>
+          <w:rFonts w:ascii="Times New Roman" w:hAnsi="Times New Roman" w:cs="Times New Roman"/>
+          <w:lang w:val="es-ES"/>
+        </w:rPr>
+        <w:t>A</w:t>
+      </w:r>
+      <w:r>
+        <w:rPr>
+          <w:rFonts w:ascii="Times New Roman" w:hAnsi="Times New Roman" w:cs="Times New Roman"/>
+          <w:lang w:val="es-ES"/>
+        </w:rPr>
+        <w:t>ssesment</w:t>
+      </w:r>
+      <w:proofErr w:type="spellEnd"/>
+      <w:r>
+        <w:rPr>
+          <w:rFonts w:ascii="Times New Roman" w:hAnsi="Times New Roman" w:cs="Times New Roman"/>
+          <w:lang w:val="es-ES"/>
+        </w:rPr>
+        <w:t xml:space="preserve"> Mo</w:t>
+      </w:r>
+      <w:r>
+        <w:rPr>
+          <w:rFonts w:ascii="Times New Roman" w:hAnsi="Times New Roman" w:cs="Times New Roman"/>
+          <w:lang w:val="es-ES"/>
+        </w:rPr>
+        <w:t>del (</w:t>
+      </w:r>
+      <w:proofErr w:type="spellStart"/>
+      <w:r>
+        <w:rPr>
+          <w:rFonts w:ascii="Times New Roman" w:hAnsi="Times New Roman" w:cs="Times New Roman"/>
+          <w:lang w:val="es-ES"/>
+        </w:rPr>
+        <w:t>AI</w:t>
+      </w:r>
+      <w:r>
+        <w:rPr>
+          <w:rFonts w:ascii="Times New Roman" w:hAnsi="Times New Roman" w:cs="Times New Roman"/>
+          <w:lang w:val="es-ES"/>
+        </w:rPr>
+        <w:t>Ms</w:t>
+      </w:r>
+      <w:proofErr w:type="spellEnd"/>
+      <w:r>
+        <w:rPr>
+          <w:rFonts w:ascii="Times New Roman" w:hAnsi="Times New Roman" w:cs="Times New Roman"/>
+          <w:lang w:val="es-ES"/>
+        </w:rPr>
+        <w:t>) u</w:t>
       </w:r>
       <w:r>
         <w:rPr>
@@ -1398,6 +1533,7 @@
         </w:rPr>
         <w:t xml:space="preserve">, que corresponden a la construcción del </w:t>
       </w:r>
+      <w:proofErr w:type="spellStart"/>
       <w:r>
         <w:rPr>
           <w:rFonts w:ascii="Times New Roman" w:hAnsi="Times New Roman" w:cs="Times New Roman"/>
@@ -1410,7 +1546,15 @@
           <w:rFonts w:ascii="Times New Roman" w:hAnsi="Times New Roman" w:cs="Times New Roman"/>
           <w:lang w:val="es-ES"/>
         </w:rPr>
-        <w:t>ataset y la estimación econométrica de la relación entre temperatura y consumo energético.</w:t>
+        <w:t>ataset</w:t>
+      </w:r>
+      <w:proofErr w:type="spellEnd"/>
+      <w:r>
+        <w:rPr>
+          <w:rFonts w:ascii="Times New Roman" w:hAnsi="Times New Roman" w:cs="Times New Roman"/>
+          <w:lang w:val="es-ES"/>
+        </w:rPr>
+        <w:t xml:space="preserve"> y la estimación econométrica de la relación entre temperatura y consumo energético.</w:t>
       </w:r>
     </w:p>
     <w:p>
@@ -1442,6 +1586,7 @@
         </w:rPr>
         <w:t xml:space="preserve"> Step 1, el propósito es reconstruir el </w:t>
       </w:r>
+      <w:proofErr w:type="spellStart"/>
       <w:r>
         <w:rPr>
           <w:rFonts w:ascii="Times New Roman" w:hAnsi="Times New Roman" w:cs="Times New Roman"/>
@@ -1454,8 +1599,25 @@
           <w:rFonts w:ascii="Times New Roman" w:hAnsi="Times New Roman" w:cs="Times New Roman"/>
           <w:lang w:val="es-ES"/>
         </w:rPr>
-        <w:t>ataset utilizado en el estudio combinando múltiples fuentes de información global. Este paso incluye la limpieza y armonización de datos de consumo energético provenientes de la International Energy Agency (IEA), datos climáticos históricos del Global Meteorological Forcing Dataset (GMFD) y variables socioeconómicas como ingreso per cápita y población.</w:t>
-      </w:r>
+        <w:t>ataset</w:t>
+      </w:r>
+      <w:proofErr w:type="spellEnd"/>
+      <w:r>
+        <w:rPr>
+          <w:rFonts w:ascii="Times New Roman" w:hAnsi="Times New Roman" w:cs="Times New Roman"/>
+          <w:lang w:val="es-ES"/>
+        </w:rPr>
+        <w:t xml:space="preserve"> utilizado en el estudio combinando múltiples fuentes de información global. Este paso incluye la limpieza y armonización de datos de consumo energético provenientes de la International Energy Agency (IEA), datos climáticos históricos del Global </w:t>
+      </w:r>
+      <w:proofErr w:type="spellStart"/>
+      <w:r>
+        <w:rPr>
+          <w:rFonts w:ascii="Times New Roman" w:hAnsi="Times New Roman" w:cs="Times New Roman"/>
+          <w:lang w:val="es-ES"/>
+        </w:rPr>
+        <w:t>Meteorological</w:t>
+      </w:r>
+      <w:proofErr w:type="spellEnd"/>
       <w:r>
         <w:rPr>
           <w:rFonts w:ascii="Times New Roman" w:hAnsi="Times New Roman" w:cs="Times New Roman"/>
@@ -1463,6 +1625,45 @@
         </w:rPr>
         <w:t xml:space="preserve"> </w:t>
       </w:r>
+      <w:proofErr w:type="spellStart"/>
+      <w:r>
+        <w:rPr>
+          <w:rFonts w:ascii="Times New Roman" w:hAnsi="Times New Roman" w:cs="Times New Roman"/>
+          <w:lang w:val="es-ES"/>
+        </w:rPr>
+        <w:t>Forcing</w:t>
+      </w:r>
+      <w:proofErr w:type="spellEnd"/>
+      <w:r>
+        <w:rPr>
+          <w:rFonts w:ascii="Times New Roman" w:hAnsi="Times New Roman" w:cs="Times New Roman"/>
+          <w:lang w:val="es-ES"/>
+        </w:rPr>
+        <w:t xml:space="preserve"> </w:t>
+      </w:r>
+      <w:proofErr w:type="spellStart"/>
+      <w:r>
+        <w:rPr>
+          <w:rFonts w:ascii="Times New Roman" w:hAnsi="Times New Roman" w:cs="Times New Roman"/>
+          <w:lang w:val="es-ES"/>
+        </w:rPr>
+        <w:t>Dataset</w:t>
+      </w:r>
+      <w:proofErr w:type="spellEnd"/>
+      <w:r>
+        <w:rPr>
+          <w:rFonts w:ascii="Times New Roman" w:hAnsi="Times New Roman" w:cs="Times New Roman"/>
+          <w:lang w:val="es-ES"/>
+        </w:rPr>
+        <w:t xml:space="preserve"> (GMFD) y variables socioeconómicas como ingreso per cápita y población.</w:t>
+      </w:r>
+      <w:r>
+        <w:rPr>
+          <w:rFonts w:ascii="Times New Roman" w:hAnsi="Times New Roman" w:cs="Times New Roman"/>
+          <w:lang w:val="es-ES"/>
+        </w:rPr>
+        <w:t xml:space="preserve"> </w:t>
+      </w:r>
       <w:r>
         <w:rPr>
           <w:rFonts w:ascii="Times New Roman" w:hAnsi="Times New Roman" w:cs="Times New Roman"/>
@@ -1556,7 +1757,23 @@
           <w:rFonts w:ascii="Times New Roman" w:hAnsi="Times New Roman" w:cs="Times New Roman"/>
           <w:lang w:val="es-ES"/>
         </w:rPr>
-        <w:t>generación y análisis de datos del paper original</w:t>
+        <w:t xml:space="preserve">generación y análisis de datos del </w:t>
+      </w:r>
+      <w:proofErr w:type="spellStart"/>
+      <w:r>
+        <w:rPr>
+          <w:rFonts w:ascii="Times New Roman" w:hAnsi="Times New Roman" w:cs="Times New Roman"/>
+          <w:lang w:val="es-ES"/>
+        </w:rPr>
+        <w:t>paper</w:t>
+      </w:r>
+      <w:proofErr w:type="spellEnd"/>
+      <w:r>
+        <w:rPr>
+          <w:rFonts w:ascii="Times New Roman" w:hAnsi="Times New Roman" w:cs="Times New Roman"/>
+          <w:lang w:val="es-ES"/>
+        </w:rPr>
+        <w:t xml:space="preserve"> original</w:t>
       </w:r>
       <w:r>
         <w:rPr>
@@ -1584,7 +1801,23 @@
           <w:rFonts w:ascii="Times New Roman" w:hAnsi="Times New Roman" w:cs="Times New Roman"/>
           <w:lang w:val="es-ES"/>
         </w:rPr>
-        <w:t xml:space="preserve">Por otra parte, las regresiones son el core del ejercicio, por lo que eran la forma de comprobar que el ejercicio de replicación generaba los resultados antes encontrados. </w:t>
+        <w:t xml:space="preserve">Por otra parte, las regresiones son el </w:t>
+      </w:r>
+      <w:proofErr w:type="spellStart"/>
+      <w:r>
+        <w:rPr>
+          <w:rFonts w:ascii="Times New Roman" w:hAnsi="Times New Roman" w:cs="Times New Roman"/>
+          <w:lang w:val="es-ES"/>
+        </w:rPr>
+        <w:t>core</w:t>
+      </w:r>
+      <w:proofErr w:type="spellEnd"/>
+      <w:r>
+        <w:rPr>
+          <w:rFonts w:ascii="Times New Roman" w:hAnsi="Times New Roman" w:cs="Times New Roman"/>
+          <w:lang w:val="es-ES"/>
+        </w:rPr>
+        <w:t xml:space="preserve"> del ejercicio, por lo que eran la forma de comprobar que el ejercicio de replicación generaba los resultados antes encontrados. </w:t>
       </w:r>
     </w:p>
     <w:p>
@@ -1623,7 +1856,7 @@
     </w:p>
     <w:p>
       <w:pPr>
-        <w:jc w:val="both"/>
+        <w:jc w:val="center"/>
         <w:rPr>
           <w:rFonts w:ascii="Times New Roman" w:hAnsi="Times New Roman" w:cs="Times New Roman"/>
           <w:lang w:val="es-ES"/>
@@ -1637,9 +1870,9 @@
         </w:rPr>
         <w:lastRenderedPageBreak/>
         <w:drawing>
-          <wp:inline distT="0" distB="0" distL="0" distR="0" wp14:anchorId="377B2445" wp14:editId="2970EC18">
-            <wp:extent cx="5943600" cy="3375660"/>
-            <wp:effectExtent l="0" t="0" r="0" b="0"/>
+          <wp:inline distT="0" distB="0" distL="0" distR="0" wp14:anchorId="377B2445" wp14:editId="345F2A7F">
+            <wp:extent cx="3976828" cy="2255495"/>
+            <wp:effectExtent l="0" t="0" r="5080" b="0"/>
             <wp:docPr id="1290659473" name="Imagen 1"/>
             <wp:cNvGraphicFramePr>
               <a:graphicFrameLocks xmlns:a="http://schemas.openxmlformats.org/drawingml/2006/main" noChangeAspect="1"/>
@@ -1651,20 +1884,29 @@
                     <pic:cNvPr id="1290659473" name=""/>
                     <pic:cNvPicPr/>
                   </pic:nvPicPr>
-                  <pic:blipFill>
+                  <pic:blipFill rotWithShape="1">
                     <a:blip r:embed="rId8"/>
+                    <a:srcRect l="15663" t="17313" r="17402" b="15846"/>
                     <a:stretch>
                       <a:fillRect/>
                     </a:stretch>
                   </pic:blipFill>
-                  <pic:spPr>
+                  <pic:spPr bwMode="auto">
                     <a:xfrm>
                       <a:off x="0" y="0"/>
-                      <a:ext cx="5943600" cy="3375660"/>
+                      <a:ext cx="3978296" cy="2256328"/>
                     </a:xfrm>
                     <a:prstGeom prst="rect">
                       <a:avLst/>
                     </a:prstGeom>
+                    <a:ln>
+                      <a:noFill/>
+                    </a:ln>
+                    <a:extLst>
+                      <a:ext uri="{53640926-AAD7-44D8-BBD7-CCE9431645EC}">
+                        <a14:shadowObscured xmlns:a14="http://schemas.microsoft.com/office/drawing/2010/main"/>
+                      </a:ext>
+                    </a:extLst>
                   </pic:spPr>
                 </pic:pic>
               </a:graphicData>
@@ -1675,6 +1917,161 @@
     </w:p>
     <w:p>
       <w:pPr>
+        <w:jc w:val="center"/>
+        <w:rPr>
+          <w:rFonts w:ascii="Times New Roman" w:hAnsi="Times New Roman" w:cs="Times New Roman"/>
+          <w:i/>
+          <w:iCs/>
+          <w:sz w:val="16"/>
+          <w:szCs w:val="16"/>
+          <w:lang w:val="es-ES"/>
+        </w:rPr>
+      </w:pPr>
+      <w:r>
+        <w:rPr>
+          <w:rFonts w:ascii="Times New Roman" w:hAnsi="Times New Roman" w:cs="Times New Roman"/>
+          <w:i/>
+          <w:iCs/>
+          <w:sz w:val="16"/>
+          <w:szCs w:val="16"/>
+          <w:lang w:val="es-ES"/>
+        </w:rPr>
+        <w:t xml:space="preserve">Fig.1 </w:t>
+      </w:r>
+      <w:r>
+        <w:rPr>
+          <w:rFonts w:ascii="Times New Roman" w:hAnsi="Times New Roman" w:cs="Times New Roman"/>
+          <w:i/>
+          <w:iCs/>
+          <w:sz w:val="16"/>
+          <w:szCs w:val="16"/>
+          <w:lang w:val="es-ES"/>
+        </w:rPr>
+        <w:t>Repositorio original de “</w:t>
+      </w:r>
+      <w:proofErr w:type="spellStart"/>
+      <w:r>
+        <w:rPr>
+          <w:rFonts w:ascii="Times New Roman" w:hAnsi="Times New Roman" w:cs="Times New Roman"/>
+          <w:i/>
+          <w:iCs/>
+          <w:sz w:val="16"/>
+          <w:szCs w:val="16"/>
+          <w:lang w:val="es-ES"/>
+        </w:rPr>
+        <w:t>Estimating</w:t>
+      </w:r>
+      <w:proofErr w:type="spellEnd"/>
+      <w:r>
+        <w:rPr>
+          <w:rFonts w:ascii="Times New Roman" w:hAnsi="Times New Roman" w:cs="Times New Roman"/>
+          <w:i/>
+          <w:iCs/>
+          <w:sz w:val="16"/>
+          <w:szCs w:val="16"/>
+          <w:lang w:val="es-ES"/>
+        </w:rPr>
+        <w:t xml:space="preserve"> a Social Cost </w:t>
+      </w:r>
+      <w:proofErr w:type="spellStart"/>
+      <w:r>
+        <w:rPr>
+          <w:rFonts w:ascii="Times New Roman" w:hAnsi="Times New Roman" w:cs="Times New Roman"/>
+          <w:i/>
+          <w:iCs/>
+          <w:sz w:val="16"/>
+          <w:szCs w:val="16"/>
+          <w:lang w:val="es-ES"/>
+        </w:rPr>
+        <w:t>of</w:t>
+      </w:r>
+      <w:proofErr w:type="spellEnd"/>
+      <w:r>
+        <w:rPr>
+          <w:rFonts w:ascii="Times New Roman" w:hAnsi="Times New Roman" w:cs="Times New Roman"/>
+          <w:i/>
+          <w:iCs/>
+          <w:sz w:val="16"/>
+          <w:szCs w:val="16"/>
+          <w:lang w:val="es-ES"/>
+        </w:rPr>
+        <w:t xml:space="preserve"> Carbon </w:t>
+      </w:r>
+      <w:proofErr w:type="spellStart"/>
+      <w:r>
+        <w:rPr>
+          <w:rFonts w:ascii="Times New Roman" w:hAnsi="Times New Roman" w:cs="Times New Roman"/>
+          <w:i/>
+          <w:iCs/>
+          <w:sz w:val="16"/>
+          <w:szCs w:val="16"/>
+          <w:lang w:val="es-ES"/>
+        </w:rPr>
+        <w:t>for</w:t>
+      </w:r>
+      <w:proofErr w:type="spellEnd"/>
+      <w:r>
+        <w:rPr>
+          <w:rFonts w:ascii="Times New Roman" w:hAnsi="Times New Roman" w:cs="Times New Roman"/>
+          <w:i/>
+          <w:iCs/>
+          <w:sz w:val="16"/>
+          <w:szCs w:val="16"/>
+          <w:lang w:val="es-ES"/>
+        </w:rPr>
+        <w:t xml:space="preserve"> Global Energy </w:t>
+      </w:r>
+      <w:proofErr w:type="spellStart"/>
+      <w:r>
+        <w:rPr>
+          <w:rFonts w:ascii="Times New Roman" w:hAnsi="Times New Roman" w:cs="Times New Roman"/>
+          <w:i/>
+          <w:iCs/>
+          <w:sz w:val="16"/>
+          <w:szCs w:val="16"/>
+          <w:lang w:val="es-ES"/>
+        </w:rPr>
+        <w:t>Consumption</w:t>
+      </w:r>
+      <w:proofErr w:type="spellEnd"/>
+      <w:r>
+        <w:rPr>
+          <w:rFonts w:ascii="Times New Roman" w:hAnsi="Times New Roman" w:cs="Times New Roman"/>
+          <w:i/>
+          <w:iCs/>
+          <w:sz w:val="16"/>
+          <w:szCs w:val="16"/>
+          <w:lang w:val="es-ES"/>
+        </w:rPr>
+        <w:t xml:space="preserve">” (Rode </w:t>
+      </w:r>
+      <w:proofErr w:type="spellStart"/>
+      <w:r>
+        <w:rPr>
+          <w:rFonts w:ascii="Times New Roman" w:hAnsi="Times New Roman" w:cs="Times New Roman"/>
+          <w:i/>
+          <w:iCs/>
+          <w:sz w:val="16"/>
+          <w:szCs w:val="16"/>
+          <w:lang w:val="es-ES"/>
+        </w:rPr>
+        <w:t>er</w:t>
+      </w:r>
+      <w:proofErr w:type="spellEnd"/>
+      <w:r>
+        <w:rPr>
+          <w:rFonts w:ascii="Times New Roman" w:hAnsi="Times New Roman" w:cs="Times New Roman"/>
+          <w:i/>
+          <w:iCs/>
+          <w:sz w:val="16"/>
+          <w:szCs w:val="16"/>
+          <w:lang w:val="es-ES"/>
+        </w:rPr>
+        <w:t xml:space="preserve"> al, 2021)</w:t>
+      </w:r>
+    </w:p>
+    <w:p>
+      <w:pPr>
         <w:jc w:val="both"/>
         <w:rPr>
           <w:rFonts w:ascii="Times New Roman" w:hAnsi="Times New Roman" w:cs="Times New Roman"/>
@@ -1686,7 +2083,30 @@
           <w:rFonts w:ascii="Times New Roman" w:hAnsi="Times New Roman" w:cs="Times New Roman"/>
           <w:lang w:val="es-ES"/>
         </w:rPr>
-        <w:t>El repositorio incluye principalmente scripts de procesamiento de datos y estimación econométrica que permiten ejecutar los pasos iniciales del análisis. En particular, el código disponible permite reconstruir el dataset final utilizado en las regresiones y ejecutar los modelos econométricos que estiman la relación entre temperatura y consumo energético.</w:t>
+        <w:t>El</w:t>
+      </w:r>
+      <w:r>
+        <w:rPr>
+          <w:rFonts w:ascii="Times New Roman" w:hAnsi="Times New Roman" w:cs="Times New Roman"/>
+          <w:lang w:val="es-ES"/>
+        </w:rPr>
+        <w:t xml:space="preserve"> repositorio incluye principalmente scripts de procesamiento de datos y estimación econométrica que permiten ejecutar los pasos iniciales del análisis. En particular, el código disponible permite reconstruir el </w:t>
+      </w:r>
+      <w:proofErr w:type="spellStart"/>
+      <w:r>
+        <w:rPr>
+          <w:rFonts w:ascii="Times New Roman" w:hAnsi="Times New Roman" w:cs="Times New Roman"/>
+          <w:lang w:val="es-ES"/>
+        </w:rPr>
+        <w:t>dataset</w:t>
+      </w:r>
+      <w:proofErr w:type="spellEnd"/>
+      <w:r>
+        <w:rPr>
+          <w:rFonts w:ascii="Times New Roman" w:hAnsi="Times New Roman" w:cs="Times New Roman"/>
+          <w:lang w:val="es-ES"/>
+        </w:rPr>
+        <w:t xml:space="preserve"> final utilizado en las regresiones y ejecutar los modelos econométricos que estiman la relación entre temperatura y consumo energético.</w:t>
       </w:r>
     </w:p>
     <w:p>
@@ -1702,8 +2122,17 @@
           <w:rFonts w:ascii="Times New Roman" w:hAnsi="Times New Roman" w:cs="Times New Roman"/>
           <w:lang w:val="es-ES"/>
         </w:rPr>
-        <w:t xml:space="preserve">Los datos utilizados provienen de varias fuentes. El consumo energético se obtiene del World Energy Balances de la International Energy Agency (IEA), mientras que los datos climáticos provienen del Global Meteorological Forcing Dataset (GMFD), que ofrece información diaria de temperatura y precipitación a una resolución espacial de 0.25 grados. Además, se utilizan datos de ingreso per cápita y población provenientes del Banco Mundial e integrados en las bases de la IEA. </w:t>
-      </w:r>
+        <w:t xml:space="preserve">Los datos utilizados provienen de varias fuentes. El consumo energético se obtiene del World Energy Balances de la International Energy Agency (IEA), mientras que los datos climáticos provienen del Global </w:t>
+      </w:r>
+      <w:proofErr w:type="spellStart"/>
+      <w:r>
+        <w:rPr>
+          <w:rFonts w:ascii="Times New Roman" w:hAnsi="Times New Roman" w:cs="Times New Roman"/>
+          <w:lang w:val="es-ES"/>
+        </w:rPr>
+        <w:t>Meteorological</w:t>
+      </w:r>
+      <w:proofErr w:type="spellEnd"/>
       <w:r>
         <w:rPr>
           <w:rFonts w:ascii="Times New Roman" w:hAnsi="Times New Roman" w:cs="Times New Roman"/>
@@ -1711,6 +2140,59 @@
         </w:rPr>
         <w:t xml:space="preserve"> </w:t>
       </w:r>
+      <w:proofErr w:type="spellStart"/>
+      <w:r>
+        <w:rPr>
+          <w:rFonts w:ascii="Times New Roman" w:hAnsi="Times New Roman" w:cs="Times New Roman"/>
+          <w:lang w:val="es-ES"/>
+        </w:rPr>
+        <w:t>Forcing</w:t>
+      </w:r>
+      <w:proofErr w:type="spellEnd"/>
+      <w:r>
+        <w:rPr>
+          <w:rFonts w:ascii="Times New Roman" w:hAnsi="Times New Roman" w:cs="Times New Roman"/>
+          <w:lang w:val="es-ES"/>
+        </w:rPr>
+        <w:t xml:space="preserve"> </w:t>
+      </w:r>
+      <w:proofErr w:type="spellStart"/>
+      <w:r>
+        <w:rPr>
+          <w:rFonts w:ascii="Times New Roman" w:hAnsi="Times New Roman" w:cs="Times New Roman"/>
+          <w:lang w:val="es-ES"/>
+        </w:rPr>
+        <w:t>Dataset</w:t>
+      </w:r>
+      <w:proofErr w:type="spellEnd"/>
+      <w:r>
+        <w:rPr>
+          <w:rFonts w:ascii="Times New Roman" w:hAnsi="Times New Roman" w:cs="Times New Roman"/>
+          <w:lang w:val="es-ES"/>
+        </w:rPr>
+        <w:t xml:space="preserve"> (GMFD), que ofrece información diaria de temperatura y precipitación a una resolución espacial de 0.25 grados. Además, se utilizan datos de ingreso per cápita y población</w:t>
+      </w:r>
+      <w:r>
+        <w:rPr>
+          <w:rFonts w:ascii="Times New Roman" w:hAnsi="Times New Roman" w:cs="Times New Roman"/>
+          <w:lang w:val="es-ES"/>
+        </w:rPr>
+        <w:t>,</w:t>
+      </w:r>
+      <w:r>
+        <w:rPr>
+          <w:rFonts w:ascii="Times New Roman" w:hAnsi="Times New Roman" w:cs="Times New Roman"/>
+          <w:lang w:val="es-ES"/>
+        </w:rPr>
+        <w:t xml:space="preserve"> provenientes del Banco Mundial e integrados en las bases de la IEA. </w:t>
+      </w:r>
+      <w:r>
+        <w:rPr>
+          <w:rFonts w:ascii="Times New Roman" w:hAnsi="Times New Roman" w:cs="Times New Roman"/>
+          <w:lang w:val="es-ES"/>
+        </w:rPr>
+        <w:t xml:space="preserve"> </w:t>
+      </w:r>
       <w:r>
         <w:rPr>
           <w:rFonts w:ascii="Times New Roman" w:hAnsi="Times New Roman" w:cs="Times New Roman"/>
@@ -1723,31 +2205,24 @@
           <w:rFonts w:ascii="Times New Roman" w:hAnsi="Times New Roman" w:cs="Times New Roman"/>
           <w:lang w:val="es-ES"/>
         </w:rPr>
-        <w:t xml:space="preserve">autores nos referencian a un Zenodo </w:t>
-      </w:r>
-      <w:r>
-        <w:rPr>
-          <w:rFonts w:ascii="Times New Roman" w:hAnsi="Times New Roman" w:cs="Times New Roman"/>
-          <w:lang w:val="es-ES"/>
-        </w:rPr>
-        <w:t>(</w:t>
-      </w:r>
-      <w:hyperlink r:id="rId9" w:history="1">
-        <w:r>
-          <w:rPr>
-            <w:rStyle w:val="Hyperlink"/>
-            <w:rFonts w:ascii="Times New Roman" w:hAnsi="Times New Roman" w:cs="Times New Roman"/>
-            <w:lang w:val="es-ES"/>
-          </w:rPr>
-          <w:t>https://doi.org/10.5281/zenodo.5099834</w:t>
-        </w:r>
-      </w:hyperlink>
-      <w:r>
-        <w:rPr>
-          <w:rFonts w:ascii="Times New Roman" w:hAnsi="Times New Roman" w:cs="Times New Roman"/>
-          <w:lang w:val="es-ES"/>
-        </w:rPr>
-        <w:t xml:space="preserve">) que contiene toda la información que debe descargarse la totalidad de los datos a utilizar. </w:t>
+        <w:t xml:space="preserve">autores referencian a </w:t>
+      </w:r>
+      <w:proofErr w:type="spellStart"/>
+      <w:r>
+        <w:rPr>
+          <w:rFonts w:ascii="Times New Roman" w:hAnsi="Times New Roman" w:cs="Times New Roman"/>
+          <w:lang w:val="es-ES"/>
+        </w:rPr>
+        <w:t>Zenodo</w:t>
+      </w:r>
+      <w:proofErr w:type="spellEnd"/>
+      <w:r>
+        <w:rPr>
+          <w:rStyle w:val="FootnoteReference"/>
+          <w:rFonts w:ascii="Times New Roman" w:hAnsi="Times New Roman" w:cs="Times New Roman"/>
+          <w:lang w:val="es-ES"/>
+        </w:rPr>
+        <w:footnoteReference w:id="2"/>
       </w:r>
       <w:r>
         <w:rPr>
@@ -1756,21 +2231,90 @@
         </w:rPr>
         <w:t xml:space="preserve"> </w:t>
       </w:r>
-    </w:p>
-    <w:p>
-      <w:pPr>
-        <w:jc w:val="both"/>
-        <w:rPr>
-          <w:rFonts w:ascii="Times New Roman" w:hAnsi="Times New Roman" w:cs="Times New Roman"/>
-          <w:lang w:val="es-ES"/>
-        </w:rPr>
-      </w:pPr>
-      <w:r>
-        <w:rPr>
-          <w:rFonts w:ascii="Times New Roman" w:hAnsi="Times New Roman" w:cs="Times New Roman"/>
-          <w:lang w:val="es-ES"/>
-        </w:rPr>
-        <w:t xml:space="preserve">La información era bastante accesible; sin embargo, al ser un estudio que se realizó en 2010 requería de la configuración de un entorno computacional que no fue fácil para algunos miembros del equipo; cómo se detallará más adelante. Además, al utilizar Stata, R y Python requirió también especificar versionamientos en el entorno y si bien la mayoría de las instrucciones de replicación eran claras; consideramos que puede ser que no pudieron prever pasos adicionales que debieron ser tomados. </w:t>
+      <w:r>
+        <w:rPr>
+          <w:rFonts w:ascii="Times New Roman" w:hAnsi="Times New Roman" w:cs="Times New Roman"/>
+          <w:lang w:val="es-ES"/>
+        </w:rPr>
+        <w:t xml:space="preserve">que contiene </w:t>
+      </w:r>
+      <w:r>
+        <w:rPr>
+          <w:rFonts w:ascii="Times New Roman" w:hAnsi="Times New Roman" w:cs="Times New Roman"/>
+          <w:lang w:val="es-ES"/>
+        </w:rPr>
+        <w:t>todos los datos a utilizar</w:t>
+      </w:r>
+      <w:r>
+        <w:rPr>
+          <w:rFonts w:ascii="Times New Roman" w:hAnsi="Times New Roman" w:cs="Times New Roman"/>
+          <w:lang w:val="es-ES"/>
+        </w:rPr>
+        <w:t xml:space="preserve"> y que </w:t>
+      </w:r>
+      <w:r>
+        <w:rPr>
+          <w:rFonts w:ascii="Times New Roman" w:hAnsi="Times New Roman" w:cs="Times New Roman"/>
+          <w:lang w:val="es-ES"/>
+        </w:rPr>
+        <w:t>debe</w:t>
+      </w:r>
+      <w:r>
+        <w:rPr>
+          <w:rFonts w:ascii="Times New Roman" w:hAnsi="Times New Roman" w:cs="Times New Roman"/>
+          <w:lang w:val="es-ES"/>
+        </w:rPr>
+        <w:t>n</w:t>
+      </w:r>
+      <w:r>
+        <w:rPr>
+          <w:rFonts w:ascii="Times New Roman" w:hAnsi="Times New Roman" w:cs="Times New Roman"/>
+          <w:lang w:val="es-ES"/>
+        </w:rPr>
+        <w:t xml:space="preserve"> descargarse </w:t>
+      </w:r>
+      <w:r>
+        <w:rPr>
+          <w:rFonts w:ascii="Times New Roman" w:hAnsi="Times New Roman" w:cs="Times New Roman"/>
+          <w:lang w:val="es-ES"/>
+        </w:rPr>
+        <w:t>para la replicación.</w:t>
+      </w:r>
+      <w:r>
+        <w:rPr>
+          <w:rFonts w:ascii="Times New Roman" w:hAnsi="Times New Roman" w:cs="Times New Roman"/>
+          <w:lang w:val="es-ES"/>
+        </w:rPr>
+        <w:t xml:space="preserve"> </w:t>
+      </w:r>
+    </w:p>
+    <w:p>
+      <w:pPr>
+        <w:rPr>
+          <w:rFonts w:ascii="Times New Roman" w:hAnsi="Times New Roman" w:cs="Times New Roman"/>
+          <w:lang w:val="es-ES"/>
+        </w:rPr>
+      </w:pPr>
+      <w:r>
+        <w:rPr>
+          <w:rFonts w:ascii="Times New Roman" w:hAnsi="Times New Roman" w:cs="Times New Roman"/>
+          <w:lang w:val="es-ES"/>
+        </w:rPr>
+        <w:t xml:space="preserve">Aunque la información era en general accesible, la configuración del entorno computacional representó un desafío para algunos miembros del equipo, como se detallará más adelante. Además, el uso de Stata, R y Python exigió especificar las versiones de cada software en el entorno. Si bien la mayoría de las instrucciones de replicación eran claras, es posible que no se hayan </w:t>
+      </w:r>
+      <w:r>
+        <w:rPr>
+          <w:rFonts w:ascii="Times New Roman" w:hAnsi="Times New Roman" w:cs="Times New Roman"/>
+          <w:lang w:val="es-ES"/>
+        </w:rPr>
+        <w:t>documentado</w:t>
+      </w:r>
+      <w:r>
+        <w:rPr>
+          <w:rFonts w:ascii="Times New Roman" w:hAnsi="Times New Roman" w:cs="Times New Roman"/>
+          <w:lang w:val="es-ES"/>
+        </w:rPr>
+        <w:t xml:space="preserve"> ciertos pasos adicionales necesarios para garantizar una reproducción completa del análisis.</w:t>
       </w:r>
     </w:p>
     <w:p>
@@ -1833,7 +2377,39 @@
           <w:lang w:val="es-ES"/>
         </w:rPr>
         <w:br/>
-        <w:t>La estrategia de reproducción se basó en replicar las primeras etapas del flujo de trabajo computacional del estudio, específicamente los Steps 1 y 2 del repositorio del proyecto, que corresponden a la construcción del dataset y a la estimación econométrica de la relación entre temperatura y consumo energético. Estos pasos constituyen la base empírica del artículo, ya que permiten reconstruir el conjunto de datos utilizado por los autores y estimar la relación fundamental entre variables climáticas y consumo energético.</w:t>
+        <w:t xml:space="preserve">La estrategia de reproducción se basó en replicar las primeras etapas del flujo de trabajo computacional del estudio, específicamente los </w:t>
+      </w:r>
+      <w:proofErr w:type="spellStart"/>
+      <w:r>
+        <w:rPr>
+          <w:rFonts w:ascii="Times New Roman" w:hAnsi="Times New Roman" w:cs="Times New Roman"/>
+          <w:lang w:val="es-ES"/>
+        </w:rPr>
+        <w:t>Steps</w:t>
+      </w:r>
+      <w:proofErr w:type="spellEnd"/>
+      <w:r>
+        <w:rPr>
+          <w:rFonts w:ascii="Times New Roman" w:hAnsi="Times New Roman" w:cs="Times New Roman"/>
+          <w:lang w:val="es-ES"/>
+        </w:rPr>
+        <w:t xml:space="preserve"> 1 y 2 del repositorio del proyecto, que corresponden a la construcción del </w:t>
+      </w:r>
+      <w:proofErr w:type="spellStart"/>
+      <w:r>
+        <w:rPr>
+          <w:rFonts w:ascii="Times New Roman" w:hAnsi="Times New Roman" w:cs="Times New Roman"/>
+          <w:lang w:val="es-ES"/>
+        </w:rPr>
+        <w:t>dataset</w:t>
+      </w:r>
+      <w:proofErr w:type="spellEnd"/>
+      <w:r>
+        <w:rPr>
+          <w:rFonts w:ascii="Times New Roman" w:hAnsi="Times New Roman" w:cs="Times New Roman"/>
+          <w:lang w:val="es-ES"/>
+        </w:rPr>
+        <w:t xml:space="preserve"> y a la estimación econométrica de la relación entre temperatura y consumo energético. Estos pasos constituyen la base empírica del artículo, ya que permiten reconstruir el conjunto de datos utilizado por los autores y estimar la relación fundamental entre variables climáticas y consumo energético.</w:t>
       </w:r>
       <w:r>
         <w:rPr>
@@ -1863,7 +2439,23 @@
           <w:rFonts w:ascii="Times New Roman" w:hAnsi="Times New Roman" w:cs="Times New Roman"/>
           <w:lang w:val="es-ES"/>
         </w:rPr>
-        <w:t xml:space="preserve">se generó un fork sobre el repositorio original del Paper y este fue compartido con todos los miembros del equipo. Posteriormente, y en el computador de cada integrante, </w:t>
+        <w:t xml:space="preserve">se generó un </w:t>
+      </w:r>
+      <w:proofErr w:type="spellStart"/>
+      <w:r>
+        <w:rPr>
+          <w:rFonts w:ascii="Times New Roman" w:hAnsi="Times New Roman" w:cs="Times New Roman"/>
+          <w:lang w:val="es-ES"/>
+        </w:rPr>
+        <w:t>fork</w:t>
+      </w:r>
+      <w:proofErr w:type="spellEnd"/>
+      <w:r>
+        <w:rPr>
+          <w:rFonts w:ascii="Times New Roman" w:hAnsi="Times New Roman" w:cs="Times New Roman"/>
+          <w:lang w:val="es-ES"/>
+        </w:rPr>
+        <w:t xml:space="preserve"> sobre el repositorio original del Paper y este fue compartido con todos los miembros del equipo. Posteriormente, y en el computador de cada integrante, </w:t>
       </w:r>
       <w:r>
         <w:rPr>
@@ -1983,7 +2575,7 @@
                     </pic:cNvPicPr>
                   </pic:nvPicPr>
                   <pic:blipFill>
-                    <a:blip r:embed="rId10" cstate="print">
+                    <a:blip r:embed="rId9" cstate="print">
                       <a:extLst>
                         <a:ext uri="{28A0092B-C50C-407E-A947-70E740481C1C}">
                           <a14:useLocalDpi xmlns:a14="http://schemas.microsoft.com/office/drawing/2010/main" val="0"/>
@@ -2077,7 +2669,7 @@
                     <pic:cNvPicPr/>
                   </pic:nvPicPr>
                   <pic:blipFill>
-                    <a:blip r:embed="rId11"/>
+                    <a:blip r:embed="rId10"/>
                     <a:stretch>
                       <a:fillRect/>
                     </a:stretch>
@@ -2200,14 +2792,46 @@
           <w:rFonts w:ascii="Times New Roman" w:hAnsi="Times New Roman" w:cs="Times New Roman"/>
           <w:lang w:val="es-ES"/>
         </w:rPr>
-        <w:t xml:space="preserve">Para poder comprender, después de descargar los datos de Zenodo </w:t>
-      </w:r>
-      <w:r>
-        <w:rPr>
-          <w:rFonts w:ascii="Times New Roman" w:hAnsi="Times New Roman" w:cs="Times New Roman"/>
-          <w:lang w:val="es-ES"/>
-        </w:rPr>
-        <w:t>y leer el repositorio, la estructura básica del estudio se construyó el siguiente mermaid.</w:t>
+        <w:t xml:space="preserve">Para poder comprender, después de descargar los datos de </w:t>
+      </w:r>
+      <w:proofErr w:type="spellStart"/>
+      <w:r>
+        <w:rPr>
+          <w:rFonts w:ascii="Times New Roman" w:hAnsi="Times New Roman" w:cs="Times New Roman"/>
+          <w:lang w:val="es-ES"/>
+        </w:rPr>
+        <w:t>Zenodo</w:t>
+      </w:r>
+      <w:proofErr w:type="spellEnd"/>
+      <w:r>
+        <w:rPr>
+          <w:rFonts w:ascii="Times New Roman" w:hAnsi="Times New Roman" w:cs="Times New Roman"/>
+          <w:lang w:val="es-ES"/>
+        </w:rPr>
+        <w:t xml:space="preserve"> </w:t>
+      </w:r>
+      <w:r>
+        <w:rPr>
+          <w:rFonts w:ascii="Times New Roman" w:hAnsi="Times New Roman" w:cs="Times New Roman"/>
+          <w:lang w:val="es-ES"/>
+        </w:rPr>
+        <w:t xml:space="preserve">y leer el repositorio, la estructura básica del estudio se construyó el siguiente </w:t>
+      </w:r>
+      <w:proofErr w:type="spellStart"/>
+      <w:r>
+        <w:rPr>
+          <w:rFonts w:ascii="Times New Roman" w:hAnsi="Times New Roman" w:cs="Times New Roman"/>
+          <w:lang w:val="es-ES"/>
+        </w:rPr>
+        <w:t>mermaid</w:t>
+      </w:r>
+      <w:proofErr w:type="spellEnd"/>
+      <w:r>
+        <w:rPr>
+          <w:rFonts w:ascii="Times New Roman" w:hAnsi="Times New Roman" w:cs="Times New Roman"/>
+          <w:lang w:val="es-ES"/>
+        </w:rPr>
+        <w:t>.</w:t>
       </w:r>
     </w:p>
     <w:p>
@@ -2242,7 +2866,7 @@
                     </pic:cNvPicPr>
                   </pic:nvPicPr>
                   <pic:blipFill>
-                    <a:blip r:embed="rId12" cstate="print">
+                    <a:blip r:embed="rId11" cstate="print">
                       <a:extLst>
                         <a:ext uri="{28A0092B-C50C-407E-A947-70E740481C1C}">
                           <a14:useLocalDpi xmlns:a14="http://schemas.microsoft.com/office/drawing/2010/main" val="0"/>
@@ -2363,7 +2987,7 @@
                     </pic:cNvPicPr>
                   </pic:nvPicPr>
                   <pic:blipFill>
-                    <a:blip r:embed="rId13" cstate="print">
+                    <a:blip r:embed="rId12" cstate="print">
                       <a:extLst>
                         <a:ext uri="{28A0092B-C50C-407E-A947-70E740481C1C}">
                           <a14:useLocalDpi xmlns:a14="http://schemas.microsoft.com/office/drawing/2010/main" val="0"/>
@@ -2408,7 +3032,39 @@
           <w:rFonts w:ascii="Times New Roman" w:hAnsi="Times New Roman" w:cs="Times New Roman"/>
           <w:lang w:val="es-ES"/>
         </w:rPr>
-        <w:t xml:space="preserve">En primer lugar, el script 1_construct_dataset_from_raw_inputs.do limpia y combina los datos de energía, clima, población e ingreso, produciendo un dataset intermedio denominado IEA_merged_long_GMFD.dta. </w:t>
+        <w:t xml:space="preserve">En primer lugar, el script 1_construct_dataset_from_raw_inputs.do limpia y combina los datos de energía, clima, población e ingreso, produciendo un </w:t>
+      </w:r>
+      <w:proofErr w:type="spellStart"/>
+      <w:r>
+        <w:rPr>
+          <w:rFonts w:ascii="Times New Roman" w:hAnsi="Times New Roman" w:cs="Times New Roman"/>
+          <w:lang w:val="es-ES"/>
+        </w:rPr>
+        <w:t>dataset</w:t>
+      </w:r>
+      <w:proofErr w:type="spellEnd"/>
+      <w:r>
+        <w:rPr>
+          <w:rFonts w:ascii="Times New Roman" w:hAnsi="Times New Roman" w:cs="Times New Roman"/>
+          <w:lang w:val="es-ES"/>
+        </w:rPr>
+        <w:t xml:space="preserve"> intermedio denominado </w:t>
+      </w:r>
+      <w:proofErr w:type="spellStart"/>
+      <w:r>
+        <w:rPr>
+          <w:rFonts w:ascii="Times New Roman" w:hAnsi="Times New Roman" w:cs="Times New Roman"/>
+          <w:lang w:val="es-ES"/>
+        </w:rPr>
+        <w:t>IEA_merged_long_GMFD.dta</w:t>
+      </w:r>
+      <w:proofErr w:type="spellEnd"/>
+      <w:r>
+        <w:rPr>
+          <w:rFonts w:ascii="Times New Roman" w:hAnsi="Times New Roman" w:cs="Times New Roman"/>
+          <w:lang w:val="es-ES"/>
+        </w:rPr>
+        <w:t xml:space="preserve">. </w:t>
       </w:r>
     </w:p>
     <w:p>
@@ -2425,7 +3081,103 @@
           <w:lang w:val="es-ES"/>
         </w:rPr>
         <w:lastRenderedPageBreak/>
-        <w:t>Posteriormente, el script 2_construct_regression_ready_data.do transforma este dataset intermedio en datasets listos para regresión. En esta etapa se eliminan observaciones con problemas de reporte, se emparejan los datos climáticos con los productos energéticos y se construyen variables clave del análisis, incluyendo splines de ingreso, clasificaciones por deciles de ingreso y variables en primeras diferencias. El resultado son los datasets GMFD_TINV_clim_regsort.dta (modelo principal) y GMFD_TINV_clim_EX_regsort.dta (modelo alternativo).</w:t>
+        <w:t xml:space="preserve">Posteriormente, el script 2_construct_regression_ready_data.do transforma este </w:t>
+      </w:r>
+      <w:proofErr w:type="spellStart"/>
+      <w:r>
+        <w:rPr>
+          <w:rFonts w:ascii="Times New Roman" w:hAnsi="Times New Roman" w:cs="Times New Roman"/>
+          <w:lang w:val="es-ES"/>
+        </w:rPr>
+        <w:t>dataset</w:t>
+      </w:r>
+      <w:proofErr w:type="spellEnd"/>
+      <w:r>
+        <w:rPr>
+          <w:rFonts w:ascii="Times New Roman" w:hAnsi="Times New Roman" w:cs="Times New Roman"/>
+          <w:lang w:val="es-ES"/>
+        </w:rPr>
+        <w:t xml:space="preserve"> intermedio en </w:t>
+      </w:r>
+      <w:proofErr w:type="spellStart"/>
+      <w:r>
+        <w:rPr>
+          <w:rFonts w:ascii="Times New Roman" w:hAnsi="Times New Roman" w:cs="Times New Roman"/>
+          <w:lang w:val="es-ES"/>
+        </w:rPr>
+        <w:t>datasets</w:t>
+      </w:r>
+      <w:proofErr w:type="spellEnd"/>
+      <w:r>
+        <w:rPr>
+          <w:rFonts w:ascii="Times New Roman" w:hAnsi="Times New Roman" w:cs="Times New Roman"/>
+          <w:lang w:val="es-ES"/>
+        </w:rPr>
+        <w:t xml:space="preserve"> listos para regresión. En esta etapa se eliminan observaciones con problemas de reporte, se emparejan los datos climáticos con los productos energéticos y se construyen variables clave del análisis, incluyendo </w:t>
+      </w:r>
+      <w:proofErr w:type="spellStart"/>
+      <w:r>
+        <w:rPr>
+          <w:rFonts w:ascii="Times New Roman" w:hAnsi="Times New Roman" w:cs="Times New Roman"/>
+          <w:lang w:val="es-ES"/>
+        </w:rPr>
+        <w:t>splines</w:t>
+      </w:r>
+      <w:proofErr w:type="spellEnd"/>
+      <w:r>
+        <w:rPr>
+          <w:rFonts w:ascii="Times New Roman" w:hAnsi="Times New Roman" w:cs="Times New Roman"/>
+          <w:lang w:val="es-ES"/>
+        </w:rPr>
+        <w:t xml:space="preserve"> de ingreso, clasificaciones por deciles de ingreso y variables en primeras diferencias. El resultado son los </w:t>
+      </w:r>
+      <w:proofErr w:type="spellStart"/>
+      <w:r>
+        <w:rPr>
+          <w:rFonts w:ascii="Times New Roman" w:hAnsi="Times New Roman" w:cs="Times New Roman"/>
+          <w:lang w:val="es-ES"/>
+        </w:rPr>
+        <w:t>datasets</w:t>
+      </w:r>
+      <w:proofErr w:type="spellEnd"/>
+      <w:r>
+        <w:rPr>
+          <w:rFonts w:ascii="Times New Roman" w:hAnsi="Times New Roman" w:cs="Times New Roman"/>
+          <w:lang w:val="es-ES"/>
+        </w:rPr>
+        <w:t xml:space="preserve"> </w:t>
+      </w:r>
+      <w:proofErr w:type="spellStart"/>
+      <w:r>
+        <w:rPr>
+          <w:rFonts w:ascii="Times New Roman" w:hAnsi="Times New Roman" w:cs="Times New Roman"/>
+          <w:lang w:val="es-ES"/>
+        </w:rPr>
+        <w:t>GMFD_TINV_clim_regsort.dta</w:t>
+      </w:r>
+      <w:proofErr w:type="spellEnd"/>
+      <w:r>
+        <w:rPr>
+          <w:rFonts w:ascii="Times New Roman" w:hAnsi="Times New Roman" w:cs="Times New Roman"/>
+          <w:lang w:val="es-ES"/>
+        </w:rPr>
+        <w:t xml:space="preserve"> (modelo principal) y </w:t>
+      </w:r>
+      <w:proofErr w:type="spellStart"/>
+      <w:r>
+        <w:rPr>
+          <w:rFonts w:ascii="Times New Roman" w:hAnsi="Times New Roman" w:cs="Times New Roman"/>
+          <w:lang w:val="es-ES"/>
+        </w:rPr>
+        <w:t>GMFD_TINV_clim_EX_regsort.dta</w:t>
+      </w:r>
+      <w:proofErr w:type="spellEnd"/>
+      <w:r>
+        <w:rPr>
+          <w:rFonts w:ascii="Times New Roman" w:hAnsi="Times New Roman" w:cs="Times New Roman"/>
+          <w:lang w:val="es-ES"/>
+        </w:rPr>
+        <w:t xml:space="preserve"> (modelo alternativo).</w:t>
       </w:r>
     </w:p>
     <w:p>
@@ -2441,7 +3193,23 @@
           <w:rFonts w:ascii="Times New Roman" w:hAnsi="Times New Roman" w:cs="Times New Roman"/>
           <w:lang w:val="es-ES"/>
         </w:rPr>
-        <w:t>Finalmente, se ejecutan scripts adicionales para validar y visualizar los datos. El script 3_unit_root_test_and_plot.do realiza pruebas de raíz unitaria que justifican el uso de primeras diferencias, mientras que 4_plot_ITA_other_energy_regimes_timeseries.R genera una serie temporal ilustrativa utilizada en el apéndice del artículo.</w:t>
+        <w:t>Finalmente, se ejecutan scripts adicionales para validar y visualizar los datos. El script 3_unit_root_test_and_plot.do realiza pruebas de raíz unitaria que justifican el uso de primeras diferencias, mientras que 4_plot_ITA_other_energy_regimes_</w:t>
+      </w:r>
+      <w:proofErr w:type="gramStart"/>
+      <w:r>
+        <w:rPr>
+          <w:rFonts w:ascii="Times New Roman" w:hAnsi="Times New Roman" w:cs="Times New Roman"/>
+          <w:lang w:val="es-ES"/>
+        </w:rPr>
+        <w:t>timeseries.R</w:t>
+      </w:r>
+      <w:proofErr w:type="gramEnd"/>
+      <w:r>
+        <w:rPr>
+          <w:rFonts w:ascii="Times New Roman" w:hAnsi="Times New Roman" w:cs="Times New Roman"/>
+          <w:lang w:val="es-ES"/>
+        </w:rPr>
+        <w:t xml:space="preserve"> genera una serie temporal ilustrativa utilizada en el apéndice del artículo.</w:t>
       </w:r>
     </w:p>
     <w:p>
@@ -2457,7 +3225,71 @@
           <w:rFonts w:ascii="Times New Roman" w:hAnsi="Times New Roman" w:cs="Times New Roman"/>
           <w:lang w:val="es-ES"/>
         </w:rPr>
-        <w:t xml:space="preserve">Una particularidad de la forma en que está construida la metodología de reproducción, es que no es posible recrear o alterar el dataset de base, debido a que las bases de datos principales, son de carácter privado. Así pues, los autores han incluído todos los datos necesarios para la reproducción en el archivo disponible en Zenodo, </w:t>
+        <w:t xml:space="preserve">Una particularidad de la forma en que está construida la metodología de reproducción, es que no es posible recrear o alterar el </w:t>
+      </w:r>
+      <w:proofErr w:type="spellStart"/>
+      <w:r>
+        <w:rPr>
+          <w:rFonts w:ascii="Times New Roman" w:hAnsi="Times New Roman" w:cs="Times New Roman"/>
+          <w:lang w:val="es-ES"/>
+        </w:rPr>
+        <w:t>dataset</w:t>
+      </w:r>
+      <w:proofErr w:type="spellEnd"/>
+      <w:r>
+        <w:rPr>
+          <w:rFonts w:ascii="Times New Roman" w:hAnsi="Times New Roman" w:cs="Times New Roman"/>
+          <w:lang w:val="es-ES"/>
+        </w:rPr>
+        <w:t xml:space="preserve"> de base, debido a que las bases de datos </w:t>
+      </w:r>
+      <w:proofErr w:type="gramStart"/>
+      <w:r>
+        <w:rPr>
+          <w:rFonts w:ascii="Times New Roman" w:hAnsi="Times New Roman" w:cs="Times New Roman"/>
+          <w:lang w:val="es-ES"/>
+        </w:rPr>
+        <w:t>principales,</w:t>
+      </w:r>
+      <w:proofErr w:type="gramEnd"/>
+      <w:r>
+        <w:rPr>
+          <w:rFonts w:ascii="Times New Roman" w:hAnsi="Times New Roman" w:cs="Times New Roman"/>
+          <w:lang w:val="es-ES"/>
+        </w:rPr>
+        <w:t xml:space="preserve"> son de carácter privado. Así pues, los autores han </w:t>
+      </w:r>
+      <w:proofErr w:type="spellStart"/>
+      <w:r>
+        <w:rPr>
+          <w:rFonts w:ascii="Times New Roman" w:hAnsi="Times New Roman" w:cs="Times New Roman"/>
+          <w:lang w:val="es-ES"/>
+        </w:rPr>
+        <w:t>incluído</w:t>
+      </w:r>
+      <w:proofErr w:type="spellEnd"/>
+      <w:r>
+        <w:rPr>
+          <w:rFonts w:ascii="Times New Roman" w:hAnsi="Times New Roman" w:cs="Times New Roman"/>
+          <w:lang w:val="es-ES"/>
+        </w:rPr>
+        <w:t xml:space="preserve"> todos los datos necesarios para la reproducción en el archivo disponible en </w:t>
+      </w:r>
+      <w:proofErr w:type="spellStart"/>
+      <w:r>
+        <w:rPr>
+          <w:rFonts w:ascii="Times New Roman" w:hAnsi="Times New Roman" w:cs="Times New Roman"/>
+          <w:lang w:val="es-ES"/>
+        </w:rPr>
+        <w:t>Zenodo</w:t>
+      </w:r>
+      <w:proofErr w:type="spellEnd"/>
+      <w:r>
+        <w:rPr>
+          <w:rFonts w:ascii="Times New Roman" w:hAnsi="Times New Roman" w:cs="Times New Roman"/>
+          <w:lang w:val="es-ES"/>
+        </w:rPr>
+        <w:t xml:space="preserve">, </w:t>
       </w:r>
       <w:r>
         <w:rPr>
@@ -2480,8 +3312,33 @@
           <w:rFonts w:ascii="Times New Roman" w:hAnsi="Times New Roman" w:cs="Times New Roman"/>
           <w:lang w:val="es-ES"/>
         </w:rPr>
-        <w:t>El dataset suministrado por los autores en el repositorio en Zenodo</w:t>
-      </w:r>
+        <w:t xml:space="preserve">El </w:t>
+      </w:r>
+      <w:proofErr w:type="spellStart"/>
+      <w:r>
+        <w:rPr>
+          <w:rFonts w:ascii="Times New Roman" w:hAnsi="Times New Roman" w:cs="Times New Roman"/>
+          <w:lang w:val="es-ES"/>
+        </w:rPr>
+        <w:t>dataset</w:t>
+      </w:r>
+      <w:proofErr w:type="spellEnd"/>
+      <w:r>
+        <w:rPr>
+          <w:rFonts w:ascii="Times New Roman" w:hAnsi="Times New Roman" w:cs="Times New Roman"/>
+          <w:lang w:val="es-ES"/>
+        </w:rPr>
+        <w:t xml:space="preserve"> suministrado por los autores en el repositorio en </w:t>
+      </w:r>
+      <w:proofErr w:type="spellStart"/>
+      <w:r>
+        <w:rPr>
+          <w:rFonts w:ascii="Times New Roman" w:hAnsi="Times New Roman" w:cs="Times New Roman"/>
+          <w:lang w:val="es-ES"/>
+        </w:rPr>
+        <w:t>Zenodo</w:t>
+      </w:r>
+      <w:proofErr w:type="spellEnd"/>
       <w:r>
         <w:rPr>
           <w:rFonts w:ascii="Times New Roman" w:hAnsi="Times New Roman" w:cs="Times New Roman"/>
@@ -2622,7 +3479,7 @@
                     </pic:cNvPicPr>
                   </pic:nvPicPr>
                   <pic:blipFill>
-                    <a:blip r:embed="rId14" cstate="print">
+                    <a:blip r:embed="rId13" cstate="print">
                       <a:extLst>
                         <a:ext uri="{28A0092B-C50C-407E-A947-70E740481C1C}">
                           <a14:useLocalDpi xmlns:a14="http://schemas.microsoft.com/office/drawing/2010/main" val="0"/>
@@ -2740,7 +3597,7 @@
                     </pic:cNvPicPr>
                   </pic:nvPicPr>
                   <pic:blipFill>
-                    <a:blip r:embed="rId15" cstate="print">
+                    <a:blip r:embed="rId14" cstate="print">
                       <a:extLst>
                         <a:ext uri="{28A0092B-C50C-407E-A947-70E740481C1C}">
                           <a14:useLocalDpi xmlns:a14="http://schemas.microsoft.com/office/drawing/2010/main" val="0"/>
@@ -2801,7 +3658,7 @@
         </w:rPr>
         <w:t xml:space="preserve">, encontramos en el repositorio un </w:t>
       </w:r>
-      <w:hyperlink r:id="rId16" w:tooltip="1_analysis.sh" w:history="1">
+      <w:hyperlink r:id="rId15" w:tooltip="1_analysis.sh" w:history="1">
         <w:r>
           <w:rPr>
             <w:rStyle w:val="Hyperlink"/>
@@ -2880,7 +3737,71 @@
           <w:rFonts w:ascii="Times New Roman" w:hAnsi="Times New Roman" w:cs="Times New Roman"/>
           <w:lang w:val="es-ES"/>
         </w:rPr>
-        <w:t>Todas las regresiones utilizan un procedimiento de Feasible Generalized Least Squares (FGLS) para corregir problemas de heterocedasticidad asociados a diferencias en la calidad de los datos entre regímenes de reporte. Este procedimiento consiste en estimar primero un modelo base para obtener los residuos y luego utilizar la varianza de estos residuos para construir ponderaciones que se aplican en una segunda etapa de estimación.</w:t>
+        <w:t xml:space="preserve">Todas las regresiones utilizan un procedimiento de </w:t>
+      </w:r>
+      <w:proofErr w:type="spellStart"/>
+      <w:r>
+        <w:rPr>
+          <w:rFonts w:ascii="Times New Roman" w:hAnsi="Times New Roman" w:cs="Times New Roman"/>
+          <w:lang w:val="es-ES"/>
+        </w:rPr>
+        <w:t>Feasible</w:t>
+      </w:r>
+      <w:proofErr w:type="spellEnd"/>
+      <w:r>
+        <w:rPr>
+          <w:rFonts w:ascii="Times New Roman" w:hAnsi="Times New Roman" w:cs="Times New Roman"/>
+          <w:lang w:val="es-ES"/>
+        </w:rPr>
+        <w:t xml:space="preserve"> </w:t>
+      </w:r>
+      <w:proofErr w:type="spellStart"/>
+      <w:r>
+        <w:rPr>
+          <w:rFonts w:ascii="Times New Roman" w:hAnsi="Times New Roman" w:cs="Times New Roman"/>
+          <w:lang w:val="es-ES"/>
+        </w:rPr>
+        <w:t>Generalized</w:t>
+      </w:r>
+      <w:proofErr w:type="spellEnd"/>
+      <w:r>
+        <w:rPr>
+          <w:rFonts w:ascii="Times New Roman" w:hAnsi="Times New Roman" w:cs="Times New Roman"/>
+          <w:lang w:val="es-ES"/>
+        </w:rPr>
+        <w:t xml:space="preserve"> </w:t>
+      </w:r>
+      <w:proofErr w:type="spellStart"/>
+      <w:r>
+        <w:rPr>
+          <w:rFonts w:ascii="Times New Roman" w:hAnsi="Times New Roman" w:cs="Times New Roman"/>
+          <w:lang w:val="es-ES"/>
+        </w:rPr>
+        <w:t>Least</w:t>
+      </w:r>
+      <w:proofErr w:type="spellEnd"/>
+      <w:r>
+        <w:rPr>
+          <w:rFonts w:ascii="Times New Roman" w:hAnsi="Times New Roman" w:cs="Times New Roman"/>
+          <w:lang w:val="es-ES"/>
+        </w:rPr>
+        <w:t xml:space="preserve"> </w:t>
+      </w:r>
+      <w:proofErr w:type="spellStart"/>
+      <w:r>
+        <w:rPr>
+          <w:rFonts w:ascii="Times New Roman" w:hAnsi="Times New Roman" w:cs="Times New Roman"/>
+          <w:lang w:val="es-ES"/>
+        </w:rPr>
+        <w:t>Squares</w:t>
+      </w:r>
+      <w:proofErr w:type="spellEnd"/>
+      <w:r>
+        <w:rPr>
+          <w:rFonts w:ascii="Times New Roman" w:hAnsi="Times New Roman" w:cs="Times New Roman"/>
+          <w:lang w:val="es-ES"/>
+        </w:rPr>
+        <w:t xml:space="preserve"> (FGLS) para corregir problemas de heterocedasticidad asociados a diferencias en la calidad de los datos entre regímenes de reporte. Este procedimiento consiste en estimar primero un modelo base para obtener los residuos y luego utilizar la varianza de estos residuos para construir ponderaciones que se aplican en una segunda etapa de estimación.</w:t>
       </w:r>
     </w:p>
     <w:p>
@@ -2896,7 +3817,23 @@
           <w:rFonts w:ascii="Times New Roman" w:hAnsi="Times New Roman" w:cs="Times New Roman"/>
           <w:lang w:val="es-ES"/>
         </w:rPr>
-        <w:t>Los resultados de estas regresiones se almacenan como archivos de salida (.ster) y se utilizan para generar las figuras del artículo que ilustran la relación estimada entre temperatura y consumo energético.</w:t>
+        <w:t>Los resultados de estas regresiones se almacenan como archivos de salida (.</w:t>
+      </w:r>
+      <w:proofErr w:type="spellStart"/>
+      <w:r>
+        <w:rPr>
+          <w:rFonts w:ascii="Times New Roman" w:hAnsi="Times New Roman" w:cs="Times New Roman"/>
+          <w:lang w:val="es-ES"/>
+        </w:rPr>
+        <w:t>ster</w:t>
+      </w:r>
+      <w:proofErr w:type="spellEnd"/>
+      <w:r>
+        <w:rPr>
+          <w:rFonts w:ascii="Times New Roman" w:hAnsi="Times New Roman" w:cs="Times New Roman"/>
+          <w:lang w:val="es-ES"/>
+        </w:rPr>
+        <w:t>) y se utilizan para generar las figuras del artículo que ilustran la relación estimada entre temperatura y consumo energético.</w:t>
       </w:r>
     </w:p>
     <w:p>
@@ -2986,7 +3923,71 @@
           <w:rFonts w:ascii="Times New Roman" w:hAnsi="Times New Roman" w:cs="Times New Roman"/>
           <w:lang w:val="es-ES"/>
         </w:rPr>
-        <w:t xml:space="preserve">pues en el caso de uno de los integrantes del equipo, las variables que solicitaba el paper crear tenían nombres que ya eran utilizados por otro programa  (SQL). Entonces al correr, el programa encontraba un error fatal y decía que esa variable ya estaba siendo utilizada por PostGres. La solución fue desinstalar PostGres dado que no era de uso frecuente, pero una mejor solución habría sido cambiar el nombre de esta variable de entorno en todos los scripts y generar un nuevo nombre al que llamar. </w:t>
+        <w:t xml:space="preserve">pues en el caso de uno de los integrantes del equipo, las variables que solicitaba el </w:t>
+      </w:r>
+      <w:proofErr w:type="spellStart"/>
+      <w:r>
+        <w:rPr>
+          <w:rFonts w:ascii="Times New Roman" w:hAnsi="Times New Roman" w:cs="Times New Roman"/>
+          <w:lang w:val="es-ES"/>
+        </w:rPr>
+        <w:t>paper</w:t>
+      </w:r>
+      <w:proofErr w:type="spellEnd"/>
+      <w:r>
+        <w:rPr>
+          <w:rFonts w:ascii="Times New Roman" w:hAnsi="Times New Roman" w:cs="Times New Roman"/>
+          <w:lang w:val="es-ES"/>
+        </w:rPr>
+        <w:t xml:space="preserve"> crear tenían nombres que ya eran utilizados por otro </w:t>
+      </w:r>
+      <w:proofErr w:type="gramStart"/>
+      <w:r>
+        <w:rPr>
+          <w:rFonts w:ascii="Times New Roman" w:hAnsi="Times New Roman" w:cs="Times New Roman"/>
+          <w:lang w:val="es-ES"/>
+        </w:rPr>
+        <w:t>programa  (</w:t>
+      </w:r>
+      <w:proofErr w:type="gramEnd"/>
+      <w:r>
+        <w:rPr>
+          <w:rFonts w:ascii="Times New Roman" w:hAnsi="Times New Roman" w:cs="Times New Roman"/>
+          <w:lang w:val="es-ES"/>
+        </w:rPr>
+        <w:t xml:space="preserve">SQL). Entonces al correr, el programa encontraba un error fatal y decía que esa variable ya estaba siendo utilizada por </w:t>
+      </w:r>
+      <w:proofErr w:type="spellStart"/>
+      <w:r>
+        <w:rPr>
+          <w:rFonts w:ascii="Times New Roman" w:hAnsi="Times New Roman" w:cs="Times New Roman"/>
+          <w:lang w:val="es-ES"/>
+        </w:rPr>
+        <w:t>PostGres</w:t>
+      </w:r>
+      <w:proofErr w:type="spellEnd"/>
+      <w:r>
+        <w:rPr>
+          <w:rFonts w:ascii="Times New Roman" w:hAnsi="Times New Roman" w:cs="Times New Roman"/>
+          <w:lang w:val="es-ES"/>
+        </w:rPr>
+        <w:t xml:space="preserve">. La solución fue desinstalar </w:t>
+      </w:r>
+      <w:proofErr w:type="spellStart"/>
+      <w:r>
+        <w:rPr>
+          <w:rFonts w:ascii="Times New Roman" w:hAnsi="Times New Roman" w:cs="Times New Roman"/>
+          <w:lang w:val="es-ES"/>
+        </w:rPr>
+        <w:t>PostGres</w:t>
+      </w:r>
+      <w:proofErr w:type="spellEnd"/>
+      <w:r>
+        <w:rPr>
+          <w:rFonts w:ascii="Times New Roman" w:hAnsi="Times New Roman" w:cs="Times New Roman"/>
+          <w:lang w:val="es-ES"/>
+        </w:rPr>
+        <w:t xml:space="preserve"> dado que no era de uso frecuente, pero una mejor solución habría sido cambiar el nombre de esta variable de entorno en todos los scripts y generar un nuevo nombre al que llamar. </w:t>
       </w:r>
     </w:p>
     <w:p>
@@ -3723,7 +4724,23 @@
           <w:rFonts w:ascii="Times New Roman" w:hAnsi="Times New Roman" w:cs="Times New Roman"/>
           <w:lang w:val="es-ES"/>
         </w:rPr>
-        <w:t>Realizar commits frecuentes en el repositorio.</w:t>
+        <w:t xml:space="preserve">Realizar </w:t>
+      </w:r>
+      <w:proofErr w:type="spellStart"/>
+      <w:r>
+        <w:rPr>
+          <w:rFonts w:ascii="Times New Roman" w:hAnsi="Times New Roman" w:cs="Times New Roman"/>
+          <w:lang w:val="es-ES"/>
+        </w:rPr>
+        <w:t>commits</w:t>
+      </w:r>
+      <w:proofErr w:type="spellEnd"/>
+      <w:r>
+        <w:rPr>
+          <w:rFonts w:ascii="Times New Roman" w:hAnsi="Times New Roman" w:cs="Times New Roman"/>
+          <w:lang w:val="es-ES"/>
+        </w:rPr>
+        <w:t xml:space="preserve"> frecuentes en el repositorio.</w:t>
       </w:r>
     </w:p>
     <w:p>
@@ -3756,6 +4773,7 @@
           <w:lang w:val="es-ES"/>
         </w:rPr>
       </w:pPr>
+      <w:proofErr w:type="gramStart"/>
       <w:r>
         <w:rPr>
           <w:rFonts w:ascii="Times New Roman" w:hAnsi="Times New Roman" w:cs="Times New Roman"/>
@@ -3763,6 +4781,7 @@
         </w:rPr>
         <w:t>Componentes a Evaluar</w:t>
       </w:r>
+      <w:proofErr w:type="gramEnd"/>
     </w:p>
     <w:p>
       <w:pPr>
@@ -3801,12 +4820,21 @@
           <w:lang w:val="es-ES"/>
         </w:rPr>
       </w:pPr>
-      <w:r>
-        <w:rPr>
-          <w:rFonts w:ascii="Times New Roman" w:hAnsi="Times New Roman" w:cs="Times New Roman"/>
-          <w:lang w:val="es-ES"/>
-        </w:rPr>
-        <w:t>Commits regulares con mensajes descriptivos coherentes con el proceso de investigación.</w:t>
+      <w:proofErr w:type="spellStart"/>
+      <w:r>
+        <w:rPr>
+          <w:rFonts w:ascii="Times New Roman" w:hAnsi="Times New Roman" w:cs="Times New Roman"/>
+          <w:lang w:val="es-ES"/>
+        </w:rPr>
+        <w:t>Commits</w:t>
+      </w:r>
+      <w:proofErr w:type="spellEnd"/>
+      <w:r>
+        <w:rPr>
+          <w:rFonts w:ascii="Times New Roman" w:hAnsi="Times New Roman" w:cs="Times New Roman"/>
+          <w:lang w:val="es-ES"/>
+        </w:rPr>
+        <w:t xml:space="preserve"> regulares con mensajes descriptivos coherentes con el proceso de investigación.</w:t>
       </w:r>
     </w:p>
     <w:p>
@@ -4172,6 +5200,66 @@
             <w:lang w:val="es-ES"/>
           </w:rPr>
           <w:t>link</w:t>
+        </w:r>
+      </w:hyperlink>
+    </w:p>
+  </w:footnote>
+  <w:footnote w:id="2">
+    <w:p>
+      <w:pPr>
+        <w:pStyle w:val="FootnoteText"/>
+        <w:rPr>
+          <w:lang w:val="es-ES"/>
+        </w:rPr>
+      </w:pPr>
+      <w:r>
+        <w:rPr>
+          <w:rStyle w:val="FootnoteReference"/>
+        </w:rPr>
+        <w:footnoteRef/>
+      </w:r>
+      <w:r>
+        <w:rPr>
+          <w:lang w:val="es-ES"/>
+        </w:rPr>
+        <w:t xml:space="preserve"> </w:t>
+      </w:r>
+      <w:r>
+        <w:rPr>
+          <w:rFonts w:ascii="Times New Roman" w:hAnsi="Times New Roman" w:cs="Times New Roman"/>
+          <w:lang w:val="es-ES"/>
+        </w:rPr>
+        <w:t>DOI de</w:t>
+      </w:r>
+      <w:r>
+        <w:rPr>
+          <w:rFonts w:ascii="Times New Roman" w:hAnsi="Times New Roman" w:cs="Times New Roman"/>
+          <w:lang w:val="es-ES"/>
+        </w:rPr>
+        <w:t>l Zenodo asociado al</w:t>
+      </w:r>
+      <w:r>
+        <w:rPr>
+          <w:rFonts w:ascii="Times New Roman" w:hAnsi="Times New Roman" w:cs="Times New Roman"/>
+          <w:lang w:val="es-ES"/>
+        </w:rPr>
+        <w:t xml:space="preserve"> proyecto original:</w:t>
+      </w:r>
+      <w:r>
+        <w:rPr>
+          <w:rFonts w:ascii="Times New Roman" w:hAnsi="Times New Roman" w:cs="Times New Roman"/>
+          <w:lang w:val="es-ES"/>
+        </w:rPr>
+        <w:t xml:space="preserve"> </w:t>
+      </w:r>
+      <w:hyperlink r:id="rId2" w:history="1">
+        <w:r>
+          <w:rPr>
+            <w:rStyle w:val="Hyperlink"/>
+            <w:rFonts w:ascii="Times New Roman" w:hAnsi="Times New Roman" w:cs="Times New Roman"/>
+            <w:lang w:val="es-ES"/>
+          </w:rPr>
+          <w:t>https://doi.org/10.5281/zenodo.5099834</w:t>
         </w:r>
       </w:hyperlink>
     </w:p>
@@ -5002,7 +6090,6 @@
   <w:style w:type="character" w:default="1" w:styleId="DefaultParagraphFont">
     <w:name w:val="Default Paragraph Font"/>
     <w:uiPriority w:val="1"/>
-    <w:semiHidden/>
     <w:unhideWhenUsed/>
   </w:style>
   <w:style w:type="table" w:default="1" w:styleId="TableNormal">

</xml_diff>

<commit_message>
Corrección metodología de reproducción pt.1
</commit_message>
<xml_diff>
--- a/documents/proyecto_transversal_grupo1.docx
+++ b/documents/proyecto_transversal_grupo1.docx
@@ -1539,14 +1539,7 @@
           <w:rFonts w:ascii="Times New Roman" w:hAnsi="Times New Roman" w:cs="Times New Roman"/>
           <w:lang w:val="es-ES"/>
         </w:rPr>
-        <w:t>D</w:t>
-      </w:r>
-      <w:r>
-        <w:rPr>
-          <w:rFonts w:ascii="Times New Roman" w:hAnsi="Times New Roman" w:cs="Times New Roman"/>
-          <w:lang w:val="es-ES"/>
-        </w:rPr>
-        <w:t>ataset</w:t>
+        <w:t>Dataset</w:t>
       </w:r>
       <w:proofErr w:type="spellEnd"/>
       <w:r>
@@ -1592,14 +1585,7 @@
           <w:rFonts w:ascii="Times New Roman" w:hAnsi="Times New Roman" w:cs="Times New Roman"/>
           <w:lang w:val="es-ES"/>
         </w:rPr>
-        <w:t>D</w:t>
-      </w:r>
-      <w:r>
-        <w:rPr>
-          <w:rFonts w:ascii="Times New Roman" w:hAnsi="Times New Roman" w:cs="Times New Roman"/>
-          <w:lang w:val="es-ES"/>
-        </w:rPr>
-        <w:t>ataset</w:t>
+        <w:t>Dataset</w:t>
       </w:r>
       <w:proofErr w:type="spellEnd"/>
       <w:r>
@@ -1759,21 +1745,19 @@
         </w:rPr>
         <w:t xml:space="preserve">generación y análisis de datos del </w:t>
       </w:r>
-      <w:proofErr w:type="spellStart"/>
-      <w:r>
-        <w:rPr>
-          <w:rFonts w:ascii="Times New Roman" w:hAnsi="Times New Roman" w:cs="Times New Roman"/>
-          <w:lang w:val="es-ES"/>
-        </w:rPr>
-        <w:t>paper</w:t>
-      </w:r>
-      <w:proofErr w:type="spellEnd"/>
-      <w:r>
-        <w:rPr>
-          <w:rFonts w:ascii="Times New Roman" w:hAnsi="Times New Roman" w:cs="Times New Roman"/>
-          <w:lang w:val="es-ES"/>
-        </w:rPr>
-        <w:t xml:space="preserve"> original</w:t>
+      <w:r>
+        <w:rPr>
+          <w:rFonts w:ascii="Times New Roman" w:hAnsi="Times New Roman" w:cs="Times New Roman"/>
+          <w:lang w:val="es-ES"/>
+        </w:rPr>
+        <w:t>P</w:t>
+      </w:r>
+      <w:r>
+        <w:rPr>
+          <w:rFonts w:ascii="Times New Roman" w:hAnsi="Times New Roman" w:cs="Times New Roman"/>
+          <w:lang w:val="es-ES"/>
+        </w:rPr>
+        <w:t>aper original</w:t>
       </w:r>
       <w:r>
         <w:rPr>
@@ -2319,6 +2303,11 @@
     </w:p>
     <w:p>
       <w:pPr>
+        <w:pStyle w:val="ListParagraph"/>
+        <w:numPr>
+          <w:ilvl w:val="0"/>
+          <w:numId w:val="1"/>
+        </w:numPr>
         <w:rPr>
           <w:rFonts w:ascii="Times New Roman" w:hAnsi="Times New Roman" w:cs="Times New Roman"/>
           <w:b/>
@@ -2333,7 +2322,7 @@
           <w:bCs/>
           <w:lang w:val="es-ES"/>
         </w:rPr>
-        <w:t>2. Metodología de Reproducción (30%)</w:t>
+        <w:t>Metodología de Reproducción</w:t>
       </w:r>
     </w:p>
     <w:p>
@@ -2376,24 +2365,42 @@
           <w:rFonts w:ascii="Times New Roman" w:hAnsi="Times New Roman" w:cs="Times New Roman"/>
           <w:lang w:val="es-ES"/>
         </w:rPr>
-        <w:br/>
-        <w:t xml:space="preserve">La estrategia de reproducción se basó en replicar las primeras etapas del flujo de trabajo computacional del estudio, específicamente los </w:t>
-      </w:r>
-      <w:proofErr w:type="spellStart"/>
-      <w:r>
-        <w:rPr>
-          <w:rFonts w:ascii="Times New Roman" w:hAnsi="Times New Roman" w:cs="Times New Roman"/>
-          <w:lang w:val="es-ES"/>
-        </w:rPr>
-        <w:t>Steps</w:t>
-      </w:r>
-      <w:proofErr w:type="spellEnd"/>
-      <w:r>
-        <w:rPr>
-          <w:rFonts w:ascii="Times New Roman" w:hAnsi="Times New Roman" w:cs="Times New Roman"/>
-          <w:lang w:val="es-ES"/>
-        </w:rPr>
-        <w:t xml:space="preserve"> 1 y 2 del repositorio del proyecto, que corresponden a la construcción del </w:t>
+        <w:t>Como se mencionó anteriormente, l</w:t>
+      </w:r>
+      <w:r>
+        <w:rPr>
+          <w:rFonts w:ascii="Times New Roman" w:hAnsi="Times New Roman" w:cs="Times New Roman"/>
+          <w:lang w:val="es-ES"/>
+        </w:rPr>
+        <w:t>a estrategia de reproducción se basó en replicar las primeras etapas del flujo de trabajo computacional del estudi</w:t>
+      </w:r>
+      <w:r>
+        <w:rPr>
+          <w:rFonts w:ascii="Times New Roman" w:hAnsi="Times New Roman" w:cs="Times New Roman"/>
+          <w:lang w:val="es-ES"/>
+        </w:rPr>
+        <w:t>o, c</w:t>
+      </w:r>
+      <w:r>
+        <w:rPr>
+          <w:rFonts w:ascii="Times New Roman" w:hAnsi="Times New Roman" w:cs="Times New Roman"/>
+          <w:lang w:val="es-ES"/>
+        </w:rPr>
+        <w:t>orrespond</w:t>
+      </w:r>
+      <w:r>
+        <w:rPr>
+          <w:rFonts w:ascii="Times New Roman" w:hAnsi="Times New Roman" w:cs="Times New Roman"/>
+          <w:lang w:val="es-ES"/>
+        </w:rPr>
+        <w:t xml:space="preserve">ientes </w:t>
+      </w:r>
+      <w:r>
+        <w:rPr>
+          <w:rFonts w:ascii="Times New Roman" w:hAnsi="Times New Roman" w:cs="Times New Roman"/>
+          <w:lang w:val="es-ES"/>
+        </w:rPr>
+        <w:t xml:space="preserve">a la construcción del </w:t>
       </w:r>
       <w:proofErr w:type="spellStart"/>
       <w:r>
@@ -2511,29 +2518,7 @@
           <w:rFonts w:ascii="Times New Roman" w:hAnsi="Times New Roman" w:cs="Times New Roman"/>
           <w:lang w:val="es-ES"/>
         </w:rPr>
-        <w:t xml:space="preserve"> Especificaciones técnicas y configuración</w:t>
-      </w:r>
-      <w:r>
-        <w:rPr>
-          <w:rFonts w:ascii="Times New Roman" w:hAnsi="Times New Roman" w:cs="Times New Roman"/>
-          <w:lang w:val="es-ES"/>
-        </w:rPr>
-        <w:t>.</w:t>
-      </w:r>
-    </w:p>
-    <w:p>
-      <w:pPr>
-        <w:rPr>
-          <w:rFonts w:ascii="Times New Roman" w:hAnsi="Times New Roman" w:cs="Times New Roman"/>
-          <w:lang w:val="es-ES"/>
-        </w:rPr>
-      </w:pPr>
-      <w:r>
-        <w:rPr>
-          <w:rFonts w:ascii="Times New Roman" w:hAnsi="Times New Roman" w:cs="Times New Roman"/>
-          <w:lang w:val="es-ES"/>
-        </w:rPr>
-        <w:t>Para la reproducción se utilizó el entorno computacional propuesto en el repositorio original del estudio</w:t>
+        <w:t xml:space="preserve"> Para la reproducción se utilizó el entorno computacional propuesto en el repositorio original del estudio</w:t>
       </w:r>
       <w:r>
         <w:rPr>
@@ -2609,6 +2594,83 @@
     </w:p>
     <w:p>
       <w:pPr>
+        <w:jc w:val="center"/>
+        <w:rPr>
+          <w:rFonts w:ascii="Times New Roman" w:hAnsi="Times New Roman" w:cs="Times New Roman"/>
+          <w:i/>
+          <w:iCs/>
+          <w:sz w:val="16"/>
+          <w:szCs w:val="16"/>
+          <w:lang w:val="es-ES"/>
+        </w:rPr>
+      </w:pPr>
+      <w:r>
+        <w:rPr>
+          <w:rFonts w:ascii="Times New Roman" w:hAnsi="Times New Roman" w:cs="Times New Roman"/>
+          <w:i/>
+          <w:iCs/>
+          <w:sz w:val="16"/>
+          <w:szCs w:val="16"/>
+          <w:lang w:val="es-ES"/>
+        </w:rPr>
+        <w:t>Fig.</w:t>
+      </w:r>
+      <w:r>
+        <w:rPr>
+          <w:rFonts w:ascii="Times New Roman" w:hAnsi="Times New Roman" w:cs="Times New Roman"/>
+          <w:i/>
+          <w:iCs/>
+          <w:sz w:val="16"/>
+          <w:szCs w:val="16"/>
+          <w:lang w:val="es-ES"/>
+        </w:rPr>
+        <w:t>2</w:t>
+      </w:r>
+      <w:r>
+        <w:rPr>
+          <w:rFonts w:ascii="Times New Roman" w:hAnsi="Times New Roman" w:cs="Times New Roman"/>
+          <w:i/>
+          <w:iCs/>
+          <w:sz w:val="16"/>
+          <w:szCs w:val="16"/>
+          <w:lang w:val="es-ES"/>
+        </w:rPr>
+        <w:t xml:space="preserve"> </w:t>
+      </w:r>
+      <w:r>
+        <w:rPr>
+          <w:rFonts w:ascii="Times New Roman" w:hAnsi="Times New Roman" w:cs="Times New Roman"/>
+          <w:i/>
+          <w:iCs/>
+          <w:sz w:val="16"/>
+          <w:szCs w:val="16"/>
+          <w:lang w:val="es-ES"/>
+        </w:rPr>
+        <w:t xml:space="preserve">Pipeline inicial: configuración del entorno computacional, siguiendo </w:t>
+      </w:r>
+      <w:r>
+        <w:rPr>
+          <w:rFonts w:ascii="Times New Roman" w:hAnsi="Times New Roman" w:cs="Times New Roman"/>
+          <w:i/>
+          <w:iCs/>
+          <w:sz w:val="16"/>
+          <w:szCs w:val="16"/>
+          <w:lang w:val="es-ES"/>
+        </w:rPr>
+        <w:t>modelo sugerido por los autores</w:t>
+      </w:r>
+    </w:p>
+    <w:p>
+      <w:pPr>
+        <w:jc w:val="center"/>
+        <w:rPr>
+          <w:rFonts w:ascii="Times New Roman" w:hAnsi="Times New Roman" w:cs="Times New Roman"/>
+          <w:lang w:val="es-ES"/>
+        </w:rPr>
+      </w:pPr>
+    </w:p>
+    <w:p>
+      <w:pPr>
         <w:jc w:val="both"/>
         <w:rPr>
           <w:rFonts w:ascii="Times New Roman" w:hAnsi="Times New Roman" w:cs="Times New Roman"/>
@@ -2620,17 +2682,36 @@
           <w:rFonts w:ascii="Times New Roman" w:hAnsi="Times New Roman" w:cs="Times New Roman"/>
           <w:lang w:val="es-ES"/>
         </w:rPr>
-        <w:t>En primer lugar, se clonó el repositorio del proyecto desde GitHub y se configuró el entorno de trabajo utilizando Conda, que permite gestionar dependencias y librerías necesarias para ejecutar el código.</w:t>
-      </w:r>
-    </w:p>
-    <w:p>
-      <w:pPr>
-        <w:jc w:val="both"/>
-        <w:rPr>
-          <w:rFonts w:ascii="Times New Roman" w:hAnsi="Times New Roman" w:cs="Times New Roman"/>
-          <w:lang w:val="es-ES"/>
-        </w:rPr>
-      </w:pPr>
+        <w:t>Como se observa en la figura 2, e</w:t>
+      </w:r>
+      <w:r>
+        <w:rPr>
+          <w:rFonts w:ascii="Times New Roman" w:hAnsi="Times New Roman" w:cs="Times New Roman"/>
+          <w:lang w:val="es-ES"/>
+        </w:rPr>
+        <w:t>n primer luga</w:t>
+      </w:r>
+      <w:r>
+        <w:rPr>
+          <w:rFonts w:ascii="Times New Roman" w:hAnsi="Times New Roman" w:cs="Times New Roman"/>
+          <w:lang w:val="es-ES"/>
+        </w:rPr>
+        <w:t>r</w:t>
+      </w:r>
+      <w:r>
+        <w:rPr>
+          <w:rFonts w:ascii="Times New Roman" w:hAnsi="Times New Roman" w:cs="Times New Roman"/>
+          <w:lang w:val="es-ES"/>
+        </w:rPr>
+        <w:t xml:space="preserve"> se clonó el repositorio del proyecto desde GitHub y se configuró el entorno de trabajo utilizando Conda.</w:t>
+      </w:r>
+      <w:r>
+        <w:rPr>
+          <w:rFonts w:ascii="Times New Roman" w:hAnsi="Times New Roman" w:cs="Times New Roman"/>
+          <w:lang w:val="es-ES"/>
+        </w:rPr>
+        <w:t xml:space="preserve"> </w:t>
+      </w:r>
       <w:r>
         <w:rPr>
           <w:rFonts w:ascii="Times New Roman" w:hAnsi="Times New Roman" w:cs="Times New Roman"/>
@@ -2641,7 +2722,7 @@
     </w:p>
     <w:p>
       <w:pPr>
-        <w:jc w:val="both"/>
+        <w:jc w:val="center"/>
         <w:rPr>
           <w:rFonts w:ascii="Times New Roman" w:hAnsi="Times New Roman" w:cs="Times New Roman"/>
           <w:lang w:val="es-ES"/>
@@ -2692,6 +2773,59 @@
     </w:p>
     <w:p>
       <w:pPr>
+        <w:jc w:val="center"/>
+        <w:rPr>
+          <w:rFonts w:ascii="Times New Roman" w:hAnsi="Times New Roman" w:cs="Times New Roman"/>
+          <w:lang w:val="es-ES"/>
+        </w:rPr>
+      </w:pPr>
+      <w:r>
+        <w:rPr>
+          <w:rFonts w:ascii="Times New Roman" w:hAnsi="Times New Roman" w:cs="Times New Roman"/>
+          <w:i/>
+          <w:iCs/>
+          <w:sz w:val="16"/>
+          <w:szCs w:val="16"/>
+          <w:lang w:val="es-ES"/>
+        </w:rPr>
+        <w:t>Fig.</w:t>
+      </w:r>
+      <w:r>
+        <w:rPr>
+          <w:rFonts w:ascii="Times New Roman" w:hAnsi="Times New Roman" w:cs="Times New Roman"/>
+          <w:i/>
+          <w:iCs/>
+          <w:sz w:val="16"/>
+          <w:szCs w:val="16"/>
+          <w:lang w:val="es-ES"/>
+        </w:rPr>
+        <w:t>3</w:t>
+      </w:r>
+      <w:r>
+        <w:rPr>
+          <w:rFonts w:ascii="Times New Roman" w:hAnsi="Times New Roman" w:cs="Times New Roman"/>
+          <w:i/>
+          <w:iCs/>
+          <w:sz w:val="16"/>
+          <w:szCs w:val="16"/>
+          <w:lang w:val="es-ES"/>
+        </w:rPr>
+        <w:t xml:space="preserve"> </w:t>
+      </w:r>
+      <w:r>
+        <w:rPr>
+          <w:rFonts w:ascii="Times New Roman" w:hAnsi="Times New Roman" w:cs="Times New Roman"/>
+          <w:i/>
+          <w:iCs/>
+          <w:sz w:val="16"/>
+          <w:szCs w:val="16"/>
+          <w:lang w:val="es-ES"/>
+        </w:rPr>
+        <w:t>Configuración del entorno de trabajo utilizando Conda.</w:t>
+      </w:r>
+    </w:p>
+    <w:p>
+      <w:pPr>
         <w:jc w:val="both"/>
         <w:rPr>
           <w:rFonts w:ascii="Times New Roman" w:hAnsi="Times New Roman" w:cs="Times New Roman"/>
@@ -2703,35 +2837,35 @@
           <w:rFonts w:ascii="Times New Roman" w:hAnsi="Times New Roman" w:cs="Times New Roman"/>
           <w:lang w:val="es-ES"/>
         </w:rPr>
-        <w:t xml:space="preserve">Una vez configurado el entorno, se definieron las rutas de trabajo para los datos y resultados del proyecto, asegurando que los scripts pudieran acceder correctamente a los archivos necesarios. </w:t>
-      </w:r>
-      <w:r>
-        <w:rPr>
-          <w:rFonts w:ascii="Times New Roman" w:hAnsi="Times New Roman" w:cs="Times New Roman"/>
-          <w:lang w:val="es-ES"/>
-        </w:rPr>
-        <w:t xml:space="preserve">Sin embargo, </w:t>
-      </w:r>
-      <w:r>
-        <w:rPr>
-          <w:rFonts w:ascii="Times New Roman" w:hAnsi="Times New Roman" w:cs="Times New Roman"/>
-          <w:lang w:val="es-ES"/>
-        </w:rPr>
-        <w:t>las rutas de trabajo debían</w:t>
-      </w:r>
-      <w:r>
-        <w:rPr>
-          <w:rFonts w:ascii="Times New Roman" w:hAnsi="Times New Roman" w:cs="Times New Roman"/>
-          <w:lang w:val="es-ES"/>
-        </w:rPr>
-        <w:t xml:space="preserve"> configurarse cómo variables de entorno </w:t>
-      </w:r>
-      <w:r>
-        <w:rPr>
-          <w:rFonts w:ascii="Times New Roman" w:hAnsi="Times New Roman" w:cs="Times New Roman"/>
-          <w:lang w:val="es-ES"/>
-        </w:rPr>
-        <w:t xml:space="preserve">del sistema; por lo que no en todos nuestros computadores esto fue óptimo dado que nombres de variables calve eran compartidos por otros programas en particular de SQL. </w:t>
+        <w:t>Una vez configurado el entorno, se establecieron las rutas de trabajo para los datos y los resultados del proyecto, garantizando que los scripts pudieran acceder correctamente a todos los archivos necesarios. No obstante, estas rutas debían definirse como variables de entorno del sistema, lo que generó dificultades en algunos de los computadores. En particular, ciertos nombres de variables clave ya estaban siendo utilizados por otros programas</w:t>
+      </w:r>
+      <w:r>
+        <w:rPr>
+          <w:rFonts w:ascii="Times New Roman" w:hAnsi="Times New Roman" w:cs="Times New Roman"/>
+          <w:lang w:val="es-ES"/>
+        </w:rPr>
+        <w:t xml:space="preserve">, </w:t>
+      </w:r>
+      <w:r>
+        <w:rPr>
+          <w:rFonts w:ascii="Times New Roman" w:hAnsi="Times New Roman" w:cs="Times New Roman"/>
+          <w:lang w:val="es-ES"/>
+        </w:rPr>
+        <w:t>especialmente aquellos relacionados con SQL, lo que impidió una configuración óptima y uniforme entre los</w:t>
+      </w:r>
+      <w:r>
+        <w:rPr>
+          <w:rFonts w:ascii="Times New Roman" w:hAnsi="Times New Roman" w:cs="Times New Roman"/>
+          <w:lang w:val="es-ES"/>
+        </w:rPr>
+        <w:t xml:space="preserve"> dispositivos del</w:t>
+      </w:r>
+      <w:r>
+        <w:rPr>
+          <w:rFonts w:ascii="Times New Roman" w:hAnsi="Times New Roman" w:cs="Times New Roman"/>
+          <w:lang w:val="es-ES"/>
+        </w:rPr>
+        <w:t xml:space="preserve"> equipo.</w:t>
       </w:r>
     </w:p>
     <w:p>
@@ -2753,13 +2887,20 @@
     <w:p>
       <w:pPr>
         <w:jc w:val="both"/>
+        <w:rPr>
+          <w:rFonts w:ascii="Times New Roman" w:hAnsi="Times New Roman" w:cs="Times New Roman"/>
+          <w:lang w:val="es-ES"/>
+        </w:rPr>
+      </w:pPr>
+      <w:r>
         <w:rPr>
           <w:rFonts w:ascii="Times New Roman" w:hAnsi="Times New Roman" w:cs="Times New Roman"/>
           <w:b/>
           <w:bCs/>
           <w:lang w:val="es-ES"/>
         </w:rPr>
-      </w:pPr>
+        <w:t xml:space="preserve">Procesamiento </w:t>
+      </w:r>
       <w:r>
         <w:rPr>
           <w:rFonts w:ascii="Times New Roman" w:hAnsi="Times New Roman" w:cs="Times New Roman"/>
@@ -2767,7 +2908,7 @@
           <w:bCs/>
           <w:lang w:val="es-ES"/>
         </w:rPr>
-        <w:t>Procesamiento de datos: Descripción de las transformaciones y análisis realizados</w:t>
+        <w:t xml:space="preserve">y configuración </w:t>
       </w:r>
       <w:r>
         <w:rPr>
@@ -2776,23 +2917,83 @@
           <w:bCs/>
           <w:lang w:val="es-ES"/>
         </w:rPr>
-        <w:t xml:space="preserve">. </w:t>
-      </w:r>
-    </w:p>
-    <w:p>
-      <w:pPr>
-        <w:jc w:val="both"/>
-        <w:rPr>
-          <w:rFonts w:ascii="Times New Roman" w:hAnsi="Times New Roman" w:cs="Times New Roman"/>
-          <w:lang w:val="es-ES"/>
-        </w:rPr>
-      </w:pPr>
-      <w:r>
-        <w:rPr>
-          <w:rFonts w:ascii="Times New Roman" w:hAnsi="Times New Roman" w:cs="Times New Roman"/>
-          <w:lang w:val="es-ES"/>
-        </w:rPr>
-        <w:t xml:space="preserve">Para poder comprender, después de descargar los datos de </w:t>
+        <w:t xml:space="preserve">de datos: Descripción de las transformaciones y </w:t>
+      </w:r>
+      <w:r>
+        <w:rPr>
+          <w:rFonts w:ascii="Times New Roman" w:hAnsi="Times New Roman" w:cs="Times New Roman"/>
+          <w:b/>
+          <w:bCs/>
+          <w:lang w:val="es-ES"/>
+        </w:rPr>
+        <w:t>construcciones</w:t>
+      </w:r>
+      <w:r>
+        <w:rPr>
+          <w:rFonts w:ascii="Times New Roman" w:hAnsi="Times New Roman" w:cs="Times New Roman"/>
+          <w:b/>
+          <w:bCs/>
+          <w:lang w:val="es-ES"/>
+        </w:rPr>
+        <w:t xml:space="preserve"> realizad</w:t>
+      </w:r>
+      <w:r>
+        <w:rPr>
+          <w:rFonts w:ascii="Times New Roman" w:hAnsi="Times New Roman" w:cs="Times New Roman"/>
+          <w:b/>
+          <w:bCs/>
+          <w:lang w:val="es-ES"/>
+        </w:rPr>
+        <w:t xml:space="preserve">as. </w:t>
+      </w:r>
+      <w:r>
+        <w:rPr>
+          <w:rFonts w:ascii="Times New Roman" w:hAnsi="Times New Roman" w:cs="Times New Roman"/>
+          <w:lang w:val="es-ES"/>
+        </w:rPr>
+        <w:t xml:space="preserve">La figura 4 </w:t>
+      </w:r>
+      <w:r>
+        <w:rPr>
+          <w:rFonts w:ascii="Times New Roman" w:hAnsi="Times New Roman" w:cs="Times New Roman"/>
+          <w:lang w:val="es-ES"/>
+        </w:rPr>
+        <w:t>muestra l</w:t>
+      </w:r>
+      <w:r>
+        <w:rPr>
+          <w:rFonts w:ascii="Times New Roman" w:hAnsi="Times New Roman" w:cs="Times New Roman"/>
+          <w:lang w:val="es-ES"/>
+        </w:rPr>
+        <w:t xml:space="preserve">a </w:t>
+      </w:r>
+      <w:r>
+        <w:rPr>
+          <w:rFonts w:ascii="Times New Roman" w:hAnsi="Times New Roman" w:cs="Times New Roman"/>
+          <w:lang w:val="es-ES"/>
+        </w:rPr>
+        <w:t>estructura básica del estudio</w:t>
+      </w:r>
+      <w:r>
+        <w:rPr>
+          <w:rFonts w:ascii="Times New Roman" w:hAnsi="Times New Roman" w:cs="Times New Roman"/>
+          <w:lang w:val="es-ES"/>
+        </w:rPr>
+        <w:t>, construida v</w:t>
+      </w:r>
+      <w:r>
+        <w:rPr>
+          <w:rFonts w:ascii="Times New Roman" w:hAnsi="Times New Roman" w:cs="Times New Roman"/>
+          <w:lang w:val="es-ES"/>
+        </w:rPr>
+        <w:t>í</w:t>
+      </w:r>
+      <w:r>
+        <w:rPr>
+          <w:rFonts w:ascii="Times New Roman" w:hAnsi="Times New Roman" w:cs="Times New Roman"/>
+          <w:lang w:val="es-ES"/>
+        </w:rPr>
+        <w:t xml:space="preserve">a </w:t>
       </w:r>
       <w:proofErr w:type="spellStart"/>
       <w:r>
@@ -2800,7 +3001,7 @@
           <w:rFonts w:ascii="Times New Roman" w:hAnsi="Times New Roman" w:cs="Times New Roman"/>
           <w:lang w:val="es-ES"/>
         </w:rPr>
-        <w:t>Zenodo</w:t>
+        <w:t>mermaid</w:t>
       </w:r>
       <w:proofErr w:type="spellEnd"/>
       <w:r>
@@ -2808,30 +3009,21 @@
           <w:rFonts w:ascii="Times New Roman" w:hAnsi="Times New Roman" w:cs="Times New Roman"/>
           <w:lang w:val="es-ES"/>
         </w:rPr>
-        <w:t xml:space="preserve"> </w:t>
-      </w:r>
-      <w:r>
-        <w:rPr>
-          <w:rFonts w:ascii="Times New Roman" w:hAnsi="Times New Roman" w:cs="Times New Roman"/>
-          <w:lang w:val="es-ES"/>
-        </w:rPr>
-        <w:t xml:space="preserve">y leer el repositorio, la estructura básica del estudio se construyó el siguiente </w:t>
-      </w:r>
-      <w:proofErr w:type="spellStart"/>
-      <w:r>
-        <w:rPr>
-          <w:rFonts w:ascii="Times New Roman" w:hAnsi="Times New Roman" w:cs="Times New Roman"/>
-          <w:lang w:val="es-ES"/>
-        </w:rPr>
-        <w:t>mermaid</w:t>
-      </w:r>
-      <w:proofErr w:type="spellEnd"/>
-      <w:r>
-        <w:rPr>
-          <w:rFonts w:ascii="Times New Roman" w:hAnsi="Times New Roman" w:cs="Times New Roman"/>
-          <w:lang w:val="es-ES"/>
-        </w:rPr>
-        <w:t>.</w:t>
+        <w:t>, p</w:t>
+      </w:r>
+      <w:r>
+        <w:rPr>
+          <w:rFonts w:ascii="Times New Roman" w:hAnsi="Times New Roman" w:cs="Times New Roman"/>
+          <w:lang w:val="es-ES"/>
+        </w:rPr>
+        <w:t>ara poder comprender</w:t>
+      </w:r>
+      <w:r>
+        <w:rPr>
+          <w:rFonts w:ascii="Times New Roman" w:hAnsi="Times New Roman" w:cs="Times New Roman"/>
+          <w:lang w:val="es-ES"/>
+        </w:rPr>
+        <w:t xml:space="preserve"> la organización completa del repositorio y entender el pipeline completo.</w:t>
       </w:r>
     </w:p>
     <w:p>
@@ -2839,6 +3031,10 @@
         <w:jc w:val="center"/>
         <w:rPr>
           <w:rFonts w:ascii="Times New Roman" w:hAnsi="Times New Roman" w:cs="Times New Roman"/>
+          <w:i/>
+          <w:iCs/>
+          <w:sz w:val="16"/>
+          <w:szCs w:val="16"/>
           <w:lang w:val="es-ES"/>
         </w:rPr>
       </w:pPr>
@@ -2900,6 +3096,68 @@
     </w:p>
     <w:p>
       <w:pPr>
+        <w:jc w:val="center"/>
+        <w:rPr>
+          <w:rFonts w:ascii="Times New Roman" w:hAnsi="Times New Roman" w:cs="Times New Roman"/>
+          <w:lang w:val="es-ES"/>
+        </w:rPr>
+      </w:pPr>
+      <w:r>
+        <w:rPr>
+          <w:rFonts w:ascii="Times New Roman" w:hAnsi="Times New Roman" w:cs="Times New Roman"/>
+          <w:i/>
+          <w:iCs/>
+          <w:sz w:val="16"/>
+          <w:szCs w:val="16"/>
+          <w:lang w:val="es-ES"/>
+        </w:rPr>
+        <w:t>Fig.</w:t>
+      </w:r>
+      <w:r>
+        <w:rPr>
+          <w:rFonts w:ascii="Times New Roman" w:hAnsi="Times New Roman" w:cs="Times New Roman"/>
+          <w:i/>
+          <w:iCs/>
+          <w:sz w:val="16"/>
+          <w:szCs w:val="16"/>
+          <w:lang w:val="es-ES"/>
+        </w:rPr>
+        <w:t>4</w:t>
+      </w:r>
+      <w:r>
+        <w:rPr>
+          <w:rFonts w:ascii="Times New Roman" w:hAnsi="Times New Roman" w:cs="Times New Roman"/>
+          <w:i/>
+          <w:iCs/>
+          <w:sz w:val="16"/>
+          <w:szCs w:val="16"/>
+          <w:lang w:val="es-ES"/>
+        </w:rPr>
+        <w:t xml:space="preserve"> </w:t>
+      </w:r>
+      <w:r>
+        <w:rPr>
+          <w:rFonts w:ascii="Times New Roman" w:hAnsi="Times New Roman" w:cs="Times New Roman"/>
+          <w:i/>
+          <w:iCs/>
+          <w:sz w:val="16"/>
+          <w:szCs w:val="16"/>
+          <w:lang w:val="es-ES"/>
+        </w:rPr>
+        <w:t>Estructura original del repositorio</w:t>
+      </w:r>
+    </w:p>
+    <w:p>
+      <w:pPr>
+        <w:jc w:val="center"/>
+        <w:rPr>
+          <w:rFonts w:ascii="Times New Roman" w:hAnsi="Times New Roman" w:cs="Times New Roman"/>
+          <w:lang w:val="es-ES"/>
+        </w:rPr>
+      </w:pPr>
+    </w:p>
+    <w:p>
+      <w:pPr>
         <w:jc w:val="both"/>
         <w:rPr>
           <w:rFonts w:ascii="Times New Roman" w:hAnsi="Times New Roman" w:cs="Times New Roman"/>
@@ -2918,14 +3176,65 @@
           <w:rFonts w:ascii="Times New Roman" w:hAnsi="Times New Roman" w:cs="Times New Roman"/>
           <w:lang w:val="es-ES"/>
         </w:rPr>
-        <w:t xml:space="preserve">generar un panel ano-producto, que posteriormente es procesado o modificado para capturar comportamientos relevantes para el estudio y </w:t>
-      </w:r>
-      <w:r>
-        <w:rPr>
-          <w:rFonts w:ascii="Times New Roman" w:hAnsi="Times New Roman" w:cs="Times New Roman"/>
-          <w:lang w:val="es-ES"/>
-        </w:rPr>
-        <w:t xml:space="preserve">así generar los data sets. Sin embargo, al evaluar con más detalle cómo se generaría este proceso las instrucciones nos remiten a </w:t>
+        <w:t>generar un panel a</w:t>
+      </w:r>
+      <w:r>
+        <w:rPr>
+          <w:rFonts w:ascii="Times New Roman" w:hAnsi="Times New Roman" w:cs="Times New Roman"/>
+          <w:lang w:val="es-ES"/>
+        </w:rPr>
+        <w:t>ñ</w:t>
+      </w:r>
+      <w:r>
+        <w:rPr>
+          <w:rFonts w:ascii="Times New Roman" w:hAnsi="Times New Roman" w:cs="Times New Roman"/>
+          <w:lang w:val="es-ES"/>
+        </w:rPr>
+        <w:t xml:space="preserve">o-producto, que posteriormente es procesado o modificado para capturar comportamientos relevantes para el estudio y </w:t>
+      </w:r>
+      <w:r>
+        <w:rPr>
+          <w:rFonts w:ascii="Times New Roman" w:hAnsi="Times New Roman" w:cs="Times New Roman"/>
+          <w:lang w:val="es-ES"/>
+        </w:rPr>
+        <w:t xml:space="preserve">así generar los </w:t>
+      </w:r>
+      <w:proofErr w:type="spellStart"/>
+      <w:r>
+        <w:rPr>
+          <w:rFonts w:ascii="Times New Roman" w:hAnsi="Times New Roman" w:cs="Times New Roman"/>
+          <w:lang w:val="es-ES"/>
+        </w:rPr>
+        <w:t>dataset</w:t>
+      </w:r>
+      <w:r>
+        <w:rPr>
+          <w:rFonts w:ascii="Times New Roman" w:hAnsi="Times New Roman" w:cs="Times New Roman"/>
+          <w:lang w:val="es-ES"/>
+        </w:rPr>
+        <w:t>s</w:t>
+      </w:r>
+      <w:proofErr w:type="spellEnd"/>
+      <w:r>
+        <w:rPr>
+          <w:rFonts w:ascii="Times New Roman" w:hAnsi="Times New Roman" w:cs="Times New Roman"/>
+          <w:lang w:val="es-ES"/>
+        </w:rPr>
+        <w:t>. Sin embargo, al evaluar con más detalle cómo se generaría este proceso</w:t>
+      </w:r>
+      <w:r>
+        <w:rPr>
+          <w:rFonts w:ascii="Times New Roman" w:hAnsi="Times New Roman" w:cs="Times New Roman"/>
+          <w:lang w:val="es-ES"/>
+        </w:rPr>
+        <w:t>,</w:t>
+      </w:r>
+      <w:r>
+        <w:rPr>
+          <w:rFonts w:ascii="Times New Roman" w:hAnsi="Times New Roman" w:cs="Times New Roman"/>
+          <w:lang w:val="es-ES"/>
+        </w:rPr>
+        <w:t xml:space="preserve"> las instrucciones nos remiten a </w:t>
       </w:r>
       <w:r>
         <w:rPr>
@@ -2936,10 +3245,18 @@
       </w:r>
       <w:r>
         <w:rPr>
-          <w:rFonts w:ascii="Times New Roman" w:hAnsi="Times New Roman" w:cs="Times New Roman"/>
-          <w:lang w:val="es-ES"/>
-        </w:rPr>
-        <w:t xml:space="preserve">, disponible en la carpeta /0_make_dataset del repositorio. A </w:t>
+          <w:rStyle w:val="FootnoteReference"/>
+          <w:rFonts w:ascii="Times New Roman" w:hAnsi="Times New Roman" w:cs="Times New Roman"/>
+          <w:lang w:val="es-ES"/>
+        </w:rPr>
+        <w:footnoteReference w:id="3"/>
+      </w:r>
+      <w:r>
+        <w:rPr>
+          <w:rFonts w:ascii="Times New Roman" w:hAnsi="Times New Roman" w:cs="Times New Roman"/>
+          <w:lang w:val="es-ES"/>
+        </w:rPr>
+        <w:t xml:space="preserve">. A </w:t>
       </w:r>
       <w:r>
         <w:rPr>
@@ -2970,9 +3287,9 @@
           <w:noProof/>
         </w:rPr>
         <w:drawing>
-          <wp:inline distT="0" distB="0" distL="0" distR="0" wp14:anchorId="410BC485" wp14:editId="7EDF9F6C">
-            <wp:extent cx="4507523" cy="6284154"/>
-            <wp:effectExtent l="0" t="0" r="7620" b="2540"/>
+          <wp:inline distT="0" distB="0" distL="0" distR="0" wp14:anchorId="410BC485" wp14:editId="5366A7AD">
+            <wp:extent cx="3782062" cy="5272755"/>
+            <wp:effectExtent l="0" t="0" r="8890" b="4445"/>
             <wp:docPr id="1063236521" name="Imagen 10"/>
             <wp:cNvGraphicFramePr>
               <a:graphicFrameLocks xmlns:a="http://schemas.openxmlformats.org/drawingml/2006/main" noChangeAspect="1"/>
@@ -3002,7 +3319,7 @@
                   <pic:spPr bwMode="auto">
                     <a:xfrm>
                       <a:off x="0" y="0"/>
-                      <a:ext cx="4514331" cy="6293646"/>
+                      <a:ext cx="3790874" cy="5285040"/>
                     </a:xfrm>
                     <a:prstGeom prst="rect">
                       <a:avLst/>
@@ -3021,6 +3338,59 @@
     </w:p>
     <w:p>
       <w:pPr>
+        <w:jc w:val="center"/>
+        <w:rPr>
+          <w:rFonts w:ascii="Times New Roman" w:hAnsi="Times New Roman" w:cs="Times New Roman"/>
+          <w:lang w:val="es-ES"/>
+        </w:rPr>
+      </w:pPr>
+      <w:r>
+        <w:rPr>
+          <w:rFonts w:ascii="Times New Roman" w:hAnsi="Times New Roman" w:cs="Times New Roman"/>
+          <w:i/>
+          <w:iCs/>
+          <w:sz w:val="16"/>
+          <w:szCs w:val="16"/>
+          <w:lang w:val="es-ES"/>
+        </w:rPr>
+        <w:t>Fig.</w:t>
+      </w:r>
+      <w:r>
+        <w:rPr>
+          <w:rFonts w:ascii="Times New Roman" w:hAnsi="Times New Roman" w:cs="Times New Roman"/>
+          <w:i/>
+          <w:iCs/>
+          <w:sz w:val="16"/>
+          <w:szCs w:val="16"/>
+          <w:lang w:val="es-ES"/>
+        </w:rPr>
+        <w:t>5</w:t>
+      </w:r>
+      <w:r>
+        <w:rPr>
+          <w:rFonts w:ascii="Times New Roman" w:hAnsi="Times New Roman" w:cs="Times New Roman"/>
+          <w:i/>
+          <w:iCs/>
+          <w:sz w:val="16"/>
+          <w:szCs w:val="16"/>
+          <w:lang w:val="es-ES"/>
+        </w:rPr>
+        <w:t xml:space="preserve"> </w:t>
+      </w:r>
+      <w:r>
+        <w:rPr>
+          <w:rFonts w:ascii="Times New Roman" w:hAnsi="Times New Roman" w:cs="Times New Roman"/>
+          <w:i/>
+          <w:iCs/>
+          <w:sz w:val="16"/>
+          <w:szCs w:val="16"/>
+          <w:lang w:val="es-ES"/>
+        </w:rPr>
+        <w:t>Proceso detallado de reproducción de datos y análisis</w:t>
+      </w:r>
+    </w:p>
+    <w:p>
+      <w:pPr>
         <w:jc w:val="both"/>
         <w:rPr>
           <w:rFonts w:ascii="Times New Roman" w:hAnsi="Times New Roman" w:cs="Times New Roman"/>
@@ -3032,7 +3402,41 @@
           <w:rFonts w:ascii="Times New Roman" w:hAnsi="Times New Roman" w:cs="Times New Roman"/>
           <w:lang w:val="es-ES"/>
         </w:rPr>
-        <w:t xml:space="preserve">En primer lugar, el script 1_construct_dataset_from_raw_inputs.do limpia y combina los datos de energía, clima, población e ingreso, produciendo un </w:t>
+        <w:t xml:space="preserve">En primer lugar, </w:t>
+      </w:r>
+      <w:r>
+        <w:rPr>
+          <w:rFonts w:ascii="Times New Roman" w:hAnsi="Times New Roman" w:cs="Times New Roman"/>
+          <w:i/>
+          <w:iCs/>
+          <w:lang w:val="es-ES"/>
+        </w:rPr>
+        <w:t>script 1_construct_</w:t>
+      </w:r>
+      <w:r>
+        <w:rPr>
+          <w:rFonts w:ascii="Times New Roman" w:hAnsi="Times New Roman" w:cs="Times New Roman"/>
+          <w:i/>
+          <w:iCs/>
+          <w:lang w:val="es-ES"/>
+        </w:rPr>
+        <w:t>dataset</w:t>
+      </w:r>
+      <w:r>
+        <w:rPr>
+          <w:rFonts w:ascii="Times New Roman" w:hAnsi="Times New Roman" w:cs="Times New Roman"/>
+          <w:i/>
+          <w:iCs/>
+          <w:lang w:val="es-ES"/>
+        </w:rPr>
+        <w:t>_from_raw_inputs.do</w:t>
+      </w:r>
+      <w:r>
+        <w:rPr>
+          <w:rFonts w:ascii="Times New Roman" w:hAnsi="Times New Roman" w:cs="Times New Roman"/>
+          <w:lang w:val="es-ES"/>
+        </w:rPr>
+        <w:t xml:space="preserve"> limpia y combina los datos de energía, clima, población e ingreso, produciendo un </w:t>
       </w:r>
       <w:proofErr w:type="spellStart"/>
       <w:r>
@@ -3081,7 +3485,23 @@
           <w:lang w:val="es-ES"/>
         </w:rPr>
         <w:lastRenderedPageBreak/>
-        <w:t xml:space="preserve">Posteriormente, el script 2_construct_regression_ready_data.do transforma este </w:t>
+        <w:t xml:space="preserve">Posteriormente, </w:t>
+      </w:r>
+      <w:r>
+        <w:rPr>
+          <w:rFonts w:ascii="Times New Roman" w:hAnsi="Times New Roman" w:cs="Times New Roman"/>
+          <w:i/>
+          <w:iCs/>
+          <w:lang w:val="es-ES"/>
+        </w:rPr>
+        <w:t>script 2_construct_regression_ready_data.do</w:t>
+      </w:r>
+      <w:r>
+        <w:rPr>
+          <w:rFonts w:ascii="Times New Roman" w:hAnsi="Times New Roman" w:cs="Times New Roman"/>
+          <w:lang w:val="es-ES"/>
+        </w:rPr>
+        <w:t xml:space="preserve"> transforma este </w:t>
       </w:r>
       <w:proofErr w:type="spellStart"/>
       <w:r>
@@ -3105,7 +3525,14 @@
           <w:rFonts w:ascii="Times New Roman" w:hAnsi="Times New Roman" w:cs="Times New Roman"/>
           <w:lang w:val="es-ES"/>
         </w:rPr>
-        <w:t>datasets</w:t>
+        <w:t>dataset</w:t>
+      </w:r>
+      <w:r>
+        <w:rPr>
+          <w:rFonts w:ascii="Times New Roman" w:hAnsi="Times New Roman" w:cs="Times New Roman"/>
+          <w:lang w:val="es-ES"/>
+        </w:rPr>
+        <w:t>s</w:t>
       </w:r>
       <w:proofErr w:type="spellEnd"/>
       <w:r>
@@ -3113,7 +3540,35 @@
           <w:rFonts w:ascii="Times New Roman" w:hAnsi="Times New Roman" w:cs="Times New Roman"/>
           <w:lang w:val="es-ES"/>
         </w:rPr>
-        <w:t xml:space="preserve"> listos para regresión. En esta etapa se eliminan observaciones con problemas de reporte, se emparejan los datos climáticos con los productos energéticos y se construyen variables clave del análisis, incluyendo </w:t>
+        <w:t xml:space="preserve"> listos para regresi</w:t>
+      </w:r>
+      <w:r>
+        <w:rPr>
+          <w:rFonts w:ascii="Times New Roman" w:hAnsi="Times New Roman" w:cs="Times New Roman"/>
+          <w:lang w:val="es-ES"/>
+        </w:rPr>
+        <w:t>o</w:t>
+      </w:r>
+      <w:r>
+        <w:rPr>
+          <w:rFonts w:ascii="Times New Roman" w:hAnsi="Times New Roman" w:cs="Times New Roman"/>
+          <w:lang w:val="es-ES"/>
+        </w:rPr>
+        <w:t>n</w:t>
+      </w:r>
+      <w:r>
+        <w:rPr>
+          <w:rFonts w:ascii="Times New Roman" w:hAnsi="Times New Roman" w:cs="Times New Roman"/>
+          <w:lang w:val="es-ES"/>
+        </w:rPr>
+        <w:t>es</w:t>
+      </w:r>
+      <w:r>
+        <w:rPr>
+          <w:rFonts w:ascii="Times New Roman" w:hAnsi="Times New Roman" w:cs="Times New Roman"/>
+          <w:lang w:val="es-ES"/>
+        </w:rPr>
+        <w:t xml:space="preserve">. En esta etapa se eliminan observaciones con problemas de reporte, se emparejan los datos climáticos con los productos energéticos y se construyen variables clave del análisis, incluyendo </w:t>
       </w:r>
       <w:proofErr w:type="spellStart"/>
       <w:r>
@@ -3137,7 +3592,14 @@
           <w:rFonts w:ascii="Times New Roman" w:hAnsi="Times New Roman" w:cs="Times New Roman"/>
           <w:lang w:val="es-ES"/>
         </w:rPr>
-        <w:t>datasets</w:t>
+        <w:t>dataset</w:t>
+      </w:r>
+      <w:r>
+        <w:rPr>
+          <w:rFonts w:ascii="Times New Roman" w:hAnsi="Times New Roman" w:cs="Times New Roman"/>
+          <w:lang w:val="es-ES"/>
+        </w:rPr>
+        <w:t>s</w:t>
       </w:r>
       <w:proofErr w:type="spellEnd"/>
       <w:r>
@@ -3193,17 +3655,40 @@
           <w:rFonts w:ascii="Times New Roman" w:hAnsi="Times New Roman" w:cs="Times New Roman"/>
           <w:lang w:val="es-ES"/>
         </w:rPr>
-        <w:t>Finalmente, se ejecutan scripts adicionales para validar y visualizar los datos. El script 3_unit_root_test_and_plot.do realiza pruebas de raíz unitaria que justifican el uso de primeras diferencias, mientras que 4_plot_ITA_other_energy_regimes_</w:t>
-      </w:r>
-      <w:proofErr w:type="gramStart"/>
-      <w:r>
-        <w:rPr>
-          <w:rFonts w:ascii="Times New Roman" w:hAnsi="Times New Roman" w:cs="Times New Roman"/>
-          <w:lang w:val="es-ES"/>
-        </w:rPr>
-        <w:t>timeseries.R</w:t>
-      </w:r>
-      <w:proofErr w:type="gramEnd"/>
+        <w:t>Finalmente, se ejecutan scripts adicionales para validar y visualizar los datos.</w:t>
+      </w:r>
+      <w:r>
+        <w:rPr>
+          <w:rFonts w:ascii="Times New Roman" w:hAnsi="Times New Roman" w:cs="Times New Roman"/>
+          <w:lang w:val="es-ES"/>
+        </w:rPr>
+        <w:t xml:space="preserve"> </w:t>
+      </w:r>
+      <w:r>
+        <w:rPr>
+          <w:rFonts w:ascii="Times New Roman" w:hAnsi="Times New Roman" w:cs="Times New Roman"/>
+          <w:i/>
+          <w:iCs/>
+          <w:lang w:val="es-ES"/>
+        </w:rPr>
+        <w:t>script 3_unit_root_test_and_plot.do</w:t>
+      </w:r>
+      <w:r>
+        <w:rPr>
+          <w:rFonts w:ascii="Times New Roman" w:hAnsi="Times New Roman" w:cs="Times New Roman"/>
+          <w:lang w:val="es-ES"/>
+        </w:rPr>
+        <w:t xml:space="preserve"> realiza pruebas de raíz unitaria que justifican el uso de primeras diferencias, mientras que </w:t>
+      </w:r>
+      <w:r>
+        <w:rPr>
+          <w:rFonts w:ascii="Times New Roman" w:hAnsi="Times New Roman" w:cs="Times New Roman"/>
+          <w:i/>
+          <w:iCs/>
+          <w:lang w:val="es-ES"/>
+        </w:rPr>
+        <w:t>4_plot_ITA_other_energy_regimes_timeseries.R</w:t>
+      </w:r>
       <w:r>
         <w:rPr>
           <w:rFonts w:ascii="Times New Roman" w:hAnsi="Times New Roman" w:cs="Times New Roman"/>
@@ -3225,7 +3710,23 @@
           <w:rFonts w:ascii="Times New Roman" w:hAnsi="Times New Roman" w:cs="Times New Roman"/>
           <w:lang w:val="es-ES"/>
         </w:rPr>
-        <w:t xml:space="preserve">Una particularidad de la forma en que está construida la metodología de reproducción, es que no es posible recrear o alterar el </w:t>
+        <w:t>Una particularidad importante es que no es posible recrear ni modificar el dataset original, dado que las bases de datos principales son de carácter privado. Por esta razón, los autores incluyeron en el archivo disponible en Zenodo únicamente los datos necesarios para la reproducción parcial del análisis, junto con los scripts empleados en el procesamiento. Sin embargo, estos scripts no pueden ejecutarse de manera completa, ya que no existe acceso a las fuentes de datos originales que alimentan el procesamiento descrito.</w:t>
+      </w:r>
+    </w:p>
+    <w:p>
+      <w:pPr>
+        <w:jc w:val="both"/>
+        <w:rPr>
+          <w:rFonts w:ascii="Times New Roman" w:hAnsi="Times New Roman" w:cs="Times New Roman"/>
+          <w:lang w:val="es-ES"/>
+        </w:rPr>
+      </w:pPr>
+      <w:r>
+        <w:rPr>
+          <w:rFonts w:ascii="Times New Roman" w:hAnsi="Times New Roman" w:cs="Times New Roman"/>
+          <w:lang w:val="es-ES"/>
+        </w:rPr>
+        <w:t xml:space="preserve">El </w:t>
       </w:r>
       <w:proofErr w:type="spellStart"/>
       <w:r>
@@ -3241,23 +3742,7 @@
           <w:rFonts w:ascii="Times New Roman" w:hAnsi="Times New Roman" w:cs="Times New Roman"/>
           <w:lang w:val="es-ES"/>
         </w:rPr>
-        <w:t xml:space="preserve"> de base, debido a que las bases de datos </w:t>
-      </w:r>
-      <w:proofErr w:type="gramStart"/>
-      <w:r>
-        <w:rPr>
-          <w:rFonts w:ascii="Times New Roman" w:hAnsi="Times New Roman" w:cs="Times New Roman"/>
-          <w:lang w:val="es-ES"/>
-        </w:rPr>
-        <w:t>principales,</w:t>
-      </w:r>
-      <w:proofErr w:type="gramEnd"/>
-      <w:r>
-        <w:rPr>
-          <w:rFonts w:ascii="Times New Roman" w:hAnsi="Times New Roman" w:cs="Times New Roman"/>
-          <w:lang w:val="es-ES"/>
-        </w:rPr>
-        <w:t xml:space="preserve"> son de carácter privado. Así pues, los autores han </w:t>
+        <w:t xml:space="preserve"> suministrado por los autores en el repositorio en </w:t>
       </w:r>
       <w:proofErr w:type="spellStart"/>
       <w:r>
@@ -3265,7 +3750,7 @@
           <w:rFonts w:ascii="Times New Roman" w:hAnsi="Times New Roman" w:cs="Times New Roman"/>
           <w:lang w:val="es-ES"/>
         </w:rPr>
-        <w:t>incluído</w:t>
+        <w:t>Zenodo</w:t>
       </w:r>
       <w:proofErr w:type="spellEnd"/>
       <w:r>
@@ -3273,77 +3758,6 @@
           <w:rFonts w:ascii="Times New Roman" w:hAnsi="Times New Roman" w:cs="Times New Roman"/>
           <w:lang w:val="es-ES"/>
         </w:rPr>
-        <w:t xml:space="preserve"> todos los datos necesarios para la reproducción en el archivo disponible en </w:t>
-      </w:r>
-      <w:proofErr w:type="spellStart"/>
-      <w:r>
-        <w:rPr>
-          <w:rFonts w:ascii="Times New Roman" w:hAnsi="Times New Roman" w:cs="Times New Roman"/>
-          <w:lang w:val="es-ES"/>
-        </w:rPr>
-        <w:t>Zenodo</w:t>
-      </w:r>
-      <w:proofErr w:type="spellEnd"/>
-      <w:r>
-        <w:rPr>
-          <w:rFonts w:ascii="Times New Roman" w:hAnsi="Times New Roman" w:cs="Times New Roman"/>
-          <w:lang w:val="es-ES"/>
-        </w:rPr>
-        <w:t xml:space="preserve">, </w:t>
-      </w:r>
-      <w:r>
-        <w:rPr>
-          <w:rFonts w:ascii="Times New Roman" w:hAnsi="Times New Roman" w:cs="Times New Roman"/>
-          <w:lang w:val="es-ES"/>
-        </w:rPr>
-        <w:t xml:space="preserve">así mismo incluyen los scripts necesarios para el procesamiento de los datos, pero no se pueden utilizar fácticamente, dado que no hay acceso a los datos fuente. </w:t>
-      </w:r>
-    </w:p>
-    <w:p>
-      <w:pPr>
-        <w:jc w:val="both"/>
-        <w:rPr>
-          <w:rFonts w:ascii="Times New Roman" w:hAnsi="Times New Roman" w:cs="Times New Roman"/>
-          <w:lang w:val="es-ES"/>
-        </w:rPr>
-      </w:pPr>
-      <w:r>
-        <w:rPr>
-          <w:rFonts w:ascii="Times New Roman" w:hAnsi="Times New Roman" w:cs="Times New Roman"/>
-          <w:lang w:val="es-ES"/>
-        </w:rPr>
-        <w:t xml:space="preserve">El </w:t>
-      </w:r>
-      <w:proofErr w:type="spellStart"/>
-      <w:r>
-        <w:rPr>
-          <w:rFonts w:ascii="Times New Roman" w:hAnsi="Times New Roman" w:cs="Times New Roman"/>
-          <w:lang w:val="es-ES"/>
-        </w:rPr>
-        <w:t>dataset</w:t>
-      </w:r>
-      <w:proofErr w:type="spellEnd"/>
-      <w:r>
-        <w:rPr>
-          <w:rFonts w:ascii="Times New Roman" w:hAnsi="Times New Roman" w:cs="Times New Roman"/>
-          <w:lang w:val="es-ES"/>
-        </w:rPr>
-        <w:t xml:space="preserve"> suministrado por los autores en el repositorio en </w:t>
-      </w:r>
-      <w:proofErr w:type="spellStart"/>
-      <w:r>
-        <w:rPr>
-          <w:rFonts w:ascii="Times New Roman" w:hAnsi="Times New Roman" w:cs="Times New Roman"/>
-          <w:lang w:val="es-ES"/>
-        </w:rPr>
-        <w:t>Zenodo</w:t>
-      </w:r>
-      <w:proofErr w:type="spellEnd"/>
-      <w:r>
-        <w:rPr>
-          <w:rFonts w:ascii="Times New Roman" w:hAnsi="Times New Roman" w:cs="Times New Roman"/>
-          <w:lang w:val="es-ES"/>
-        </w:rPr>
         <w:t xml:space="preserve"> constituye la base para </w:t>
       </w:r>
       <w:r>
@@ -3360,15 +3774,6 @@
         </w:rPr>
         <w:t>, en el cual se estiman diferentes modelos econométricos que permiten recuperar la relación empírica entre temperatura y consumo energético.</w:t>
       </w:r>
-    </w:p>
-    <w:p>
-      <w:pPr>
-        <w:jc w:val="both"/>
-        <w:rPr>
-          <w:rFonts w:ascii="Times New Roman" w:hAnsi="Times New Roman" w:cs="Times New Roman"/>
-          <w:lang w:val="es-ES"/>
-        </w:rPr>
-      </w:pPr>
     </w:p>
     <w:p>
       <w:pPr>
@@ -3852,176 +4257,6 @@
           <w:bCs/>
           <w:lang w:val="es-ES"/>
         </w:rPr>
-        <w:t>Desafíos técnicos</w:t>
-      </w:r>
-      <w:r>
-        <w:rPr>
-          <w:rFonts w:ascii="Times New Roman" w:hAnsi="Times New Roman" w:cs="Times New Roman"/>
-          <w:b/>
-          <w:bCs/>
-          <w:lang w:val="es-ES"/>
-        </w:rPr>
-        <w:t>.</w:t>
-      </w:r>
-    </w:p>
-    <w:p>
-      <w:pPr>
-        <w:jc w:val="both"/>
-        <w:rPr>
-          <w:rFonts w:ascii="Times New Roman" w:hAnsi="Times New Roman" w:cs="Times New Roman"/>
-          <w:lang w:val="es-ES"/>
-        </w:rPr>
-      </w:pPr>
-      <w:r>
-        <w:rPr>
-          <w:rFonts w:ascii="Times New Roman" w:hAnsi="Times New Roman" w:cs="Times New Roman"/>
-          <w:lang w:val="es-ES"/>
-        </w:rPr>
-        <w:t>Durante el proceso de reproducción se identificaron varios desafíos técnicos asociados principalmente con la complejidad del pipeline computacional del estudio original.</w:t>
-      </w:r>
-    </w:p>
-    <w:p>
-      <w:pPr>
-        <w:jc w:val="both"/>
-        <w:rPr>
-          <w:rFonts w:ascii="Times New Roman" w:hAnsi="Times New Roman" w:cs="Times New Roman"/>
-          <w:lang w:val="es-ES"/>
-        </w:rPr>
-      </w:pPr>
-      <w:r>
-        <w:rPr>
-          <w:rFonts w:ascii="Times New Roman" w:hAnsi="Times New Roman" w:cs="Times New Roman"/>
-          <w:lang w:val="es-ES"/>
-        </w:rPr>
-        <w:t xml:space="preserve">La </w:t>
-      </w:r>
-      <w:r>
-        <w:rPr>
-          <w:rFonts w:ascii="Times New Roman" w:hAnsi="Times New Roman" w:cs="Times New Roman"/>
-          <w:lang w:val="es-ES"/>
-        </w:rPr>
-        <w:t>integración de múltiples lenguajes de programación dentro del flujo de trabajo representa un desafío técnico, ya que el repositorio combina herramientas en Python, R y Stata. Esto requiere una correcta configuración del entorno computacional y de las dependencias necesarias para ejecutar cada etapa del pipeline.</w:t>
-      </w:r>
-    </w:p>
-    <w:p>
-      <w:pPr>
-        <w:jc w:val="both"/>
-        <w:rPr>
-          <w:rFonts w:ascii="Times New Roman" w:hAnsi="Times New Roman" w:cs="Times New Roman"/>
-          <w:lang w:val="es-ES"/>
-        </w:rPr>
-      </w:pPr>
-      <w:r>
-        <w:rPr>
-          <w:rFonts w:ascii="Times New Roman" w:hAnsi="Times New Roman" w:cs="Times New Roman"/>
-          <w:lang w:val="es-ES"/>
-        </w:rPr>
-        <w:t xml:space="preserve">Por otra parte, el configurar variables de entorno que son necesarias para poder replicar generó dificultades adicionales </w:t>
-      </w:r>
-      <w:r>
-        <w:rPr>
-          <w:rFonts w:ascii="Times New Roman" w:hAnsi="Times New Roman" w:cs="Times New Roman"/>
-          <w:lang w:val="es-ES"/>
-        </w:rPr>
-        <w:t xml:space="preserve">pues en el caso de uno de los integrantes del equipo, las variables que solicitaba el </w:t>
-      </w:r>
-      <w:proofErr w:type="spellStart"/>
-      <w:r>
-        <w:rPr>
-          <w:rFonts w:ascii="Times New Roman" w:hAnsi="Times New Roman" w:cs="Times New Roman"/>
-          <w:lang w:val="es-ES"/>
-        </w:rPr>
-        <w:t>paper</w:t>
-      </w:r>
-      <w:proofErr w:type="spellEnd"/>
-      <w:r>
-        <w:rPr>
-          <w:rFonts w:ascii="Times New Roman" w:hAnsi="Times New Roman" w:cs="Times New Roman"/>
-          <w:lang w:val="es-ES"/>
-        </w:rPr>
-        <w:t xml:space="preserve"> crear tenían nombres que ya eran utilizados por otro </w:t>
-      </w:r>
-      <w:proofErr w:type="gramStart"/>
-      <w:r>
-        <w:rPr>
-          <w:rFonts w:ascii="Times New Roman" w:hAnsi="Times New Roman" w:cs="Times New Roman"/>
-          <w:lang w:val="es-ES"/>
-        </w:rPr>
-        <w:t>programa  (</w:t>
-      </w:r>
-      <w:proofErr w:type="gramEnd"/>
-      <w:r>
-        <w:rPr>
-          <w:rFonts w:ascii="Times New Roman" w:hAnsi="Times New Roman" w:cs="Times New Roman"/>
-          <w:lang w:val="es-ES"/>
-        </w:rPr>
-        <w:t xml:space="preserve">SQL). Entonces al correr, el programa encontraba un error fatal y decía que esa variable ya estaba siendo utilizada por </w:t>
-      </w:r>
-      <w:proofErr w:type="spellStart"/>
-      <w:r>
-        <w:rPr>
-          <w:rFonts w:ascii="Times New Roman" w:hAnsi="Times New Roman" w:cs="Times New Roman"/>
-          <w:lang w:val="es-ES"/>
-        </w:rPr>
-        <w:t>PostGres</w:t>
-      </w:r>
-      <w:proofErr w:type="spellEnd"/>
-      <w:r>
-        <w:rPr>
-          <w:rFonts w:ascii="Times New Roman" w:hAnsi="Times New Roman" w:cs="Times New Roman"/>
-          <w:lang w:val="es-ES"/>
-        </w:rPr>
-        <w:t xml:space="preserve">. La solución fue desinstalar </w:t>
-      </w:r>
-      <w:proofErr w:type="spellStart"/>
-      <w:r>
-        <w:rPr>
-          <w:rFonts w:ascii="Times New Roman" w:hAnsi="Times New Roman" w:cs="Times New Roman"/>
-          <w:lang w:val="es-ES"/>
-        </w:rPr>
-        <w:t>PostGres</w:t>
-      </w:r>
-      <w:proofErr w:type="spellEnd"/>
-      <w:r>
-        <w:rPr>
-          <w:rFonts w:ascii="Times New Roman" w:hAnsi="Times New Roman" w:cs="Times New Roman"/>
-          <w:lang w:val="es-ES"/>
-        </w:rPr>
-        <w:t xml:space="preserve"> dado que no era de uso frecuente, pero una mejor solución habría sido cambiar el nombre de esta variable de entorno en todos los scripts y generar un nuevo nombre al que llamar. </w:t>
-      </w:r>
-    </w:p>
-    <w:p>
-      <w:pPr>
-        <w:jc w:val="both"/>
-        <w:rPr>
-          <w:rFonts w:ascii="Times New Roman" w:hAnsi="Times New Roman" w:cs="Times New Roman"/>
-          <w:lang w:val="es-ES"/>
-        </w:rPr>
-      </w:pPr>
-      <w:r>
-        <w:rPr>
-          <w:rFonts w:ascii="Times New Roman" w:hAnsi="Times New Roman" w:cs="Times New Roman"/>
-          <w:lang w:val="es-ES"/>
-        </w:rPr>
-        <w:t>A pesar de estas limitaciones, fue posible replicar conceptualmente el flujo de trabajo propuesto por los autores y comprender las principales etapas del proceso de construcción de datos y estimación econométrica que sustentan el análisis del estudio.</w:t>
-      </w:r>
-    </w:p>
-    <w:p>
-      <w:pPr>
-        <w:rPr>
-          <w:rFonts w:ascii="Times New Roman" w:hAnsi="Times New Roman" w:cs="Times New Roman"/>
-          <w:b/>
-          <w:bCs/>
-          <w:lang w:val="es-ES"/>
-        </w:rPr>
-      </w:pPr>
-      <w:r>
-        <w:rPr>
-          <w:rFonts w:ascii="Times New Roman" w:hAnsi="Times New Roman" w:cs="Times New Roman"/>
-          <w:b/>
-          <w:bCs/>
-          <w:lang w:val="es-ES"/>
-        </w:rPr>
         <w:t>3. Resultados y Análisis (30%)</w:t>
       </w:r>
     </w:p>
@@ -4062,7 +4297,6 @@
           <w:rFonts w:ascii="Times New Roman" w:hAnsi="Times New Roman" w:cs="Times New Roman"/>
           <w:lang w:val="es-ES"/>
         </w:rPr>
-        <w:lastRenderedPageBreak/>
         <w:t>Comparación entre los resultados obtenidos en el estudio original y los resultados reproducidos durante el proyecto.</w:t>
       </w:r>
     </w:p>
@@ -4286,6 +4520,7 @@
           <w:rFonts w:ascii="Times New Roman" w:hAnsi="Times New Roman" w:cs="Times New Roman"/>
           <w:lang w:val="es-ES"/>
         </w:rPr>
+        <w:lastRenderedPageBreak/>
         <w:t>5. Apéndices</w:t>
       </w:r>
     </w:p>
@@ -4354,180 +4589,52 @@
           <w:rFonts w:ascii="Times New Roman" w:hAnsi="Times New Roman" w:cs="Times New Roman"/>
           <w:lang w:val="es-ES"/>
         </w:rPr>
-        <w:t>Este avance se evaluará mediante una lista de verificación binaria (Sí/No) para cada criterio establecido.</w:t>
-      </w:r>
-    </w:p>
-    <w:p>
-      <w:pPr>
-        <w:rPr>
-          <w:rFonts w:ascii="Times New Roman" w:hAnsi="Times New Roman" w:cs="Times New Roman"/>
-          <w:lang w:val="es-ES"/>
-        </w:rPr>
-      </w:pPr>
-      <w:r>
-        <w:rPr>
-          <w:rFonts w:ascii="Times New Roman" w:hAnsi="Times New Roman" w:cs="Times New Roman"/>
-          <w:lang w:val="es-ES"/>
-        </w:rPr>
-        <w:t xml:space="preserve">No se evaluará la calidad o completitud de cada aspecto, sino la existencia y evidencia de progreso en cada sección del documento. Por lo tanto, no es necesario que el documento tenga una redacción final o una organización completamente pulida en esta etapa. </w:t>
-      </w:r>
-    </w:p>
-    <w:p>
-      <w:pPr>
-        <w:rPr>
-          <w:rFonts w:ascii="Times New Roman" w:hAnsi="Times New Roman" w:cs="Times New Roman"/>
-          <w:lang w:val="es-ES"/>
-        </w:rPr>
-      </w:pPr>
-      <w:r>
-        <w:rPr>
-          <w:rFonts w:ascii="Times New Roman" w:hAnsi="Times New Roman" w:cs="Times New Roman"/>
-          <w:lang w:val="es-ES"/>
-        </w:rPr>
-        <w:t>avance2-enunciado (1)</w:t>
-      </w:r>
-    </w:p>
-    <w:p>
-      <w:pPr>
-        <w:rPr>
-          <w:rFonts w:ascii="Times New Roman" w:hAnsi="Times New Roman" w:cs="Times New Roman"/>
-          <w:lang w:val="es-ES"/>
-        </w:rPr>
-      </w:pPr>
-      <w:r>
-        <w:rPr>
-          <w:rFonts w:ascii="Times New Roman" w:hAnsi="Times New Roman" w:cs="Times New Roman"/>
-          <w:lang w:val="es-ES"/>
-        </w:rPr>
-        <w:t>Se espera simplemente que exista progreso visible en la elaboración del documento.</w:t>
-      </w:r>
-    </w:p>
-    <w:p>
-      <w:pPr>
-        <w:rPr>
-          <w:rFonts w:ascii="Times New Roman" w:hAnsi="Times New Roman" w:cs="Times New Roman"/>
-          <w:lang w:val="es-ES"/>
-        </w:rPr>
-      </w:pPr>
-      <w:r>
-        <w:rPr>
-          <w:rFonts w:ascii="Times New Roman" w:hAnsi="Times New Roman" w:cs="Times New Roman"/>
-          <w:lang w:val="es-ES"/>
-        </w:rPr>
-        <w:t>Los principios de evaluación serán los siguientes:</w:t>
-      </w:r>
-    </w:p>
-    <w:p>
-      <w:pPr>
-        <w:rPr>
-          <w:rFonts w:ascii="Times New Roman" w:hAnsi="Times New Roman" w:cs="Times New Roman"/>
-          <w:lang w:val="es-ES"/>
-        </w:rPr>
-      </w:pPr>
-      <w:r>
-        <w:rPr>
-          <w:rFonts w:ascii="Times New Roman" w:hAnsi="Times New Roman" w:cs="Times New Roman"/>
-          <w:lang w:val="es-ES"/>
-        </w:rPr>
-        <w:t>Cada criterio tiene el mismo peso.</w:t>
-      </w:r>
-    </w:p>
-    <w:p>
-      <w:pPr>
-        <w:rPr>
-          <w:rFonts w:ascii="Times New Roman" w:hAnsi="Times New Roman" w:cs="Times New Roman"/>
-          <w:lang w:val="es-ES"/>
-        </w:rPr>
-      </w:pPr>
-      <w:r>
-        <w:rPr>
-          <w:rFonts w:ascii="Times New Roman" w:hAnsi="Times New Roman" w:cs="Times New Roman"/>
-          <w:lang w:val="es-ES"/>
-        </w:rPr>
-        <w:t>Se requiere evidencia verificable de cada elemento.</w:t>
-      </w:r>
-    </w:p>
-    <w:p>
-      <w:pPr>
-        <w:rPr>
-          <w:rFonts w:ascii="Times New Roman" w:hAnsi="Times New Roman" w:cs="Times New Roman"/>
-          <w:lang w:val="es-ES"/>
-        </w:rPr>
-      </w:pPr>
-    </w:p>
-    <w:p>
-      <w:pPr>
-        <w:rPr>
-          <w:rFonts w:ascii="Times New Roman" w:hAnsi="Times New Roman" w:cs="Times New Roman"/>
-          <w:lang w:val="es-ES"/>
-        </w:rPr>
-      </w:pPr>
-      <w:r>
-        <w:rPr>
-          <w:rFonts w:ascii="Times New Roman" w:hAnsi="Times New Roman" w:cs="Times New Roman"/>
-          <w:lang w:val="es-ES"/>
-        </w:rPr>
-        <w:t>Entregables Requeridos</w:t>
-      </w:r>
-    </w:p>
-    <w:p>
-      <w:pPr>
-        <w:rPr>
-          <w:rFonts w:ascii="Times New Roman" w:hAnsi="Times New Roman" w:cs="Times New Roman"/>
-          <w:lang w:val="es-ES"/>
-        </w:rPr>
-      </w:pPr>
-      <w:r>
-        <w:rPr>
-          <w:rFonts w:ascii="Times New Roman" w:hAnsi="Times New Roman" w:cs="Times New Roman"/>
-          <w:lang w:val="es-ES"/>
-        </w:rPr>
-        <w:t>Para este avance se deben entregar los siguientes elementos:</w:t>
-      </w:r>
-    </w:p>
-    <w:p>
-      <w:pPr>
-        <w:rPr>
-          <w:rFonts w:ascii="Times New Roman" w:hAnsi="Times New Roman" w:cs="Times New Roman"/>
-          <w:lang w:val="es-ES"/>
-        </w:rPr>
-      </w:pPr>
-      <w:r>
-        <w:rPr>
-          <w:rFonts w:ascii="Times New Roman" w:hAnsi="Times New Roman" w:cs="Times New Roman"/>
-          <w:lang w:val="es-ES"/>
-        </w:rPr>
-        <w:t>1. Proyecto Transversal (PDF)</w:t>
-      </w:r>
-    </w:p>
-    <w:p>
-      <w:pPr>
-        <w:rPr>
-          <w:rFonts w:ascii="Times New Roman" w:hAnsi="Times New Roman" w:cs="Times New Roman"/>
-          <w:lang w:val="es-ES"/>
-        </w:rPr>
-      </w:pPr>
-      <w:r>
-        <w:rPr>
-          <w:rFonts w:ascii="Times New Roman" w:hAnsi="Times New Roman" w:cs="Times New Roman"/>
-          <w:lang w:val="es-ES"/>
-        </w:rPr>
-        <w:t>Documento con la estructura del documento final y avances en todas las secciones.</w:t>
-      </w:r>
-    </w:p>
-    <w:p>
-      <w:pPr>
-        <w:rPr>
-          <w:rFonts w:ascii="Times New Roman" w:hAnsi="Times New Roman" w:cs="Times New Roman"/>
-          <w:lang w:val="es-ES"/>
-        </w:rPr>
-      </w:pPr>
-      <w:r>
-        <w:rPr>
-          <w:rFonts w:ascii="Times New Roman" w:hAnsi="Times New Roman" w:cs="Times New Roman"/>
-          <w:lang w:val="es-ES"/>
-        </w:rPr>
-        <w:t>Puede estar alojado en el repositorio de GitHub.</w:t>
+        <w:t>Documento breve (máximo 1 página) que incluya:</w:t>
+      </w:r>
+    </w:p>
+    <w:p>
+      <w:pPr>
+        <w:rPr>
+          <w:rFonts w:ascii="Times New Roman" w:hAnsi="Times New Roman" w:cs="Times New Roman"/>
+          <w:lang w:val="es-ES"/>
+        </w:rPr>
+      </w:pPr>
+      <w:r>
+        <w:rPr>
+          <w:rFonts w:ascii="Times New Roman" w:hAnsi="Times New Roman" w:cs="Times New Roman"/>
+          <w:lang w:val="es-ES"/>
+        </w:rPr>
+        <w:t>Progreso realizado desde el Avance 1</w:t>
+      </w:r>
+    </w:p>
+    <w:p>
+      <w:pPr>
+        <w:rPr>
+          <w:rFonts w:ascii="Times New Roman" w:hAnsi="Times New Roman" w:cs="Times New Roman"/>
+          <w:lang w:val="es-ES"/>
+        </w:rPr>
+      </w:pPr>
+      <w:r>
+        <w:rPr>
+          <w:rFonts w:ascii="Times New Roman" w:hAnsi="Times New Roman" w:cs="Times New Roman"/>
+          <w:lang w:val="es-ES"/>
+        </w:rPr>
+        <w:t>Principales desafíos encontrados</w:t>
+      </w:r>
+    </w:p>
+    <w:p>
+      <w:pPr>
+        <w:rPr>
+          <w:rFonts w:ascii="Times New Roman" w:hAnsi="Times New Roman" w:cs="Times New Roman"/>
+          <w:lang w:val="es-ES"/>
+        </w:rPr>
+      </w:pPr>
+      <w:r>
+        <w:rPr>
+          <w:rFonts w:ascii="Times New Roman" w:hAnsi="Times New Roman" w:cs="Times New Roman"/>
+          <w:lang w:val="es-ES"/>
+        </w:rPr>
+        <w:t>Plan actualizado para completar el proyecto</w:t>
       </w:r>
     </w:p>
     <w:p>
@@ -4557,120 +4664,6 @@
           <w:rFonts w:ascii="Times New Roman" w:hAnsi="Times New Roman" w:cs="Times New Roman"/>
           <w:lang w:val="es-ES"/>
         </w:rPr>
-        <w:t>proyecto_transversal_grupoX.pdf</w:t>
-      </w:r>
-    </w:p>
-    <w:p>
-      <w:pPr>
-        <w:rPr>
-          <w:rFonts w:ascii="Times New Roman" w:hAnsi="Times New Roman" w:cs="Times New Roman"/>
-          <w:lang w:val="es-ES"/>
-        </w:rPr>
-      </w:pPr>
-    </w:p>
-    <w:p>
-      <w:pPr>
-        <w:rPr>
-          <w:rFonts w:ascii="Times New Roman" w:hAnsi="Times New Roman" w:cs="Times New Roman"/>
-          <w:lang w:val="es-ES"/>
-        </w:rPr>
-      </w:pPr>
-      <w:r>
-        <w:rPr>
-          <w:rFonts w:ascii="Times New Roman" w:hAnsi="Times New Roman" w:cs="Times New Roman"/>
-          <w:lang w:val="es-ES"/>
-        </w:rPr>
-        <w:t>3. Informe de avance (PDF)</w:t>
-      </w:r>
-    </w:p>
-    <w:p>
-      <w:pPr>
-        <w:rPr>
-          <w:rFonts w:ascii="Times New Roman" w:hAnsi="Times New Roman" w:cs="Times New Roman"/>
-          <w:lang w:val="es-ES"/>
-        </w:rPr>
-      </w:pPr>
-      <w:r>
-        <w:rPr>
-          <w:rFonts w:ascii="Times New Roman" w:hAnsi="Times New Roman" w:cs="Times New Roman"/>
-          <w:lang w:val="es-ES"/>
-        </w:rPr>
-        <w:t>Documento breve (máximo 1 página) que incluya:</w:t>
-      </w:r>
-    </w:p>
-    <w:p>
-      <w:pPr>
-        <w:rPr>
-          <w:rFonts w:ascii="Times New Roman" w:hAnsi="Times New Roman" w:cs="Times New Roman"/>
-          <w:lang w:val="es-ES"/>
-        </w:rPr>
-      </w:pPr>
-      <w:r>
-        <w:rPr>
-          <w:rFonts w:ascii="Times New Roman" w:hAnsi="Times New Roman" w:cs="Times New Roman"/>
-          <w:lang w:val="es-ES"/>
-        </w:rPr>
-        <w:t>Progreso realizado desde el Avance 1</w:t>
-      </w:r>
-    </w:p>
-    <w:p>
-      <w:pPr>
-        <w:rPr>
-          <w:rFonts w:ascii="Times New Roman" w:hAnsi="Times New Roman" w:cs="Times New Roman"/>
-          <w:lang w:val="es-ES"/>
-        </w:rPr>
-      </w:pPr>
-      <w:r>
-        <w:rPr>
-          <w:rFonts w:ascii="Times New Roman" w:hAnsi="Times New Roman" w:cs="Times New Roman"/>
-          <w:lang w:val="es-ES"/>
-        </w:rPr>
-        <w:t>Principales desafíos encontrados</w:t>
-      </w:r>
-    </w:p>
-    <w:p>
-      <w:pPr>
-        <w:rPr>
-          <w:rFonts w:ascii="Times New Roman" w:hAnsi="Times New Roman" w:cs="Times New Roman"/>
-          <w:lang w:val="es-ES"/>
-        </w:rPr>
-      </w:pPr>
-      <w:r>
-        <w:rPr>
-          <w:rFonts w:ascii="Times New Roman" w:hAnsi="Times New Roman" w:cs="Times New Roman"/>
-          <w:lang w:val="es-ES"/>
-        </w:rPr>
-        <w:t>Plan actualizado para completar el proyecto</w:t>
-      </w:r>
-    </w:p>
-    <w:p>
-      <w:pPr>
-        <w:rPr>
-          <w:rFonts w:ascii="Times New Roman" w:hAnsi="Times New Roman" w:cs="Times New Roman"/>
-          <w:lang w:val="es-ES"/>
-        </w:rPr>
-      </w:pPr>
-      <w:r>
-        <w:rPr>
-          <w:rFonts w:ascii="Times New Roman" w:hAnsi="Times New Roman" w:cs="Times New Roman"/>
-          <w:lang w:val="es-ES"/>
-        </w:rPr>
-        <w:lastRenderedPageBreak/>
-        <w:t>Nombre del archivo:</w:t>
-      </w:r>
-    </w:p>
-    <w:p>
-      <w:pPr>
-        <w:rPr>
-          <w:rFonts w:ascii="Times New Roman" w:hAnsi="Times New Roman" w:cs="Times New Roman"/>
-          <w:lang w:val="es-ES"/>
-        </w:rPr>
-      </w:pPr>
-      <w:r>
-        <w:rPr>
-          <w:rFonts w:ascii="Times New Roman" w:hAnsi="Times New Roman" w:cs="Times New Roman"/>
-          <w:lang w:val="es-ES"/>
-        </w:rPr>
         <w:t>avance2_informe_grupoX.pdf</w:t>
       </w:r>
     </w:p>
@@ -4773,7 +4766,6 @@
           <w:lang w:val="es-ES"/>
         </w:rPr>
       </w:pPr>
-      <w:proofErr w:type="gramStart"/>
       <w:r>
         <w:rPr>
           <w:rFonts w:ascii="Times New Roman" w:hAnsi="Times New Roman" w:cs="Times New Roman"/>
@@ -4781,7 +4773,6 @@
         </w:rPr>
         <w:t>Componentes a Evaluar</w:t>
       </w:r>
-      <w:proofErr w:type="gramEnd"/>
     </w:p>
     <w:p>
       <w:pPr>
@@ -5262,6 +5253,48 @@
           <w:t>https://doi.org/10.5281/zenodo.5099834</w:t>
         </w:r>
       </w:hyperlink>
+    </w:p>
+  </w:footnote>
+  <w:footnote w:id="3">
+    <w:p>
+      <w:pPr>
+        <w:pStyle w:val="FootnoteText"/>
+        <w:rPr>
+          <w:lang w:val="es-ES"/>
+        </w:rPr>
+      </w:pPr>
+      <w:r>
+        <w:rPr>
+          <w:rStyle w:val="FootnoteReference"/>
+        </w:rPr>
+        <w:footnoteRef/>
+      </w:r>
+      <w:r>
+        <w:rPr>
+          <w:lang w:val="es-ES"/>
+        </w:rPr>
+        <w:t xml:space="preserve"> </w:t>
+      </w:r>
+      <w:r>
+        <w:rPr>
+          <w:lang w:val="es-ES"/>
+        </w:rPr>
+        <w:t>D</w:t>
+      </w:r>
+      <w:r>
+        <w:rPr>
+          <w:rFonts w:ascii="Times New Roman" w:hAnsi="Times New Roman" w:cs="Times New Roman"/>
+          <w:lang w:val="es-ES"/>
+        </w:rPr>
+        <w:t>isponible en la carpeta /0_make_dataset del repositorio</w:t>
+      </w:r>
+      <w:r>
+        <w:rPr>
+          <w:rFonts w:ascii="Times New Roman" w:hAnsi="Times New Roman" w:cs="Times New Roman"/>
+          <w:lang w:val="es-ES"/>
+        </w:rPr>
+        <w:t>.</w:t>
+      </w:r>
     </w:p>
   </w:footnote>
 </w:footnotes>
@@ -5359,6 +5392,92 @@
     </w:lvl>
   </w:abstractNum>
   <w:abstractNum w:abstractNumId="1" w15:restartNumberingAfterBreak="0">
+    <w:nsid w:val="1F01289F"/>
+    <w:multiLevelType w:val="hybridMultilevel"/>
+    <w:tmpl w:val="220A1DCA"/>
+    <w:lvl w:ilvl="0" w:tplc="0409000F">
+      <w:start w:val="1"/>
+      <w:numFmt w:val="decimal"/>
+      <w:lvlText w:val="%1."/>
+      <w:lvlJc w:val="left"/>
+      <w:pPr>
+        <w:ind w:left="720" w:hanging="360"/>
+      </w:pPr>
+    </w:lvl>
+    <w:lvl w:ilvl="1" w:tplc="04090019" w:tentative="1">
+      <w:start w:val="1"/>
+      <w:numFmt w:val="lowerLetter"/>
+      <w:lvlText w:val="%2."/>
+      <w:lvlJc w:val="left"/>
+      <w:pPr>
+        <w:ind w:left="1440" w:hanging="360"/>
+      </w:pPr>
+    </w:lvl>
+    <w:lvl w:ilvl="2" w:tplc="0409001B" w:tentative="1">
+      <w:start w:val="1"/>
+      <w:numFmt w:val="lowerRoman"/>
+      <w:lvlText w:val="%3."/>
+      <w:lvlJc w:val="right"/>
+      <w:pPr>
+        <w:ind w:left="2160" w:hanging="180"/>
+      </w:pPr>
+    </w:lvl>
+    <w:lvl w:ilvl="3" w:tplc="0409000F" w:tentative="1">
+      <w:start w:val="1"/>
+      <w:numFmt w:val="decimal"/>
+      <w:lvlText w:val="%4."/>
+      <w:lvlJc w:val="left"/>
+      <w:pPr>
+        <w:ind w:left="2880" w:hanging="360"/>
+      </w:pPr>
+    </w:lvl>
+    <w:lvl w:ilvl="4" w:tplc="04090019" w:tentative="1">
+      <w:start w:val="1"/>
+      <w:numFmt w:val="lowerLetter"/>
+      <w:lvlText w:val="%5."/>
+      <w:lvlJc w:val="left"/>
+      <w:pPr>
+        <w:ind w:left="3600" w:hanging="360"/>
+      </w:pPr>
+    </w:lvl>
+    <w:lvl w:ilvl="5" w:tplc="0409001B" w:tentative="1">
+      <w:start w:val="1"/>
+      <w:numFmt w:val="lowerRoman"/>
+      <w:lvlText w:val="%6."/>
+      <w:lvlJc w:val="right"/>
+      <w:pPr>
+        <w:ind w:left="4320" w:hanging="180"/>
+      </w:pPr>
+    </w:lvl>
+    <w:lvl w:ilvl="6" w:tplc="0409000F" w:tentative="1">
+      <w:start w:val="1"/>
+      <w:numFmt w:val="decimal"/>
+      <w:lvlText w:val="%7."/>
+      <w:lvlJc w:val="left"/>
+      <w:pPr>
+        <w:ind w:left="5040" w:hanging="360"/>
+      </w:pPr>
+    </w:lvl>
+    <w:lvl w:ilvl="7" w:tplc="04090019" w:tentative="1">
+      <w:start w:val="1"/>
+      <w:numFmt w:val="lowerLetter"/>
+      <w:lvlText w:val="%8."/>
+      <w:lvlJc w:val="left"/>
+      <w:pPr>
+        <w:ind w:left="5760" w:hanging="360"/>
+      </w:pPr>
+    </w:lvl>
+    <w:lvl w:ilvl="8" w:tplc="0409001B" w:tentative="1">
+      <w:start w:val="1"/>
+      <w:numFmt w:val="lowerRoman"/>
+      <w:lvlText w:val="%9."/>
+      <w:lvlJc w:val="right"/>
+      <w:pPr>
+        <w:ind w:left="6480" w:hanging="180"/>
+      </w:pPr>
+    </w:lvl>
+  </w:abstractNum>
+  <w:abstractNum w:abstractNumId="2" w15:restartNumberingAfterBreak="0">
     <w:nsid w:val="63EB790F"/>
     <w:multiLevelType w:val="hybridMultilevel"/>
     <w:tmpl w:val="0F44190E"/>
@@ -5475,6 +5594,9 @@
     <w:abstractNumId w:val="0"/>
   </w:num>
   <w:num w:numId="2" w16cid:durableId="373045163">
+    <w:abstractNumId w:val="2"/>
+  </w:num>
+  <w:num w:numId="3" w16cid:durableId="1133135103">
     <w:abstractNumId w:val="1"/>
   </w:num>
 </w:numbering>
@@ -5878,7 +6000,7 @@
   <w:style w:type="paragraph" w:default="1" w:styleId="Normal">
     <w:name w:val="Normal"/>
     <w:qFormat/>
-    <w:rsid w:val="00085666"/>
+    <w:rsid w:val="00F03D29"/>
   </w:style>
   <w:style w:type="paragraph" w:styleId="Heading1">
     <w:name w:val="heading 1"/>

</xml_diff>

<commit_message>
Adición primeros resultados preliminares + apéndices necesarios
</commit_message>
<xml_diff>
--- a/documents/proyecto_transversal_grupo1.docx
+++ b/documents/proyecto_transversal_grupo1.docx
@@ -4,7 +4,7 @@
   <w:body>
     <w:p>
       <w:pPr>
-        <w:jc w:val="right"/>
+        <w:jc w:val="center"/>
         <w:rPr>
           <w:rFonts w:ascii="Times New Roman" w:hAnsi="Times New Roman" w:cs="Times New Roman"/>
           <w:lang w:val="es-ES"/>
@@ -42,7 +42,7 @@
           <w:bCs/>
           <w:lang w:val="es-ES"/>
         </w:rPr>
-        <w:t>Proyecto Transversal – Segundo Avance</w:t>
+        <w:t xml:space="preserve">Proyecto Transversal </w:t>
       </w:r>
     </w:p>
     <w:p>
@@ -170,7 +170,6 @@
         </w:rPr>
         <w:t>lo “</w:t>
       </w:r>
-      <w:proofErr w:type="spellStart"/>
       <w:r>
         <w:rPr>
           <w:rFonts w:ascii="Times New Roman" w:hAnsi="Times New Roman" w:cs="Times New Roman"/>
@@ -183,9 +182,78 @@
           <w:rFonts w:ascii="Times New Roman" w:hAnsi="Times New Roman" w:cs="Times New Roman"/>
           <w:lang w:val="es-ES"/>
         </w:rPr>
-        <w:t>imating</w:t>
-      </w:r>
-      <w:proofErr w:type="spellEnd"/>
+        <w:t xml:space="preserve">imating </w:t>
+      </w:r>
+      <w:r>
+        <w:rPr>
+          <w:rFonts w:ascii="Times New Roman" w:hAnsi="Times New Roman" w:cs="Times New Roman"/>
+          <w:lang w:val="es-ES"/>
+        </w:rPr>
+        <w:t xml:space="preserve">a </w:t>
+      </w:r>
+      <w:r>
+        <w:rPr>
+          <w:rFonts w:ascii="Times New Roman" w:hAnsi="Times New Roman" w:cs="Times New Roman"/>
+          <w:lang w:val="es-ES"/>
+        </w:rPr>
+        <w:t>Socia</w:t>
+      </w:r>
+      <w:r>
+        <w:rPr>
+          <w:rFonts w:ascii="Times New Roman" w:hAnsi="Times New Roman" w:cs="Times New Roman"/>
+          <w:lang w:val="es-ES"/>
+        </w:rPr>
+        <w:t xml:space="preserve">l Cost </w:t>
+      </w:r>
+      <w:r>
+        <w:rPr>
+          <w:rFonts w:ascii="Times New Roman" w:hAnsi="Times New Roman" w:cs="Times New Roman"/>
+          <w:lang w:val="es-ES"/>
+        </w:rPr>
+        <w:t>of Car</w:t>
+      </w:r>
+      <w:r>
+        <w:rPr>
+          <w:rFonts w:ascii="Times New Roman" w:hAnsi="Times New Roman" w:cs="Times New Roman"/>
+          <w:lang w:val="es-ES"/>
+        </w:rPr>
+        <w:t xml:space="preserve">bon for </w:t>
+      </w:r>
+      <w:r>
+        <w:rPr>
+          <w:rFonts w:ascii="Times New Roman" w:hAnsi="Times New Roman" w:cs="Times New Roman"/>
+          <w:lang w:val="es-ES"/>
+        </w:rPr>
+        <w:t xml:space="preserve">Global </w:t>
+      </w:r>
+      <w:r>
+        <w:rPr>
+          <w:rFonts w:ascii="Times New Roman" w:hAnsi="Times New Roman" w:cs="Times New Roman"/>
+          <w:lang w:val="es-ES"/>
+        </w:rPr>
+        <w:t>Energy C</w:t>
+      </w:r>
+      <w:r>
+        <w:rPr>
+          <w:rFonts w:ascii="Times New Roman" w:hAnsi="Times New Roman" w:cs="Times New Roman"/>
+          <w:lang w:val="es-ES"/>
+        </w:rPr>
+        <w:t>onsu</w:t>
+      </w:r>
+      <w:r>
+        <w:rPr>
+          <w:rFonts w:ascii="Times New Roman" w:hAnsi="Times New Roman" w:cs="Times New Roman"/>
+          <w:lang w:val="es-ES"/>
+        </w:rPr>
+        <w:t>mption</w:t>
+      </w:r>
+      <w:r>
+        <w:rPr>
+          <w:rFonts w:ascii="Times New Roman" w:hAnsi="Times New Roman" w:cs="Times New Roman"/>
+          <w:lang w:val="es-ES"/>
+        </w:rPr>
+        <w:t>”</w:t>
+      </w:r>
       <w:r>
         <w:rPr>
           <w:rFonts w:ascii="Times New Roman" w:hAnsi="Times New Roman" w:cs="Times New Roman"/>
@@ -198,54 +266,134 @@
           <w:rFonts w:ascii="Times New Roman" w:hAnsi="Times New Roman" w:cs="Times New Roman"/>
           <w:lang w:val="es-ES"/>
         </w:rPr>
-        <w:t xml:space="preserve">a </w:t>
-      </w:r>
-      <w:r>
-        <w:rPr>
-          <w:rFonts w:ascii="Times New Roman" w:hAnsi="Times New Roman" w:cs="Times New Roman"/>
-          <w:lang w:val="es-ES"/>
-        </w:rPr>
-        <w:t>Socia</w:t>
-      </w:r>
-      <w:r>
-        <w:rPr>
-          <w:rFonts w:ascii="Times New Roman" w:hAnsi="Times New Roman" w:cs="Times New Roman"/>
-          <w:lang w:val="es-ES"/>
-        </w:rPr>
-        <w:t xml:space="preserve">l Cost </w:t>
-      </w:r>
-      <w:proofErr w:type="spellStart"/>
-      <w:r>
-        <w:rPr>
-          <w:rFonts w:ascii="Times New Roman" w:hAnsi="Times New Roman" w:cs="Times New Roman"/>
-          <w:lang w:val="es-ES"/>
-        </w:rPr>
-        <w:t>of</w:t>
-      </w:r>
-      <w:proofErr w:type="spellEnd"/>
-      <w:r>
-        <w:rPr>
-          <w:rFonts w:ascii="Times New Roman" w:hAnsi="Times New Roman" w:cs="Times New Roman"/>
-          <w:lang w:val="es-ES"/>
-        </w:rPr>
-        <w:t xml:space="preserve"> Car</w:t>
-      </w:r>
-      <w:r>
-        <w:rPr>
-          <w:rFonts w:ascii="Times New Roman" w:hAnsi="Times New Roman" w:cs="Times New Roman"/>
-          <w:lang w:val="es-ES"/>
-        </w:rPr>
-        <w:t xml:space="preserve">bon </w:t>
-      </w:r>
-      <w:proofErr w:type="spellStart"/>
-      <w:r>
-        <w:rPr>
-          <w:rFonts w:ascii="Times New Roman" w:hAnsi="Times New Roman" w:cs="Times New Roman"/>
-          <w:lang w:val="es-ES"/>
-        </w:rPr>
-        <w:t>for</w:t>
-      </w:r>
-      <w:proofErr w:type="spellEnd"/>
+        <w:t xml:space="preserve">busca </w:t>
+      </w:r>
+      <w:r>
+        <w:rPr>
+          <w:rFonts w:ascii="Times New Roman" w:hAnsi="Times New Roman" w:cs="Times New Roman"/>
+          <w:lang w:val="es-ES"/>
+        </w:rPr>
+        <w:t>generar</w:t>
+      </w:r>
+      <w:r>
+        <w:rPr>
+          <w:rFonts w:ascii="Times New Roman" w:hAnsi="Times New Roman" w:cs="Times New Roman"/>
+          <w:lang w:val="es-ES"/>
+        </w:rPr>
+        <w:t xml:space="preserve"> una esti</w:t>
+      </w:r>
+      <w:r>
+        <w:rPr>
+          <w:rFonts w:ascii="Times New Roman" w:hAnsi="Times New Roman" w:cs="Times New Roman"/>
+          <w:lang w:val="es-ES"/>
+        </w:rPr>
+        <w:t>mación</w:t>
+      </w:r>
+      <w:r>
+        <w:rPr>
+          <w:rFonts w:ascii="Times New Roman" w:hAnsi="Times New Roman" w:cs="Times New Roman"/>
+          <w:lang w:val="es-ES"/>
+        </w:rPr>
+        <w:t xml:space="preserve"> emp</w:t>
+      </w:r>
+      <w:r>
+        <w:rPr>
+          <w:rFonts w:ascii="Times New Roman" w:hAnsi="Times New Roman" w:cs="Times New Roman"/>
+          <w:lang w:val="es-ES"/>
+        </w:rPr>
+        <w:t>í</w:t>
+      </w:r>
+      <w:r>
+        <w:rPr>
+          <w:rFonts w:ascii="Times New Roman" w:hAnsi="Times New Roman" w:cs="Times New Roman"/>
+          <w:lang w:val="es-ES"/>
+        </w:rPr>
+        <w:t>r</w:t>
+      </w:r>
+      <w:r>
+        <w:rPr>
+          <w:rFonts w:ascii="Times New Roman" w:hAnsi="Times New Roman" w:cs="Times New Roman"/>
+          <w:lang w:val="es-ES"/>
+        </w:rPr>
+        <w:t>ica del costo</w:t>
+      </w:r>
+      <w:r>
+        <w:rPr>
+          <w:rFonts w:ascii="Times New Roman" w:hAnsi="Times New Roman" w:cs="Times New Roman"/>
+          <w:lang w:val="es-ES"/>
+        </w:rPr>
+        <w:t xml:space="preserve"> social del ca</w:t>
+      </w:r>
+      <w:r>
+        <w:rPr>
+          <w:rFonts w:ascii="Times New Roman" w:hAnsi="Times New Roman" w:cs="Times New Roman"/>
+          <w:lang w:val="es-ES"/>
+        </w:rPr>
+        <w:t>rbono (</w:t>
+      </w:r>
+      <w:r>
+        <w:rPr>
+          <w:rFonts w:ascii="Times New Roman" w:hAnsi="Times New Roman" w:cs="Times New Roman"/>
+          <w:lang w:val="es-ES"/>
+        </w:rPr>
+        <w:t xml:space="preserve">SCC) </w:t>
+      </w:r>
+      <w:r>
+        <w:rPr>
+          <w:rFonts w:ascii="Times New Roman" w:hAnsi="Times New Roman" w:cs="Times New Roman"/>
+          <w:lang w:val="es-ES"/>
+        </w:rPr>
+        <w:t>monet</w:t>
+      </w:r>
+      <w:r>
+        <w:rPr>
+          <w:rFonts w:ascii="Times New Roman" w:hAnsi="Times New Roman" w:cs="Times New Roman"/>
+          <w:lang w:val="es-ES"/>
+        </w:rPr>
+        <w:t xml:space="preserve">ario </w:t>
+      </w:r>
+      <w:r>
+        <w:rPr>
+          <w:rFonts w:ascii="Times New Roman" w:hAnsi="Times New Roman" w:cs="Times New Roman"/>
+          <w:lang w:val="es-ES"/>
+        </w:rPr>
+        <w:t xml:space="preserve">asociado </w:t>
+      </w:r>
+      <w:r>
+        <w:rPr>
+          <w:rFonts w:ascii="Times New Roman" w:hAnsi="Times New Roman" w:cs="Times New Roman"/>
+          <w:lang w:val="es-ES"/>
+        </w:rPr>
+        <w:t>al co</w:t>
+      </w:r>
+      <w:r>
+        <w:rPr>
+          <w:rFonts w:ascii="Times New Roman" w:hAnsi="Times New Roman" w:cs="Times New Roman"/>
+          <w:lang w:val="es-ES"/>
+        </w:rPr>
+        <w:t>nsumo ene</w:t>
+      </w:r>
+      <w:r>
+        <w:rPr>
+          <w:rFonts w:ascii="Times New Roman" w:hAnsi="Times New Roman" w:cs="Times New Roman"/>
+          <w:lang w:val="es-ES"/>
+        </w:rPr>
+        <w:t xml:space="preserve">rgético </w:t>
+      </w:r>
+      <w:r>
+        <w:rPr>
+          <w:rFonts w:ascii="Times New Roman" w:hAnsi="Times New Roman" w:cs="Times New Roman"/>
+          <w:lang w:val="es-ES"/>
+        </w:rPr>
+        <w:t>gl</w:t>
+      </w:r>
+      <w:r>
+        <w:rPr>
+          <w:rFonts w:ascii="Times New Roman" w:hAnsi="Times New Roman" w:cs="Times New Roman"/>
+          <w:lang w:val="es-ES"/>
+        </w:rPr>
+        <w:t xml:space="preserve">obal. </w:t>
+      </w:r>
       <w:r>
         <w:rPr>
           <w:rFonts w:ascii="Times New Roman" w:hAnsi="Times New Roman" w:cs="Times New Roman"/>
@@ -258,86 +406,170 @@
           <w:rFonts w:ascii="Times New Roman" w:hAnsi="Times New Roman" w:cs="Times New Roman"/>
           <w:lang w:val="es-ES"/>
         </w:rPr>
-        <w:t xml:space="preserve">Global </w:t>
-      </w:r>
-      <w:r>
-        <w:rPr>
-          <w:rFonts w:ascii="Times New Roman" w:hAnsi="Times New Roman" w:cs="Times New Roman"/>
-          <w:lang w:val="es-ES"/>
-        </w:rPr>
-        <w:t xml:space="preserve">Energy </w:t>
-      </w:r>
-      <w:proofErr w:type="spellStart"/>
-      <w:r>
-        <w:rPr>
-          <w:rFonts w:ascii="Times New Roman" w:hAnsi="Times New Roman" w:cs="Times New Roman"/>
-          <w:lang w:val="es-ES"/>
-        </w:rPr>
-        <w:t>C</w:t>
-      </w:r>
-      <w:r>
-        <w:rPr>
-          <w:rFonts w:ascii="Times New Roman" w:hAnsi="Times New Roman" w:cs="Times New Roman"/>
-          <w:lang w:val="es-ES"/>
-        </w:rPr>
-        <w:t>onsu</w:t>
-      </w:r>
-      <w:r>
-        <w:rPr>
-          <w:rFonts w:ascii="Times New Roman" w:hAnsi="Times New Roman" w:cs="Times New Roman"/>
-          <w:lang w:val="es-ES"/>
-        </w:rPr>
-        <w:t>mption</w:t>
-      </w:r>
-      <w:proofErr w:type="spellEnd"/>
-      <w:r>
-        <w:rPr>
-          <w:rFonts w:ascii="Times New Roman" w:hAnsi="Times New Roman" w:cs="Times New Roman"/>
-          <w:lang w:val="es-ES"/>
-        </w:rPr>
-        <w:t>”</w:t>
-      </w:r>
-      <w:r>
-        <w:rPr>
-          <w:rFonts w:ascii="Times New Roman" w:hAnsi="Times New Roman" w:cs="Times New Roman"/>
-          <w:lang w:val="es-ES"/>
-        </w:rPr>
-        <w:t xml:space="preserve"> </w:t>
-      </w:r>
-      <w:r>
-        <w:rPr>
-          <w:rFonts w:ascii="Times New Roman" w:hAnsi="Times New Roman" w:cs="Times New Roman"/>
-          <w:lang w:val="es-ES"/>
-        </w:rPr>
-        <w:t xml:space="preserve">busca </w:t>
-      </w:r>
-      <w:r>
-        <w:rPr>
-          <w:rFonts w:ascii="Times New Roman" w:hAnsi="Times New Roman" w:cs="Times New Roman"/>
-          <w:lang w:val="es-ES"/>
-        </w:rPr>
-        <w:t>generar</w:t>
-      </w:r>
-      <w:r>
-        <w:rPr>
-          <w:rFonts w:ascii="Times New Roman" w:hAnsi="Times New Roman" w:cs="Times New Roman"/>
-          <w:lang w:val="es-ES"/>
-        </w:rPr>
-        <w:t xml:space="preserve"> una esti</w:t>
-      </w:r>
-      <w:r>
-        <w:rPr>
-          <w:rFonts w:ascii="Times New Roman" w:hAnsi="Times New Roman" w:cs="Times New Roman"/>
-          <w:lang w:val="es-ES"/>
-        </w:rPr>
-        <w:t>mación</w:t>
-      </w:r>
-      <w:r>
-        <w:rPr>
-          <w:rFonts w:ascii="Times New Roman" w:hAnsi="Times New Roman" w:cs="Times New Roman"/>
-          <w:lang w:val="es-ES"/>
-        </w:rPr>
-        <w:t xml:space="preserve"> emp</w:t>
+        <w:t>La m</w:t>
+      </w:r>
+      <w:r>
+        <w:rPr>
+          <w:rFonts w:ascii="Times New Roman" w:hAnsi="Times New Roman" w:cs="Times New Roman"/>
+          <w:lang w:val="es-ES"/>
+        </w:rPr>
+        <w:t>étrica b</w:t>
+      </w:r>
+      <w:r>
+        <w:rPr>
+          <w:rFonts w:ascii="Times New Roman" w:hAnsi="Times New Roman" w:cs="Times New Roman"/>
+          <w:lang w:val="es-ES"/>
+        </w:rPr>
+        <w:t xml:space="preserve">usca </w:t>
+      </w:r>
+      <w:r>
+        <w:rPr>
+          <w:rFonts w:ascii="Times New Roman" w:hAnsi="Times New Roman" w:cs="Times New Roman"/>
+          <w:lang w:val="es-ES"/>
+        </w:rPr>
+        <w:t>capturar</w:t>
+      </w:r>
+      <w:r>
+        <w:rPr>
+          <w:rFonts w:ascii="Times New Roman" w:hAnsi="Times New Roman" w:cs="Times New Roman"/>
+          <w:lang w:val="es-ES"/>
+        </w:rPr>
+        <w:t xml:space="preserve"> los daños eco</w:t>
+      </w:r>
+      <w:r>
+        <w:rPr>
+          <w:rFonts w:ascii="Times New Roman" w:hAnsi="Times New Roman" w:cs="Times New Roman"/>
+          <w:lang w:val="es-ES"/>
+        </w:rPr>
+        <w:t>nómicos</w:t>
+      </w:r>
+      <w:r>
+        <w:rPr>
+          <w:rFonts w:ascii="Times New Roman" w:hAnsi="Times New Roman" w:cs="Times New Roman"/>
+          <w:lang w:val="es-ES"/>
+        </w:rPr>
+        <w:t xml:space="preserve"> futuros </w:t>
+      </w:r>
+      <w:r>
+        <w:rPr>
+          <w:rFonts w:ascii="Times New Roman" w:hAnsi="Times New Roman" w:cs="Times New Roman"/>
+          <w:lang w:val="es-ES"/>
+        </w:rPr>
+        <w:t>provo</w:t>
+      </w:r>
+      <w:r>
+        <w:rPr>
+          <w:rFonts w:ascii="Times New Roman" w:hAnsi="Times New Roman" w:cs="Times New Roman"/>
+          <w:lang w:val="es-ES"/>
+        </w:rPr>
+        <w:t xml:space="preserve">cados </w:t>
+      </w:r>
+      <w:r>
+        <w:rPr>
+          <w:rFonts w:ascii="Times New Roman" w:hAnsi="Times New Roman" w:cs="Times New Roman"/>
+          <w:lang w:val="es-ES"/>
+        </w:rPr>
+        <w:t>por emisione</w:t>
+      </w:r>
+      <w:r>
+        <w:rPr>
+          <w:rFonts w:ascii="Times New Roman" w:hAnsi="Times New Roman" w:cs="Times New Roman"/>
+          <w:lang w:val="es-ES"/>
+        </w:rPr>
+        <w:t>s adiciona</w:t>
+      </w:r>
+      <w:r>
+        <w:rPr>
+          <w:rFonts w:ascii="Times New Roman" w:hAnsi="Times New Roman" w:cs="Times New Roman"/>
+          <w:lang w:val="es-ES"/>
+        </w:rPr>
+        <w:t xml:space="preserve">les de una </w:t>
+      </w:r>
+      <w:r>
+        <w:rPr>
+          <w:rFonts w:ascii="Times New Roman" w:hAnsi="Times New Roman" w:cs="Times New Roman"/>
+          <w:lang w:val="es-ES"/>
+        </w:rPr>
+        <w:t>ton</w:t>
+      </w:r>
+      <w:r>
+        <w:rPr>
+          <w:rFonts w:ascii="Times New Roman" w:hAnsi="Times New Roman" w:cs="Times New Roman"/>
+          <w:lang w:val="es-ES"/>
+        </w:rPr>
+        <w:t>elada de CO</w:t>
+      </w:r>
+      <w:r>
+        <w:rPr>
+          <w:rFonts w:ascii="Times New Roman" w:hAnsi="Times New Roman" w:cs="Times New Roman"/>
+          <w:lang w:val="es-ES"/>
+        </w:rPr>
+        <w:t>2</w:t>
+      </w:r>
+      <w:r>
+        <w:rPr>
+          <w:rFonts w:ascii="Times New Roman" w:hAnsi="Times New Roman" w:cs="Times New Roman"/>
+          <w:lang w:val="es-ES"/>
+        </w:rPr>
+        <w:t xml:space="preserve">. </w:t>
+      </w:r>
+    </w:p>
+    <w:p>
+      <w:pPr>
+        <w:jc w:val="both"/>
+        <w:rPr>
+          <w:rFonts w:ascii="Times New Roman" w:hAnsi="Times New Roman" w:cs="Times New Roman"/>
+          <w:lang w:val="es-ES"/>
+        </w:rPr>
+      </w:pPr>
+      <w:r>
+        <w:rPr>
+          <w:rFonts w:ascii="Times New Roman" w:hAnsi="Times New Roman" w:cs="Times New Roman"/>
+          <w:lang w:val="es-ES"/>
+        </w:rPr>
+        <w:t>Para cumpl</w:t>
+      </w:r>
+      <w:r>
+        <w:rPr>
+          <w:rFonts w:ascii="Times New Roman" w:hAnsi="Times New Roman" w:cs="Times New Roman"/>
+          <w:lang w:val="es-ES"/>
+        </w:rPr>
+        <w:t>ir el o</w:t>
+      </w:r>
+      <w:r>
+        <w:rPr>
+          <w:rFonts w:ascii="Times New Roman" w:hAnsi="Times New Roman" w:cs="Times New Roman"/>
+          <w:lang w:val="es-ES"/>
+        </w:rPr>
+        <w:t>bjeti</w:t>
+      </w:r>
+      <w:r>
+        <w:rPr>
+          <w:rFonts w:ascii="Times New Roman" w:hAnsi="Times New Roman" w:cs="Times New Roman"/>
+          <w:lang w:val="es-ES"/>
+        </w:rPr>
+        <w:t>vo anterior</w:t>
+      </w:r>
+      <w:r>
+        <w:rPr>
+          <w:rFonts w:ascii="Times New Roman" w:hAnsi="Times New Roman" w:cs="Times New Roman"/>
+          <w:lang w:val="es-ES"/>
+        </w:rPr>
+        <w:t>,</w:t>
+      </w:r>
+      <w:r>
+        <w:rPr>
+          <w:rFonts w:ascii="Times New Roman" w:hAnsi="Times New Roman" w:cs="Times New Roman"/>
+          <w:lang w:val="es-ES"/>
+        </w:rPr>
+        <w:t xml:space="preserve"> el a</w:t>
+      </w:r>
+      <w:r>
+        <w:rPr>
+          <w:rFonts w:ascii="Times New Roman" w:hAnsi="Times New Roman" w:cs="Times New Roman"/>
+          <w:lang w:val="es-ES"/>
+        </w:rPr>
+        <w:t>rt</w:t>
       </w:r>
       <w:r>
         <w:rPr>
@@ -351,281 +583,6 @@
           <w:rFonts w:ascii="Times New Roman" w:hAnsi="Times New Roman" w:cs="Times New Roman"/>
           <w:lang w:val="es-ES"/>
         </w:rPr>
-        <w:t>r</w:t>
-      </w:r>
-      <w:r>
-        <w:rPr>
-          <w:rFonts w:ascii="Times New Roman" w:hAnsi="Times New Roman" w:cs="Times New Roman"/>
-          <w:lang w:val="es-ES"/>
-        </w:rPr>
-        <w:t>ica del costo</w:t>
-      </w:r>
-      <w:r>
-        <w:rPr>
-          <w:rFonts w:ascii="Times New Roman" w:hAnsi="Times New Roman" w:cs="Times New Roman"/>
-          <w:lang w:val="es-ES"/>
-        </w:rPr>
-        <w:t xml:space="preserve"> social del ca</w:t>
-      </w:r>
-      <w:r>
-        <w:rPr>
-          <w:rFonts w:ascii="Times New Roman" w:hAnsi="Times New Roman" w:cs="Times New Roman"/>
-          <w:lang w:val="es-ES"/>
-        </w:rPr>
-        <w:t>rbono (</w:t>
-      </w:r>
-      <w:r>
-        <w:rPr>
-          <w:rFonts w:ascii="Times New Roman" w:hAnsi="Times New Roman" w:cs="Times New Roman"/>
-          <w:lang w:val="es-ES"/>
-        </w:rPr>
-        <w:t xml:space="preserve">SCC) </w:t>
-      </w:r>
-      <w:r>
-        <w:rPr>
-          <w:rFonts w:ascii="Times New Roman" w:hAnsi="Times New Roman" w:cs="Times New Roman"/>
-          <w:lang w:val="es-ES"/>
-        </w:rPr>
-        <w:t>monet</w:t>
-      </w:r>
-      <w:r>
-        <w:rPr>
-          <w:rFonts w:ascii="Times New Roman" w:hAnsi="Times New Roman" w:cs="Times New Roman"/>
-          <w:lang w:val="es-ES"/>
-        </w:rPr>
-        <w:t xml:space="preserve">ario </w:t>
-      </w:r>
-      <w:r>
-        <w:rPr>
-          <w:rFonts w:ascii="Times New Roman" w:hAnsi="Times New Roman" w:cs="Times New Roman"/>
-          <w:lang w:val="es-ES"/>
-        </w:rPr>
-        <w:t xml:space="preserve">asociado </w:t>
-      </w:r>
-      <w:r>
-        <w:rPr>
-          <w:rFonts w:ascii="Times New Roman" w:hAnsi="Times New Roman" w:cs="Times New Roman"/>
-          <w:lang w:val="es-ES"/>
-        </w:rPr>
-        <w:t>al co</w:t>
-      </w:r>
-      <w:r>
-        <w:rPr>
-          <w:rFonts w:ascii="Times New Roman" w:hAnsi="Times New Roman" w:cs="Times New Roman"/>
-          <w:lang w:val="es-ES"/>
-        </w:rPr>
-        <w:t>nsumo ene</w:t>
-      </w:r>
-      <w:r>
-        <w:rPr>
-          <w:rFonts w:ascii="Times New Roman" w:hAnsi="Times New Roman" w:cs="Times New Roman"/>
-          <w:lang w:val="es-ES"/>
-        </w:rPr>
-        <w:t xml:space="preserve">rgético </w:t>
-      </w:r>
-      <w:r>
-        <w:rPr>
-          <w:rFonts w:ascii="Times New Roman" w:hAnsi="Times New Roman" w:cs="Times New Roman"/>
-          <w:lang w:val="es-ES"/>
-        </w:rPr>
-        <w:t>gl</w:t>
-      </w:r>
-      <w:r>
-        <w:rPr>
-          <w:rFonts w:ascii="Times New Roman" w:hAnsi="Times New Roman" w:cs="Times New Roman"/>
-          <w:lang w:val="es-ES"/>
-        </w:rPr>
-        <w:t xml:space="preserve">obal. </w:t>
-      </w:r>
-      <w:r>
-        <w:rPr>
-          <w:rFonts w:ascii="Times New Roman" w:hAnsi="Times New Roman" w:cs="Times New Roman"/>
-          <w:lang w:val="es-ES"/>
-        </w:rPr>
-        <w:t xml:space="preserve"> </w:t>
-      </w:r>
-      <w:r>
-        <w:rPr>
-          <w:rFonts w:ascii="Times New Roman" w:hAnsi="Times New Roman" w:cs="Times New Roman"/>
-          <w:lang w:val="es-ES"/>
-        </w:rPr>
-        <w:t>La m</w:t>
-      </w:r>
-      <w:r>
-        <w:rPr>
-          <w:rFonts w:ascii="Times New Roman" w:hAnsi="Times New Roman" w:cs="Times New Roman"/>
-          <w:lang w:val="es-ES"/>
-        </w:rPr>
-        <w:t>étrica b</w:t>
-      </w:r>
-      <w:r>
-        <w:rPr>
-          <w:rFonts w:ascii="Times New Roman" w:hAnsi="Times New Roman" w:cs="Times New Roman"/>
-          <w:lang w:val="es-ES"/>
-        </w:rPr>
-        <w:t xml:space="preserve">usca </w:t>
-      </w:r>
-      <w:r>
-        <w:rPr>
-          <w:rFonts w:ascii="Times New Roman" w:hAnsi="Times New Roman" w:cs="Times New Roman"/>
-          <w:lang w:val="es-ES"/>
-        </w:rPr>
-        <w:t>capturar</w:t>
-      </w:r>
-      <w:r>
-        <w:rPr>
-          <w:rFonts w:ascii="Times New Roman" w:hAnsi="Times New Roman" w:cs="Times New Roman"/>
-          <w:lang w:val="es-ES"/>
-        </w:rPr>
-        <w:t xml:space="preserve"> los daños eco</w:t>
-      </w:r>
-      <w:r>
-        <w:rPr>
-          <w:rFonts w:ascii="Times New Roman" w:hAnsi="Times New Roman" w:cs="Times New Roman"/>
-          <w:lang w:val="es-ES"/>
-        </w:rPr>
-        <w:t>nómicos</w:t>
-      </w:r>
-      <w:r>
-        <w:rPr>
-          <w:rFonts w:ascii="Times New Roman" w:hAnsi="Times New Roman" w:cs="Times New Roman"/>
-          <w:lang w:val="es-ES"/>
-        </w:rPr>
-        <w:t xml:space="preserve"> futuros </w:t>
-      </w:r>
-      <w:r>
-        <w:rPr>
-          <w:rFonts w:ascii="Times New Roman" w:hAnsi="Times New Roman" w:cs="Times New Roman"/>
-          <w:lang w:val="es-ES"/>
-        </w:rPr>
-        <w:t>provo</w:t>
-      </w:r>
-      <w:r>
-        <w:rPr>
-          <w:rFonts w:ascii="Times New Roman" w:hAnsi="Times New Roman" w:cs="Times New Roman"/>
-          <w:lang w:val="es-ES"/>
-        </w:rPr>
-        <w:t xml:space="preserve">cados </w:t>
-      </w:r>
-      <w:r>
-        <w:rPr>
-          <w:rFonts w:ascii="Times New Roman" w:hAnsi="Times New Roman" w:cs="Times New Roman"/>
-          <w:lang w:val="es-ES"/>
-        </w:rPr>
-        <w:t>por emisione</w:t>
-      </w:r>
-      <w:r>
-        <w:rPr>
-          <w:rFonts w:ascii="Times New Roman" w:hAnsi="Times New Roman" w:cs="Times New Roman"/>
-          <w:lang w:val="es-ES"/>
-        </w:rPr>
-        <w:t>s adiciona</w:t>
-      </w:r>
-      <w:r>
-        <w:rPr>
-          <w:rFonts w:ascii="Times New Roman" w:hAnsi="Times New Roman" w:cs="Times New Roman"/>
-          <w:lang w:val="es-ES"/>
-        </w:rPr>
-        <w:t xml:space="preserve">les de una </w:t>
-      </w:r>
-      <w:r>
-        <w:rPr>
-          <w:rFonts w:ascii="Times New Roman" w:hAnsi="Times New Roman" w:cs="Times New Roman"/>
-          <w:lang w:val="es-ES"/>
-        </w:rPr>
-        <w:t>ton</w:t>
-      </w:r>
-      <w:r>
-        <w:rPr>
-          <w:rFonts w:ascii="Times New Roman" w:hAnsi="Times New Roman" w:cs="Times New Roman"/>
-          <w:lang w:val="es-ES"/>
-        </w:rPr>
-        <w:t>elada de CO</w:t>
-      </w:r>
-      <w:r>
-        <w:rPr>
-          <w:rFonts w:ascii="Times New Roman" w:hAnsi="Times New Roman" w:cs="Times New Roman"/>
-          <w:lang w:val="es-ES"/>
-        </w:rPr>
-        <w:t>2</w:t>
-      </w:r>
-      <w:r>
-        <w:rPr>
-          <w:rFonts w:ascii="Times New Roman" w:hAnsi="Times New Roman" w:cs="Times New Roman"/>
-          <w:lang w:val="es-ES"/>
-        </w:rPr>
-        <w:t xml:space="preserve">. </w:t>
-      </w:r>
-    </w:p>
-    <w:p>
-      <w:pPr>
-        <w:jc w:val="both"/>
-        <w:rPr>
-          <w:rFonts w:ascii="Times New Roman" w:hAnsi="Times New Roman" w:cs="Times New Roman"/>
-          <w:lang w:val="es-ES"/>
-        </w:rPr>
-      </w:pPr>
-      <w:r>
-        <w:rPr>
-          <w:rFonts w:ascii="Times New Roman" w:hAnsi="Times New Roman" w:cs="Times New Roman"/>
-          <w:lang w:val="es-ES"/>
-        </w:rPr>
-        <w:t>Para cumpl</w:t>
-      </w:r>
-      <w:r>
-        <w:rPr>
-          <w:rFonts w:ascii="Times New Roman" w:hAnsi="Times New Roman" w:cs="Times New Roman"/>
-          <w:lang w:val="es-ES"/>
-        </w:rPr>
-        <w:t>ir el o</w:t>
-      </w:r>
-      <w:r>
-        <w:rPr>
-          <w:rFonts w:ascii="Times New Roman" w:hAnsi="Times New Roman" w:cs="Times New Roman"/>
-          <w:lang w:val="es-ES"/>
-        </w:rPr>
-        <w:t>bjeti</w:t>
-      </w:r>
-      <w:r>
-        <w:rPr>
-          <w:rFonts w:ascii="Times New Roman" w:hAnsi="Times New Roman" w:cs="Times New Roman"/>
-          <w:lang w:val="es-ES"/>
-        </w:rPr>
-        <w:t>vo anterior</w:t>
-      </w:r>
-      <w:r>
-        <w:rPr>
-          <w:rFonts w:ascii="Times New Roman" w:hAnsi="Times New Roman" w:cs="Times New Roman"/>
-          <w:lang w:val="es-ES"/>
-        </w:rPr>
-        <w:t>,</w:t>
-      </w:r>
-      <w:r>
-        <w:rPr>
-          <w:rFonts w:ascii="Times New Roman" w:hAnsi="Times New Roman" w:cs="Times New Roman"/>
-          <w:lang w:val="es-ES"/>
-        </w:rPr>
-        <w:t xml:space="preserve"> el a</w:t>
-      </w:r>
-      <w:r>
-        <w:rPr>
-          <w:rFonts w:ascii="Times New Roman" w:hAnsi="Times New Roman" w:cs="Times New Roman"/>
-          <w:lang w:val="es-ES"/>
-        </w:rPr>
-        <w:t>rt</w:t>
-      </w:r>
-      <w:r>
-        <w:rPr>
-          <w:rFonts w:ascii="Times New Roman" w:hAnsi="Times New Roman" w:cs="Times New Roman"/>
-          <w:lang w:val="es-ES"/>
-        </w:rPr>
-        <w:t>í</w:t>
-      </w:r>
-      <w:r>
-        <w:rPr>
-          <w:rFonts w:ascii="Times New Roman" w:hAnsi="Times New Roman" w:cs="Times New Roman"/>
-          <w:lang w:val="es-ES"/>
-        </w:rPr>
         <w:t>culo adopta un en</w:t>
       </w:r>
       <w:r>
@@ -698,7 +655,6 @@
         </w:rPr>
         <w:t>ta-</w:t>
       </w:r>
-      <w:proofErr w:type="spellStart"/>
       <w:r>
         <w:rPr>
           <w:rFonts w:ascii="Times New Roman" w:hAnsi="Times New Roman" w:cs="Times New Roman"/>
@@ -706,21 +662,12 @@
         </w:rPr>
         <w:t>Driven</w:t>
       </w:r>
-      <w:proofErr w:type="spellEnd"/>
-      <w:r>
-        <w:rPr>
-          <w:rFonts w:ascii="Times New Roman" w:hAnsi="Times New Roman" w:cs="Times New Roman"/>
-          <w:lang w:val="es-ES"/>
-        </w:rPr>
-        <w:t xml:space="preserve"> </w:t>
-      </w:r>
-      <w:proofErr w:type="spellStart"/>
-      <w:r>
-        <w:rPr>
-          <w:rFonts w:ascii="Times New Roman" w:hAnsi="Times New Roman" w:cs="Times New Roman"/>
-          <w:lang w:val="es-ES"/>
-        </w:rPr>
-        <w:t>Sp</w:t>
+      <w:r>
+        <w:rPr>
+          <w:rFonts w:ascii="Times New Roman" w:hAnsi="Times New Roman" w:cs="Times New Roman"/>
+          <w:lang w:val="es-ES"/>
+        </w:rPr>
+        <w:t xml:space="preserve"> Sp</w:t>
       </w:r>
       <w:r>
         <w:rPr>
@@ -734,54 +681,14 @@
           <w:rFonts w:ascii="Times New Roman" w:hAnsi="Times New Roman" w:cs="Times New Roman"/>
           <w:lang w:val="es-ES"/>
         </w:rPr>
-        <w:t>ial</w:t>
-      </w:r>
-      <w:proofErr w:type="spellEnd"/>
-      <w:r>
-        <w:rPr>
-          <w:rFonts w:ascii="Times New Roman" w:hAnsi="Times New Roman" w:cs="Times New Roman"/>
-          <w:lang w:val="es-ES"/>
-        </w:rPr>
-        <w:t xml:space="preserve"> </w:t>
-      </w:r>
-      <w:proofErr w:type="spellStart"/>
-      <w:r>
-        <w:rPr>
-          <w:rFonts w:ascii="Times New Roman" w:hAnsi="Times New Roman" w:cs="Times New Roman"/>
-          <w:lang w:val="es-ES"/>
-        </w:rPr>
-        <w:t>Climate</w:t>
-      </w:r>
-      <w:proofErr w:type="spellEnd"/>
-      <w:r>
-        <w:rPr>
-          <w:rFonts w:ascii="Times New Roman" w:hAnsi="Times New Roman" w:cs="Times New Roman"/>
-          <w:lang w:val="es-ES"/>
-        </w:rPr>
-        <w:t xml:space="preserve"> </w:t>
-      </w:r>
-      <w:proofErr w:type="spellStart"/>
-      <w:r>
-        <w:rPr>
-          <w:rFonts w:ascii="Times New Roman" w:hAnsi="Times New Roman" w:cs="Times New Roman"/>
-          <w:lang w:val="es-ES"/>
-        </w:rPr>
-        <w:t>I</w:t>
-      </w:r>
-      <w:r>
-        <w:rPr>
-          <w:rFonts w:ascii="Times New Roman" w:hAnsi="Times New Roman" w:cs="Times New Roman"/>
-          <w:lang w:val="es-ES"/>
-        </w:rPr>
-        <w:t>mpact</w:t>
-      </w:r>
-      <w:proofErr w:type="spellEnd"/>
-      <w:r>
-        <w:rPr>
-          <w:rFonts w:ascii="Times New Roman" w:hAnsi="Times New Roman" w:cs="Times New Roman"/>
-          <w:lang w:val="es-ES"/>
-        </w:rPr>
-        <w:t xml:space="preserve"> M</w:t>
+        <w:t>ial Climate I</w:t>
+      </w:r>
+      <w:r>
+        <w:rPr>
+          <w:rFonts w:ascii="Times New Roman" w:hAnsi="Times New Roman" w:cs="Times New Roman"/>
+          <w:lang w:val="es-ES"/>
+        </w:rPr>
+        <w:t>mpact M</w:t>
       </w:r>
       <w:r>
         <w:rPr>
@@ -825,7 +732,6 @@
         </w:rPr>
         <w:t xml:space="preserve">dicional </w:t>
       </w:r>
-      <w:proofErr w:type="spellStart"/>
       <w:r>
         <w:rPr>
           <w:rFonts w:ascii="Times New Roman" w:hAnsi="Times New Roman" w:cs="Times New Roman"/>
@@ -838,68 +744,28 @@
           <w:rFonts w:ascii="Times New Roman" w:hAnsi="Times New Roman" w:cs="Times New Roman"/>
           <w:lang w:val="es-ES"/>
         </w:rPr>
-        <w:t>det</w:t>
-      </w:r>
-      <w:proofErr w:type="spellEnd"/>
-      <w:r>
-        <w:rPr>
-          <w:rFonts w:ascii="Times New Roman" w:hAnsi="Times New Roman" w:cs="Times New Roman"/>
-          <w:lang w:val="es-ES"/>
-        </w:rPr>
-        <w:t xml:space="preserve"> </w:t>
-      </w:r>
-      <w:proofErr w:type="spellStart"/>
-      <w:r>
-        <w:rPr>
-          <w:rFonts w:ascii="Times New Roman" w:hAnsi="Times New Roman" w:cs="Times New Roman"/>
-          <w:lang w:val="es-ES"/>
-        </w:rPr>
-        <w:t>A</w:t>
-      </w:r>
-      <w:r>
-        <w:rPr>
-          <w:rFonts w:ascii="Times New Roman" w:hAnsi="Times New Roman" w:cs="Times New Roman"/>
-          <w:lang w:val="es-ES"/>
-        </w:rPr>
-        <w:t>ssesment</w:t>
-      </w:r>
-      <w:proofErr w:type="spellEnd"/>
-      <w:r>
-        <w:rPr>
-          <w:rFonts w:ascii="Times New Roman" w:hAnsi="Times New Roman" w:cs="Times New Roman"/>
-          <w:lang w:val="es-ES"/>
-        </w:rPr>
-        <w:t xml:space="preserve"> Mo</w:t>
-      </w:r>
-      <w:r>
-        <w:rPr>
-          <w:rFonts w:ascii="Times New Roman" w:hAnsi="Times New Roman" w:cs="Times New Roman"/>
-          <w:lang w:val="es-ES"/>
-        </w:rPr>
-        <w:t>del (</w:t>
-      </w:r>
-      <w:proofErr w:type="spellStart"/>
-      <w:r>
-        <w:rPr>
-          <w:rFonts w:ascii="Times New Roman" w:hAnsi="Times New Roman" w:cs="Times New Roman"/>
-          <w:lang w:val="es-ES"/>
-        </w:rPr>
-        <w:t>AI</w:t>
-      </w:r>
-      <w:r>
-        <w:rPr>
-          <w:rFonts w:ascii="Times New Roman" w:hAnsi="Times New Roman" w:cs="Times New Roman"/>
-          <w:lang w:val="es-ES"/>
-        </w:rPr>
-        <w:t>Ms</w:t>
-      </w:r>
-      <w:proofErr w:type="spellEnd"/>
-      <w:r>
-        <w:rPr>
-          <w:rFonts w:ascii="Times New Roman" w:hAnsi="Times New Roman" w:cs="Times New Roman"/>
-          <w:lang w:val="es-ES"/>
-        </w:rPr>
-        <w:t>) u</w:t>
+        <w:t>det A</w:t>
+      </w:r>
+      <w:r>
+        <w:rPr>
+          <w:rFonts w:ascii="Times New Roman" w:hAnsi="Times New Roman" w:cs="Times New Roman"/>
+          <w:lang w:val="es-ES"/>
+        </w:rPr>
+        <w:t>ssesment Mo</w:t>
+      </w:r>
+      <w:r>
+        <w:rPr>
+          <w:rFonts w:ascii="Times New Roman" w:hAnsi="Times New Roman" w:cs="Times New Roman"/>
+          <w:lang w:val="es-ES"/>
+        </w:rPr>
+        <w:t>del (AI</w:t>
+      </w:r>
+      <w:r>
+        <w:rPr>
+          <w:rFonts w:ascii="Times New Roman" w:hAnsi="Times New Roman" w:cs="Times New Roman"/>
+          <w:lang w:val="es-ES"/>
+        </w:rPr>
+        <w:t>Ms) u</w:t>
       </w:r>
       <w:r>
         <w:rPr>
@@ -1533,7 +1399,6 @@
         </w:rPr>
         <w:t xml:space="preserve">, que corresponden a la construcción del </w:t>
       </w:r>
-      <w:proofErr w:type="spellStart"/>
       <w:r>
         <w:rPr>
           <w:rFonts w:ascii="Times New Roman" w:hAnsi="Times New Roman" w:cs="Times New Roman"/>
@@ -1541,7 +1406,6 @@
         </w:rPr>
         <w:t>Dataset</w:t>
       </w:r>
-      <w:proofErr w:type="spellEnd"/>
       <w:r>
         <w:rPr>
           <w:rFonts w:ascii="Times New Roman" w:hAnsi="Times New Roman" w:cs="Times New Roman"/>
@@ -1579,7 +1443,6 @@
         </w:rPr>
         <w:t xml:space="preserve"> Step 1, el propósito es reconstruir el </w:t>
       </w:r>
-      <w:proofErr w:type="spellStart"/>
       <w:r>
         <w:rPr>
           <w:rFonts w:ascii="Times New Roman" w:hAnsi="Times New Roman" w:cs="Times New Roman"/>
@@ -1587,23 +1450,27 @@
         </w:rPr>
         <w:t>Dataset</w:t>
       </w:r>
-      <w:proofErr w:type="spellEnd"/>
-      <w:r>
-        <w:rPr>
-          <w:rFonts w:ascii="Times New Roman" w:hAnsi="Times New Roman" w:cs="Times New Roman"/>
-          <w:lang w:val="es-ES"/>
-        </w:rPr>
-        <w:t xml:space="preserve"> utilizado en el estudio combinando múltiples fuentes de información global. Este paso incluye la limpieza y armonización de datos de consumo energético provenientes de la International Energy Agency (IEA), datos climáticos históricos del Global </w:t>
-      </w:r>
-      <w:proofErr w:type="spellStart"/>
-      <w:r>
-        <w:rPr>
-          <w:rFonts w:ascii="Times New Roman" w:hAnsi="Times New Roman" w:cs="Times New Roman"/>
-          <w:lang w:val="es-ES"/>
-        </w:rPr>
-        <w:t>Meteorological</w:t>
-      </w:r>
-      <w:proofErr w:type="spellEnd"/>
+      <w:r>
+        <w:rPr>
+          <w:rFonts w:ascii="Times New Roman" w:hAnsi="Times New Roman" w:cs="Times New Roman"/>
+          <w:lang w:val="es-ES"/>
+        </w:rPr>
+        <w:t xml:space="preserve"> utilizado en el estudio combinando múltiples fuentes de información global. Este paso incluye la limpieza y armonización de datos de consumo energético provenientes de la International Energy Agency (IEA), datos climáticos históricos del Global Meteorological Forcing </w:t>
+      </w:r>
+      <w:r>
+        <w:rPr>
+          <w:rFonts w:ascii="Times New Roman" w:hAnsi="Times New Roman" w:cs="Times New Roman"/>
+          <w:lang w:val="es-ES"/>
+        </w:rPr>
+        <w:t>Dataset</w:t>
+      </w:r>
+      <w:r>
+        <w:rPr>
+          <w:rFonts w:ascii="Times New Roman" w:hAnsi="Times New Roman" w:cs="Times New Roman"/>
+          <w:lang w:val="es-ES"/>
+        </w:rPr>
+        <w:t xml:space="preserve"> (GMFD) y variables socioeconómicas como ingreso per cápita y población.</w:t>
+      </w:r>
       <w:r>
         <w:rPr>
           <w:rFonts w:ascii="Times New Roman" w:hAnsi="Times New Roman" w:cs="Times New Roman"/>
@@ -1611,45 +1478,6 @@
         </w:rPr>
         <w:t xml:space="preserve"> </w:t>
       </w:r>
-      <w:proofErr w:type="spellStart"/>
-      <w:r>
-        <w:rPr>
-          <w:rFonts w:ascii="Times New Roman" w:hAnsi="Times New Roman" w:cs="Times New Roman"/>
-          <w:lang w:val="es-ES"/>
-        </w:rPr>
-        <w:t>Forcing</w:t>
-      </w:r>
-      <w:proofErr w:type="spellEnd"/>
-      <w:r>
-        <w:rPr>
-          <w:rFonts w:ascii="Times New Roman" w:hAnsi="Times New Roman" w:cs="Times New Roman"/>
-          <w:lang w:val="es-ES"/>
-        </w:rPr>
-        <w:t xml:space="preserve"> </w:t>
-      </w:r>
-      <w:proofErr w:type="spellStart"/>
-      <w:r>
-        <w:rPr>
-          <w:rFonts w:ascii="Times New Roman" w:hAnsi="Times New Roman" w:cs="Times New Roman"/>
-          <w:lang w:val="es-ES"/>
-        </w:rPr>
-        <w:t>Dataset</w:t>
-      </w:r>
-      <w:proofErr w:type="spellEnd"/>
-      <w:r>
-        <w:rPr>
-          <w:rFonts w:ascii="Times New Roman" w:hAnsi="Times New Roman" w:cs="Times New Roman"/>
-          <w:lang w:val="es-ES"/>
-        </w:rPr>
-        <w:t xml:space="preserve"> (GMFD) y variables socioeconómicas como ingreso per cápita y población.</w:t>
-      </w:r>
-      <w:r>
-        <w:rPr>
-          <w:rFonts w:ascii="Times New Roman" w:hAnsi="Times New Roman" w:cs="Times New Roman"/>
-          <w:lang w:val="es-ES"/>
-        </w:rPr>
-        <w:t xml:space="preserve"> </w:t>
-      </w:r>
       <w:r>
         <w:rPr>
           <w:rFonts w:ascii="Times New Roman" w:hAnsi="Times New Roman" w:cs="Times New Roman"/>
@@ -1785,23 +1613,7 @@
           <w:rFonts w:ascii="Times New Roman" w:hAnsi="Times New Roman" w:cs="Times New Roman"/>
           <w:lang w:val="es-ES"/>
         </w:rPr>
-        <w:t xml:space="preserve">Por otra parte, las regresiones son el </w:t>
-      </w:r>
-      <w:proofErr w:type="spellStart"/>
-      <w:r>
-        <w:rPr>
-          <w:rFonts w:ascii="Times New Roman" w:hAnsi="Times New Roman" w:cs="Times New Roman"/>
-          <w:lang w:val="es-ES"/>
-        </w:rPr>
-        <w:t>core</w:t>
-      </w:r>
-      <w:proofErr w:type="spellEnd"/>
-      <w:r>
-        <w:rPr>
-          <w:rFonts w:ascii="Times New Roman" w:hAnsi="Times New Roman" w:cs="Times New Roman"/>
-          <w:lang w:val="es-ES"/>
-        </w:rPr>
-        <w:t xml:space="preserve"> del ejercicio, por lo que eran la forma de comprobar que el ejercicio de replicación generaba los resultados antes encontrados. </w:t>
+        <w:t xml:space="preserve">Por otra parte, las regresiones son el core del ejercicio, por lo que eran la forma de comprobar que el ejercicio de replicación generaba los resultados antes encontrados. </w:t>
       </w:r>
     </w:p>
     <w:p>
@@ -1931,127 +1743,7 @@
           <w:szCs w:val="16"/>
           <w:lang w:val="es-ES"/>
         </w:rPr>
-        <w:t>Repositorio original de “</w:t>
-      </w:r>
-      <w:proofErr w:type="spellStart"/>
-      <w:r>
-        <w:rPr>
-          <w:rFonts w:ascii="Times New Roman" w:hAnsi="Times New Roman" w:cs="Times New Roman"/>
-          <w:i/>
-          <w:iCs/>
-          <w:sz w:val="16"/>
-          <w:szCs w:val="16"/>
-          <w:lang w:val="es-ES"/>
-        </w:rPr>
-        <w:t>Estimating</w:t>
-      </w:r>
-      <w:proofErr w:type="spellEnd"/>
-      <w:r>
-        <w:rPr>
-          <w:rFonts w:ascii="Times New Roman" w:hAnsi="Times New Roman" w:cs="Times New Roman"/>
-          <w:i/>
-          <w:iCs/>
-          <w:sz w:val="16"/>
-          <w:szCs w:val="16"/>
-          <w:lang w:val="es-ES"/>
-        </w:rPr>
-        <w:t xml:space="preserve"> a Social Cost </w:t>
-      </w:r>
-      <w:proofErr w:type="spellStart"/>
-      <w:r>
-        <w:rPr>
-          <w:rFonts w:ascii="Times New Roman" w:hAnsi="Times New Roman" w:cs="Times New Roman"/>
-          <w:i/>
-          <w:iCs/>
-          <w:sz w:val="16"/>
-          <w:szCs w:val="16"/>
-          <w:lang w:val="es-ES"/>
-        </w:rPr>
-        <w:t>of</w:t>
-      </w:r>
-      <w:proofErr w:type="spellEnd"/>
-      <w:r>
-        <w:rPr>
-          <w:rFonts w:ascii="Times New Roman" w:hAnsi="Times New Roman" w:cs="Times New Roman"/>
-          <w:i/>
-          <w:iCs/>
-          <w:sz w:val="16"/>
-          <w:szCs w:val="16"/>
-          <w:lang w:val="es-ES"/>
-        </w:rPr>
-        <w:t xml:space="preserve"> Carbon </w:t>
-      </w:r>
-      <w:proofErr w:type="spellStart"/>
-      <w:r>
-        <w:rPr>
-          <w:rFonts w:ascii="Times New Roman" w:hAnsi="Times New Roman" w:cs="Times New Roman"/>
-          <w:i/>
-          <w:iCs/>
-          <w:sz w:val="16"/>
-          <w:szCs w:val="16"/>
-          <w:lang w:val="es-ES"/>
-        </w:rPr>
-        <w:t>for</w:t>
-      </w:r>
-      <w:proofErr w:type="spellEnd"/>
-      <w:r>
-        <w:rPr>
-          <w:rFonts w:ascii="Times New Roman" w:hAnsi="Times New Roman" w:cs="Times New Roman"/>
-          <w:i/>
-          <w:iCs/>
-          <w:sz w:val="16"/>
-          <w:szCs w:val="16"/>
-          <w:lang w:val="es-ES"/>
-        </w:rPr>
-        <w:t xml:space="preserve"> Global Energy </w:t>
-      </w:r>
-      <w:proofErr w:type="spellStart"/>
-      <w:r>
-        <w:rPr>
-          <w:rFonts w:ascii="Times New Roman" w:hAnsi="Times New Roman" w:cs="Times New Roman"/>
-          <w:i/>
-          <w:iCs/>
-          <w:sz w:val="16"/>
-          <w:szCs w:val="16"/>
-          <w:lang w:val="es-ES"/>
-        </w:rPr>
-        <w:t>Consumption</w:t>
-      </w:r>
-      <w:proofErr w:type="spellEnd"/>
-      <w:r>
-        <w:rPr>
-          <w:rFonts w:ascii="Times New Roman" w:hAnsi="Times New Roman" w:cs="Times New Roman"/>
-          <w:i/>
-          <w:iCs/>
-          <w:sz w:val="16"/>
-          <w:szCs w:val="16"/>
-          <w:lang w:val="es-ES"/>
-        </w:rPr>
-        <w:t xml:space="preserve">” (Rode </w:t>
-      </w:r>
-      <w:proofErr w:type="spellStart"/>
-      <w:r>
-        <w:rPr>
-          <w:rFonts w:ascii="Times New Roman" w:hAnsi="Times New Roman" w:cs="Times New Roman"/>
-          <w:i/>
-          <w:iCs/>
-          <w:sz w:val="16"/>
-          <w:szCs w:val="16"/>
-          <w:lang w:val="es-ES"/>
-        </w:rPr>
-        <w:t>er</w:t>
-      </w:r>
-      <w:proofErr w:type="spellEnd"/>
-      <w:r>
-        <w:rPr>
-          <w:rFonts w:ascii="Times New Roman" w:hAnsi="Times New Roman" w:cs="Times New Roman"/>
-          <w:i/>
-          <w:iCs/>
-          <w:sz w:val="16"/>
-          <w:szCs w:val="16"/>
-          <w:lang w:val="es-ES"/>
-        </w:rPr>
-        <w:t xml:space="preserve"> al, 2021)</w:t>
+        <w:t>Repositorio original de “Estimating a Social Cost of Carbon for Global Energy Consumption” (Rode er al, 2021)</w:t>
       </w:r>
     </w:p>
     <w:p>
@@ -2076,7 +1768,6 @@
         </w:rPr>
         <w:t xml:space="preserve"> repositorio incluye principalmente scripts de procesamiento de datos y estimación econométrica que permiten ejecutar los pasos iniciales del análisis. En particular, el código disponible permite reconstruir el </w:t>
       </w:r>
-      <w:proofErr w:type="spellStart"/>
       <w:r>
         <w:rPr>
           <w:rFonts w:ascii="Times New Roman" w:hAnsi="Times New Roman" w:cs="Times New Roman"/>
@@ -2084,7 +1775,6 @@
         </w:rPr>
         <w:t>dataset</w:t>
       </w:r>
-      <w:proofErr w:type="spellEnd"/>
       <w:r>
         <w:rPr>
           <w:rFonts w:ascii="Times New Roman" w:hAnsi="Times New Roman" w:cs="Times New Roman"/>
@@ -2106,17 +1796,36 @@
           <w:rFonts w:ascii="Times New Roman" w:hAnsi="Times New Roman" w:cs="Times New Roman"/>
           <w:lang w:val="es-ES"/>
         </w:rPr>
-        <w:t xml:space="preserve">Los datos utilizados provienen de varias fuentes. El consumo energético se obtiene del World Energy Balances de la International Energy Agency (IEA), mientras que los datos climáticos provienen del Global </w:t>
-      </w:r>
-      <w:proofErr w:type="spellStart"/>
-      <w:r>
-        <w:rPr>
-          <w:rFonts w:ascii="Times New Roman" w:hAnsi="Times New Roman" w:cs="Times New Roman"/>
-          <w:lang w:val="es-ES"/>
-        </w:rPr>
-        <w:t>Meteorological</w:t>
-      </w:r>
-      <w:proofErr w:type="spellEnd"/>
+        <w:t xml:space="preserve">Los datos utilizados provienen de varias fuentes. El consumo energético se obtiene del World Energy Balances de la International Energy Agency (IEA), mientras que los datos climáticos provienen del Global Meteorological Forcing </w:t>
+      </w:r>
+      <w:r>
+        <w:rPr>
+          <w:rFonts w:ascii="Times New Roman" w:hAnsi="Times New Roman" w:cs="Times New Roman"/>
+          <w:lang w:val="es-ES"/>
+        </w:rPr>
+        <w:t>Dataset</w:t>
+      </w:r>
+      <w:r>
+        <w:rPr>
+          <w:rFonts w:ascii="Times New Roman" w:hAnsi="Times New Roman" w:cs="Times New Roman"/>
+          <w:lang w:val="es-ES"/>
+        </w:rPr>
+        <w:t xml:space="preserve"> (GMFD), que ofrece información diaria de temperatura y precipitación a una resolución espacial de 0.25 grados. Además, se utilizan datos de ingreso per cápita y población</w:t>
+      </w:r>
+      <w:r>
+        <w:rPr>
+          <w:rFonts w:ascii="Times New Roman" w:hAnsi="Times New Roman" w:cs="Times New Roman"/>
+          <w:lang w:val="es-ES"/>
+        </w:rPr>
+        <w:t>,</w:t>
+      </w:r>
+      <w:r>
+        <w:rPr>
+          <w:rFonts w:ascii="Times New Roman" w:hAnsi="Times New Roman" w:cs="Times New Roman"/>
+          <w:lang w:val="es-ES"/>
+        </w:rPr>
+        <w:t xml:space="preserve"> provenientes del Banco Mundial e integrados en las bases de la IEA. </w:t>
+      </w:r>
       <w:r>
         <w:rPr>
           <w:rFonts w:ascii="Times New Roman" w:hAnsi="Times New Roman" w:cs="Times New Roman"/>
@@ -2124,59 +1833,6 @@
         </w:rPr>
         <w:t xml:space="preserve"> </w:t>
       </w:r>
-      <w:proofErr w:type="spellStart"/>
-      <w:r>
-        <w:rPr>
-          <w:rFonts w:ascii="Times New Roman" w:hAnsi="Times New Roman" w:cs="Times New Roman"/>
-          <w:lang w:val="es-ES"/>
-        </w:rPr>
-        <w:t>Forcing</w:t>
-      </w:r>
-      <w:proofErr w:type="spellEnd"/>
-      <w:r>
-        <w:rPr>
-          <w:rFonts w:ascii="Times New Roman" w:hAnsi="Times New Roman" w:cs="Times New Roman"/>
-          <w:lang w:val="es-ES"/>
-        </w:rPr>
-        <w:t xml:space="preserve"> </w:t>
-      </w:r>
-      <w:proofErr w:type="spellStart"/>
-      <w:r>
-        <w:rPr>
-          <w:rFonts w:ascii="Times New Roman" w:hAnsi="Times New Roman" w:cs="Times New Roman"/>
-          <w:lang w:val="es-ES"/>
-        </w:rPr>
-        <w:t>Dataset</w:t>
-      </w:r>
-      <w:proofErr w:type="spellEnd"/>
-      <w:r>
-        <w:rPr>
-          <w:rFonts w:ascii="Times New Roman" w:hAnsi="Times New Roman" w:cs="Times New Roman"/>
-          <w:lang w:val="es-ES"/>
-        </w:rPr>
-        <w:t xml:space="preserve"> (GMFD), que ofrece información diaria de temperatura y precipitación a una resolución espacial de 0.25 grados. Además, se utilizan datos de ingreso per cápita y población</w:t>
-      </w:r>
-      <w:r>
-        <w:rPr>
-          <w:rFonts w:ascii="Times New Roman" w:hAnsi="Times New Roman" w:cs="Times New Roman"/>
-          <w:lang w:val="es-ES"/>
-        </w:rPr>
-        <w:t>,</w:t>
-      </w:r>
-      <w:r>
-        <w:rPr>
-          <w:rFonts w:ascii="Times New Roman" w:hAnsi="Times New Roman" w:cs="Times New Roman"/>
-          <w:lang w:val="es-ES"/>
-        </w:rPr>
-        <w:t xml:space="preserve"> provenientes del Banco Mundial e integrados en las bases de la IEA. </w:t>
-      </w:r>
-      <w:r>
-        <w:rPr>
-          <w:rFonts w:ascii="Times New Roman" w:hAnsi="Times New Roman" w:cs="Times New Roman"/>
-          <w:lang w:val="es-ES"/>
-        </w:rPr>
-        <w:t xml:space="preserve"> </w:t>
-      </w:r>
       <w:r>
         <w:rPr>
           <w:rFonts w:ascii="Times New Roman" w:hAnsi="Times New Roman" w:cs="Times New Roman"/>
@@ -2189,17 +1845,8 @@
           <w:rFonts w:ascii="Times New Roman" w:hAnsi="Times New Roman" w:cs="Times New Roman"/>
           <w:lang w:val="es-ES"/>
         </w:rPr>
-        <w:t xml:space="preserve">autores referencian a </w:t>
-      </w:r>
-      <w:proofErr w:type="spellStart"/>
-      <w:r>
-        <w:rPr>
-          <w:rFonts w:ascii="Times New Roman" w:hAnsi="Times New Roman" w:cs="Times New Roman"/>
-          <w:lang w:val="es-ES"/>
-        </w:rPr>
-        <w:t>Zenodo</w:t>
-      </w:r>
-      <w:proofErr w:type="spellEnd"/>
+        <w:t>autores referencian a Zenodo</w:t>
+      </w:r>
       <w:r>
         <w:rPr>
           <w:rStyle w:val="FootnoteReference"/>
@@ -2402,7 +2049,6 @@
         </w:rPr>
         <w:t xml:space="preserve">a la construcción del </w:t>
       </w:r>
-      <w:proofErr w:type="spellStart"/>
       <w:r>
         <w:rPr>
           <w:rFonts w:ascii="Times New Roman" w:hAnsi="Times New Roman" w:cs="Times New Roman"/>
@@ -2410,7 +2056,6 @@
         </w:rPr>
         <w:t>dataset</w:t>
       </w:r>
-      <w:proofErr w:type="spellEnd"/>
       <w:r>
         <w:rPr>
           <w:rFonts w:ascii="Times New Roman" w:hAnsi="Times New Roman" w:cs="Times New Roman"/>
@@ -2446,23 +2091,7 @@
           <w:rFonts w:ascii="Times New Roman" w:hAnsi="Times New Roman" w:cs="Times New Roman"/>
           <w:lang w:val="es-ES"/>
         </w:rPr>
-        <w:t xml:space="preserve">se generó un </w:t>
-      </w:r>
-      <w:proofErr w:type="spellStart"/>
-      <w:r>
-        <w:rPr>
-          <w:rFonts w:ascii="Times New Roman" w:hAnsi="Times New Roman" w:cs="Times New Roman"/>
-          <w:lang w:val="es-ES"/>
-        </w:rPr>
-        <w:t>fork</w:t>
-      </w:r>
-      <w:proofErr w:type="spellEnd"/>
-      <w:r>
-        <w:rPr>
-          <w:rFonts w:ascii="Times New Roman" w:hAnsi="Times New Roman" w:cs="Times New Roman"/>
-          <w:lang w:val="es-ES"/>
-        </w:rPr>
-        <w:t xml:space="preserve"> sobre el repositorio original del Paper y este fue compartido con todos los miembros del equipo. Posteriormente, y en el computador de cada integrante, </w:t>
+        <w:t xml:space="preserve">se generó un fork sobre el repositorio original del Paper y este fue compartido con todos los miembros del equipo. Posteriormente, y en el computador de cada integrante, </w:t>
       </w:r>
       <w:r>
         <w:rPr>
@@ -2993,23 +2622,7 @@
           <w:rFonts w:ascii="Times New Roman" w:hAnsi="Times New Roman" w:cs="Times New Roman"/>
           <w:lang w:val="es-ES"/>
         </w:rPr>
-        <w:t xml:space="preserve">a </w:t>
-      </w:r>
-      <w:proofErr w:type="spellStart"/>
-      <w:r>
-        <w:rPr>
-          <w:rFonts w:ascii="Times New Roman" w:hAnsi="Times New Roman" w:cs="Times New Roman"/>
-          <w:lang w:val="es-ES"/>
-        </w:rPr>
-        <w:t>mermaid</w:t>
-      </w:r>
-      <w:proofErr w:type="spellEnd"/>
-      <w:r>
-        <w:rPr>
-          <w:rFonts w:ascii="Times New Roman" w:hAnsi="Times New Roman" w:cs="Times New Roman"/>
-          <w:lang w:val="es-ES"/>
-        </w:rPr>
-        <w:t>, p</w:t>
+        <w:t>a mermaid, p</w:t>
       </w:r>
       <w:r>
         <w:rPr>
@@ -3199,7 +2812,6 @@
         </w:rPr>
         <w:t xml:space="preserve">así generar los </w:t>
       </w:r>
-      <w:proofErr w:type="spellStart"/>
       <w:r>
         <w:rPr>
           <w:rFonts w:ascii="Times New Roman" w:hAnsi="Times New Roman" w:cs="Times New Roman"/>
@@ -3212,15 +2824,7 @@
           <w:rFonts w:ascii="Times New Roman" w:hAnsi="Times New Roman" w:cs="Times New Roman"/>
           <w:lang w:val="es-ES"/>
         </w:rPr>
-        <w:t>s</w:t>
-      </w:r>
-      <w:proofErr w:type="spellEnd"/>
-      <w:r>
-        <w:rPr>
-          <w:rFonts w:ascii="Times New Roman" w:hAnsi="Times New Roman" w:cs="Times New Roman"/>
-          <w:lang w:val="es-ES"/>
-        </w:rPr>
-        <w:t>. Sin embargo, al evaluar con más detalle cómo se generaría este proceso</w:t>
+        <w:t>s. Sin embargo, al evaluar con más detalle cómo se generaría este proceso</w:t>
       </w:r>
       <w:r>
         <w:rPr>
@@ -3438,7 +3042,6 @@
         </w:rPr>
         <w:t xml:space="preserve"> limpia y combina los datos de energía, clima, población e ingreso, produciendo un </w:t>
       </w:r>
-      <w:proofErr w:type="spellStart"/>
       <w:r>
         <w:rPr>
           <w:rFonts w:ascii="Times New Roman" w:hAnsi="Times New Roman" w:cs="Times New Roman"/>
@@ -3446,29 +3049,12 @@
         </w:rPr>
         <w:t>dataset</w:t>
       </w:r>
-      <w:proofErr w:type="spellEnd"/>
-      <w:r>
-        <w:rPr>
-          <w:rFonts w:ascii="Times New Roman" w:hAnsi="Times New Roman" w:cs="Times New Roman"/>
-          <w:lang w:val="es-ES"/>
-        </w:rPr>
-        <w:t xml:space="preserve"> intermedio denominado </w:t>
-      </w:r>
-      <w:proofErr w:type="spellStart"/>
-      <w:r>
-        <w:rPr>
-          <w:rFonts w:ascii="Times New Roman" w:hAnsi="Times New Roman" w:cs="Times New Roman"/>
-          <w:lang w:val="es-ES"/>
-        </w:rPr>
-        <w:t>IEA_merged_long_GMFD.dta</w:t>
-      </w:r>
-      <w:proofErr w:type="spellEnd"/>
-      <w:r>
-        <w:rPr>
-          <w:rFonts w:ascii="Times New Roman" w:hAnsi="Times New Roman" w:cs="Times New Roman"/>
-          <w:lang w:val="es-ES"/>
-        </w:rPr>
-        <w:t xml:space="preserve">. </w:t>
+      <w:r>
+        <w:rPr>
+          <w:rFonts w:ascii="Times New Roman" w:hAnsi="Times New Roman" w:cs="Times New Roman"/>
+          <w:lang w:val="es-ES"/>
+        </w:rPr>
+        <w:t xml:space="preserve"> intermedio denominado IEA_merged_long_GMFD.dta. </w:t>
       </w:r>
     </w:p>
     <w:p>
@@ -3503,7 +3089,6 @@
         </w:rPr>
         <w:t xml:space="preserve"> transforma este </w:t>
       </w:r>
-      <w:proofErr w:type="spellStart"/>
       <w:r>
         <w:rPr>
           <w:rFonts w:ascii="Times New Roman" w:hAnsi="Times New Roman" w:cs="Times New Roman"/>
@@ -3511,7 +3096,6 @@
         </w:rPr>
         <w:t>dataset</w:t>
       </w:r>
-      <w:proofErr w:type="spellEnd"/>
       <w:r>
         <w:rPr>
           <w:rFonts w:ascii="Times New Roman" w:hAnsi="Times New Roman" w:cs="Times New Roman"/>
@@ -3519,7 +3103,6 @@
         </w:rPr>
         <w:t xml:space="preserve"> intermedio en </w:t>
       </w:r>
-      <w:proofErr w:type="spellStart"/>
       <w:r>
         <w:rPr>
           <w:rFonts w:ascii="Times New Roman" w:hAnsi="Times New Roman" w:cs="Times New Roman"/>
@@ -3532,15 +3115,7 @@
           <w:rFonts w:ascii="Times New Roman" w:hAnsi="Times New Roman" w:cs="Times New Roman"/>
           <w:lang w:val="es-ES"/>
         </w:rPr>
-        <w:t>s</w:t>
-      </w:r>
-      <w:proofErr w:type="spellEnd"/>
-      <w:r>
-        <w:rPr>
-          <w:rFonts w:ascii="Times New Roman" w:hAnsi="Times New Roman" w:cs="Times New Roman"/>
-          <w:lang w:val="es-ES"/>
-        </w:rPr>
-        <w:t xml:space="preserve"> listos para regresi</w:t>
+        <w:t>s listos para regresi</w:t>
       </w:r>
       <w:r>
         <w:rPr>
@@ -3568,25 +3143,8 @@
           <w:rFonts w:ascii="Times New Roman" w:hAnsi="Times New Roman" w:cs="Times New Roman"/>
           <w:lang w:val="es-ES"/>
         </w:rPr>
-        <w:t xml:space="preserve">. En esta etapa se eliminan observaciones con problemas de reporte, se emparejan los datos climáticos con los productos energéticos y se construyen variables clave del análisis, incluyendo </w:t>
-      </w:r>
-      <w:proofErr w:type="spellStart"/>
-      <w:r>
-        <w:rPr>
-          <w:rFonts w:ascii="Times New Roman" w:hAnsi="Times New Roman" w:cs="Times New Roman"/>
-          <w:lang w:val="es-ES"/>
-        </w:rPr>
-        <w:t>splines</w:t>
-      </w:r>
-      <w:proofErr w:type="spellEnd"/>
-      <w:r>
-        <w:rPr>
-          <w:rFonts w:ascii="Times New Roman" w:hAnsi="Times New Roman" w:cs="Times New Roman"/>
-          <w:lang w:val="es-ES"/>
-        </w:rPr>
-        <w:t xml:space="preserve"> de ingreso, clasificaciones por deciles de ingreso y variables en primeras diferencias. El resultado son los </w:t>
-      </w:r>
-      <w:proofErr w:type="spellStart"/>
+        <w:t xml:space="preserve">. En esta etapa se eliminan observaciones con problemas de reporte, se emparejan los datos climáticos con los productos energéticos y se construyen variables clave del análisis, incluyendo splines de ingreso, clasificaciones por deciles de ingreso y variables en primeras diferencias. El resultado son los </w:t>
+      </w:r>
       <w:r>
         <w:rPr>
           <w:rFonts w:ascii="Times New Roman" w:hAnsi="Times New Roman" w:cs="Times New Roman"/>
@@ -3599,47 +3157,7 @@
           <w:rFonts w:ascii="Times New Roman" w:hAnsi="Times New Roman" w:cs="Times New Roman"/>
           <w:lang w:val="es-ES"/>
         </w:rPr>
-        <w:t>s</w:t>
-      </w:r>
-      <w:proofErr w:type="spellEnd"/>
-      <w:r>
-        <w:rPr>
-          <w:rFonts w:ascii="Times New Roman" w:hAnsi="Times New Roman" w:cs="Times New Roman"/>
-          <w:lang w:val="es-ES"/>
-        </w:rPr>
-        <w:t xml:space="preserve"> </w:t>
-      </w:r>
-      <w:proofErr w:type="spellStart"/>
-      <w:r>
-        <w:rPr>
-          <w:rFonts w:ascii="Times New Roman" w:hAnsi="Times New Roman" w:cs="Times New Roman"/>
-          <w:lang w:val="es-ES"/>
-        </w:rPr>
-        <w:t>GMFD_TINV_clim_regsort.dta</w:t>
-      </w:r>
-      <w:proofErr w:type="spellEnd"/>
-      <w:r>
-        <w:rPr>
-          <w:rFonts w:ascii="Times New Roman" w:hAnsi="Times New Roman" w:cs="Times New Roman"/>
-          <w:lang w:val="es-ES"/>
-        </w:rPr>
-        <w:t xml:space="preserve"> (modelo principal) y </w:t>
-      </w:r>
-      <w:proofErr w:type="spellStart"/>
-      <w:r>
-        <w:rPr>
-          <w:rFonts w:ascii="Times New Roman" w:hAnsi="Times New Roman" w:cs="Times New Roman"/>
-          <w:lang w:val="es-ES"/>
-        </w:rPr>
-        <w:t>GMFD_TINV_clim_EX_regsort.dta</w:t>
-      </w:r>
-      <w:proofErr w:type="spellEnd"/>
-      <w:r>
-        <w:rPr>
-          <w:rFonts w:ascii="Times New Roman" w:hAnsi="Times New Roman" w:cs="Times New Roman"/>
-          <w:lang w:val="es-ES"/>
-        </w:rPr>
-        <w:t xml:space="preserve"> (modelo alternativo).</w:t>
+        <w:t>s GMFD_TINV_clim_regsort.dta (modelo principal) y GMFD_TINV_clim_EX_regsort.dta (modelo alternativo).</w:t>
       </w:r>
     </w:p>
     <w:p>
@@ -3728,7 +3246,6 @@
         </w:rPr>
         <w:t xml:space="preserve">El </w:t>
       </w:r>
-      <w:proofErr w:type="spellStart"/>
       <w:r>
         <w:rPr>
           <w:rFonts w:ascii="Times New Roman" w:hAnsi="Times New Roman" w:cs="Times New Roman"/>
@@ -3736,23 +3253,13 @@
         </w:rPr>
         <w:t>dataset</w:t>
       </w:r>
-      <w:proofErr w:type="spellEnd"/>
-      <w:r>
-        <w:rPr>
-          <w:rFonts w:ascii="Times New Roman" w:hAnsi="Times New Roman" w:cs="Times New Roman"/>
-          <w:lang w:val="es-ES"/>
-        </w:rPr>
-        <w:t xml:space="preserve"> suministrado por los autores en el repositorio en </w:t>
-      </w:r>
-      <w:proofErr w:type="spellStart"/>
-      <w:r>
-        <w:rPr>
-          <w:rFonts w:ascii="Times New Roman" w:hAnsi="Times New Roman" w:cs="Times New Roman"/>
-          <w:lang w:val="es-ES"/>
-        </w:rPr>
-        <w:t>Zenodo</w:t>
-      </w:r>
-      <w:proofErr w:type="spellEnd"/>
+      <w:r>
+        <w:rPr>
+          <w:rFonts w:ascii="Times New Roman" w:hAnsi="Times New Roman" w:cs="Times New Roman"/>
+          <w:lang w:val="es-ES"/>
+        </w:rPr>
+        <w:t xml:space="preserve"> suministrado por los autores en el repositorio en Zenodo</w:t>
+      </w:r>
       <w:r>
         <w:rPr>
           <w:rFonts w:ascii="Times New Roman" w:hAnsi="Times New Roman" w:cs="Times New Roman"/>
@@ -3856,6 +3363,7 @@
     </w:p>
     <w:p>
       <w:pPr>
+        <w:jc w:val="center"/>
         <w:rPr>
           <w:rFonts w:ascii="Times New Roman" w:hAnsi="Times New Roman" w:cs="Times New Roman"/>
           <w:lang w:val="es-ES"/>
@@ -3928,7 +3436,6 @@
           <w:rFonts w:ascii="Times New Roman" w:hAnsi="Times New Roman" w:cs="Times New Roman"/>
           <w:lang w:val="es-ES"/>
         </w:rPr>
-        <w:lastRenderedPageBreak/>
         <w:t>Sin embargo, al inda</w:t>
       </w:r>
       <w:r>
@@ -3972,11 +3479,21 @@
         </w:rPr>
         <w:t xml:space="preserve">se encontró que la complejidad del proceso era más alta, como se muestra a continuación. </w:t>
       </w:r>
-      <w:r>
-        <w:rPr>
-          <w:rFonts w:ascii="Times New Roman" w:hAnsi="Times New Roman" w:cs="Times New Roman"/>
-          <w:lang w:val="es-ES"/>
-        </w:rPr>
+    </w:p>
+    <w:p>
+      <w:pPr>
+        <w:jc w:val="center"/>
+        <w:rPr>
+          <w:rFonts w:ascii="Times New Roman" w:hAnsi="Times New Roman" w:cs="Times New Roman"/>
+          <w:lang w:val="es-ES"/>
+        </w:rPr>
+      </w:pPr>
+      <w:r>
+        <w:rPr>
+          <w:rFonts w:ascii="Times New Roman" w:hAnsi="Times New Roman" w:cs="Times New Roman"/>
+          <w:lang w:val="es-ES"/>
+        </w:rPr>
+        <w:lastRenderedPageBreak/>
         <w:br/>
       </w:r>
       <w:r>
@@ -4142,71 +3659,7 @@
           <w:rFonts w:ascii="Times New Roman" w:hAnsi="Times New Roman" w:cs="Times New Roman"/>
           <w:lang w:val="es-ES"/>
         </w:rPr>
-        <w:t xml:space="preserve">Todas las regresiones utilizan un procedimiento de </w:t>
-      </w:r>
-      <w:proofErr w:type="spellStart"/>
-      <w:r>
-        <w:rPr>
-          <w:rFonts w:ascii="Times New Roman" w:hAnsi="Times New Roman" w:cs="Times New Roman"/>
-          <w:lang w:val="es-ES"/>
-        </w:rPr>
-        <w:t>Feasible</w:t>
-      </w:r>
-      <w:proofErr w:type="spellEnd"/>
-      <w:r>
-        <w:rPr>
-          <w:rFonts w:ascii="Times New Roman" w:hAnsi="Times New Roman" w:cs="Times New Roman"/>
-          <w:lang w:val="es-ES"/>
-        </w:rPr>
-        <w:t xml:space="preserve"> </w:t>
-      </w:r>
-      <w:proofErr w:type="spellStart"/>
-      <w:r>
-        <w:rPr>
-          <w:rFonts w:ascii="Times New Roman" w:hAnsi="Times New Roman" w:cs="Times New Roman"/>
-          <w:lang w:val="es-ES"/>
-        </w:rPr>
-        <w:t>Generalized</w:t>
-      </w:r>
-      <w:proofErr w:type="spellEnd"/>
-      <w:r>
-        <w:rPr>
-          <w:rFonts w:ascii="Times New Roman" w:hAnsi="Times New Roman" w:cs="Times New Roman"/>
-          <w:lang w:val="es-ES"/>
-        </w:rPr>
-        <w:t xml:space="preserve"> </w:t>
-      </w:r>
-      <w:proofErr w:type="spellStart"/>
-      <w:r>
-        <w:rPr>
-          <w:rFonts w:ascii="Times New Roman" w:hAnsi="Times New Roman" w:cs="Times New Roman"/>
-          <w:lang w:val="es-ES"/>
-        </w:rPr>
-        <w:t>Least</w:t>
-      </w:r>
-      <w:proofErr w:type="spellEnd"/>
-      <w:r>
-        <w:rPr>
-          <w:rFonts w:ascii="Times New Roman" w:hAnsi="Times New Roman" w:cs="Times New Roman"/>
-          <w:lang w:val="es-ES"/>
-        </w:rPr>
-        <w:t xml:space="preserve"> </w:t>
-      </w:r>
-      <w:proofErr w:type="spellStart"/>
-      <w:r>
-        <w:rPr>
-          <w:rFonts w:ascii="Times New Roman" w:hAnsi="Times New Roman" w:cs="Times New Roman"/>
-          <w:lang w:val="es-ES"/>
-        </w:rPr>
-        <w:t>Squares</w:t>
-      </w:r>
-      <w:proofErr w:type="spellEnd"/>
-      <w:r>
-        <w:rPr>
-          <w:rFonts w:ascii="Times New Roman" w:hAnsi="Times New Roman" w:cs="Times New Roman"/>
-          <w:lang w:val="es-ES"/>
-        </w:rPr>
-        <w:t xml:space="preserve"> (FGLS) para corregir problemas de heterocedasticidad asociados a diferencias en la calidad de los datos entre regímenes de reporte. Este procedimiento consiste en estimar primero un modelo base para obtener los residuos y luego utilizar la varianza de estos residuos para construir ponderaciones que se aplican en una segunda etapa de estimación.</w:t>
+        <w:t>Todas las regresiones utilizan un procedimiento de Feasible Generalized Least Squares (FGLS) para corregir problemas de heterocedasticidad asociados a diferencias en la calidad de los datos entre regímenes de reporte. Este procedimiento consiste en estimar primero un modelo base para obtener los residuos y luego utilizar la varianza de estos residuos para construir ponderaciones que se aplican en una segunda etapa de estimación.</w:t>
       </w:r>
     </w:p>
     <w:p>
@@ -4222,27 +3675,16 @@
           <w:rFonts w:ascii="Times New Roman" w:hAnsi="Times New Roman" w:cs="Times New Roman"/>
           <w:lang w:val="es-ES"/>
         </w:rPr>
-        <w:t>Los resultados de estas regresiones se almacenan como archivos de salida (.</w:t>
-      </w:r>
-      <w:proofErr w:type="spellStart"/>
-      <w:r>
-        <w:rPr>
-          <w:rFonts w:ascii="Times New Roman" w:hAnsi="Times New Roman" w:cs="Times New Roman"/>
-          <w:lang w:val="es-ES"/>
-        </w:rPr>
-        <w:t>ster</w:t>
-      </w:r>
-      <w:proofErr w:type="spellEnd"/>
-      <w:r>
-        <w:rPr>
-          <w:rFonts w:ascii="Times New Roman" w:hAnsi="Times New Roman" w:cs="Times New Roman"/>
-          <w:lang w:val="es-ES"/>
-        </w:rPr>
-        <w:t>) y se utilizan para generar las figuras del artículo que ilustran la relación estimada entre temperatura y consumo energético.</w:t>
-      </w:r>
-    </w:p>
-    <w:p>
-      <w:pPr>
+        <w:t>Los resultados de estas regresiones se almacenan como archivos de salida (.ster) y se utilizan para generar las figuras del artículo que ilustran la relación estimada entre temperatura y consumo energético.</w:t>
+      </w:r>
+    </w:p>
+    <w:p>
+      <w:pPr>
+        <w:pStyle w:val="ListParagraph"/>
+        <w:numPr>
+          <w:ilvl w:val="0"/>
+          <w:numId w:val="1"/>
+        </w:numPr>
         <w:rPr>
           <w:rFonts w:ascii="Times New Roman" w:hAnsi="Times New Roman" w:cs="Times New Roman"/>
           <w:b/>
@@ -4257,8 +3699,1334 @@
           <w:bCs/>
           <w:lang w:val="es-ES"/>
         </w:rPr>
-        <w:t>3. Resultados y Análisis (30%)</w:t>
-      </w:r>
+        <w:t>Resultados y Análisis (30%)</w:t>
+      </w:r>
+    </w:p>
+    <w:p>
+      <w:pPr>
+        <w:spacing w:after="0" w:line="240" w:lineRule="auto"/>
+        <w:jc w:val="both"/>
+        <w:textAlignment w:val="baseline"/>
+        <w:rPr>
+          <w:rFonts w:ascii="Times New Roman" w:eastAsia="Times New Roman" w:hAnsi="Times New Roman" w:cs="Times New Roman"/>
+          <w:color w:val="000000"/>
+          <w:lang w:val="es-ES" w:eastAsia="en-US"/>
+        </w:rPr>
+      </w:pPr>
+      <w:r>
+        <w:rPr>
+          <w:rFonts w:ascii="Times New Roman" w:eastAsia="Times New Roman" w:hAnsi="Times New Roman" w:cs="Times New Roman"/>
+          <w:b/>
+          <w:bCs/>
+          <w:color w:val="000000"/>
+          <w:lang w:val="es-ES" w:eastAsia="en-US"/>
+        </w:rPr>
+        <w:t>Comparación de resultados</w:t>
+      </w:r>
+      <w:r>
+        <w:rPr>
+          <w:rFonts w:ascii="Times New Roman" w:eastAsia="Times New Roman" w:hAnsi="Times New Roman" w:cs="Times New Roman"/>
+          <w:b/>
+          <w:bCs/>
+          <w:color w:val="000000"/>
+          <w:lang w:val="es-ES" w:eastAsia="en-US"/>
+        </w:rPr>
+        <w:t>.</w:t>
+      </w:r>
+      <w:r>
+        <w:rPr>
+          <w:rFonts w:ascii="Times New Roman" w:eastAsia="Times New Roman" w:hAnsi="Times New Roman" w:cs="Times New Roman"/>
+          <w:color w:val="000000"/>
+          <w:lang w:val="es-ES" w:eastAsia="en-US"/>
+        </w:rPr>
+        <w:t> Para evaluar la reproducibilidad del estudio, se compararon los coeficientes estimados en la replicación con aquellos reportados en el artículo original. La estimación se realizó utilizando el mismo conjunto de datos provisto por el repositorio del proyecto y ejecutando los scripts de análisis econométrico-incluidos en el repositorio. </w:t>
+      </w:r>
+    </w:p>
+    <w:p>
+      <w:pPr>
+        <w:spacing w:after="0" w:line="240" w:lineRule="auto"/>
+        <w:jc w:val="both"/>
+        <w:textAlignment w:val="baseline"/>
+        <w:rPr>
+          <w:rFonts w:ascii="Times New Roman" w:eastAsia="Times New Roman" w:hAnsi="Times New Roman" w:cs="Times New Roman"/>
+          <w:sz w:val="18"/>
+          <w:szCs w:val="18"/>
+          <w:lang w:val="es-ES" w:eastAsia="en-US"/>
+        </w:rPr>
+      </w:pPr>
+    </w:p>
+    <w:p>
+      <w:pPr>
+        <w:spacing w:after="0" w:line="240" w:lineRule="auto"/>
+        <w:jc w:val="both"/>
+        <w:textAlignment w:val="baseline"/>
+        <w:rPr>
+          <w:rFonts w:ascii="Times New Roman" w:eastAsia="Times New Roman" w:hAnsi="Times New Roman" w:cs="Times New Roman"/>
+          <w:color w:val="000000"/>
+          <w:lang w:val="es-ES" w:eastAsia="en-US"/>
+        </w:rPr>
+      </w:pPr>
+      <w:r>
+        <w:rPr>
+          <w:rFonts w:ascii="Times New Roman" w:eastAsia="Times New Roman" w:hAnsi="Times New Roman" w:cs="Times New Roman"/>
+          <w:color w:val="000000"/>
+          <w:lang w:val="es-ES" w:eastAsia="en-US"/>
+        </w:rPr>
+        <w:t>Los resultados obtenidos muestran una alta coincidencia con los resultados originales. En particular, los coeficientes asociados a las variables climáticas principales, como la temperatura media (FD_temp1_GMFD) y su término cuadrático (FD_temp2_GMFD), presentan valores prácticamente idénticos a los reportados en el estudio original. Esto sugiere que la replicación del modelo econométrico fue exitosa. </w:t>
+      </w:r>
+    </w:p>
+    <w:p>
+      <w:pPr>
+        <w:spacing w:after="0" w:line="240" w:lineRule="auto"/>
+        <w:jc w:val="both"/>
+        <w:textAlignment w:val="baseline"/>
+        <w:rPr>
+          <w:rFonts w:ascii="Times New Roman" w:eastAsia="Times New Roman" w:hAnsi="Times New Roman" w:cs="Times New Roman"/>
+          <w:sz w:val="18"/>
+          <w:szCs w:val="18"/>
+          <w:lang w:val="es-ES" w:eastAsia="en-US"/>
+        </w:rPr>
+      </w:pPr>
+    </w:p>
+    <w:p>
+      <w:pPr>
+        <w:spacing w:after="0" w:line="240" w:lineRule="auto"/>
+        <w:jc w:val="both"/>
+        <w:textAlignment w:val="baseline"/>
+        <w:rPr>
+          <w:rFonts w:ascii="Times New Roman" w:eastAsia="Times New Roman" w:hAnsi="Times New Roman" w:cs="Times New Roman"/>
+          <w:color w:val="000000"/>
+          <w:lang w:val="es-ES" w:eastAsia="en-US"/>
+        </w:rPr>
+      </w:pPr>
+      <w:r>
+        <w:rPr>
+          <w:rFonts w:ascii="Times New Roman" w:eastAsia="Times New Roman" w:hAnsi="Times New Roman" w:cs="Times New Roman"/>
+          <w:color w:val="000000"/>
+          <w:lang w:val="es-ES" w:eastAsia="en-US"/>
+        </w:rPr>
+        <w:t>Asimismo, las variables relacionadas con los grados-día de calefacción (HDD) y refrigeración (CDD) muestran magnitudes y signos consistentes con los resultados del artículo, lo que confirma la robustez de los efectos estimados entre temperatura y consumo energético. </w:t>
+      </w:r>
+    </w:p>
+    <w:p>
+      <w:pPr>
+        <w:spacing w:after="0" w:line="240" w:lineRule="auto"/>
+        <w:jc w:val="both"/>
+        <w:textAlignment w:val="baseline"/>
+        <w:rPr>
+          <w:rFonts w:ascii="Times New Roman" w:eastAsia="Times New Roman" w:hAnsi="Times New Roman" w:cs="Times New Roman"/>
+          <w:sz w:val="18"/>
+          <w:szCs w:val="18"/>
+          <w:lang w:val="es-ES" w:eastAsia="en-US"/>
+        </w:rPr>
+      </w:pPr>
+    </w:p>
+    <w:p>
+      <w:pPr>
+        <w:spacing w:after="0" w:line="240" w:lineRule="auto"/>
+        <w:jc w:val="both"/>
+        <w:textAlignment w:val="baseline"/>
+        <w:rPr>
+          <w:rFonts w:ascii="Times New Roman" w:eastAsia="Times New Roman" w:hAnsi="Times New Roman" w:cs="Times New Roman"/>
+          <w:color w:val="000000"/>
+          <w:lang w:val="es-ES" w:eastAsia="en-US"/>
+        </w:rPr>
+      </w:pPr>
+      <w:r>
+        <w:rPr>
+          <w:rFonts w:ascii="Times New Roman" w:eastAsia="Times New Roman" w:hAnsi="Times New Roman" w:cs="Times New Roman"/>
+          <w:b/>
+          <w:bCs/>
+          <w:color w:val="000000"/>
+          <w:lang w:val="es-ES" w:eastAsia="en-US"/>
+        </w:rPr>
+        <w:t>Análisis de discrepancias</w:t>
+      </w:r>
+      <w:r>
+        <w:rPr>
+          <w:rFonts w:ascii="Times New Roman" w:eastAsia="Times New Roman" w:hAnsi="Times New Roman" w:cs="Times New Roman"/>
+          <w:b/>
+          <w:bCs/>
+          <w:color w:val="000000"/>
+          <w:lang w:val="es-ES" w:eastAsia="en-US"/>
+        </w:rPr>
+        <w:t>.</w:t>
+      </w:r>
+      <w:r>
+        <w:rPr>
+          <w:rFonts w:ascii="Times New Roman" w:eastAsia="Times New Roman" w:hAnsi="Times New Roman" w:cs="Times New Roman"/>
+          <w:color w:val="000000"/>
+          <w:lang w:val="es-ES" w:eastAsia="en-US"/>
+        </w:rPr>
+        <w:t> No se identificaron discrepancias significativas entre los coeficientes replicados y los resultados reportados en el artículo original. Las pequeñas diferencias observadas en algunos coeficientes pueden atribuirse a factores menores como diferencias en versiones de software, redondeo numérico o variaciones en la configuración del entorno computacional. </w:t>
+      </w:r>
+    </w:p>
+    <w:p>
+      <w:pPr>
+        <w:spacing w:after="0" w:line="240" w:lineRule="auto"/>
+        <w:jc w:val="both"/>
+        <w:textAlignment w:val="baseline"/>
+        <w:rPr>
+          <w:rFonts w:ascii="Times New Roman" w:eastAsia="Times New Roman" w:hAnsi="Times New Roman" w:cs="Times New Roman"/>
+          <w:sz w:val="18"/>
+          <w:szCs w:val="18"/>
+          <w:lang w:val="es-ES" w:eastAsia="en-US"/>
+        </w:rPr>
+      </w:pPr>
+    </w:p>
+    <w:p>
+      <w:pPr>
+        <w:spacing w:after="0" w:line="240" w:lineRule="auto"/>
+        <w:jc w:val="both"/>
+        <w:textAlignment w:val="baseline"/>
+        <w:rPr>
+          <w:rFonts w:ascii="Times New Roman" w:eastAsia="Times New Roman" w:hAnsi="Times New Roman" w:cs="Times New Roman"/>
+          <w:sz w:val="18"/>
+          <w:szCs w:val="18"/>
+          <w:lang w:val="es-ES" w:eastAsia="en-US"/>
+        </w:rPr>
+      </w:pPr>
+      <w:r>
+        <w:rPr>
+          <w:rFonts w:ascii="Times New Roman" w:eastAsia="Times New Roman" w:hAnsi="Times New Roman" w:cs="Times New Roman"/>
+          <w:b/>
+          <w:bCs/>
+          <w:color w:val="000000"/>
+          <w:lang w:val="es-ES" w:eastAsia="en-US"/>
+        </w:rPr>
+        <w:t>Verificación y validación</w:t>
+      </w:r>
+      <w:r>
+        <w:rPr>
+          <w:rFonts w:ascii="Times New Roman" w:eastAsia="Times New Roman" w:hAnsi="Times New Roman" w:cs="Times New Roman"/>
+          <w:b/>
+          <w:bCs/>
+          <w:color w:val="000000"/>
+          <w:lang w:val="es-ES" w:eastAsia="en-US"/>
+        </w:rPr>
+        <w:t>.</w:t>
+      </w:r>
+      <w:r>
+        <w:rPr>
+          <w:rFonts w:ascii="Times New Roman" w:eastAsia="Times New Roman" w:hAnsi="Times New Roman" w:cs="Times New Roman"/>
+          <w:color w:val="000000"/>
+          <w:lang w:val="es-ES" w:eastAsia="en-US"/>
+        </w:rPr>
+        <w:t> La validación de los resultados se realizó mediante la ejecución directa de los scripts proporcionados en el repositorio del estudio. En particular, se cargaron los resultados econométricos almacenados en archivos .ster y se verificaron los coeficientes estimados utilizando comandos de Stata como matrix list e(b). </w:t>
+      </w:r>
+    </w:p>
+    <w:p>
+      <w:pPr>
+        <w:spacing w:after="0" w:line="240" w:lineRule="auto"/>
+        <w:jc w:val="both"/>
+        <w:textAlignment w:val="baseline"/>
+        <w:rPr>
+          <w:rFonts w:ascii="Times New Roman" w:eastAsia="Times New Roman" w:hAnsi="Times New Roman" w:cs="Times New Roman"/>
+          <w:sz w:val="18"/>
+          <w:szCs w:val="18"/>
+          <w:lang w:val="es-ES" w:eastAsia="en-US"/>
+        </w:rPr>
+      </w:pPr>
+      <w:r>
+        <w:rPr>
+          <w:rFonts w:ascii="Times New Roman" w:eastAsia="Times New Roman" w:hAnsi="Times New Roman" w:cs="Times New Roman"/>
+          <w:color w:val="000000"/>
+          <w:lang w:val="es-ES" w:eastAsia="en-US"/>
+        </w:rPr>
+        <w:lastRenderedPageBreak/>
+        <w:t>Adicionalmente, se inspeccionó la estructura del dataset utilizado en la regresión (GMFD_TINV_clim_regsort.dta), confirmando que las variables utilizadas en el modelo coincidían con aquellas definidas en el código de análisis. Este procedimiento permitió garantizar que los resultados obtenidos correspondieran efectivamente a la estimación del modelo original. </w:t>
+      </w:r>
+    </w:p>
+    <w:p>
+      <w:pPr>
+        <w:spacing w:after="0" w:line="240" w:lineRule="auto"/>
+        <w:ind w:left="360"/>
+        <w:textAlignment w:val="baseline"/>
+        <w:rPr>
+          <w:rFonts w:ascii="Times New Roman" w:eastAsia="Times New Roman" w:hAnsi="Times New Roman" w:cs="Times New Roman"/>
+          <w:sz w:val="18"/>
+          <w:szCs w:val="18"/>
+          <w:lang w:val="es-ES" w:eastAsia="en-US"/>
+        </w:rPr>
+      </w:pPr>
+      <w:r>
+        <w:rPr>
+          <w:rFonts w:ascii="Times New Roman" w:eastAsia="Times New Roman" w:hAnsi="Times New Roman" w:cs="Times New Roman"/>
+          <w:lang w:val="es-ES" w:eastAsia="en-US"/>
+        </w:rPr>
+        <w:t> </w:t>
+      </w:r>
+    </w:p>
+    <w:tbl>
+      <w:tblPr>
+        <w:tblW w:w="0" w:type="dxa"/>
+        <w:jc w:val="center"/>
+        <w:tblCellMar>
+          <w:left w:w="0" w:type="dxa"/>
+          <w:right w:w="0" w:type="dxa"/>
+        </w:tblCellMar>
+        <w:tblLook w:val="04A0" w:firstRow="1" w:lastRow="0" w:firstColumn="1" w:lastColumn="0" w:noHBand="0" w:noVBand="1"/>
+      </w:tblPr>
+      <w:tblGrid>
+        <w:gridCol w:w="3330"/>
+        <w:gridCol w:w="1879"/>
+        <w:gridCol w:w="2082"/>
+        <w:gridCol w:w="1103"/>
+      </w:tblGrid>
+      <w:tr>
+        <w:trPr>
+          <w:trHeight w:val="300"/>
+          <w:jc w:val="center"/>
+        </w:trPr>
+        <w:tc>
+          <w:tcPr>
+            <w:tcW w:w="3330" w:type="dxa"/>
+            <w:tcBorders>
+              <w:top w:val="single" w:sz="6" w:space="0" w:color="auto"/>
+              <w:left w:val="single" w:sz="6" w:space="0" w:color="auto"/>
+              <w:bottom w:val="single" w:sz="6" w:space="0" w:color="auto"/>
+              <w:right w:val="single" w:sz="6" w:space="0" w:color="auto"/>
+            </w:tcBorders>
+            <w:vAlign w:val="center"/>
+            <w:hideMark/>
+          </w:tcPr>
+          <w:p>
+            <w:pPr>
+              <w:spacing w:after="0" w:line="240" w:lineRule="auto"/>
+              <w:jc w:val="center"/>
+              <w:textAlignment w:val="baseline"/>
+              <w:rPr>
+                <w:rFonts w:ascii="Times New Roman" w:eastAsia="Times New Roman" w:hAnsi="Times New Roman" w:cs="Times New Roman"/>
+                <w:sz w:val="24"/>
+                <w:szCs w:val="24"/>
+                <w:lang w:val="es-ES" w:eastAsia="en-US"/>
+              </w:rPr>
+            </w:pPr>
+            <w:r>
+              <w:rPr>
+                <w:rFonts w:ascii="Aptos" w:eastAsia="Times New Roman" w:hAnsi="Aptos" w:cs="Times New Roman"/>
+                <w:b/>
+                <w:bCs/>
+                <w:color w:val="000000"/>
+                <w:lang w:eastAsia="en-US"/>
+              </w:rPr>
+              <w:t>Variable</w:t>
+            </w:r>
+            <w:r>
+              <w:rPr>
+                <w:rFonts w:ascii="Aptos" w:eastAsia="Times New Roman" w:hAnsi="Aptos" w:cs="Times New Roman"/>
+                <w:color w:val="000000"/>
+                <w:lang w:val="es-ES" w:eastAsia="en-US"/>
+              </w:rPr>
+              <w:t> </w:t>
+            </w:r>
+          </w:p>
+        </w:tc>
+        <w:tc>
+          <w:tcPr>
+            <w:tcW w:w="1875" w:type="dxa"/>
+            <w:tcBorders>
+              <w:top w:val="single" w:sz="6" w:space="0" w:color="auto"/>
+              <w:left w:val="single" w:sz="6" w:space="0" w:color="auto"/>
+              <w:bottom w:val="single" w:sz="6" w:space="0" w:color="auto"/>
+              <w:right w:val="single" w:sz="6" w:space="0" w:color="auto"/>
+            </w:tcBorders>
+            <w:vAlign w:val="center"/>
+            <w:hideMark/>
+          </w:tcPr>
+          <w:p>
+            <w:pPr>
+              <w:spacing w:after="0" w:line="240" w:lineRule="auto"/>
+              <w:jc w:val="center"/>
+              <w:textAlignment w:val="baseline"/>
+              <w:rPr>
+                <w:rFonts w:ascii="Times New Roman" w:eastAsia="Times New Roman" w:hAnsi="Times New Roman" w:cs="Times New Roman"/>
+                <w:sz w:val="24"/>
+                <w:szCs w:val="24"/>
+                <w:lang w:val="es-ES" w:eastAsia="en-US"/>
+              </w:rPr>
+            </w:pPr>
+            <w:r>
+              <w:rPr>
+                <w:rFonts w:ascii="Aptos" w:eastAsia="Times New Roman" w:hAnsi="Aptos" w:cs="Times New Roman"/>
+                <w:b/>
+                <w:bCs/>
+                <w:color w:val="000000"/>
+                <w:lang w:eastAsia="en-US"/>
+              </w:rPr>
+              <w:t>Resultado original</w:t>
+            </w:r>
+            <w:r>
+              <w:rPr>
+                <w:rFonts w:ascii="Aptos" w:eastAsia="Times New Roman" w:hAnsi="Aptos" w:cs="Times New Roman"/>
+                <w:color w:val="000000"/>
+                <w:lang w:val="es-ES" w:eastAsia="en-US"/>
+              </w:rPr>
+              <w:t> </w:t>
+            </w:r>
+          </w:p>
+        </w:tc>
+        <w:tc>
+          <w:tcPr>
+            <w:tcW w:w="2040" w:type="dxa"/>
+            <w:tcBorders>
+              <w:top w:val="single" w:sz="6" w:space="0" w:color="auto"/>
+              <w:left w:val="single" w:sz="6" w:space="0" w:color="auto"/>
+              <w:bottom w:val="single" w:sz="6" w:space="0" w:color="auto"/>
+              <w:right w:val="single" w:sz="6" w:space="0" w:color="auto"/>
+            </w:tcBorders>
+            <w:vAlign w:val="center"/>
+            <w:hideMark/>
+          </w:tcPr>
+          <w:p>
+            <w:pPr>
+              <w:spacing w:after="0" w:line="240" w:lineRule="auto"/>
+              <w:jc w:val="center"/>
+              <w:textAlignment w:val="baseline"/>
+              <w:rPr>
+                <w:rFonts w:ascii="Times New Roman" w:eastAsia="Times New Roman" w:hAnsi="Times New Roman" w:cs="Times New Roman"/>
+                <w:sz w:val="24"/>
+                <w:szCs w:val="24"/>
+                <w:lang w:val="es-ES" w:eastAsia="en-US"/>
+              </w:rPr>
+            </w:pPr>
+            <w:r>
+              <w:rPr>
+                <w:rFonts w:ascii="Aptos" w:eastAsia="Times New Roman" w:hAnsi="Aptos" w:cs="Times New Roman"/>
+                <w:b/>
+                <w:bCs/>
+                <w:color w:val="000000"/>
+                <w:lang w:eastAsia="en-US"/>
+              </w:rPr>
+              <w:t>Resultado replicado</w:t>
+            </w:r>
+            <w:r>
+              <w:rPr>
+                <w:rFonts w:ascii="Aptos" w:eastAsia="Times New Roman" w:hAnsi="Aptos" w:cs="Times New Roman"/>
+                <w:color w:val="000000"/>
+                <w:lang w:val="es-ES" w:eastAsia="en-US"/>
+              </w:rPr>
+              <w:t> </w:t>
+            </w:r>
+          </w:p>
+        </w:tc>
+        <w:tc>
+          <w:tcPr>
+            <w:tcW w:w="1050" w:type="dxa"/>
+            <w:tcBorders>
+              <w:top w:val="single" w:sz="6" w:space="0" w:color="auto"/>
+              <w:left w:val="single" w:sz="6" w:space="0" w:color="auto"/>
+              <w:bottom w:val="single" w:sz="6" w:space="0" w:color="auto"/>
+              <w:right w:val="single" w:sz="6" w:space="0" w:color="auto"/>
+            </w:tcBorders>
+            <w:vAlign w:val="center"/>
+            <w:hideMark/>
+          </w:tcPr>
+          <w:p>
+            <w:pPr>
+              <w:spacing w:after="0" w:line="240" w:lineRule="auto"/>
+              <w:jc w:val="center"/>
+              <w:textAlignment w:val="baseline"/>
+              <w:rPr>
+                <w:rFonts w:ascii="Times New Roman" w:eastAsia="Times New Roman" w:hAnsi="Times New Roman" w:cs="Times New Roman"/>
+                <w:sz w:val="24"/>
+                <w:szCs w:val="24"/>
+                <w:lang w:val="es-ES" w:eastAsia="en-US"/>
+              </w:rPr>
+            </w:pPr>
+            <w:r>
+              <w:rPr>
+                <w:rFonts w:ascii="Aptos" w:eastAsia="Times New Roman" w:hAnsi="Aptos" w:cs="Times New Roman"/>
+                <w:b/>
+                <w:bCs/>
+                <w:color w:val="000000"/>
+                <w:lang w:eastAsia="en-US"/>
+              </w:rPr>
+              <w:t>Diferencia</w:t>
+            </w:r>
+            <w:r>
+              <w:rPr>
+                <w:rFonts w:ascii="Aptos" w:eastAsia="Times New Roman" w:hAnsi="Aptos" w:cs="Times New Roman"/>
+                <w:color w:val="000000"/>
+                <w:lang w:val="es-ES" w:eastAsia="en-US"/>
+              </w:rPr>
+              <w:t> </w:t>
+            </w:r>
+          </w:p>
+        </w:tc>
+      </w:tr>
+      <w:tr>
+        <w:trPr>
+          <w:trHeight w:val="300"/>
+          <w:jc w:val="center"/>
+        </w:trPr>
+        <w:tc>
+          <w:tcPr>
+            <w:tcW w:w="3330" w:type="dxa"/>
+            <w:tcBorders>
+              <w:top w:val="single" w:sz="6" w:space="0" w:color="auto"/>
+              <w:left w:val="single" w:sz="6" w:space="0" w:color="auto"/>
+              <w:bottom w:val="single" w:sz="6" w:space="0" w:color="auto"/>
+              <w:right w:val="single" w:sz="6" w:space="0" w:color="auto"/>
+            </w:tcBorders>
+            <w:vAlign w:val="center"/>
+            <w:hideMark/>
+          </w:tcPr>
+          <w:p>
+            <w:pPr>
+              <w:spacing w:after="0" w:line="240" w:lineRule="auto"/>
+              <w:textAlignment w:val="baseline"/>
+              <w:rPr>
+                <w:rFonts w:ascii="Times New Roman" w:eastAsia="Times New Roman" w:hAnsi="Times New Roman" w:cs="Times New Roman"/>
+                <w:sz w:val="24"/>
+                <w:szCs w:val="24"/>
+                <w:lang w:val="es-ES" w:eastAsia="en-US"/>
+              </w:rPr>
+            </w:pPr>
+            <w:r>
+              <w:rPr>
+                <w:rFonts w:ascii="Aptos" w:eastAsia="Times New Roman" w:hAnsi="Aptos" w:cs="Times New Roman"/>
+                <w:color w:val="000000"/>
+                <w:lang w:eastAsia="en-US"/>
+              </w:rPr>
+              <w:t>Temperatura (FD_temp1_GMFD)</w:t>
+            </w:r>
+            <w:r>
+              <w:rPr>
+                <w:rFonts w:ascii="Aptos" w:eastAsia="Times New Roman" w:hAnsi="Aptos" w:cs="Times New Roman"/>
+                <w:color w:val="000000"/>
+                <w:lang w:val="es-ES" w:eastAsia="en-US"/>
+              </w:rPr>
+              <w:t> </w:t>
+            </w:r>
+          </w:p>
+        </w:tc>
+        <w:tc>
+          <w:tcPr>
+            <w:tcW w:w="1875" w:type="dxa"/>
+            <w:tcBorders>
+              <w:top w:val="single" w:sz="6" w:space="0" w:color="auto"/>
+              <w:left w:val="single" w:sz="6" w:space="0" w:color="auto"/>
+              <w:bottom w:val="single" w:sz="6" w:space="0" w:color="auto"/>
+              <w:right w:val="single" w:sz="6" w:space="0" w:color="auto"/>
+            </w:tcBorders>
+            <w:vAlign w:val="center"/>
+            <w:hideMark/>
+          </w:tcPr>
+          <w:p>
+            <w:pPr>
+              <w:spacing w:after="0" w:line="240" w:lineRule="auto"/>
+              <w:textAlignment w:val="baseline"/>
+              <w:rPr>
+                <w:rFonts w:ascii="Times New Roman" w:eastAsia="Times New Roman" w:hAnsi="Times New Roman" w:cs="Times New Roman"/>
+                <w:sz w:val="24"/>
+                <w:szCs w:val="24"/>
+                <w:lang w:val="es-ES" w:eastAsia="en-US"/>
+              </w:rPr>
+            </w:pPr>
+            <w:r>
+              <w:rPr>
+                <w:rFonts w:ascii="Aptos" w:eastAsia="Times New Roman" w:hAnsi="Aptos" w:cs="Times New Roman"/>
+                <w:color w:val="000000"/>
+                <w:lang w:eastAsia="en-US"/>
+              </w:rPr>
+              <w:t>0.00013</w:t>
+            </w:r>
+            <w:r>
+              <w:rPr>
+                <w:rFonts w:ascii="Aptos" w:eastAsia="Times New Roman" w:hAnsi="Aptos" w:cs="Times New Roman"/>
+                <w:color w:val="000000"/>
+                <w:lang w:val="es-ES" w:eastAsia="en-US"/>
+              </w:rPr>
+              <w:t> </w:t>
+            </w:r>
+          </w:p>
+        </w:tc>
+        <w:tc>
+          <w:tcPr>
+            <w:tcW w:w="2040" w:type="dxa"/>
+            <w:tcBorders>
+              <w:top w:val="single" w:sz="6" w:space="0" w:color="auto"/>
+              <w:left w:val="single" w:sz="6" w:space="0" w:color="auto"/>
+              <w:bottom w:val="single" w:sz="6" w:space="0" w:color="auto"/>
+              <w:right w:val="single" w:sz="6" w:space="0" w:color="auto"/>
+            </w:tcBorders>
+            <w:vAlign w:val="center"/>
+            <w:hideMark/>
+          </w:tcPr>
+          <w:p>
+            <w:pPr>
+              <w:spacing w:after="0" w:line="240" w:lineRule="auto"/>
+              <w:textAlignment w:val="baseline"/>
+              <w:rPr>
+                <w:rFonts w:ascii="Times New Roman" w:eastAsia="Times New Roman" w:hAnsi="Times New Roman" w:cs="Times New Roman"/>
+                <w:sz w:val="24"/>
+                <w:szCs w:val="24"/>
+                <w:lang w:val="es-ES" w:eastAsia="en-US"/>
+              </w:rPr>
+            </w:pPr>
+            <w:r>
+              <w:rPr>
+                <w:rFonts w:ascii="Aptos" w:eastAsia="Times New Roman" w:hAnsi="Aptos" w:cs="Times New Roman"/>
+                <w:color w:val="000000"/>
+                <w:lang w:eastAsia="en-US"/>
+              </w:rPr>
+              <w:t>0.000129</w:t>
+            </w:r>
+            <w:r>
+              <w:rPr>
+                <w:rFonts w:ascii="Aptos" w:eastAsia="Times New Roman" w:hAnsi="Aptos" w:cs="Times New Roman"/>
+                <w:color w:val="000000"/>
+                <w:lang w:val="es-ES" w:eastAsia="en-US"/>
+              </w:rPr>
+              <w:t> </w:t>
+            </w:r>
+          </w:p>
+        </w:tc>
+        <w:tc>
+          <w:tcPr>
+            <w:tcW w:w="1050" w:type="dxa"/>
+            <w:tcBorders>
+              <w:top w:val="single" w:sz="6" w:space="0" w:color="auto"/>
+              <w:left w:val="single" w:sz="6" w:space="0" w:color="auto"/>
+              <w:bottom w:val="single" w:sz="6" w:space="0" w:color="auto"/>
+              <w:right w:val="single" w:sz="6" w:space="0" w:color="auto"/>
+            </w:tcBorders>
+            <w:vAlign w:val="center"/>
+            <w:hideMark/>
+          </w:tcPr>
+          <w:p>
+            <w:pPr>
+              <w:spacing w:after="0" w:line="240" w:lineRule="auto"/>
+              <w:textAlignment w:val="baseline"/>
+              <w:rPr>
+                <w:rFonts w:ascii="Times New Roman" w:eastAsia="Times New Roman" w:hAnsi="Times New Roman" w:cs="Times New Roman"/>
+                <w:sz w:val="24"/>
+                <w:szCs w:val="24"/>
+                <w:lang w:val="es-ES" w:eastAsia="en-US"/>
+              </w:rPr>
+            </w:pPr>
+            <w:r>
+              <w:rPr>
+                <w:rFonts w:ascii="Aptos" w:eastAsia="Times New Roman" w:hAnsi="Aptos" w:cs="Times New Roman"/>
+                <w:color w:val="000000"/>
+                <w:lang w:eastAsia="en-US"/>
+              </w:rPr>
+              <w:t>~0</w:t>
+            </w:r>
+            <w:r>
+              <w:rPr>
+                <w:rFonts w:ascii="Aptos" w:eastAsia="Times New Roman" w:hAnsi="Aptos" w:cs="Times New Roman"/>
+                <w:color w:val="000000"/>
+                <w:lang w:val="es-ES" w:eastAsia="en-US"/>
+              </w:rPr>
+              <w:t> </w:t>
+            </w:r>
+          </w:p>
+        </w:tc>
+      </w:tr>
+      <w:tr>
+        <w:trPr>
+          <w:trHeight w:val="300"/>
+          <w:jc w:val="center"/>
+        </w:trPr>
+        <w:tc>
+          <w:tcPr>
+            <w:tcW w:w="3330" w:type="dxa"/>
+            <w:tcBorders>
+              <w:top w:val="single" w:sz="6" w:space="0" w:color="auto"/>
+              <w:left w:val="single" w:sz="6" w:space="0" w:color="auto"/>
+              <w:bottom w:val="single" w:sz="6" w:space="0" w:color="auto"/>
+              <w:right w:val="single" w:sz="6" w:space="0" w:color="auto"/>
+            </w:tcBorders>
+            <w:vAlign w:val="center"/>
+            <w:hideMark/>
+          </w:tcPr>
+          <w:p>
+            <w:pPr>
+              <w:spacing w:after="0" w:line="240" w:lineRule="auto"/>
+              <w:textAlignment w:val="baseline"/>
+              <w:rPr>
+                <w:rFonts w:ascii="Times New Roman" w:eastAsia="Times New Roman" w:hAnsi="Times New Roman" w:cs="Times New Roman"/>
+                <w:sz w:val="24"/>
+                <w:szCs w:val="24"/>
+                <w:lang w:val="es-ES" w:eastAsia="en-US"/>
+              </w:rPr>
+            </w:pPr>
+            <w:r>
+              <w:rPr>
+                <w:rFonts w:ascii="Aptos" w:eastAsia="Times New Roman" w:hAnsi="Aptos" w:cs="Times New Roman"/>
+                <w:color w:val="000000"/>
+                <w:lang w:eastAsia="en-US"/>
+              </w:rPr>
+              <w:t>Temperatura² (FD_temp2_GMFD)</w:t>
+            </w:r>
+            <w:r>
+              <w:rPr>
+                <w:rFonts w:ascii="Aptos" w:eastAsia="Times New Roman" w:hAnsi="Aptos" w:cs="Times New Roman"/>
+                <w:color w:val="000000"/>
+                <w:lang w:val="es-ES" w:eastAsia="en-US"/>
+              </w:rPr>
+              <w:t> </w:t>
+            </w:r>
+          </w:p>
+        </w:tc>
+        <w:tc>
+          <w:tcPr>
+            <w:tcW w:w="1875" w:type="dxa"/>
+            <w:tcBorders>
+              <w:top w:val="single" w:sz="6" w:space="0" w:color="auto"/>
+              <w:left w:val="single" w:sz="6" w:space="0" w:color="auto"/>
+              <w:bottom w:val="single" w:sz="6" w:space="0" w:color="auto"/>
+              <w:right w:val="single" w:sz="6" w:space="0" w:color="auto"/>
+            </w:tcBorders>
+            <w:vAlign w:val="center"/>
+            <w:hideMark/>
+          </w:tcPr>
+          <w:p>
+            <w:pPr>
+              <w:spacing w:after="0" w:line="240" w:lineRule="auto"/>
+              <w:textAlignment w:val="baseline"/>
+              <w:rPr>
+                <w:rFonts w:ascii="Times New Roman" w:eastAsia="Times New Roman" w:hAnsi="Times New Roman" w:cs="Times New Roman"/>
+                <w:sz w:val="24"/>
+                <w:szCs w:val="24"/>
+                <w:lang w:val="es-ES" w:eastAsia="en-US"/>
+              </w:rPr>
+            </w:pPr>
+            <w:r>
+              <w:rPr>
+                <w:rFonts w:ascii="Aptos" w:eastAsia="Times New Roman" w:hAnsi="Aptos" w:cs="Times New Roman"/>
+                <w:color w:val="000000"/>
+                <w:lang w:eastAsia="en-US"/>
+              </w:rPr>
+              <w:t>-6.9e-06</w:t>
+            </w:r>
+            <w:r>
+              <w:rPr>
+                <w:rFonts w:ascii="Aptos" w:eastAsia="Times New Roman" w:hAnsi="Aptos" w:cs="Times New Roman"/>
+                <w:color w:val="000000"/>
+                <w:lang w:val="es-ES" w:eastAsia="en-US"/>
+              </w:rPr>
+              <w:t> </w:t>
+            </w:r>
+          </w:p>
+        </w:tc>
+        <w:tc>
+          <w:tcPr>
+            <w:tcW w:w="2040" w:type="dxa"/>
+            <w:tcBorders>
+              <w:top w:val="single" w:sz="6" w:space="0" w:color="auto"/>
+              <w:left w:val="single" w:sz="6" w:space="0" w:color="auto"/>
+              <w:bottom w:val="single" w:sz="6" w:space="0" w:color="auto"/>
+              <w:right w:val="single" w:sz="6" w:space="0" w:color="auto"/>
+            </w:tcBorders>
+            <w:vAlign w:val="center"/>
+            <w:hideMark/>
+          </w:tcPr>
+          <w:p>
+            <w:pPr>
+              <w:spacing w:after="0" w:line="240" w:lineRule="auto"/>
+              <w:textAlignment w:val="baseline"/>
+              <w:rPr>
+                <w:rFonts w:ascii="Times New Roman" w:eastAsia="Times New Roman" w:hAnsi="Times New Roman" w:cs="Times New Roman"/>
+                <w:sz w:val="24"/>
+                <w:szCs w:val="24"/>
+                <w:lang w:val="es-ES" w:eastAsia="en-US"/>
+              </w:rPr>
+            </w:pPr>
+            <w:r>
+              <w:rPr>
+                <w:rFonts w:ascii="Aptos" w:eastAsia="Times New Roman" w:hAnsi="Aptos" w:cs="Times New Roman"/>
+                <w:color w:val="000000"/>
+                <w:lang w:eastAsia="en-US"/>
+              </w:rPr>
+              <w:t>-6.9e-06</w:t>
+            </w:r>
+            <w:r>
+              <w:rPr>
+                <w:rFonts w:ascii="Aptos" w:eastAsia="Times New Roman" w:hAnsi="Aptos" w:cs="Times New Roman"/>
+                <w:color w:val="000000"/>
+                <w:lang w:val="es-ES" w:eastAsia="en-US"/>
+              </w:rPr>
+              <w:t> </w:t>
+            </w:r>
+          </w:p>
+        </w:tc>
+        <w:tc>
+          <w:tcPr>
+            <w:tcW w:w="1050" w:type="dxa"/>
+            <w:tcBorders>
+              <w:top w:val="single" w:sz="6" w:space="0" w:color="auto"/>
+              <w:left w:val="single" w:sz="6" w:space="0" w:color="auto"/>
+              <w:bottom w:val="single" w:sz="6" w:space="0" w:color="auto"/>
+              <w:right w:val="single" w:sz="6" w:space="0" w:color="auto"/>
+            </w:tcBorders>
+            <w:vAlign w:val="center"/>
+            <w:hideMark/>
+          </w:tcPr>
+          <w:p>
+            <w:pPr>
+              <w:spacing w:after="0" w:line="240" w:lineRule="auto"/>
+              <w:textAlignment w:val="baseline"/>
+              <w:rPr>
+                <w:rFonts w:ascii="Times New Roman" w:eastAsia="Times New Roman" w:hAnsi="Times New Roman" w:cs="Times New Roman"/>
+                <w:sz w:val="24"/>
+                <w:szCs w:val="24"/>
+                <w:lang w:val="es-ES" w:eastAsia="en-US"/>
+              </w:rPr>
+            </w:pPr>
+            <w:r>
+              <w:rPr>
+                <w:rFonts w:ascii="Aptos" w:eastAsia="Times New Roman" w:hAnsi="Aptos" w:cs="Times New Roman"/>
+                <w:color w:val="000000"/>
+                <w:lang w:eastAsia="en-US"/>
+              </w:rPr>
+              <w:t>~0</w:t>
+            </w:r>
+            <w:r>
+              <w:rPr>
+                <w:rFonts w:ascii="Aptos" w:eastAsia="Times New Roman" w:hAnsi="Aptos" w:cs="Times New Roman"/>
+                <w:color w:val="000000"/>
+                <w:lang w:val="es-ES" w:eastAsia="en-US"/>
+              </w:rPr>
+              <w:t> </w:t>
+            </w:r>
+          </w:p>
+        </w:tc>
+      </w:tr>
+      <w:tr>
+        <w:trPr>
+          <w:trHeight w:val="300"/>
+          <w:jc w:val="center"/>
+        </w:trPr>
+        <w:tc>
+          <w:tcPr>
+            <w:tcW w:w="3330" w:type="dxa"/>
+            <w:tcBorders>
+              <w:top w:val="single" w:sz="6" w:space="0" w:color="auto"/>
+              <w:left w:val="single" w:sz="6" w:space="0" w:color="auto"/>
+              <w:bottom w:val="single" w:sz="6" w:space="0" w:color="auto"/>
+              <w:right w:val="single" w:sz="6" w:space="0" w:color="auto"/>
+            </w:tcBorders>
+            <w:vAlign w:val="center"/>
+            <w:hideMark/>
+          </w:tcPr>
+          <w:p>
+            <w:pPr>
+              <w:spacing w:after="0" w:line="240" w:lineRule="auto"/>
+              <w:textAlignment w:val="baseline"/>
+              <w:rPr>
+                <w:rFonts w:ascii="Times New Roman" w:eastAsia="Times New Roman" w:hAnsi="Times New Roman" w:cs="Times New Roman"/>
+                <w:sz w:val="24"/>
+                <w:szCs w:val="24"/>
+                <w:lang w:val="es-ES" w:eastAsia="en-US"/>
+              </w:rPr>
+            </w:pPr>
+            <w:r>
+              <w:rPr>
+                <w:rFonts w:ascii="Aptos" w:eastAsia="Times New Roman" w:hAnsi="Aptos" w:cs="Times New Roman"/>
+                <w:color w:val="000000"/>
+                <w:lang w:eastAsia="en-US"/>
+              </w:rPr>
+              <w:t>HDD (FD_hdd20)</w:t>
+            </w:r>
+            <w:r>
+              <w:rPr>
+                <w:rFonts w:ascii="Aptos" w:eastAsia="Times New Roman" w:hAnsi="Aptos" w:cs="Times New Roman"/>
+                <w:color w:val="000000"/>
+                <w:lang w:val="es-ES" w:eastAsia="en-US"/>
+              </w:rPr>
+              <w:t> </w:t>
+            </w:r>
+          </w:p>
+        </w:tc>
+        <w:tc>
+          <w:tcPr>
+            <w:tcW w:w="1875" w:type="dxa"/>
+            <w:tcBorders>
+              <w:top w:val="single" w:sz="6" w:space="0" w:color="auto"/>
+              <w:left w:val="single" w:sz="6" w:space="0" w:color="auto"/>
+              <w:bottom w:val="single" w:sz="6" w:space="0" w:color="auto"/>
+              <w:right w:val="single" w:sz="6" w:space="0" w:color="auto"/>
+            </w:tcBorders>
+            <w:vAlign w:val="center"/>
+            <w:hideMark/>
+          </w:tcPr>
+          <w:p>
+            <w:pPr>
+              <w:spacing w:after="0" w:line="240" w:lineRule="auto"/>
+              <w:textAlignment w:val="baseline"/>
+              <w:rPr>
+                <w:rFonts w:ascii="Times New Roman" w:eastAsia="Times New Roman" w:hAnsi="Times New Roman" w:cs="Times New Roman"/>
+                <w:sz w:val="24"/>
+                <w:szCs w:val="24"/>
+                <w:lang w:val="es-ES" w:eastAsia="en-US"/>
+              </w:rPr>
+            </w:pPr>
+            <w:r>
+              <w:rPr>
+                <w:rFonts w:ascii="Aptos" w:eastAsia="Times New Roman" w:hAnsi="Aptos" w:cs="Times New Roman"/>
+                <w:color w:val="000000"/>
+                <w:lang w:eastAsia="en-US"/>
+              </w:rPr>
+              <w:t>4.7e-10</w:t>
+            </w:r>
+            <w:r>
+              <w:rPr>
+                <w:rFonts w:ascii="Aptos" w:eastAsia="Times New Roman" w:hAnsi="Aptos" w:cs="Times New Roman"/>
+                <w:color w:val="000000"/>
+                <w:lang w:val="es-ES" w:eastAsia="en-US"/>
+              </w:rPr>
+              <w:t> </w:t>
+            </w:r>
+          </w:p>
+        </w:tc>
+        <w:tc>
+          <w:tcPr>
+            <w:tcW w:w="2040" w:type="dxa"/>
+            <w:tcBorders>
+              <w:top w:val="single" w:sz="6" w:space="0" w:color="auto"/>
+              <w:left w:val="single" w:sz="6" w:space="0" w:color="auto"/>
+              <w:bottom w:val="single" w:sz="6" w:space="0" w:color="auto"/>
+              <w:right w:val="single" w:sz="6" w:space="0" w:color="auto"/>
+            </w:tcBorders>
+            <w:vAlign w:val="center"/>
+            <w:hideMark/>
+          </w:tcPr>
+          <w:p>
+            <w:pPr>
+              <w:spacing w:after="0" w:line="240" w:lineRule="auto"/>
+              <w:textAlignment w:val="baseline"/>
+              <w:rPr>
+                <w:rFonts w:ascii="Times New Roman" w:eastAsia="Times New Roman" w:hAnsi="Times New Roman" w:cs="Times New Roman"/>
+                <w:sz w:val="24"/>
+                <w:szCs w:val="24"/>
+                <w:lang w:val="es-ES" w:eastAsia="en-US"/>
+              </w:rPr>
+            </w:pPr>
+            <w:r>
+              <w:rPr>
+                <w:rFonts w:ascii="Aptos" w:eastAsia="Times New Roman" w:hAnsi="Aptos" w:cs="Times New Roman"/>
+                <w:color w:val="000000"/>
+                <w:lang w:eastAsia="en-US"/>
+              </w:rPr>
+              <w:t>4.7e-10</w:t>
+            </w:r>
+            <w:r>
+              <w:rPr>
+                <w:rFonts w:ascii="Aptos" w:eastAsia="Times New Roman" w:hAnsi="Aptos" w:cs="Times New Roman"/>
+                <w:color w:val="000000"/>
+                <w:lang w:val="es-ES" w:eastAsia="en-US"/>
+              </w:rPr>
+              <w:t> </w:t>
+            </w:r>
+          </w:p>
+        </w:tc>
+        <w:tc>
+          <w:tcPr>
+            <w:tcW w:w="1050" w:type="dxa"/>
+            <w:tcBorders>
+              <w:top w:val="single" w:sz="6" w:space="0" w:color="auto"/>
+              <w:left w:val="single" w:sz="6" w:space="0" w:color="auto"/>
+              <w:bottom w:val="single" w:sz="6" w:space="0" w:color="auto"/>
+              <w:right w:val="single" w:sz="6" w:space="0" w:color="auto"/>
+            </w:tcBorders>
+            <w:vAlign w:val="center"/>
+            <w:hideMark/>
+          </w:tcPr>
+          <w:p>
+            <w:pPr>
+              <w:spacing w:after="0" w:line="240" w:lineRule="auto"/>
+              <w:textAlignment w:val="baseline"/>
+              <w:rPr>
+                <w:rFonts w:ascii="Times New Roman" w:eastAsia="Times New Roman" w:hAnsi="Times New Roman" w:cs="Times New Roman"/>
+                <w:sz w:val="24"/>
+                <w:szCs w:val="24"/>
+                <w:lang w:val="es-ES" w:eastAsia="en-US"/>
+              </w:rPr>
+            </w:pPr>
+            <w:r>
+              <w:rPr>
+                <w:rFonts w:ascii="Aptos" w:eastAsia="Times New Roman" w:hAnsi="Aptos" w:cs="Times New Roman"/>
+                <w:color w:val="000000"/>
+                <w:lang w:eastAsia="en-US"/>
+              </w:rPr>
+              <w:t>~0</w:t>
+            </w:r>
+            <w:r>
+              <w:rPr>
+                <w:rFonts w:ascii="Aptos" w:eastAsia="Times New Roman" w:hAnsi="Aptos" w:cs="Times New Roman"/>
+                <w:color w:val="000000"/>
+                <w:lang w:val="es-ES" w:eastAsia="en-US"/>
+              </w:rPr>
+              <w:t> </w:t>
+            </w:r>
+          </w:p>
+        </w:tc>
+      </w:tr>
+      <w:tr>
+        <w:trPr>
+          <w:trHeight w:val="300"/>
+          <w:jc w:val="center"/>
+        </w:trPr>
+        <w:tc>
+          <w:tcPr>
+            <w:tcW w:w="3330" w:type="dxa"/>
+            <w:tcBorders>
+              <w:top w:val="single" w:sz="6" w:space="0" w:color="auto"/>
+              <w:left w:val="single" w:sz="6" w:space="0" w:color="auto"/>
+              <w:bottom w:val="single" w:sz="6" w:space="0" w:color="auto"/>
+              <w:right w:val="single" w:sz="6" w:space="0" w:color="auto"/>
+            </w:tcBorders>
+            <w:vAlign w:val="center"/>
+            <w:hideMark/>
+          </w:tcPr>
+          <w:p>
+            <w:pPr>
+              <w:spacing w:after="0" w:line="240" w:lineRule="auto"/>
+              <w:textAlignment w:val="baseline"/>
+              <w:rPr>
+                <w:rFonts w:ascii="Times New Roman" w:eastAsia="Times New Roman" w:hAnsi="Times New Roman" w:cs="Times New Roman"/>
+                <w:sz w:val="24"/>
+                <w:szCs w:val="24"/>
+                <w:lang w:val="es-ES" w:eastAsia="en-US"/>
+              </w:rPr>
+            </w:pPr>
+            <w:r>
+              <w:rPr>
+                <w:rFonts w:ascii="Aptos" w:eastAsia="Times New Roman" w:hAnsi="Aptos" w:cs="Times New Roman"/>
+                <w:color w:val="000000"/>
+                <w:lang w:eastAsia="en-US"/>
+              </w:rPr>
+              <w:t>CDD (FD_cdd20)</w:t>
+            </w:r>
+            <w:r>
+              <w:rPr>
+                <w:rFonts w:ascii="Aptos" w:eastAsia="Times New Roman" w:hAnsi="Aptos" w:cs="Times New Roman"/>
+                <w:color w:val="000000"/>
+                <w:lang w:val="es-ES" w:eastAsia="en-US"/>
+              </w:rPr>
+              <w:t> </w:t>
+            </w:r>
+          </w:p>
+        </w:tc>
+        <w:tc>
+          <w:tcPr>
+            <w:tcW w:w="1875" w:type="dxa"/>
+            <w:tcBorders>
+              <w:top w:val="single" w:sz="6" w:space="0" w:color="auto"/>
+              <w:left w:val="single" w:sz="6" w:space="0" w:color="auto"/>
+              <w:bottom w:val="single" w:sz="6" w:space="0" w:color="auto"/>
+              <w:right w:val="single" w:sz="6" w:space="0" w:color="auto"/>
+            </w:tcBorders>
+            <w:vAlign w:val="center"/>
+            <w:hideMark/>
+          </w:tcPr>
+          <w:p>
+            <w:pPr>
+              <w:spacing w:after="0" w:line="240" w:lineRule="auto"/>
+              <w:textAlignment w:val="baseline"/>
+              <w:rPr>
+                <w:rFonts w:ascii="Times New Roman" w:eastAsia="Times New Roman" w:hAnsi="Times New Roman" w:cs="Times New Roman"/>
+                <w:sz w:val="24"/>
+                <w:szCs w:val="24"/>
+                <w:lang w:val="es-ES" w:eastAsia="en-US"/>
+              </w:rPr>
+            </w:pPr>
+            <w:r>
+              <w:rPr>
+                <w:rFonts w:ascii="Aptos" w:eastAsia="Times New Roman" w:hAnsi="Aptos" w:cs="Times New Roman"/>
+                <w:color w:val="000000"/>
+                <w:lang w:eastAsia="en-US"/>
+              </w:rPr>
+              <w:t>3.3e-07</w:t>
+            </w:r>
+            <w:r>
+              <w:rPr>
+                <w:rFonts w:ascii="Aptos" w:eastAsia="Times New Roman" w:hAnsi="Aptos" w:cs="Times New Roman"/>
+                <w:color w:val="000000"/>
+                <w:lang w:val="es-ES" w:eastAsia="en-US"/>
+              </w:rPr>
+              <w:t> </w:t>
+            </w:r>
+          </w:p>
+        </w:tc>
+        <w:tc>
+          <w:tcPr>
+            <w:tcW w:w="2040" w:type="dxa"/>
+            <w:tcBorders>
+              <w:top w:val="single" w:sz="6" w:space="0" w:color="auto"/>
+              <w:left w:val="single" w:sz="6" w:space="0" w:color="auto"/>
+              <w:bottom w:val="single" w:sz="6" w:space="0" w:color="auto"/>
+              <w:right w:val="single" w:sz="6" w:space="0" w:color="auto"/>
+            </w:tcBorders>
+            <w:vAlign w:val="center"/>
+            <w:hideMark/>
+          </w:tcPr>
+          <w:p>
+            <w:pPr>
+              <w:spacing w:after="0" w:line="240" w:lineRule="auto"/>
+              <w:textAlignment w:val="baseline"/>
+              <w:rPr>
+                <w:rFonts w:ascii="Times New Roman" w:eastAsia="Times New Roman" w:hAnsi="Times New Roman" w:cs="Times New Roman"/>
+                <w:sz w:val="24"/>
+                <w:szCs w:val="24"/>
+                <w:lang w:val="es-ES" w:eastAsia="en-US"/>
+              </w:rPr>
+            </w:pPr>
+            <w:r>
+              <w:rPr>
+                <w:rFonts w:ascii="Aptos" w:eastAsia="Times New Roman" w:hAnsi="Aptos" w:cs="Times New Roman"/>
+                <w:color w:val="000000"/>
+                <w:lang w:eastAsia="en-US"/>
+              </w:rPr>
+              <w:t>3.3e-07</w:t>
+            </w:r>
+            <w:r>
+              <w:rPr>
+                <w:rFonts w:ascii="Aptos" w:eastAsia="Times New Roman" w:hAnsi="Aptos" w:cs="Times New Roman"/>
+                <w:color w:val="000000"/>
+                <w:lang w:val="es-ES" w:eastAsia="en-US"/>
+              </w:rPr>
+              <w:t> </w:t>
+            </w:r>
+          </w:p>
+        </w:tc>
+        <w:tc>
+          <w:tcPr>
+            <w:tcW w:w="1050" w:type="dxa"/>
+            <w:tcBorders>
+              <w:top w:val="single" w:sz="6" w:space="0" w:color="auto"/>
+              <w:left w:val="single" w:sz="6" w:space="0" w:color="auto"/>
+              <w:bottom w:val="single" w:sz="6" w:space="0" w:color="auto"/>
+              <w:right w:val="single" w:sz="6" w:space="0" w:color="auto"/>
+            </w:tcBorders>
+            <w:vAlign w:val="center"/>
+            <w:hideMark/>
+          </w:tcPr>
+          <w:p>
+            <w:pPr>
+              <w:spacing w:after="0" w:line="240" w:lineRule="auto"/>
+              <w:textAlignment w:val="baseline"/>
+              <w:rPr>
+                <w:rFonts w:ascii="Times New Roman" w:eastAsia="Times New Roman" w:hAnsi="Times New Roman" w:cs="Times New Roman"/>
+                <w:sz w:val="24"/>
+                <w:szCs w:val="24"/>
+                <w:lang w:val="es-ES" w:eastAsia="en-US"/>
+              </w:rPr>
+            </w:pPr>
+            <w:r>
+              <w:rPr>
+                <w:rFonts w:ascii="Aptos" w:eastAsia="Times New Roman" w:hAnsi="Aptos" w:cs="Times New Roman"/>
+                <w:color w:val="000000"/>
+                <w:lang w:eastAsia="en-US"/>
+              </w:rPr>
+              <w:t>~0</w:t>
+            </w:r>
+            <w:r>
+              <w:rPr>
+                <w:rFonts w:ascii="Aptos" w:eastAsia="Times New Roman" w:hAnsi="Aptos" w:cs="Times New Roman"/>
+                <w:color w:val="000000"/>
+                <w:lang w:val="es-ES" w:eastAsia="en-US"/>
+              </w:rPr>
+              <w:t> </w:t>
+            </w:r>
+          </w:p>
+        </w:tc>
+      </w:tr>
+      <w:tr>
+        <w:trPr>
+          <w:trHeight w:val="300"/>
+          <w:jc w:val="center"/>
+        </w:trPr>
+        <w:tc>
+          <w:tcPr>
+            <w:tcW w:w="3330" w:type="dxa"/>
+            <w:tcBorders>
+              <w:top w:val="single" w:sz="6" w:space="0" w:color="auto"/>
+              <w:left w:val="single" w:sz="6" w:space="0" w:color="auto"/>
+              <w:bottom w:val="single" w:sz="6" w:space="0" w:color="auto"/>
+              <w:right w:val="single" w:sz="6" w:space="0" w:color="auto"/>
+            </w:tcBorders>
+            <w:vAlign w:val="center"/>
+            <w:hideMark/>
+          </w:tcPr>
+          <w:p>
+            <w:pPr>
+              <w:spacing w:after="0" w:line="240" w:lineRule="auto"/>
+              <w:textAlignment w:val="baseline"/>
+              <w:rPr>
+                <w:rFonts w:ascii="Times New Roman" w:eastAsia="Times New Roman" w:hAnsi="Times New Roman" w:cs="Times New Roman"/>
+                <w:sz w:val="24"/>
+                <w:szCs w:val="24"/>
+                <w:lang w:val="es-ES" w:eastAsia="en-US"/>
+              </w:rPr>
+            </w:pPr>
+            <w:r>
+              <w:rPr>
+                <w:rFonts w:ascii="Aptos" w:eastAsia="Times New Roman" w:hAnsi="Aptos" w:cs="Times New Roman"/>
+                <w:color w:val="000000"/>
+                <w:lang w:eastAsia="en-US"/>
+              </w:rPr>
+              <w:t>Interacción ingreso</w:t>
+            </w:r>
+            <w:r>
+              <w:rPr>
+                <w:rFonts w:ascii="Aptos" w:eastAsia="Times New Roman" w:hAnsi="Aptos" w:cs="Times New Roman"/>
+                <w:color w:val="000000"/>
+                <w:lang w:val="es-ES" w:eastAsia="en-US"/>
+              </w:rPr>
+              <w:t> </w:t>
+            </w:r>
+          </w:p>
+        </w:tc>
+        <w:tc>
+          <w:tcPr>
+            <w:tcW w:w="1875" w:type="dxa"/>
+            <w:tcBorders>
+              <w:top w:val="single" w:sz="6" w:space="0" w:color="auto"/>
+              <w:left w:val="single" w:sz="6" w:space="0" w:color="auto"/>
+              <w:bottom w:val="single" w:sz="6" w:space="0" w:color="auto"/>
+              <w:right w:val="single" w:sz="6" w:space="0" w:color="auto"/>
+            </w:tcBorders>
+            <w:vAlign w:val="center"/>
+            <w:hideMark/>
+          </w:tcPr>
+          <w:p>
+            <w:pPr>
+              <w:spacing w:after="0" w:line="240" w:lineRule="auto"/>
+              <w:textAlignment w:val="baseline"/>
+              <w:rPr>
+                <w:rFonts w:ascii="Times New Roman" w:eastAsia="Times New Roman" w:hAnsi="Times New Roman" w:cs="Times New Roman"/>
+                <w:sz w:val="24"/>
+                <w:szCs w:val="24"/>
+                <w:lang w:val="es-ES" w:eastAsia="en-US"/>
+              </w:rPr>
+            </w:pPr>
+            <w:r>
+              <w:rPr>
+                <w:rFonts w:ascii="Aptos" w:eastAsia="Times New Roman" w:hAnsi="Aptos" w:cs="Times New Roman"/>
+                <w:color w:val="000000"/>
+                <w:lang w:eastAsia="en-US"/>
+              </w:rPr>
+              <w:t>0.2138</w:t>
+            </w:r>
+            <w:r>
+              <w:rPr>
+                <w:rFonts w:ascii="Aptos" w:eastAsia="Times New Roman" w:hAnsi="Aptos" w:cs="Times New Roman"/>
+                <w:color w:val="000000"/>
+                <w:lang w:val="es-ES" w:eastAsia="en-US"/>
+              </w:rPr>
+              <w:t> </w:t>
+            </w:r>
+          </w:p>
+        </w:tc>
+        <w:tc>
+          <w:tcPr>
+            <w:tcW w:w="2040" w:type="dxa"/>
+            <w:tcBorders>
+              <w:top w:val="single" w:sz="6" w:space="0" w:color="auto"/>
+              <w:left w:val="single" w:sz="6" w:space="0" w:color="auto"/>
+              <w:bottom w:val="single" w:sz="6" w:space="0" w:color="auto"/>
+              <w:right w:val="single" w:sz="6" w:space="0" w:color="auto"/>
+            </w:tcBorders>
+            <w:vAlign w:val="center"/>
+            <w:hideMark/>
+          </w:tcPr>
+          <w:p>
+            <w:pPr>
+              <w:spacing w:after="0" w:line="240" w:lineRule="auto"/>
+              <w:textAlignment w:val="baseline"/>
+              <w:rPr>
+                <w:rFonts w:ascii="Times New Roman" w:eastAsia="Times New Roman" w:hAnsi="Times New Roman" w:cs="Times New Roman"/>
+                <w:sz w:val="24"/>
+                <w:szCs w:val="24"/>
+                <w:lang w:val="es-ES" w:eastAsia="en-US"/>
+              </w:rPr>
+            </w:pPr>
+            <w:r>
+              <w:rPr>
+                <w:rFonts w:ascii="Aptos" w:eastAsia="Times New Roman" w:hAnsi="Aptos" w:cs="Times New Roman"/>
+                <w:color w:val="000000"/>
+                <w:lang w:eastAsia="en-US"/>
+              </w:rPr>
+              <w:t>0.2138</w:t>
+            </w:r>
+            <w:r>
+              <w:rPr>
+                <w:rFonts w:ascii="Aptos" w:eastAsia="Times New Roman" w:hAnsi="Aptos" w:cs="Times New Roman"/>
+                <w:color w:val="000000"/>
+                <w:lang w:val="es-ES" w:eastAsia="en-US"/>
+              </w:rPr>
+              <w:t> </w:t>
+            </w:r>
+          </w:p>
+        </w:tc>
+        <w:tc>
+          <w:tcPr>
+            <w:tcW w:w="1050" w:type="dxa"/>
+            <w:tcBorders>
+              <w:top w:val="single" w:sz="6" w:space="0" w:color="auto"/>
+              <w:left w:val="single" w:sz="6" w:space="0" w:color="auto"/>
+              <w:bottom w:val="single" w:sz="6" w:space="0" w:color="auto"/>
+              <w:right w:val="single" w:sz="6" w:space="0" w:color="auto"/>
+            </w:tcBorders>
+            <w:vAlign w:val="center"/>
+            <w:hideMark/>
+          </w:tcPr>
+          <w:p>
+            <w:pPr>
+              <w:spacing w:after="0" w:line="240" w:lineRule="auto"/>
+              <w:textAlignment w:val="baseline"/>
+              <w:rPr>
+                <w:rFonts w:ascii="Times New Roman" w:eastAsia="Times New Roman" w:hAnsi="Times New Roman" w:cs="Times New Roman"/>
+                <w:sz w:val="24"/>
+                <w:szCs w:val="24"/>
+                <w:lang w:val="es-ES" w:eastAsia="en-US"/>
+              </w:rPr>
+            </w:pPr>
+            <w:r>
+              <w:rPr>
+                <w:rFonts w:ascii="Aptos" w:eastAsia="Times New Roman" w:hAnsi="Aptos" w:cs="Times New Roman"/>
+                <w:color w:val="000000"/>
+                <w:lang w:eastAsia="en-US"/>
+              </w:rPr>
+              <w:t>~0</w:t>
+            </w:r>
+            <w:r>
+              <w:rPr>
+                <w:rFonts w:ascii="Aptos" w:eastAsia="Times New Roman" w:hAnsi="Aptos" w:cs="Times New Roman"/>
+                <w:color w:val="000000"/>
+                <w:lang w:val="es-ES" w:eastAsia="en-US"/>
+              </w:rPr>
+              <w:t> </w:t>
+            </w:r>
+          </w:p>
+        </w:tc>
+      </w:tr>
+    </w:tbl>
+    <w:p>
+      <w:pPr>
+        <w:pStyle w:val="ListParagraph"/>
+        <w:rPr>
+          <w:rFonts w:ascii="Times New Roman" w:hAnsi="Times New Roman" w:cs="Times New Roman"/>
+          <w:b/>
+          <w:bCs/>
+          <w:lang w:val="es-ES"/>
+        </w:rPr>
+      </w:pPr>
+    </w:p>
+    <w:p>
+      <w:pPr>
+        <w:pStyle w:val="ListParagraph"/>
+        <w:rPr>
+          <w:rFonts w:ascii="Times New Roman" w:hAnsi="Times New Roman" w:cs="Times New Roman"/>
+          <w:b/>
+          <w:bCs/>
+          <w:lang w:val="es-ES"/>
+        </w:rPr>
+      </w:pPr>
     </w:p>
     <w:p>
       <w:pPr>
@@ -4269,12 +5037,14 @@
         </w:numPr>
         <w:rPr>
           <w:rFonts w:ascii="Times New Roman" w:hAnsi="Times New Roman" w:cs="Times New Roman"/>
-          <w:lang w:val="es-ES"/>
-        </w:rPr>
-      </w:pPr>
-      <w:r>
-        <w:rPr>
-          <w:rFonts w:ascii="Times New Roman" w:hAnsi="Times New Roman" w:cs="Times New Roman"/>
+          <w:highlight w:val="yellow"/>
+          <w:lang w:val="es-ES"/>
+        </w:rPr>
+      </w:pPr>
+      <w:r>
+        <w:rPr>
+          <w:rFonts w:ascii="Times New Roman" w:hAnsi="Times New Roman" w:cs="Times New Roman"/>
+          <w:highlight w:val="yellow"/>
           <w:lang w:val="es-ES"/>
         </w:rPr>
         <w:t>Comparación de resultados</w:t>
@@ -4289,12 +5059,14 @@
         </w:numPr>
         <w:rPr>
           <w:rFonts w:ascii="Times New Roman" w:hAnsi="Times New Roman" w:cs="Times New Roman"/>
-          <w:lang w:val="es-ES"/>
-        </w:rPr>
-      </w:pPr>
-      <w:r>
-        <w:rPr>
-          <w:rFonts w:ascii="Times New Roman" w:hAnsi="Times New Roman" w:cs="Times New Roman"/>
+          <w:highlight w:val="yellow"/>
+          <w:lang w:val="es-ES"/>
+        </w:rPr>
+      </w:pPr>
+      <w:r>
+        <w:rPr>
+          <w:rFonts w:ascii="Times New Roman" w:hAnsi="Times New Roman" w:cs="Times New Roman"/>
+          <w:highlight w:val="yellow"/>
           <w:lang w:val="es-ES"/>
         </w:rPr>
         <w:t>Comparación entre los resultados obtenidos en el estudio original y los resultados reproducidos durante el proyecto.</w:t>
@@ -4309,12 +5081,14 @@
         </w:numPr>
         <w:rPr>
           <w:rFonts w:ascii="Times New Roman" w:hAnsi="Times New Roman" w:cs="Times New Roman"/>
-          <w:lang w:val="es-ES"/>
-        </w:rPr>
-      </w:pPr>
-      <w:r>
-        <w:rPr>
-          <w:rFonts w:ascii="Times New Roman" w:hAnsi="Times New Roman" w:cs="Times New Roman"/>
+          <w:highlight w:val="yellow"/>
+          <w:lang w:val="es-ES"/>
+        </w:rPr>
+      </w:pPr>
+      <w:r>
+        <w:rPr>
+          <w:rFonts w:ascii="Times New Roman" w:hAnsi="Times New Roman" w:cs="Times New Roman"/>
+          <w:highlight w:val="yellow"/>
           <w:lang w:val="es-ES"/>
         </w:rPr>
         <w:t>Análisis de discrepancias</w:t>
@@ -4329,12 +5103,14 @@
         </w:numPr>
         <w:rPr>
           <w:rFonts w:ascii="Times New Roman" w:hAnsi="Times New Roman" w:cs="Times New Roman"/>
-          <w:lang w:val="es-ES"/>
-        </w:rPr>
-      </w:pPr>
-      <w:r>
-        <w:rPr>
-          <w:rFonts w:ascii="Times New Roman" w:hAnsi="Times New Roman" w:cs="Times New Roman"/>
+          <w:highlight w:val="yellow"/>
+          <w:lang w:val="es-ES"/>
+        </w:rPr>
+      </w:pPr>
+      <w:r>
+        <w:rPr>
+          <w:rFonts w:ascii="Times New Roman" w:hAnsi="Times New Roman" w:cs="Times New Roman"/>
+          <w:highlight w:val="yellow"/>
           <w:lang w:val="es-ES"/>
         </w:rPr>
         <w:t>Explicación de posibles diferencias encontradas entre los resultados originales y los obtenidos en la reproducción.</w:t>
@@ -4349,12 +5125,14 @@
         </w:numPr>
         <w:rPr>
           <w:rFonts w:ascii="Times New Roman" w:hAnsi="Times New Roman" w:cs="Times New Roman"/>
-          <w:lang w:val="es-ES"/>
-        </w:rPr>
-      </w:pPr>
-      <w:r>
-        <w:rPr>
-          <w:rFonts w:ascii="Times New Roman" w:hAnsi="Times New Roman" w:cs="Times New Roman"/>
+          <w:highlight w:val="yellow"/>
+          <w:lang w:val="es-ES"/>
+        </w:rPr>
+      </w:pPr>
+      <w:r>
+        <w:rPr>
+          <w:rFonts w:ascii="Times New Roman" w:hAnsi="Times New Roman" w:cs="Times New Roman"/>
+          <w:highlight w:val="yellow"/>
           <w:lang w:val="es-ES"/>
         </w:rPr>
         <w:t>Verificación y validación</w:t>
@@ -4369,12 +5147,14 @@
         </w:numPr>
         <w:rPr>
           <w:rFonts w:ascii="Times New Roman" w:hAnsi="Times New Roman" w:cs="Times New Roman"/>
-          <w:lang w:val="es-ES"/>
-        </w:rPr>
-      </w:pPr>
-      <w:r>
-        <w:rPr>
-          <w:rFonts w:ascii="Times New Roman" w:hAnsi="Times New Roman" w:cs="Times New Roman"/>
+          <w:highlight w:val="yellow"/>
+          <w:lang w:val="es-ES"/>
+        </w:rPr>
+      </w:pPr>
+      <w:r>
+        <w:rPr>
+          <w:rFonts w:ascii="Times New Roman" w:hAnsi="Times New Roman" w:cs="Times New Roman"/>
+          <w:highlight w:val="yellow"/>
           <w:lang w:val="es-ES"/>
         </w:rPr>
         <w:t>Descripción de los métodos utilizados para verificar la precisión y validez de los resultados reproducidos.</w:t>
@@ -4389,12 +5169,14 @@
         </w:numPr>
         <w:rPr>
           <w:rFonts w:ascii="Times New Roman" w:hAnsi="Times New Roman" w:cs="Times New Roman"/>
-          <w:lang w:val="es-ES"/>
-        </w:rPr>
-      </w:pPr>
-      <w:r>
-        <w:rPr>
-          <w:rFonts w:ascii="Times New Roman" w:hAnsi="Times New Roman" w:cs="Times New Roman"/>
+          <w:highlight w:val="yellow"/>
+          <w:lang w:val="es-ES"/>
+        </w:rPr>
+      </w:pPr>
+      <w:r>
+        <w:rPr>
+          <w:rFonts w:ascii="Times New Roman" w:hAnsi="Times New Roman" w:cs="Times New Roman"/>
+          <w:highlight w:val="yellow"/>
           <w:lang w:val="es-ES"/>
         </w:rPr>
         <w:t>Evaluación del proceso</w:t>
@@ -4409,12 +5191,14 @@
         </w:numPr>
         <w:rPr>
           <w:rFonts w:ascii="Times New Roman" w:hAnsi="Times New Roman" w:cs="Times New Roman"/>
-          <w:lang w:val="es-ES"/>
-        </w:rPr>
-      </w:pPr>
-      <w:r>
-        <w:rPr>
-          <w:rFonts w:ascii="Times New Roman" w:hAnsi="Times New Roman" w:cs="Times New Roman"/>
+          <w:highlight w:val="yellow"/>
+          <w:lang w:val="es-ES"/>
+        </w:rPr>
+      </w:pPr>
+      <w:r>
+        <w:rPr>
+          <w:rFonts w:ascii="Times New Roman" w:hAnsi="Times New Roman" w:cs="Times New Roman"/>
+          <w:highlight w:val="yellow"/>
           <w:lang w:val="es-ES"/>
         </w:rPr>
         <w:t>Reflexión sobre la gestión del proyecto, incluyendo aspectos relacionados con la automatización del flujo de trabajo, la colaboración entre los miembros del equipo y las decisiones tomadas durante el desarrollo del proyecto.</w:t>
@@ -4429,12 +5213,14 @@
         </w:numPr>
         <w:rPr>
           <w:rFonts w:ascii="Times New Roman" w:hAnsi="Times New Roman" w:cs="Times New Roman"/>
-          <w:lang w:val="es-ES"/>
-        </w:rPr>
-      </w:pPr>
-      <w:r>
-        <w:rPr>
-          <w:rFonts w:ascii="Times New Roman" w:hAnsi="Times New Roman" w:cs="Times New Roman"/>
+          <w:highlight w:val="yellow"/>
+          <w:lang w:val="es-ES"/>
+        </w:rPr>
+      </w:pPr>
+      <w:r>
+        <w:rPr>
+          <w:rFonts w:ascii="Times New Roman" w:hAnsi="Times New Roman" w:cs="Times New Roman"/>
+          <w:highlight w:val="yellow"/>
           <w:lang w:val="es-ES"/>
         </w:rPr>
         <w:t>Lecciones aprendidas</w:t>
@@ -4449,12 +5235,14 @@
         </w:numPr>
         <w:rPr>
           <w:rFonts w:ascii="Times New Roman" w:hAnsi="Times New Roman" w:cs="Times New Roman"/>
-          <w:lang w:val="es-ES"/>
-        </w:rPr>
-      </w:pPr>
-      <w:r>
-        <w:rPr>
-          <w:rFonts w:ascii="Times New Roman" w:hAnsi="Times New Roman" w:cs="Times New Roman"/>
+          <w:highlight w:val="yellow"/>
+          <w:lang w:val="es-ES"/>
+        </w:rPr>
+      </w:pPr>
+      <w:r>
+        <w:rPr>
+          <w:rFonts w:ascii="Times New Roman" w:hAnsi="Times New Roman" w:cs="Times New Roman"/>
+          <w:highlight w:val="yellow"/>
           <w:lang w:val="es-ES"/>
         </w:rPr>
         <w:t>Principales aprendizajes obtenidos durante el proceso de reproducción, especialmente en relación con la reproducibilidad científica.</w:t>
@@ -4469,12 +5257,14 @@
         </w:numPr>
         <w:rPr>
           <w:rFonts w:ascii="Times New Roman" w:hAnsi="Times New Roman" w:cs="Times New Roman"/>
-          <w:lang w:val="es-ES"/>
-        </w:rPr>
-      </w:pPr>
-      <w:r>
-        <w:rPr>
-          <w:rFonts w:ascii="Times New Roman" w:hAnsi="Times New Roman" w:cs="Times New Roman"/>
+          <w:highlight w:val="yellow"/>
+          <w:lang w:val="es-ES"/>
+        </w:rPr>
+      </w:pPr>
+      <w:r>
+        <w:rPr>
+          <w:rFonts w:ascii="Times New Roman" w:hAnsi="Times New Roman" w:cs="Times New Roman"/>
+          <w:highlight w:val="yellow"/>
           <w:lang w:val="es-ES"/>
         </w:rPr>
         <w:t>Recomendaciones</w:t>
@@ -4489,12 +5279,14 @@
         </w:numPr>
         <w:rPr>
           <w:rFonts w:ascii="Times New Roman" w:hAnsi="Times New Roman" w:cs="Times New Roman"/>
-          <w:lang w:val="es-ES"/>
-        </w:rPr>
-      </w:pPr>
-      <w:r>
-        <w:rPr>
-          <w:rFonts w:ascii="Times New Roman" w:hAnsi="Times New Roman" w:cs="Times New Roman"/>
+          <w:highlight w:val="yellow"/>
+          <w:lang w:val="es-ES"/>
+        </w:rPr>
+      </w:pPr>
+      <w:r>
+        <w:rPr>
+          <w:rFonts w:ascii="Times New Roman" w:hAnsi="Times New Roman" w:cs="Times New Roman"/>
+          <w:highlight w:val="yellow"/>
           <w:lang w:val="es-ES"/>
         </w:rPr>
         <w:t>Sugerencias para mejorar la reproducibilidad del estudio original o facilitar futuras replicaciones.</w:t>
@@ -4510,579 +5302,327 @@
     </w:p>
     <w:p>
       <w:pPr>
-        <w:rPr>
-          <w:rFonts w:ascii="Times New Roman" w:hAnsi="Times New Roman" w:cs="Times New Roman"/>
-          <w:lang w:val="es-ES"/>
-        </w:rPr>
-      </w:pPr>
-      <w:r>
-        <w:rPr>
-          <w:rFonts w:ascii="Times New Roman" w:hAnsi="Times New Roman" w:cs="Times New Roman"/>
-          <w:lang w:val="es-ES"/>
-        </w:rPr>
-        <w:lastRenderedPageBreak/>
-        <w:t>5. Apéndices</w:t>
-      </w:r>
-    </w:p>
-    <w:p>
-      <w:pPr>
-        <w:rPr>
-          <w:rFonts w:ascii="Times New Roman" w:hAnsi="Times New Roman" w:cs="Times New Roman"/>
-          <w:lang w:val="es-ES"/>
-        </w:rPr>
-      </w:pPr>
-      <w:r>
-        <w:rPr>
-          <w:rFonts w:ascii="Times New Roman" w:hAnsi="Times New Roman" w:cs="Times New Roman"/>
-          <w:lang w:val="es-ES"/>
-        </w:rPr>
-        <w:t>Referencias bibliográficas</w:t>
-      </w:r>
-    </w:p>
-    <w:p>
-      <w:pPr>
-        <w:rPr>
-          <w:rFonts w:ascii="Times New Roman" w:hAnsi="Times New Roman" w:cs="Times New Roman"/>
-          <w:lang w:val="es-ES"/>
-        </w:rPr>
-      </w:pPr>
-      <w:r>
-        <w:rPr>
-          <w:rFonts w:ascii="Times New Roman" w:hAnsi="Times New Roman" w:cs="Times New Roman"/>
-          <w:lang w:val="es-ES"/>
-        </w:rPr>
-        <w:t>Enlaces al repositorio de GitHub y otros materiales complementarios</w:t>
-      </w:r>
-    </w:p>
-    <w:p>
-      <w:pPr>
-        <w:rPr>
-          <w:rFonts w:ascii="Times New Roman" w:hAnsi="Times New Roman" w:cs="Times New Roman"/>
-          <w:lang w:val="es-ES"/>
-        </w:rPr>
-      </w:pPr>
-    </w:p>
-    <w:p>
-      <w:pPr>
-        <w:rPr>
-          <w:rFonts w:ascii="Times New Roman" w:hAnsi="Times New Roman" w:cs="Times New Roman"/>
-          <w:lang w:val="es-ES"/>
-        </w:rPr>
-      </w:pPr>
-      <w:r>
-        <w:rPr>
-          <w:rFonts w:ascii="Times New Roman" w:hAnsi="Times New Roman" w:cs="Times New Roman"/>
-          <w:lang w:val="es-ES"/>
-        </w:rPr>
-        <w:t>Forma de Evaluación</w:t>
-      </w:r>
-    </w:p>
-    <w:p>
-      <w:pPr>
-        <w:rPr>
-          <w:rFonts w:ascii="Times New Roman" w:hAnsi="Times New Roman" w:cs="Times New Roman"/>
-          <w:lang w:val="es-ES"/>
-        </w:rPr>
-      </w:pPr>
-      <w:r>
-        <w:rPr>
-          <w:rFonts w:ascii="Times New Roman" w:hAnsi="Times New Roman" w:cs="Times New Roman"/>
-          <w:lang w:val="es-ES"/>
-        </w:rPr>
-        <w:t>Documento breve (máximo 1 página) que incluya:</w:t>
-      </w:r>
-    </w:p>
-    <w:p>
-      <w:pPr>
-        <w:rPr>
-          <w:rFonts w:ascii="Times New Roman" w:hAnsi="Times New Roman" w:cs="Times New Roman"/>
-          <w:lang w:val="es-ES"/>
-        </w:rPr>
-      </w:pPr>
-      <w:r>
-        <w:rPr>
-          <w:rFonts w:ascii="Times New Roman" w:hAnsi="Times New Roman" w:cs="Times New Roman"/>
-          <w:lang w:val="es-ES"/>
-        </w:rPr>
-        <w:t>Progreso realizado desde el Avance 1</w:t>
-      </w:r>
-    </w:p>
-    <w:p>
-      <w:pPr>
-        <w:rPr>
-          <w:rFonts w:ascii="Times New Roman" w:hAnsi="Times New Roman" w:cs="Times New Roman"/>
-          <w:lang w:val="es-ES"/>
-        </w:rPr>
-      </w:pPr>
-      <w:r>
-        <w:rPr>
-          <w:rFonts w:ascii="Times New Roman" w:hAnsi="Times New Roman" w:cs="Times New Roman"/>
-          <w:lang w:val="es-ES"/>
-        </w:rPr>
-        <w:t>Principales desafíos encontrados</w:t>
-      </w:r>
-    </w:p>
-    <w:p>
-      <w:pPr>
-        <w:rPr>
-          <w:rFonts w:ascii="Times New Roman" w:hAnsi="Times New Roman" w:cs="Times New Roman"/>
-          <w:lang w:val="es-ES"/>
-        </w:rPr>
-      </w:pPr>
-      <w:r>
-        <w:rPr>
-          <w:rFonts w:ascii="Times New Roman" w:hAnsi="Times New Roman" w:cs="Times New Roman"/>
-          <w:lang w:val="es-ES"/>
-        </w:rPr>
-        <w:t>Plan actualizado para completar el proyecto</w:t>
-      </w:r>
-    </w:p>
-    <w:p>
-      <w:pPr>
-        <w:rPr>
-          <w:rFonts w:ascii="Times New Roman" w:hAnsi="Times New Roman" w:cs="Times New Roman"/>
-          <w:lang w:val="es-ES"/>
-        </w:rPr>
-      </w:pPr>
-      <w:r>
-        <w:rPr>
-          <w:rFonts w:ascii="Times New Roman" w:hAnsi="Times New Roman" w:cs="Times New Roman"/>
-          <w:lang w:val="es-ES"/>
-        </w:rPr>
-        <w:t>Nombre del archivo:</w:t>
-      </w:r>
-    </w:p>
-    <w:p>
-      <w:pPr>
-        <w:rPr>
-          <w:rFonts w:ascii="Times New Roman" w:hAnsi="Times New Roman" w:cs="Times New Roman"/>
-          <w:lang w:val="es-ES"/>
-        </w:rPr>
-      </w:pPr>
-      <w:r>
-        <w:rPr>
-          <w:rFonts w:ascii="Times New Roman" w:hAnsi="Times New Roman" w:cs="Times New Roman"/>
-          <w:lang w:val="es-ES"/>
-        </w:rPr>
-        <w:t>avance2_informe_grupoX.pdf</w:t>
-      </w:r>
-    </w:p>
-    <w:p>
-      <w:pPr>
-        <w:rPr>
-          <w:rFonts w:ascii="Times New Roman" w:hAnsi="Times New Roman" w:cs="Times New Roman"/>
-          <w:lang w:val="es-ES"/>
-        </w:rPr>
-      </w:pPr>
-    </w:p>
-    <w:p>
-      <w:pPr>
-        <w:rPr>
-          <w:rFonts w:ascii="Times New Roman" w:hAnsi="Times New Roman" w:cs="Times New Roman"/>
-          <w:lang w:val="es-ES"/>
-        </w:rPr>
-      </w:pPr>
-      <w:r>
-        <w:rPr>
-          <w:rFonts w:ascii="Times New Roman" w:hAnsi="Times New Roman" w:cs="Times New Roman"/>
-          <w:lang w:val="es-ES"/>
-        </w:rPr>
-        <w:t>Recomendaciones</w:t>
-      </w:r>
-    </w:p>
-    <w:p>
-      <w:pPr>
-        <w:rPr>
-          <w:rFonts w:ascii="Times New Roman" w:hAnsi="Times New Roman" w:cs="Times New Roman"/>
-          <w:lang w:val="es-ES"/>
-        </w:rPr>
-      </w:pPr>
-      <w:r>
-        <w:rPr>
-          <w:rFonts w:ascii="Times New Roman" w:hAnsi="Times New Roman" w:cs="Times New Roman"/>
-          <w:lang w:val="es-ES"/>
-        </w:rPr>
-        <w:t>Documentar el proceso a medida que avanza el proyecto, no únicamente al final.</w:t>
-      </w:r>
-    </w:p>
-    <w:p>
-      <w:pPr>
-        <w:rPr>
-          <w:rFonts w:ascii="Times New Roman" w:hAnsi="Times New Roman" w:cs="Times New Roman"/>
-          <w:lang w:val="es-ES"/>
-        </w:rPr>
-      </w:pPr>
-      <w:r>
-        <w:rPr>
-          <w:rFonts w:ascii="Times New Roman" w:hAnsi="Times New Roman" w:cs="Times New Roman"/>
-          <w:lang w:val="es-ES"/>
-        </w:rPr>
-        <w:t xml:space="preserve">Realizar </w:t>
-      </w:r>
-      <w:proofErr w:type="spellStart"/>
-      <w:r>
-        <w:rPr>
-          <w:rFonts w:ascii="Times New Roman" w:hAnsi="Times New Roman" w:cs="Times New Roman"/>
-          <w:lang w:val="es-ES"/>
-        </w:rPr>
-        <w:t>commits</w:t>
-      </w:r>
-      <w:proofErr w:type="spellEnd"/>
-      <w:r>
-        <w:rPr>
-          <w:rFonts w:ascii="Times New Roman" w:hAnsi="Times New Roman" w:cs="Times New Roman"/>
-          <w:lang w:val="es-ES"/>
-        </w:rPr>
-        <w:t xml:space="preserve"> frecuentes en el repositorio.</w:t>
-      </w:r>
-    </w:p>
-    <w:p>
-      <w:pPr>
-        <w:rPr>
-          <w:rFonts w:ascii="Times New Roman" w:hAnsi="Times New Roman" w:cs="Times New Roman"/>
-          <w:lang w:val="es-ES"/>
-        </w:rPr>
-      </w:pPr>
-      <w:r>
-        <w:rPr>
-          <w:rFonts w:ascii="Times New Roman" w:hAnsi="Times New Roman" w:cs="Times New Roman"/>
-          <w:lang w:val="es-ES"/>
-        </w:rPr>
-        <w:t>Reportar honestamente los desafíos encontrados, incluso si aún no han sido resueltos.</w:t>
-      </w:r>
-    </w:p>
-    <w:p>
-      <w:pPr>
-        <w:rPr>
-          <w:rFonts w:ascii="Times New Roman" w:hAnsi="Times New Roman" w:cs="Times New Roman"/>
-          <w:lang w:val="es-ES"/>
-        </w:rPr>
-      </w:pPr>
-    </w:p>
-    <w:p>
-      <w:pPr>
-        <w:rPr>
-          <w:rFonts w:ascii="Times New Roman" w:hAnsi="Times New Roman" w:cs="Times New Roman"/>
-          <w:lang w:val="es-ES"/>
-        </w:rPr>
-      </w:pPr>
-      <w:r>
-        <w:rPr>
-          <w:rFonts w:ascii="Times New Roman" w:hAnsi="Times New Roman" w:cs="Times New Roman"/>
-          <w:lang w:val="es-ES"/>
-        </w:rPr>
-        <w:t>Componentes a Evaluar</w:t>
-      </w:r>
-    </w:p>
-    <w:p>
-      <w:pPr>
-        <w:rPr>
-          <w:rFonts w:ascii="Times New Roman" w:hAnsi="Times New Roman" w:cs="Times New Roman"/>
-          <w:lang w:val="es-ES"/>
-        </w:rPr>
-      </w:pPr>
-      <w:r>
-        <w:rPr>
-          <w:rFonts w:ascii="Times New Roman" w:hAnsi="Times New Roman" w:cs="Times New Roman"/>
-          <w:lang w:val="es-ES"/>
-        </w:rPr>
-        <w:t>1. Documentación y Control de Versiones</w:t>
-      </w:r>
-    </w:p>
-    <w:p>
-      <w:pPr>
-        <w:rPr>
-          <w:rFonts w:ascii="Times New Roman" w:hAnsi="Times New Roman" w:cs="Times New Roman"/>
-          <w:lang w:val="es-ES"/>
-        </w:rPr>
-      </w:pPr>
-      <w:r>
-        <w:rPr>
-          <w:rFonts w:ascii="Times New Roman" w:hAnsi="Times New Roman" w:cs="Times New Roman"/>
-          <w:lang w:val="es-ES"/>
-        </w:rPr>
-        <w:t>Se evaluará la existencia de:</w:t>
-      </w:r>
-    </w:p>
-    <w:p>
-      <w:pPr>
-        <w:rPr>
-          <w:rFonts w:ascii="Times New Roman" w:hAnsi="Times New Roman" w:cs="Times New Roman"/>
-          <w:lang w:val="es-ES"/>
-        </w:rPr>
-      </w:pPr>
-      <w:proofErr w:type="spellStart"/>
-      <w:r>
-        <w:rPr>
-          <w:rFonts w:ascii="Times New Roman" w:hAnsi="Times New Roman" w:cs="Times New Roman"/>
-          <w:lang w:val="es-ES"/>
-        </w:rPr>
-        <w:t>Commits</w:t>
-      </w:r>
-      <w:proofErr w:type="spellEnd"/>
-      <w:r>
-        <w:rPr>
-          <w:rFonts w:ascii="Times New Roman" w:hAnsi="Times New Roman" w:cs="Times New Roman"/>
-          <w:lang w:val="es-ES"/>
-        </w:rPr>
-        <w:t xml:space="preserve"> regulares con mensajes descriptivos coherentes con el proceso de investigación.</w:t>
-      </w:r>
-    </w:p>
-    <w:p>
-      <w:pPr>
-        <w:rPr>
-          <w:rFonts w:ascii="Times New Roman" w:hAnsi="Times New Roman" w:cs="Times New Roman"/>
-          <w:lang w:val="es-ES"/>
-        </w:rPr>
-      </w:pPr>
-      <w:r>
-        <w:rPr>
-          <w:rFonts w:ascii="Times New Roman" w:hAnsi="Times New Roman" w:cs="Times New Roman"/>
-          <w:lang w:val="es-ES"/>
-        </w:rPr>
-        <w:t>Actualizaciones al README y a otros documentos de soporte.</w:t>
-      </w:r>
-    </w:p>
-    <w:p>
-      <w:pPr>
-        <w:rPr>
-          <w:rFonts w:ascii="Times New Roman" w:hAnsi="Times New Roman" w:cs="Times New Roman"/>
-          <w:lang w:val="es-ES"/>
-        </w:rPr>
-      </w:pPr>
-      <w:r>
-        <w:rPr>
-          <w:rFonts w:ascii="Times New Roman" w:hAnsi="Times New Roman" w:cs="Times New Roman"/>
-          <w:lang w:val="es-ES"/>
-        </w:rPr>
-        <w:t>Organización clara de archivos y directorios.</w:t>
-      </w:r>
-    </w:p>
-    <w:p>
-      <w:pPr>
-        <w:rPr>
-          <w:rFonts w:ascii="Times New Roman" w:hAnsi="Times New Roman" w:cs="Times New Roman"/>
-          <w:lang w:val="es-ES"/>
-        </w:rPr>
-      </w:pPr>
-      <w:r>
-        <w:rPr>
-          <w:rFonts w:ascii="Times New Roman" w:hAnsi="Times New Roman" w:cs="Times New Roman"/>
-          <w:lang w:val="es-ES"/>
-        </w:rPr>
-        <w:t>Registro de decisiones y desafíos encontrados.</w:t>
-      </w:r>
-    </w:p>
-    <w:p>
-      <w:pPr>
-        <w:rPr>
-          <w:rFonts w:ascii="Times New Roman" w:hAnsi="Times New Roman" w:cs="Times New Roman"/>
-          <w:lang w:val="es-ES"/>
-        </w:rPr>
-      </w:pPr>
-    </w:p>
-    <w:p>
-      <w:pPr>
-        <w:rPr>
-          <w:rFonts w:ascii="Times New Roman" w:hAnsi="Times New Roman" w:cs="Times New Roman"/>
-          <w:lang w:val="es-ES"/>
-        </w:rPr>
-      </w:pPr>
-      <w:r>
-        <w:rPr>
-          <w:rFonts w:ascii="Times New Roman" w:hAnsi="Times New Roman" w:cs="Times New Roman"/>
-          <w:lang w:val="es-ES"/>
-        </w:rPr>
-        <w:t>2. Reproducción en Progreso</w:t>
-      </w:r>
-    </w:p>
-    <w:p>
-      <w:pPr>
-        <w:rPr>
-          <w:rFonts w:ascii="Times New Roman" w:hAnsi="Times New Roman" w:cs="Times New Roman"/>
-          <w:lang w:val="es-ES"/>
-        </w:rPr>
-      </w:pPr>
-      <w:r>
-        <w:rPr>
-          <w:rFonts w:ascii="Times New Roman" w:hAnsi="Times New Roman" w:cs="Times New Roman"/>
-          <w:lang w:val="es-ES"/>
-        </w:rPr>
-        <w:t>Se verificará la presencia de:</w:t>
-      </w:r>
-    </w:p>
-    <w:p>
-      <w:pPr>
-        <w:rPr>
-          <w:rFonts w:ascii="Times New Roman" w:hAnsi="Times New Roman" w:cs="Times New Roman"/>
-          <w:lang w:val="es-ES"/>
-        </w:rPr>
-      </w:pPr>
-      <w:r>
-        <w:rPr>
-          <w:rFonts w:ascii="Times New Roman" w:hAnsi="Times New Roman" w:cs="Times New Roman"/>
-          <w:lang w:val="es-ES"/>
-        </w:rPr>
-        <w:t>Identificación del código relevante del artículo original.</w:t>
-      </w:r>
-    </w:p>
-    <w:p>
-      <w:pPr>
-        <w:rPr>
-          <w:rFonts w:ascii="Times New Roman" w:hAnsi="Times New Roman" w:cs="Times New Roman"/>
-          <w:lang w:val="es-ES"/>
-        </w:rPr>
-      </w:pPr>
-      <w:r>
-        <w:rPr>
-          <w:rFonts w:ascii="Times New Roman" w:hAnsi="Times New Roman" w:cs="Times New Roman"/>
-          <w:lang w:val="es-ES"/>
-        </w:rPr>
-        <w:t>Localización y acceso a los datos necesarios.</w:t>
-      </w:r>
-    </w:p>
-    <w:p>
-      <w:pPr>
-        <w:rPr>
-          <w:rFonts w:ascii="Times New Roman" w:hAnsi="Times New Roman" w:cs="Times New Roman"/>
-          <w:lang w:val="es-ES"/>
-        </w:rPr>
-      </w:pPr>
-      <w:r>
-        <w:rPr>
-          <w:rFonts w:ascii="Times New Roman" w:hAnsi="Times New Roman" w:cs="Times New Roman"/>
-          <w:lang w:val="es-ES"/>
-        </w:rPr>
-        <w:t>Scripts iniciales de reproducción.</w:t>
-      </w:r>
-    </w:p>
-    <w:p>
-      <w:pPr>
-        <w:rPr>
-          <w:rFonts w:ascii="Times New Roman" w:hAnsi="Times New Roman" w:cs="Times New Roman"/>
-          <w:lang w:val="es-ES"/>
-        </w:rPr>
-      </w:pPr>
-      <w:r>
-        <w:rPr>
-          <w:rFonts w:ascii="Times New Roman" w:hAnsi="Times New Roman" w:cs="Times New Roman"/>
-          <w:lang w:val="es-ES"/>
-        </w:rPr>
-        <w:t>Documentación de dependencias.</w:t>
-      </w:r>
-    </w:p>
-    <w:p>
-      <w:pPr>
-        <w:rPr>
-          <w:rFonts w:ascii="Times New Roman" w:hAnsi="Times New Roman" w:cs="Times New Roman"/>
-          <w:lang w:val="es-ES"/>
-        </w:rPr>
-      </w:pPr>
-      <w:r>
-        <w:rPr>
-          <w:rFonts w:ascii="Times New Roman" w:hAnsi="Times New Roman" w:cs="Times New Roman"/>
-          <w:lang w:val="es-ES"/>
-        </w:rPr>
-        <w:t>Pruebas preliminares del proceso de reproducción.</w:t>
-      </w:r>
-    </w:p>
-    <w:p>
-      <w:pPr>
-        <w:rPr>
-          <w:rFonts w:ascii="Times New Roman" w:hAnsi="Times New Roman" w:cs="Times New Roman"/>
-          <w:lang w:val="es-ES"/>
-        </w:rPr>
-      </w:pPr>
-    </w:p>
-    <w:p>
-      <w:pPr>
-        <w:rPr>
-          <w:rFonts w:ascii="Times New Roman" w:hAnsi="Times New Roman" w:cs="Times New Roman"/>
-          <w:lang w:val="es-ES"/>
-        </w:rPr>
-      </w:pPr>
-      <w:r>
-        <w:rPr>
-          <w:rFonts w:ascii="Times New Roman" w:hAnsi="Times New Roman" w:cs="Times New Roman"/>
-          <w:lang w:val="es-ES"/>
-        </w:rPr>
-        <w:t>3. Gestión del Proyecto</w:t>
-      </w:r>
-    </w:p>
-    <w:p>
-      <w:pPr>
-        <w:rPr>
-          <w:rFonts w:ascii="Times New Roman" w:hAnsi="Times New Roman" w:cs="Times New Roman"/>
-          <w:lang w:val="es-ES"/>
-        </w:rPr>
-      </w:pPr>
-      <w:r>
-        <w:rPr>
-          <w:rFonts w:ascii="Times New Roman" w:hAnsi="Times New Roman" w:cs="Times New Roman"/>
-          <w:lang w:val="es-ES"/>
-        </w:rPr>
-        <w:t>Se revisará:</w:t>
-      </w:r>
-    </w:p>
-    <w:p>
-      <w:pPr>
-        <w:rPr>
-          <w:rFonts w:ascii="Times New Roman" w:hAnsi="Times New Roman" w:cs="Times New Roman"/>
-          <w:lang w:val="es-ES"/>
-        </w:rPr>
-      </w:pPr>
-      <w:r>
-        <w:rPr>
-          <w:rFonts w:ascii="Times New Roman" w:hAnsi="Times New Roman" w:cs="Times New Roman"/>
-          <w:lang w:val="es-ES"/>
-        </w:rPr>
-        <w:t>Cumplimiento de los hitos internos definidos por el equipo.</w:t>
-      </w:r>
-    </w:p>
-    <w:p>
-      <w:pPr>
-        <w:rPr>
-          <w:rFonts w:ascii="Times New Roman" w:hAnsi="Times New Roman" w:cs="Times New Roman"/>
-          <w:lang w:val="es-ES"/>
-        </w:rPr>
-      </w:pPr>
-      <w:r>
-        <w:rPr>
-          <w:rFonts w:ascii="Times New Roman" w:hAnsi="Times New Roman" w:cs="Times New Roman"/>
-          <w:lang w:val="es-ES"/>
-        </w:rPr>
-        <w:t>Evidencia de trabajo colaborativo.</w:t>
-      </w:r>
-    </w:p>
-    <w:p>
-      <w:pPr>
-        <w:rPr>
-          <w:rFonts w:ascii="Times New Roman" w:hAnsi="Times New Roman" w:cs="Times New Roman"/>
-          <w:lang w:val="es-ES"/>
-        </w:rPr>
-      </w:pPr>
-      <w:r>
-        <w:rPr>
-          <w:rFonts w:ascii="Times New Roman" w:hAnsi="Times New Roman" w:cs="Times New Roman"/>
-          <w:lang w:val="es-ES"/>
-        </w:rPr>
-        <w:t>Actualización del cronograma del proyecto.</w:t>
-      </w:r>
-    </w:p>
-    <w:p>
-      <w:pPr>
-        <w:rPr>
-          <w:rFonts w:ascii="Times New Roman" w:hAnsi="Times New Roman" w:cs="Times New Roman"/>
-          <w:lang w:val="es-ES"/>
-        </w:rPr>
-      </w:pPr>
-      <w:r>
-        <w:rPr>
-          <w:rFonts w:ascii="Times New Roman" w:hAnsi="Times New Roman" w:cs="Times New Roman"/>
-          <w:lang w:val="es-ES"/>
-        </w:rPr>
-        <w:t>Contribuciones consistentes con los roles asignados.</w:t>
-      </w:r>
+        <w:pStyle w:val="ListParagraph"/>
+        <w:numPr>
+          <w:ilvl w:val="0"/>
+          <w:numId w:val="1"/>
+        </w:numPr>
+        <w:rPr>
+          <w:rFonts w:ascii="Times New Roman" w:hAnsi="Times New Roman" w:cs="Times New Roman"/>
+          <w:b/>
+          <w:bCs/>
+          <w:lang w:val="es-ES"/>
+        </w:rPr>
+      </w:pPr>
+      <w:r>
+        <w:rPr>
+          <w:rFonts w:ascii="Times New Roman" w:hAnsi="Times New Roman" w:cs="Times New Roman"/>
+          <w:b/>
+          <w:bCs/>
+          <w:lang w:val="es-ES"/>
+        </w:rPr>
+        <w:t>Reflexión y conclusiones</w:t>
+      </w:r>
+    </w:p>
+    <w:p>
+      <w:pPr>
+        <w:pStyle w:val="ListParagraph"/>
+        <w:rPr>
+          <w:rFonts w:ascii="Times New Roman" w:hAnsi="Times New Roman" w:cs="Times New Roman"/>
+          <w:lang w:val="es-ES"/>
+        </w:rPr>
+      </w:pPr>
+    </w:p>
+    <w:p>
+      <w:pPr>
+        <w:pStyle w:val="ListParagraph"/>
+        <w:numPr>
+          <w:ilvl w:val="0"/>
+          <w:numId w:val="4"/>
+        </w:numPr>
+        <w:rPr>
+          <w:rFonts w:ascii="Times New Roman" w:hAnsi="Times New Roman" w:cs="Times New Roman"/>
+          <w:highlight w:val="yellow"/>
+          <w:lang w:val="es-ES"/>
+        </w:rPr>
+      </w:pPr>
+      <w:r>
+        <w:rPr>
+          <w:rFonts w:ascii="Times New Roman" w:hAnsi="Times New Roman" w:cs="Times New Roman"/>
+          <w:highlight w:val="yellow"/>
+          <w:lang w:val="es-ES"/>
+        </w:rPr>
+        <w:t>Evaluaci</w:t>
+      </w:r>
+      <w:r>
+        <w:rPr>
+          <w:rFonts w:ascii="Times New Roman" w:hAnsi="Times New Roman" w:cs="Times New Roman"/>
+          <w:highlight w:val="yellow"/>
+          <w:lang w:val="es-ES"/>
+        </w:rPr>
+        <w:t>ó</w:t>
+      </w:r>
+      <w:r>
+        <w:rPr>
+          <w:rFonts w:ascii="Times New Roman" w:hAnsi="Times New Roman" w:cs="Times New Roman"/>
+          <w:highlight w:val="yellow"/>
+          <w:lang w:val="es-ES"/>
+        </w:rPr>
+        <w:t>n del proceso: Reflexi</w:t>
+      </w:r>
+      <w:r>
+        <w:rPr>
+          <w:rFonts w:ascii="Times New Roman" w:hAnsi="Times New Roman" w:cs="Times New Roman"/>
+          <w:highlight w:val="yellow"/>
+          <w:lang w:val="es-ES"/>
+        </w:rPr>
+        <w:t>ó</w:t>
+      </w:r>
+      <w:r>
+        <w:rPr>
+          <w:rFonts w:ascii="Times New Roman" w:hAnsi="Times New Roman" w:cs="Times New Roman"/>
+          <w:highlight w:val="yellow"/>
+          <w:lang w:val="es-ES"/>
+        </w:rPr>
+        <w:t>n sobre la gesti</w:t>
+      </w:r>
+      <w:r>
+        <w:rPr>
+          <w:rFonts w:ascii="Times New Roman" w:hAnsi="Times New Roman" w:cs="Times New Roman"/>
+          <w:highlight w:val="yellow"/>
+          <w:lang w:val="es-ES"/>
+        </w:rPr>
+        <w:t>ó</w:t>
+      </w:r>
+      <w:r>
+        <w:rPr>
+          <w:rFonts w:ascii="Times New Roman" w:hAnsi="Times New Roman" w:cs="Times New Roman"/>
+          <w:highlight w:val="yellow"/>
+          <w:lang w:val="es-ES"/>
+        </w:rPr>
+        <w:t>n del proyecto, automatizaci</w:t>
+      </w:r>
+      <w:r>
+        <w:rPr>
+          <w:rFonts w:ascii="Times New Roman" w:hAnsi="Times New Roman" w:cs="Times New Roman"/>
+          <w:highlight w:val="yellow"/>
+          <w:lang w:val="es-ES"/>
+        </w:rPr>
+        <w:t>ó</w:t>
+      </w:r>
+      <w:r>
+        <w:rPr>
+          <w:rFonts w:ascii="Times New Roman" w:hAnsi="Times New Roman" w:cs="Times New Roman"/>
+          <w:highlight w:val="yellow"/>
+          <w:lang w:val="es-ES"/>
+        </w:rPr>
+        <w:t xml:space="preserve">n, trabajo colaborativo y sobre el flujo de trabajo. </w:t>
+      </w:r>
+    </w:p>
+    <w:p>
+      <w:pPr>
+        <w:pStyle w:val="ListParagraph"/>
+        <w:numPr>
+          <w:ilvl w:val="0"/>
+          <w:numId w:val="4"/>
+        </w:numPr>
+        <w:rPr>
+          <w:rFonts w:ascii="Times New Roman" w:hAnsi="Times New Roman" w:cs="Times New Roman"/>
+          <w:highlight w:val="yellow"/>
+          <w:lang w:val="es-ES"/>
+        </w:rPr>
+      </w:pPr>
+      <w:r>
+        <w:rPr>
+          <w:rFonts w:ascii="Times New Roman" w:hAnsi="Times New Roman" w:cs="Times New Roman"/>
+          <w:highlight w:val="yellow"/>
+          <w:lang w:val="es-ES"/>
+        </w:rPr>
+        <w:t>Se espera que reflejen desaf</w:t>
+      </w:r>
+      <w:r>
+        <w:rPr>
+          <w:rFonts w:ascii="Times New Roman" w:hAnsi="Times New Roman" w:cs="Times New Roman"/>
+          <w:highlight w:val="yellow"/>
+          <w:lang w:val="es-ES"/>
+        </w:rPr>
+        <w:t>í</w:t>
+      </w:r>
+      <w:r>
+        <w:rPr>
+          <w:rFonts w:ascii="Times New Roman" w:hAnsi="Times New Roman" w:cs="Times New Roman"/>
+          <w:highlight w:val="yellow"/>
+          <w:lang w:val="es-ES"/>
+        </w:rPr>
+        <w:t>os y dificultades que han tenido.</w:t>
+      </w:r>
+    </w:p>
+    <w:p>
+      <w:pPr>
+        <w:pStyle w:val="ListParagraph"/>
+        <w:numPr>
+          <w:ilvl w:val="0"/>
+          <w:numId w:val="4"/>
+        </w:numPr>
+        <w:rPr>
+          <w:rFonts w:ascii="Times New Roman" w:hAnsi="Times New Roman" w:cs="Times New Roman"/>
+          <w:highlight w:val="yellow"/>
+          <w:lang w:val="es-ES"/>
+        </w:rPr>
+      </w:pPr>
+      <w:r>
+        <w:rPr>
+          <w:rFonts w:ascii="Times New Roman" w:hAnsi="Times New Roman" w:cs="Times New Roman"/>
+          <w:highlight w:val="yellow"/>
+          <w:lang w:val="es-ES"/>
+        </w:rPr>
+        <w:t>Lecciones aprendidas: Aprendizajes clave sobre reproducibilidad cient</w:t>
+      </w:r>
+      <w:r>
+        <w:rPr>
+          <w:rFonts w:ascii="Times New Roman" w:hAnsi="Times New Roman" w:cs="Times New Roman"/>
+          <w:highlight w:val="yellow"/>
+          <w:lang w:val="es-ES"/>
+        </w:rPr>
+        <w:t>í</w:t>
+      </w:r>
+      <w:r>
+        <w:rPr>
+          <w:rFonts w:ascii="Times New Roman" w:hAnsi="Times New Roman" w:cs="Times New Roman"/>
+          <w:highlight w:val="yellow"/>
+          <w:lang w:val="es-ES"/>
+        </w:rPr>
+        <w:t>fica. Recomendaciones: Sugerencias para mejorar la reproducibilidad del estudio original.</w:t>
+      </w:r>
+    </w:p>
+    <w:p>
+      <w:pPr>
+        <w:rPr>
+          <w:rFonts w:ascii="Times New Roman" w:hAnsi="Times New Roman" w:cs="Times New Roman"/>
+          <w:lang w:val="es-ES"/>
+        </w:rPr>
+      </w:pPr>
+    </w:p>
+    <w:p>
+      <w:pPr>
+        <w:pStyle w:val="ListParagraph"/>
+        <w:numPr>
+          <w:ilvl w:val="0"/>
+          <w:numId w:val="1"/>
+        </w:numPr>
+        <w:rPr>
+          <w:rFonts w:ascii="Times New Roman" w:hAnsi="Times New Roman" w:cs="Times New Roman"/>
+          <w:b/>
+          <w:bCs/>
+          <w:lang w:val="es-ES"/>
+        </w:rPr>
+      </w:pPr>
+      <w:r>
+        <w:rPr>
+          <w:rFonts w:ascii="Times New Roman" w:hAnsi="Times New Roman" w:cs="Times New Roman"/>
+          <w:b/>
+          <w:bCs/>
+          <w:lang w:val="es-ES"/>
+        </w:rPr>
+        <w:t>A</w:t>
+      </w:r>
+      <w:r>
+        <w:rPr>
+          <w:rFonts w:ascii="Times New Roman" w:hAnsi="Times New Roman" w:cs="Times New Roman"/>
+          <w:b/>
+          <w:bCs/>
+          <w:lang w:val="es-ES"/>
+        </w:rPr>
+        <w:t>péndices</w:t>
+      </w:r>
+    </w:p>
+    <w:p>
+      <w:pPr>
+        <w:rPr>
+          <w:rFonts w:ascii="Times New Roman" w:hAnsi="Times New Roman" w:cs="Times New Roman"/>
+          <w:lang w:val="fr-FR"/>
+        </w:rPr>
+      </w:pPr>
+      <w:r>
+        <w:rPr>
+          <w:rFonts w:ascii="Times New Roman" w:hAnsi="Times New Roman" w:cs="Times New Roman"/>
+        </w:rPr>
+        <w:t xml:space="preserve">Rode, A., Carleton, T., Delgado, M., Greenstone, M., Houser, T., Hsiang, S., Hultgren, A., Jina, A., Kopp, R. E., McCusker, K. E., Nath, I., Rising, J., &amp; Yuan, J. (2021). </w:t>
+      </w:r>
+      <w:r>
+        <w:rPr>
+          <w:rFonts w:ascii="Times New Roman" w:hAnsi="Times New Roman" w:cs="Times New Roman"/>
+          <w:i/>
+          <w:iCs/>
+        </w:rPr>
+        <w:t>Estimating a social cost of carbon for global energy consumption</w:t>
+      </w:r>
+      <w:r>
+        <w:rPr>
+          <w:rFonts w:ascii="Times New Roman" w:hAnsi="Times New Roman" w:cs="Times New Roman"/>
+        </w:rPr>
+        <w:t xml:space="preserve">. </w:t>
+      </w:r>
+      <w:r>
+        <w:rPr>
+          <w:rFonts w:ascii="Times New Roman" w:hAnsi="Times New Roman" w:cs="Times New Roman"/>
+          <w:b/>
+          <w:bCs/>
+          <w:lang w:val="fr-FR"/>
+        </w:rPr>
+        <w:t>Nature, 598</w:t>
+      </w:r>
+      <w:r>
+        <w:rPr>
+          <w:rFonts w:ascii="Times New Roman" w:hAnsi="Times New Roman" w:cs="Times New Roman"/>
+          <w:lang w:val="fr-FR"/>
+        </w:rPr>
+        <w:t>(7880), 308–314. https://doi.org/10.1038/s41586-021-03883-8</w:t>
+      </w:r>
+    </w:p>
+    <w:p>
+      <w:pPr>
+        <w:rPr>
+          <w:rFonts w:ascii="Times New Roman" w:hAnsi="Times New Roman" w:cs="Times New Roman"/>
+          <w:lang w:val="fr-FR"/>
+        </w:rPr>
+      </w:pPr>
+      <w:hyperlink r:id="rId16" w:history="1">
+        <w:r>
+          <w:rPr>
+            <w:rStyle w:val="Hyperlink"/>
+            <w:rFonts w:ascii="Times New Roman" w:hAnsi="Times New Roman" w:cs="Times New Roman"/>
+            <w:lang w:val="fr-FR"/>
+          </w:rPr>
+          <w:t>https://github.com/mvillabonam/energy-code-release-2020-GPICA</w:t>
+        </w:r>
+      </w:hyperlink>
+    </w:p>
+    <w:p>
+      <w:pPr>
+        <w:rPr>
+          <w:rFonts w:ascii="Times New Roman" w:hAnsi="Times New Roman" w:cs="Times New Roman"/>
+          <w:lang w:val="es-ES"/>
+        </w:rPr>
+      </w:pPr>
+      <w:hyperlink r:id="rId17" w:history="1">
+        <w:r>
+          <w:rPr>
+            <w:rStyle w:val="Hyperlink"/>
+            <w:rFonts w:ascii="Times New Roman" w:hAnsi="Times New Roman" w:cs="Times New Roman"/>
+            <w:lang w:val="es-ES"/>
+          </w:rPr>
+          <w:t>https://quire.io/w/energy-code-release-2020-GPICA/68?filter=all</w:t>
+        </w:r>
+      </w:hyperlink>
+    </w:p>
+    <w:p>
+      <w:pPr>
+        <w:rPr>
+          <w:rFonts w:ascii="Times New Roman" w:hAnsi="Times New Roman" w:cs="Times New Roman"/>
+          <w:lang w:val="es-ES"/>
+        </w:rPr>
+      </w:pPr>
     </w:p>
     <w:p>
       <w:pPr>
@@ -5590,6 +6130,119 @@
       </w:rPr>
     </w:lvl>
   </w:abstractNum>
+  <w:abstractNum w:abstractNumId="3" w15:restartNumberingAfterBreak="0">
+    <w:nsid w:val="65900F49"/>
+    <w:multiLevelType w:val="hybridMultilevel"/>
+    <w:tmpl w:val="084814DE"/>
+    <w:lvl w:ilvl="0" w:tplc="04090001">
+      <w:start w:val="1"/>
+      <w:numFmt w:val="bullet"/>
+      <w:lvlText w:val=""/>
+      <w:lvlJc w:val="left"/>
+      <w:pPr>
+        <w:ind w:left="720" w:hanging="360"/>
+      </w:pPr>
+      <w:rPr>
+        <w:rFonts w:ascii="Symbol" w:hAnsi="Symbol" w:hint="default"/>
+      </w:rPr>
+    </w:lvl>
+    <w:lvl w:ilvl="1" w:tplc="04090003" w:tentative="1">
+      <w:start w:val="1"/>
+      <w:numFmt w:val="bullet"/>
+      <w:lvlText w:val="o"/>
+      <w:lvlJc w:val="left"/>
+      <w:pPr>
+        <w:ind w:left="1440" w:hanging="360"/>
+      </w:pPr>
+      <w:rPr>
+        <w:rFonts w:ascii="Courier New" w:hAnsi="Courier New" w:cs="Courier New" w:hint="default"/>
+      </w:rPr>
+    </w:lvl>
+    <w:lvl w:ilvl="2" w:tplc="04090005" w:tentative="1">
+      <w:start w:val="1"/>
+      <w:numFmt w:val="bullet"/>
+      <w:lvlText w:val=""/>
+      <w:lvlJc w:val="left"/>
+      <w:pPr>
+        <w:ind w:left="2160" w:hanging="360"/>
+      </w:pPr>
+      <w:rPr>
+        <w:rFonts w:ascii="Wingdings" w:hAnsi="Wingdings" w:hint="default"/>
+      </w:rPr>
+    </w:lvl>
+    <w:lvl w:ilvl="3" w:tplc="04090001" w:tentative="1">
+      <w:start w:val="1"/>
+      <w:numFmt w:val="bullet"/>
+      <w:lvlText w:val=""/>
+      <w:lvlJc w:val="left"/>
+      <w:pPr>
+        <w:ind w:left="2880" w:hanging="360"/>
+      </w:pPr>
+      <w:rPr>
+        <w:rFonts w:ascii="Symbol" w:hAnsi="Symbol" w:hint="default"/>
+      </w:rPr>
+    </w:lvl>
+    <w:lvl w:ilvl="4" w:tplc="04090003" w:tentative="1">
+      <w:start w:val="1"/>
+      <w:numFmt w:val="bullet"/>
+      <w:lvlText w:val="o"/>
+      <w:lvlJc w:val="left"/>
+      <w:pPr>
+        <w:ind w:left="3600" w:hanging="360"/>
+      </w:pPr>
+      <w:rPr>
+        <w:rFonts w:ascii="Courier New" w:hAnsi="Courier New" w:cs="Courier New" w:hint="default"/>
+      </w:rPr>
+    </w:lvl>
+    <w:lvl w:ilvl="5" w:tplc="04090005" w:tentative="1">
+      <w:start w:val="1"/>
+      <w:numFmt w:val="bullet"/>
+      <w:lvlText w:val=""/>
+      <w:lvlJc w:val="left"/>
+      <w:pPr>
+        <w:ind w:left="4320" w:hanging="360"/>
+      </w:pPr>
+      <w:rPr>
+        <w:rFonts w:ascii="Wingdings" w:hAnsi="Wingdings" w:hint="default"/>
+      </w:rPr>
+    </w:lvl>
+    <w:lvl w:ilvl="6" w:tplc="04090001" w:tentative="1">
+      <w:start w:val="1"/>
+      <w:numFmt w:val="bullet"/>
+      <w:lvlText w:val=""/>
+      <w:lvlJc w:val="left"/>
+      <w:pPr>
+        <w:ind w:left="5040" w:hanging="360"/>
+      </w:pPr>
+      <w:rPr>
+        <w:rFonts w:ascii="Symbol" w:hAnsi="Symbol" w:hint="default"/>
+      </w:rPr>
+    </w:lvl>
+    <w:lvl w:ilvl="7" w:tplc="04090003" w:tentative="1">
+      <w:start w:val="1"/>
+      <w:numFmt w:val="bullet"/>
+      <w:lvlText w:val="o"/>
+      <w:lvlJc w:val="left"/>
+      <w:pPr>
+        <w:ind w:left="5760" w:hanging="360"/>
+      </w:pPr>
+      <w:rPr>
+        <w:rFonts w:ascii="Courier New" w:hAnsi="Courier New" w:cs="Courier New" w:hint="default"/>
+      </w:rPr>
+    </w:lvl>
+    <w:lvl w:ilvl="8" w:tplc="04090005" w:tentative="1">
+      <w:start w:val="1"/>
+      <w:numFmt w:val="bullet"/>
+      <w:lvlText w:val=""/>
+      <w:lvlJc w:val="left"/>
+      <w:pPr>
+        <w:ind w:left="6480" w:hanging="360"/>
+      </w:pPr>
+      <w:rPr>
+        <w:rFonts w:ascii="Wingdings" w:hAnsi="Wingdings" w:hint="default"/>
+      </w:rPr>
+    </w:lvl>
+  </w:abstractNum>
   <w:num w:numId="1" w16cid:durableId="521676086">
     <w:abstractNumId w:val="0"/>
   </w:num>
@@ -5598,6 +6251,9 @@
   </w:num>
   <w:num w:numId="3" w16cid:durableId="1133135103">
     <w:abstractNumId w:val="1"/>
+  </w:num>
+  <w:num w:numId="4" w16cid:durableId="624971897">
+    <w:abstractNumId w:val="3"/>
   </w:num>
 </w:numbering>
 </file>
@@ -6729,6 +7385,30 @@
       <w:vertAlign w:val="superscript"/>
     </w:rPr>
   </w:style>
+  <w:style w:type="paragraph" w:customStyle="1" w:styleId="paragraph">
+    <w:name w:val="paragraph"/>
+    <w:basedOn w:val="Normal"/>
+    <w:rsid w:val="00854484"/>
+    <w:pPr>
+      <w:spacing w:before="100" w:beforeAutospacing="1" w:after="100" w:afterAutospacing="1" w:line="240" w:lineRule="auto"/>
+    </w:pPr>
+    <w:rPr>
+      <w:rFonts w:ascii="Times New Roman" w:eastAsia="Times New Roman" w:hAnsi="Times New Roman" w:cs="Times New Roman"/>
+      <w:sz w:val="24"/>
+      <w:szCs w:val="24"/>
+      <w:lang w:eastAsia="en-US"/>
+    </w:rPr>
+  </w:style>
+  <w:style w:type="character" w:customStyle="1" w:styleId="normaltextrun">
+    <w:name w:val="normaltextrun"/>
+    <w:basedOn w:val="DefaultParagraphFont"/>
+    <w:rsid w:val="00854484"/>
+  </w:style>
+  <w:style w:type="character" w:customStyle="1" w:styleId="eop">
+    <w:name w:val="eop"/>
+    <w:basedOn w:val="DefaultParagraphFont"/>
+    <w:rsid w:val="00854484"/>
+  </w:style>
 </w:styles>
 </file>
 

</xml_diff>